<commit_message>
Döküman başlangıcı + Decisions dosyasına EARS formatını gerekliliğinin de girilmesi
</commit_message>
<xml_diff>
--- a/CSE443 - RAD_Template.docx
+++ b/CSE443 - RAD_Template.docx
@@ -270,8 +270,16 @@
         <w:rPr>
           <w:lang w:val="en-US"/>
         </w:rPr>
-        <w:t>Emircan Badur</w:t>
-      </w:r>
+        <w:t xml:space="preserve">Emircan </w:t>
+      </w:r>
+      <w:proofErr w:type="spellStart"/>
+      <w:r>
+        <w:rPr>
+          <w:lang w:val="en-US"/>
+        </w:rPr>
+        <w:t>Badur</w:t>
+      </w:r>
+      <w:proofErr w:type="spellEnd"/>
     </w:p>
     <w:p>
       <w:pPr>
@@ -2809,46 +2817,1199 @@
     <w:p>
       <w:pPr>
         <w:rPr>
+          <w:lang w:val="en-US"/>
+        </w:rPr>
+      </w:pPr>
+      <w:bookmarkStart w:id="1" w:name="_Hlk212158917"/>
+      <w:r>
+        <w:rPr>
+          <w:lang w:val="en-US"/>
+        </w:rPr>
+        <w:t>The Automated Gherkin and BDD Test Scenario Generator is a developer-oriented tool that converts structured software requirements into Behavior-Driven Development (BDD) test scenarios written in Gherkin, using the Given–When–Then format. In its first version, the input is a Jira backlog exported as a CSV file. The system reads the Issue Type and Summary of each item, identifies the user stories, parses them into a structured internal model, and generates Gherkin feature files that developers can review, copy, and export.</w:t>
+      </w:r>
+    </w:p>
+    <w:bookmarkEnd w:id="1"/>
+    <w:p>
+      <w:pPr>
+        <w:rPr>
           <w:i/>
           <w:iCs/>
           <w:lang w:val="en-US"/>
         </w:rPr>
       </w:pPr>
-      <w:r>
+    </w:p>
+    <w:p>
+      <w:pPr>
+        <w:pStyle w:val="Balk2"/>
+        <w:rPr>
+          <w:lang w:val="en-US"/>
+        </w:rPr>
+      </w:pPr>
+      <w:bookmarkStart w:id="2" w:name="_Toc243343154"/>
+      <w:r>
+        <w:rPr>
+          <w:lang w:val="en-US"/>
+        </w:rPr>
+        <w:t>Purpose of the system</w:t>
+      </w:r>
+      <w:bookmarkEnd w:id="2"/>
+    </w:p>
+    <w:p>
+      <w:pPr>
+        <w:rPr>
+          <w:lang w:val="en-US"/>
+        </w:rPr>
+      </w:pPr>
+      <w:r>
+        <w:rPr>
+          <w:lang w:val="en-US"/>
+        </w:rPr>
+        <w:t>The purpose of the system is to automate the transformation of user stories into BDD test scenarios. Writing Gherkin scenarios by hand is time</w:t>
+      </w:r>
+      <w:r>
+        <w:rPr>
+          <w:lang w:val="en-US"/>
+        </w:rPr>
+        <w:t xml:space="preserve"> </w:t>
+      </w:r>
+      <w:r>
+        <w:rPr>
+          <w:lang w:val="en-US"/>
+        </w:rPr>
+        <w:t xml:space="preserve">consuming and </w:t>
+      </w:r>
+      <w:r>
+        <w:rPr>
+          <w:lang w:val="en-US"/>
+        </w:rPr>
+        <w:t>potentially</w:t>
+      </w:r>
+      <w:r>
+        <w:rPr>
+          <w:lang w:val="en-US"/>
+        </w:rPr>
+        <w:t xml:space="preserve"> inconsistent between team members. The system reads user stories from a Jira backlog exported as a CSV file, validates them, and generates structured Gherkin feature files in the Given–When–Then format. By doing so, it helps developers and testers obtain consistent test scenarios earlier in the development process and reveals incomplete requirements before implementation begins.</w:t>
+      </w:r>
+    </w:p>
+    <w:p>
+      <w:pPr>
+        <w:rPr>
+          <w:lang w:val="en-US"/>
+        </w:rPr>
+      </w:pPr>
+    </w:p>
+    <w:p>
+      <w:pPr>
+        <w:pStyle w:val="Balk2"/>
+        <w:rPr>
+          <w:lang w:val="en-US"/>
+        </w:rPr>
+      </w:pPr>
+      <w:bookmarkStart w:id="3" w:name="_Toc243343155"/>
+      <w:r>
+        <w:rPr>
+          <w:lang w:val="en-US"/>
+        </w:rPr>
+        <w:t>Scope of the system</w:t>
+      </w:r>
+      <w:bookmarkEnd w:id="3"/>
+    </w:p>
+    <w:p>
+      <w:pPr>
+        <w:rPr>
+          <w:lang w:val="en-US"/>
+        </w:rPr>
+      </w:pPr>
+      <w:r>
+        <w:rPr>
+          <w:lang w:val="en-US"/>
+        </w:rPr>
+        <w:t>The system includes the following capabilities:</w:t>
+      </w:r>
+    </w:p>
+    <w:p>
+      <w:pPr>
+        <w:pStyle w:val="ListeParagraf"/>
+        <w:numPr>
+          <w:ilvl w:val="0"/>
+          <w:numId w:val="26"/>
+        </w:numPr>
+        <w:rPr>
+          <w:lang w:val="en-US"/>
+        </w:rPr>
+      </w:pPr>
+      <w:r>
+        <w:rPr>
+          <w:lang w:val="en-US"/>
+        </w:rPr>
+        <w:t>Importing a Jira CSV file and identifying user stories by their Issue Type and Summary fields.</w:t>
+      </w:r>
+    </w:p>
+    <w:p>
+      <w:pPr>
+        <w:pStyle w:val="ListeParagraf"/>
+        <w:numPr>
+          <w:ilvl w:val="0"/>
+          <w:numId w:val="26"/>
+        </w:numPr>
+        <w:rPr>
+          <w:lang w:val="en-US"/>
+        </w:rPr>
+      </w:pPr>
+      <w:r>
+        <w:rPr>
+          <w:lang w:val="en-US"/>
+        </w:rPr>
+        <w:t>Validating the parsed user stories and reporting clear feedback for incomplete or invalid input.</w:t>
+      </w:r>
+    </w:p>
+    <w:p>
+      <w:pPr>
+        <w:pStyle w:val="ListeParagraf"/>
+        <w:numPr>
+          <w:ilvl w:val="0"/>
+          <w:numId w:val="26"/>
+        </w:numPr>
+        <w:rPr>
+          <w:lang w:val="en-US"/>
+        </w:rPr>
+      </w:pPr>
+      <w:r>
+        <w:rPr>
+          <w:lang w:val="en-US"/>
+        </w:rPr>
+        <w:t>Building a structured internal representation of each requirement.</w:t>
+      </w:r>
+    </w:p>
+    <w:p>
+      <w:pPr>
+        <w:pStyle w:val="ListeParagraf"/>
+        <w:numPr>
+          <w:ilvl w:val="0"/>
+          <w:numId w:val="26"/>
+        </w:numPr>
+        <w:rPr>
+          <w:lang w:val="en-US"/>
+        </w:rPr>
+      </w:pPr>
+      <w:r>
+        <w:rPr>
+          <w:lang w:val="en-US"/>
+        </w:rPr>
+        <w:t>Generating one or more Gherkin scenarios per user story, including alternative and exceptional flows where they can be identified.</w:t>
+      </w:r>
+    </w:p>
+    <w:p>
+      <w:pPr>
+        <w:pStyle w:val="ListeParagraf"/>
+        <w:numPr>
+          <w:ilvl w:val="0"/>
+          <w:numId w:val="26"/>
+        </w:numPr>
+        <w:rPr>
+          <w:lang w:val="en-US"/>
+        </w:rPr>
+      </w:pPr>
+      <w:r>
+        <w:rPr>
+          <w:lang w:val="en-US"/>
+        </w:rPr>
+        <w:t>Presenting the generated scenarios as valid Gherkin text that can be viewed, copied, and exported.</w:t>
+      </w:r>
+    </w:p>
+    <w:p>
+      <w:pPr>
+        <w:pStyle w:val="ListeParagraf"/>
+        <w:numPr>
+          <w:ilvl w:val="0"/>
+          <w:numId w:val="26"/>
+        </w:numPr>
+        <w:rPr>
+          <w:lang w:val="en-US"/>
+        </w:rPr>
+      </w:pPr>
+      <w:r>
+        <w:rPr>
+          <w:lang w:val="en-US"/>
+        </w:rPr>
+        <w:t>User registration and login, with persistent storage of each user's imports and generated scenarios.</w:t>
+      </w:r>
+    </w:p>
+    <w:p>
+      <w:pPr>
+        <w:pStyle w:val="ListeParagraf"/>
+        <w:numPr>
+          <w:ilvl w:val="0"/>
+          <w:numId w:val="26"/>
+        </w:numPr>
+        <w:rPr>
+          <w:lang w:val="en-US"/>
+        </w:rPr>
+      </w:pPr>
+      <w:r>
+        <w:rPr>
+          <w:lang w:val="en-US"/>
+        </w:rPr>
+        <w:t>Optional AI-assisted validation of the generated Gherkin text.</w:t>
+      </w:r>
+    </w:p>
+    <w:p>
+      <w:pPr>
+        <w:rPr>
+          <w:lang w:val="en-US"/>
+        </w:rPr>
+      </w:pPr>
+      <w:r>
+        <w:rPr>
+          <w:lang w:val="en-US"/>
+        </w:rPr>
+        <w:t>The system does not execute the generated scenarios, does not generate source code, and does not modify the Jira backlog.</w:t>
+      </w:r>
+    </w:p>
+    <w:p>
+      <w:pPr>
+        <w:rPr>
+          <w:lang w:val="en-US"/>
+        </w:rPr>
+      </w:pPr>
+    </w:p>
+    <w:p>
+      <w:pPr>
+        <w:pStyle w:val="Balk2"/>
+        <w:rPr>
+          <w:lang w:val="en-US"/>
+        </w:rPr>
+      </w:pPr>
+      <w:bookmarkStart w:id="4" w:name="_Toc243343156"/>
+      <w:r>
+        <w:rPr>
+          <w:lang w:val="en-US"/>
+        </w:rPr>
+        <w:t xml:space="preserve">Objectives and success criteria </w:t>
+      </w:r>
+      <w:proofErr w:type="gramStart"/>
+      <w:r>
+        <w:rPr>
+          <w:lang w:val="en-US"/>
+        </w:rPr>
+        <w:t>of</w:t>
+      </w:r>
+      <w:proofErr w:type="gramEnd"/>
+      <w:r>
+        <w:rPr>
+          <w:lang w:val="en-US"/>
+        </w:rPr>
+        <w:t xml:space="preserve"> the project</w:t>
+      </w:r>
+      <w:bookmarkEnd w:id="4"/>
+    </w:p>
+    <w:p>
+      <w:pPr>
+        <w:pStyle w:val="Balk4"/>
+        <w:rPr>
+          <w:lang w:val="en-US"/>
+        </w:rPr>
+      </w:pPr>
+      <w:r>
+        <w:rPr>
+          <w:lang w:val="en-US"/>
+        </w:rPr>
+        <w:t>Objectives</w:t>
+      </w:r>
+    </w:p>
+    <w:p>
+      <w:pPr>
+        <w:pStyle w:val="ListeParagraf"/>
+        <w:numPr>
+          <w:ilvl w:val="0"/>
+          <w:numId w:val="26"/>
+        </w:numPr>
+        <w:rPr>
+          <w:lang w:val="en-US"/>
+        </w:rPr>
+      </w:pPr>
+      <w:r>
+        <w:rPr>
+          <w:lang w:val="en-US"/>
+        </w:rPr>
+        <w:t>O-1: Convert user stories from a Jira CSV export into syntactically valid Gherkin feature files.</w:t>
+      </w:r>
+    </w:p>
+    <w:p>
+      <w:pPr>
+        <w:pStyle w:val="ListeParagraf"/>
+        <w:numPr>
+          <w:ilvl w:val="0"/>
+          <w:numId w:val="26"/>
+        </w:numPr>
+        <w:rPr>
+          <w:lang w:val="en-US"/>
+        </w:rPr>
+      </w:pPr>
+      <w:r>
+        <w:rPr>
+          <w:lang w:val="en-US"/>
+        </w:rPr>
+        <w:t>O-2: Generate multiple scenarios for a requirement where alternative or exceptional behavior can be identified.</w:t>
+      </w:r>
+    </w:p>
+    <w:p>
+      <w:pPr>
+        <w:pStyle w:val="ListeParagraf"/>
+        <w:numPr>
+          <w:ilvl w:val="0"/>
+          <w:numId w:val="26"/>
+        </w:numPr>
+        <w:rPr>
+          <w:lang w:val="en-US"/>
+        </w:rPr>
+      </w:pPr>
+      <w:r>
+        <w:rPr>
+          <w:lang w:val="en-US"/>
+        </w:rPr>
+        <w:t>O-3: Report clear and actionable feedback when a requirement is incomplete or cannot be processed.</w:t>
+      </w:r>
+    </w:p>
+    <w:p>
+      <w:pPr>
+        <w:pStyle w:val="ListeParagraf"/>
+        <w:numPr>
+          <w:ilvl w:val="0"/>
+          <w:numId w:val="26"/>
+        </w:numPr>
+        <w:rPr>
+          <w:lang w:val="en-US"/>
+        </w:rPr>
+      </w:pPr>
+      <w:r>
+        <w:rPr>
+          <w:lang w:val="en-US"/>
+        </w:rPr>
+        <w:t>O-4: Store users, imports, and generated scenarios so that each user can review their history.</w:t>
+      </w:r>
+    </w:p>
+    <w:p>
+      <w:pPr>
+        <w:pStyle w:val="ListeParagraf"/>
+        <w:numPr>
+          <w:ilvl w:val="0"/>
+          <w:numId w:val="26"/>
+        </w:numPr>
+        <w:rPr>
+          <w:lang w:val="en-US"/>
+        </w:rPr>
+      </w:pPr>
+      <w:r>
+        <w:rPr>
+          <w:lang w:val="en-US"/>
+        </w:rPr>
+        <w:t>O-5: Apply object-oriented analysis and design principles throughout the system.</w:t>
+      </w:r>
+    </w:p>
+    <w:p>
+      <w:pPr>
+        <w:rPr>
+          <w:lang w:val="en-US"/>
+        </w:rPr>
+      </w:pPr>
+    </w:p>
+    <w:p>
+      <w:pPr>
+        <w:pStyle w:val="Balk4"/>
+        <w:rPr>
+          <w:lang w:val="en-US"/>
+        </w:rPr>
+      </w:pPr>
+      <w:r>
+        <w:rPr>
+          <w:lang w:val="en-US"/>
+        </w:rPr>
+        <w:t>Success criteria</w:t>
+      </w:r>
+    </w:p>
+    <w:p>
+      <w:pPr>
+        <w:rPr>
+          <w:lang w:val="en-US"/>
+        </w:rPr>
+      </w:pPr>
+      <w:r>
+        <w:rPr>
+          <w:lang w:val="en-US"/>
+        </w:rPr>
+        <w:t>- SC-1: For the sample backlog, the system identifies all items of type Story and generates at least one scenario for each.</w:t>
+      </w:r>
+    </w:p>
+    <w:p>
+      <w:pPr>
+        <w:rPr>
+          <w:lang w:val="en-US"/>
+        </w:rPr>
+      </w:pPr>
+      <w:r>
+        <w:rPr>
+          <w:lang w:val="en-US"/>
+        </w:rPr>
+        <w:t>- SC-2: Every generated feature file is accepted by a standard Gherkin parser without errors.</w:t>
+      </w:r>
+    </w:p>
+    <w:p>
+      <w:pPr>
+        <w:rPr>
+          <w:lang w:val="en-US"/>
+        </w:rPr>
+      </w:pPr>
+      <w:r>
+        <w:rPr>
+          <w:lang w:val="en-US"/>
+        </w:rPr>
+        <w:t>- SC-3: Every generated scenario can be traced back to its source user story.</w:t>
+      </w:r>
+    </w:p>
+    <w:p>
+      <w:pPr>
+        <w:rPr>
+          <w:lang w:val="en-US"/>
+        </w:rPr>
+      </w:pPr>
+      <w:r>
+        <w:rPr>
+          <w:lang w:val="en-US"/>
+        </w:rPr>
+        <w:t>- SC-4: A user story without a "so that" clause produces a warning instead of a failure.</w:t>
+      </w:r>
+    </w:p>
+    <w:p>
+      <w:pPr>
+        <w:rPr>
+          <w:lang w:val="en-US"/>
+        </w:rPr>
+      </w:pPr>
+      <w:r>
+        <w:rPr>
+          <w:lang w:val="en-US"/>
+        </w:rPr>
+        <w:t>- SC-5: A registered user can log in, import a CSV file, and see that import in their history.</w:t>
+      </w:r>
+    </w:p>
+    <w:p>
+      <w:pPr>
+        <w:rPr>
+          <w:lang w:val="en-US"/>
+        </w:rPr>
+      </w:pPr>
+      <w:r>
+        <w:rPr>
+          <w:lang w:val="en-US"/>
+        </w:rPr>
+        <w:t>- SC-6: A new input format can be added by writing a new parser and adapter, without modifying the scenario-generation engine.</w:t>
+      </w:r>
+    </w:p>
+    <w:p>
+      <w:pPr>
+        <w:rPr>
+          <w:lang w:val="en-US"/>
+        </w:rPr>
+      </w:pPr>
+    </w:p>
+    <w:p>
+      <w:pPr>
+        <w:pStyle w:val="Balk2"/>
+        <w:rPr>
+          <w:lang w:val="en-US"/>
+        </w:rPr>
+      </w:pPr>
+      <w:bookmarkStart w:id="5" w:name="_Toc243343157"/>
+      <w:r>
+        <w:rPr>
+          <w:lang w:val="en-US"/>
+        </w:rPr>
+        <w:t>Definitions, acronyms, and abbreviations</w:t>
+      </w:r>
+      <w:bookmarkEnd w:id="5"/>
+    </w:p>
+    <w:tbl>
+      <w:tblPr>
+        <w:tblStyle w:val="TabloKlavuzu"/>
+        <w:tblW w:w="0" w:type="auto"/>
+        <w:tblLook w:val="04A0" w:firstRow="1" w:lastRow="0" w:firstColumn="1" w:lastColumn="0" w:noHBand="0" w:noVBand="1"/>
+      </w:tblPr>
+      <w:tblGrid>
+        <w:gridCol w:w="1696"/>
+        <w:gridCol w:w="7366"/>
+      </w:tblGrid>
+      <w:tr>
+        <w:tc>
+          <w:tcPr>
+            <w:tcW w:w="1696" w:type="dxa"/>
+          </w:tcPr>
+          <w:p>
+            <w:pPr>
+              <w:rPr>
+                <w:lang w:val="en-US"/>
+              </w:rPr>
+            </w:pPr>
+            <w:r>
+              <w:rPr>
+                <w:lang w:val="en-US"/>
+              </w:rPr>
+              <w:t>Term</w:t>
+            </w:r>
+          </w:p>
+        </w:tc>
+        <w:tc>
+          <w:tcPr>
+            <w:tcW w:w="7366" w:type="dxa"/>
+          </w:tcPr>
+          <w:p>
+            <w:pPr>
+              <w:rPr>
+                <w:lang w:val="en-US"/>
+              </w:rPr>
+            </w:pPr>
+            <w:r>
+              <w:rPr>
+                <w:lang w:val="en-US"/>
+              </w:rPr>
+              <w:t>Definition</w:t>
+            </w:r>
+          </w:p>
+        </w:tc>
+      </w:tr>
+      <w:tr>
+        <w:tc>
+          <w:tcPr>
+            <w:tcW w:w="1696" w:type="dxa"/>
+          </w:tcPr>
+          <w:p>
+            <w:pPr>
+              <w:rPr>
+                <w:lang w:val="en-US"/>
+              </w:rPr>
+            </w:pPr>
+            <w:r>
+              <w:rPr>
+                <w:lang w:val="en-US"/>
+              </w:rPr>
+              <w:t>User Story</w:t>
+            </w:r>
+          </w:p>
+        </w:tc>
+        <w:tc>
+          <w:tcPr>
+            <w:tcW w:w="7366" w:type="dxa"/>
+          </w:tcPr>
+          <w:p>
+            <w:pPr>
+              <w:rPr>
+                <w:lang w:val="en-US"/>
+              </w:rPr>
+            </w:pPr>
+            <w:r>
+              <w:rPr>
+                <w:lang w:val="en-US"/>
+              </w:rPr>
+              <w:t xml:space="preserve">In this document, </w:t>
+            </w:r>
+            <w:proofErr w:type="gramStart"/>
+            <w:r>
+              <w:rPr>
+                <w:lang w:val="en-US"/>
+              </w:rPr>
+              <w:t>a Jira</w:t>
+            </w:r>
+            <w:proofErr w:type="gramEnd"/>
+            <w:r>
+              <w:rPr>
+                <w:lang w:val="en-US"/>
+              </w:rPr>
+              <w:t xml:space="preserve"> backlog item of type Story. Its Summary contains a requirement.</w:t>
+            </w:r>
+          </w:p>
+        </w:tc>
+      </w:tr>
+      <w:tr>
+        <w:tc>
+          <w:tcPr>
+            <w:tcW w:w="1696" w:type="dxa"/>
+          </w:tcPr>
+          <w:p>
+            <w:pPr>
+              <w:rPr>
+                <w:lang w:val="en-US"/>
+              </w:rPr>
+            </w:pPr>
+            <w:r>
+              <w:rPr>
+                <w:lang w:val="en-US"/>
+              </w:rPr>
+              <w:t>User Story</w:t>
+            </w:r>
+            <w:r>
+              <w:rPr>
+                <w:lang w:val="en-US"/>
+              </w:rPr>
+              <w:t xml:space="preserve"> Template</w:t>
+            </w:r>
+          </w:p>
+        </w:tc>
+        <w:tc>
+          <w:tcPr>
+            <w:tcW w:w="7366" w:type="dxa"/>
+          </w:tcPr>
+          <w:p>
+            <w:pPr>
+              <w:rPr>
+                <w:lang w:val="en-US"/>
+              </w:rPr>
+            </w:pPr>
+            <w:r>
+              <w:rPr>
+                <w:lang w:val="en-US"/>
+              </w:rPr>
+              <w:t>A requirement format of the form "As a [role], I want [capability], so that [benefit]."</w:t>
+            </w:r>
+          </w:p>
+        </w:tc>
+      </w:tr>
+      <w:tr>
+        <w:tc>
+          <w:tcPr>
+            <w:tcW w:w="1696" w:type="dxa"/>
+          </w:tcPr>
+          <w:p>
+            <w:pPr>
+              <w:rPr>
+                <w:lang w:val="en-US"/>
+              </w:rPr>
+            </w:pPr>
+            <w:r>
+              <w:rPr>
+                <w:lang w:val="en-US"/>
+              </w:rPr>
+              <w:t>EARS</w:t>
+            </w:r>
+          </w:p>
+        </w:tc>
+        <w:tc>
+          <w:tcPr>
+            <w:tcW w:w="7366" w:type="dxa"/>
+          </w:tcPr>
+          <w:p>
+            <w:pPr>
+              <w:rPr>
+                <w:lang w:val="en-US"/>
+              </w:rPr>
+            </w:pPr>
+            <w:r>
+              <w:rPr>
+                <w:lang w:val="en-US"/>
+              </w:rPr>
+              <w:t>Easy Approach to Requirements Syntax, a set of sentence templates for writing requirements, e.g. "When [trigger], the system shall [response]."</w:t>
+            </w:r>
+          </w:p>
+        </w:tc>
+      </w:tr>
+      <w:tr>
+        <w:tc>
+          <w:tcPr>
+            <w:tcW w:w="1696" w:type="dxa"/>
+          </w:tcPr>
+          <w:p>
+            <w:pPr>
+              <w:rPr>
+                <w:lang w:val="en-US"/>
+              </w:rPr>
+            </w:pPr>
+            <w:r>
+              <w:rPr>
+                <w:lang w:val="en-US"/>
+              </w:rPr>
+              <w:t>Epic</w:t>
+            </w:r>
+          </w:p>
+        </w:tc>
+        <w:tc>
+          <w:tcPr>
+            <w:tcW w:w="7366" w:type="dxa"/>
+          </w:tcPr>
+          <w:p>
+            <w:pPr>
+              <w:rPr>
+                <w:lang w:val="en-US"/>
+              </w:rPr>
+            </w:pPr>
+            <w:r>
+              <w:rPr>
+                <w:lang w:val="en-US"/>
+              </w:rPr>
+              <w:t>A Jira issue type that groups related user stories.</w:t>
+            </w:r>
+          </w:p>
+        </w:tc>
+      </w:tr>
+      <w:tr>
+        <w:tc>
+          <w:tcPr>
+            <w:tcW w:w="1696" w:type="dxa"/>
+          </w:tcPr>
+          <w:p>
+            <w:pPr>
+              <w:rPr>
+                <w:lang w:val="en-US"/>
+              </w:rPr>
+            </w:pPr>
+            <w:r>
+              <w:rPr>
+                <w:lang w:val="en-US"/>
+              </w:rPr>
+              <w:t>Jira</w:t>
+            </w:r>
+          </w:p>
+        </w:tc>
+        <w:tc>
+          <w:tcPr>
+            <w:tcW w:w="7366" w:type="dxa"/>
+          </w:tcPr>
+          <w:p>
+            <w:pPr>
+              <w:rPr>
+                <w:lang w:val="en-US"/>
+              </w:rPr>
+            </w:pPr>
+            <w:r>
+              <w:rPr>
+                <w:lang w:val="en-US"/>
+              </w:rPr>
+              <w:t>An issue-tracking tool used to manage backlogs.</w:t>
+            </w:r>
+          </w:p>
+        </w:tc>
+      </w:tr>
+      <w:tr>
+        <w:tc>
+          <w:tcPr>
+            <w:tcW w:w="1696" w:type="dxa"/>
+          </w:tcPr>
+          <w:p>
+            <w:pPr>
+              <w:rPr>
+                <w:lang w:val="en-US"/>
+              </w:rPr>
+            </w:pPr>
+            <w:r>
+              <w:rPr>
+                <w:lang w:val="en-US"/>
+              </w:rPr>
+              <w:t>BDD</w:t>
+            </w:r>
+          </w:p>
+        </w:tc>
+        <w:tc>
+          <w:tcPr>
+            <w:tcW w:w="7366" w:type="dxa"/>
+          </w:tcPr>
+          <w:p>
+            <w:pPr>
+              <w:rPr>
+                <w:lang w:val="en-US"/>
+              </w:rPr>
+            </w:pPr>
+            <w:r>
+              <w:rPr>
+                <w:lang w:val="en-US"/>
+              </w:rPr>
+              <w:t>Behavior-Driven Development, a development approach where behavior is described in a shared, readable format.</w:t>
+            </w:r>
+          </w:p>
+        </w:tc>
+      </w:tr>
+      <w:tr>
+        <w:tc>
+          <w:tcPr>
+            <w:tcW w:w="1696" w:type="dxa"/>
+          </w:tcPr>
+          <w:p>
+            <w:pPr>
+              <w:rPr>
+                <w:lang w:val="en-US"/>
+              </w:rPr>
+            </w:pPr>
+            <w:r>
+              <w:rPr>
+                <w:lang w:val="en-US"/>
+              </w:rPr>
+              <w:t>Gherkin</w:t>
+            </w:r>
+          </w:p>
+        </w:tc>
+        <w:tc>
+          <w:tcPr>
+            <w:tcW w:w="7366" w:type="dxa"/>
+          </w:tcPr>
+          <w:p>
+            <w:pPr>
+              <w:rPr>
+                <w:lang w:val="en-US"/>
+              </w:rPr>
+            </w:pPr>
+            <w:r>
+              <w:rPr>
+                <w:lang w:val="en-US"/>
+              </w:rPr>
+              <w:t xml:space="preserve">A plain-text language </w:t>
+            </w:r>
+            <w:proofErr w:type="gramStart"/>
+            <w:r>
+              <w:rPr>
+                <w:lang w:val="en-US"/>
+              </w:rPr>
+              <w:t>used</w:t>
+            </w:r>
+            <w:proofErr w:type="gramEnd"/>
+            <w:r>
+              <w:rPr>
+                <w:lang w:val="en-US"/>
+              </w:rPr>
+              <w:t xml:space="preserve"> to describe behavior with the keywords Feature, Scenario, Given, When, and Then.</w:t>
+            </w:r>
+          </w:p>
+        </w:tc>
+      </w:tr>
+      <w:tr>
+        <w:tc>
+          <w:tcPr>
+            <w:tcW w:w="1696" w:type="dxa"/>
+          </w:tcPr>
+          <w:p>
+            <w:pPr>
+              <w:rPr>
+                <w:lang w:val="en-US"/>
+              </w:rPr>
+            </w:pPr>
+            <w:r>
+              <w:rPr>
+                <w:lang w:val="en-US"/>
+              </w:rPr>
+              <w:t>CSV</w:t>
+            </w:r>
+          </w:p>
+        </w:tc>
+        <w:tc>
+          <w:tcPr>
+            <w:tcW w:w="7366" w:type="dxa"/>
+          </w:tcPr>
+          <w:p>
+            <w:pPr>
+              <w:rPr>
+                <w:lang w:val="en-US"/>
+              </w:rPr>
+            </w:pPr>
+            <w:r>
+              <w:rPr>
+                <w:lang w:val="en-US"/>
+              </w:rPr>
+              <w:t>Comma-Separated Values, a plain-text tabular file format.</w:t>
+            </w:r>
+          </w:p>
+        </w:tc>
+      </w:tr>
+      <w:tr>
+        <w:tc>
+          <w:tcPr>
+            <w:tcW w:w="1696" w:type="dxa"/>
+          </w:tcPr>
+          <w:p>
+            <w:pPr>
+              <w:rPr>
+                <w:lang w:val="en-US"/>
+              </w:rPr>
+            </w:pPr>
+            <w:r>
+              <w:rPr>
+                <w:lang w:val="en-US"/>
+              </w:rPr>
+              <w:t>AST</w:t>
+            </w:r>
+          </w:p>
+        </w:tc>
+        <w:tc>
+          <w:tcPr>
+            <w:tcW w:w="7366" w:type="dxa"/>
+          </w:tcPr>
+          <w:p>
+            <w:pPr>
+              <w:rPr>
+                <w:lang w:val="en-US"/>
+              </w:rPr>
+            </w:pPr>
+            <w:r>
+              <w:rPr>
+                <w:lang w:val="en-US"/>
+              </w:rPr>
+              <w:t>Abstract Syntax Tree, the structured internal representation of a parsed requirement.</w:t>
+            </w:r>
+          </w:p>
+        </w:tc>
+      </w:tr>
+    </w:tbl>
+    <w:p>
+      <w:pPr>
+        <w:rPr>
+          <w:lang w:val="en-US"/>
+        </w:rPr>
+      </w:pPr>
+    </w:p>
+    <w:p>
+      <w:pPr>
+        <w:pStyle w:val="Balk2"/>
+        <w:rPr>
+          <w:lang w:val="en-US"/>
+        </w:rPr>
+      </w:pPr>
+      <w:bookmarkStart w:id="6" w:name="_Toc243343158"/>
+      <w:r>
+        <w:rPr>
+          <w:lang w:val="en-US"/>
+        </w:rPr>
+        <w:t>References</w:t>
+      </w:r>
+      <w:bookmarkEnd w:id="6"/>
+    </w:p>
+    <w:p>
+      <w:pPr>
+        <w:pStyle w:val="ListeParagraf"/>
+        <w:numPr>
+          <w:ilvl w:val="0"/>
+          <w:numId w:val="28"/>
+        </w:numPr>
+        <w:rPr>
+          <w:lang w:val="en-US"/>
+        </w:rPr>
+      </w:pPr>
+      <w:r>
+        <w:rPr>
+          <w:lang w:val="en-US"/>
+        </w:rPr>
+        <w:t>Automated Gherkin and BDD Test Scenario Generator project description (problem statement), CSE443, 2026.</w:t>
+      </w:r>
+    </w:p>
+    <w:p>
+      <w:pPr>
+        <w:pStyle w:val="ListeParagraf"/>
+        <w:numPr>
+          <w:ilvl w:val="0"/>
+          <w:numId w:val="28"/>
+        </w:numPr>
+        <w:rPr>
+          <w:lang w:val="en-US"/>
+        </w:rPr>
+      </w:pPr>
+      <w:r>
+        <w:rPr>
+          <w:lang w:val="en-US"/>
+        </w:rPr>
+        <w:t>CSE443 Project Deliverable #1: Requirements Analysis Document, 2026.</w:t>
+      </w:r>
+    </w:p>
+    <w:p>
+      <w:pPr>
+        <w:pStyle w:val="ListeParagraf"/>
+        <w:numPr>
+          <w:ilvl w:val="0"/>
+          <w:numId w:val="28"/>
+        </w:numPr>
+        <w:rPr>
+          <w:lang w:val="en-US"/>
+        </w:rPr>
+      </w:pPr>
+      <w:r>
+        <w:rPr>
+          <w:lang w:val="en-US"/>
+        </w:rPr>
+        <w:t xml:space="preserve">Cucumber, "Gherkin Reference," </w:t>
+      </w:r>
+      <w:hyperlink r:id="rId11" w:history="1">
+        <w:r>
+          <w:rPr>
+            <w:rStyle w:val="Kpr"/>
+            <w:lang w:val="en-US"/>
+          </w:rPr>
+          <w:t>https://cucumber.io/docs/gherkin/reference/</w:t>
+        </w:r>
+      </w:hyperlink>
+      <w:r>
+        <w:rPr>
+          <w:lang w:val="en-US"/>
+        </w:rPr>
+        <w:t>.</w:t>
+      </w:r>
+    </w:p>
+    <w:p>
+      <w:pPr>
+        <w:pStyle w:val="ListeParagraf"/>
+        <w:numPr>
+          <w:ilvl w:val="0"/>
+          <w:numId w:val="28"/>
+        </w:numPr>
+        <w:rPr>
+          <w:lang w:val="en-US"/>
+        </w:rPr>
+      </w:pPr>
+      <w:r>
+        <w:rPr>
+          <w:lang w:val="en-US"/>
+        </w:rPr>
+        <w:t xml:space="preserve">Alistair Mavin, “EARS”, </w:t>
+      </w:r>
+      <w:hyperlink r:id="rId12" w:history="1">
+        <w:r>
+          <w:rPr>
+            <w:rStyle w:val="Kpr"/>
+            <w:lang w:val="en-US"/>
+          </w:rPr>
+          <w:t>https://alistairmavin.c</w:t>
+        </w:r>
+        <w:r>
+          <w:rPr>
+            <w:rStyle w:val="Kpr"/>
+            <w:lang w:val="en-US"/>
+          </w:rPr>
+          <w:t>o</w:t>
+        </w:r>
+        <w:r>
+          <w:rPr>
+            <w:rStyle w:val="Kpr"/>
+            <w:lang w:val="en-US"/>
+          </w:rPr>
+          <w:t>m/ears/</w:t>
+        </w:r>
+      </w:hyperlink>
+    </w:p>
+    <w:p>
+      <w:pPr>
+        <w:pStyle w:val="Balk2"/>
+        <w:rPr>
+          <w:lang w:val="en-US"/>
+        </w:rPr>
+      </w:pPr>
+      <w:bookmarkStart w:id="7" w:name="_Toc243343159"/>
+      <w:r>
+        <w:rPr>
+          <w:lang w:val="en-US"/>
+        </w:rPr>
+        <w:t>Overview</w:t>
+      </w:r>
+      <w:bookmarkEnd w:id="7"/>
+    </w:p>
+    <w:p>
+      <w:pPr>
+        <w:rPr>
+          <w:lang w:val="en-US"/>
+        </w:rPr>
+      </w:pPr>
+      <w:r>
+        <w:rPr>
+          <w:lang w:val="en-US"/>
+        </w:rPr>
+        <w:t xml:space="preserve">This document specifies the requirements of the Automated Gherkin and BDD Test Scenario Generator and is organized into six sections. Section 1 introduces the system, its scope, and its objectives. Section 2 describes how BDD test scenarios are currently derived from backlog requirements, which motivates the proposed system. Section 3 is the main part of </w:t>
+      </w:r>
+      <w:r>
+        <w:rPr>
+          <w:lang w:val="en-US"/>
+        </w:rPr>
+        <w:lastRenderedPageBreak/>
+        <w:t>the document: it lists the functional and nonfunctional requirements and presents the analysis models, namely scenarios, the use case model, the object model, the dynamic model, and user interface mock-ups. Section 4 defines the terms used throughout the document. Section 5 assigns a priority to each requirement, and Section 6 traces the requirements back to the project problem statement. Readers who need only the expected behavior of the system can focus on Sections 3.2 and 3.4.2, while readers interested in the conceptual structure can refer to Section 3.4.3.</w:t>
+      </w:r>
+    </w:p>
+    <w:p>
+      <w:pPr>
+        <w:pStyle w:val="Balk1"/>
+        <w:ind w:left="431" w:hanging="431"/>
+        <w:rPr>
+          <w:lang w:val="en-US"/>
+        </w:rPr>
+      </w:pPr>
+      <w:bookmarkStart w:id="8" w:name="_Toc243343160"/>
+      <w:r>
+        <w:rPr>
+          <w:lang w:val="en-US"/>
+        </w:rPr>
+        <w:t>Current system</w:t>
+      </w:r>
+      <w:bookmarkEnd w:id="8"/>
+    </w:p>
+    <w:p>
+      <w:pPr>
         <w:rPr>
           <w:i/>
           <w:iCs/>
           <w:lang w:val="en-US"/>
         </w:rPr>
-        <w:t xml:space="preserve">The first section of the </w:t>
-      </w:r>
+      </w:pPr>
       <w:r>
         <w:rPr>
           <w:i/>
           <w:iCs/>
           <w:lang w:val="en-US"/>
         </w:rPr>
-        <w:t>document</w:t>
-      </w:r>
+        <w:t xml:space="preserve">The second section, Current system, describes the current </w:t>
+      </w:r>
+      <w:proofErr w:type="gramStart"/>
       <w:r>
         <w:rPr>
           <w:i/>
           <w:iCs/>
           <w:lang w:val="en-US"/>
         </w:rPr>
-        <w:t xml:space="preserve"> is an Introduction. Its purpose is </w:t>
-      </w:r>
-      <w:bookmarkStart w:id="1" w:name="_Hlk212158917"/>
+        <w:t>state of affairs</w:t>
+      </w:r>
+      <w:proofErr w:type="gramEnd"/>
       <w:r>
         <w:rPr>
           <w:i/>
           <w:iCs/>
           <w:lang w:val="en-US"/>
         </w:rPr>
-        <w:t>to provide a brief overview of the function of the system and the reasons for its development, its scope, and references to the development context (e.g., reference to the problem statement written by the client, references to existing systems, feasibility studies). The introduction also includes the objectives and success criteria of the project.</w:t>
-      </w:r>
-    </w:p>
-    <w:bookmarkEnd w:id="1"/>
+        <w:t>. If the new system will replace an existing system, this section describes the functionality and the problems of the current system. Otherwise, this section describes how the tasks supported by the new system are accomplished now.</w:t>
+      </w:r>
+    </w:p>
+    <w:p>
+      <w:pPr>
+        <w:rPr>
+          <w:lang w:val="en-US"/>
+        </w:rPr>
+      </w:pPr>
+      <w:r>
+        <w:rPr>
+          <w:lang w:val="en-US"/>
+        </w:rPr>
+        <w:t xml:space="preserve"> </w:t>
+      </w:r>
+    </w:p>
+    <w:p>
+      <w:pPr>
+        <w:pStyle w:val="Balk1"/>
+        <w:rPr>
+          <w:lang w:val="en-US"/>
+        </w:rPr>
+      </w:pPr>
+      <w:bookmarkStart w:id="9" w:name="_Toc243343161"/>
+      <w:r>
+        <w:rPr>
+          <w:lang w:val="en-US"/>
+        </w:rPr>
+        <w:t>Proposed syste</w:t>
+      </w:r>
+      <w:r>
+        <w:rPr>
+          <w:lang w:val="en-US"/>
+        </w:rPr>
+        <w:t>m</w:t>
+      </w:r>
+      <w:bookmarkEnd w:id="9"/>
+    </w:p>
     <w:p>
       <w:pPr>
         <w:rPr>
@@ -2857,809 +4018,607 @@
           <w:lang w:val="en-US"/>
         </w:rPr>
       </w:pPr>
-    </w:p>
-    <w:p>
-      <w:pPr>
-        <w:pStyle w:val="Balk2"/>
-        <w:rPr>
-          <w:lang w:val="en-US"/>
-        </w:rPr>
-      </w:pPr>
-      <w:bookmarkStart w:id="2" w:name="_Toc243343154"/>
-      <w:r>
-        <w:rPr>
-          <w:lang w:val="en-US"/>
-        </w:rPr>
-        <w:t>Purpose of the system</w:t>
-      </w:r>
-      <w:bookmarkEnd w:id="2"/>
-    </w:p>
-    <w:p>
-      <w:pPr>
-        <w:rPr>
-          <w:lang w:val="en-US"/>
-        </w:rPr>
-      </w:pPr>
-    </w:p>
-    <w:p>
-      <w:pPr>
-        <w:pStyle w:val="Balk2"/>
-        <w:rPr>
-          <w:lang w:val="en-US"/>
-        </w:rPr>
-      </w:pPr>
-      <w:bookmarkStart w:id="3" w:name="_Toc243343155"/>
-      <w:r>
-        <w:rPr>
-          <w:lang w:val="en-US"/>
-        </w:rPr>
-        <w:t>Scope of the system</w:t>
-      </w:r>
-      <w:bookmarkEnd w:id="3"/>
-    </w:p>
-    <w:p>
-      <w:pPr>
-        <w:rPr>
-          <w:lang w:val="en-US"/>
-        </w:rPr>
-      </w:pPr>
-    </w:p>
-    <w:p>
-      <w:pPr>
-        <w:pStyle w:val="Balk2"/>
-        <w:rPr>
-          <w:lang w:val="en-US"/>
-        </w:rPr>
-      </w:pPr>
-      <w:bookmarkStart w:id="4" w:name="_Toc243343156"/>
-      <w:r>
-        <w:rPr>
-          <w:lang w:val="en-US"/>
-        </w:rPr>
-        <w:t>Objectives and success criteria of the project</w:t>
-      </w:r>
-      <w:bookmarkEnd w:id="4"/>
-    </w:p>
-    <w:p>
-      <w:pPr>
-        <w:rPr>
-          <w:lang w:val="en-US"/>
-        </w:rPr>
-      </w:pPr>
-    </w:p>
-    <w:p>
-      <w:pPr>
-        <w:pStyle w:val="Balk2"/>
-        <w:rPr>
-          <w:lang w:val="en-US"/>
-        </w:rPr>
-      </w:pPr>
-      <w:bookmarkStart w:id="5" w:name="_Toc243343157"/>
-      <w:r>
-        <w:rPr>
-          <w:lang w:val="en-US"/>
-        </w:rPr>
-        <w:t>Definitions, acronyms, and abbreviations</w:t>
-      </w:r>
-      <w:bookmarkEnd w:id="5"/>
-    </w:p>
-    <w:p>
-      <w:pPr>
-        <w:rPr>
-          <w:lang w:val="en-US"/>
-        </w:rPr>
-      </w:pPr>
-    </w:p>
-    <w:p>
-      <w:pPr>
-        <w:pStyle w:val="Balk2"/>
-        <w:rPr>
-          <w:lang w:val="en-US"/>
-        </w:rPr>
-      </w:pPr>
-      <w:bookmarkStart w:id="6" w:name="_Toc243343158"/>
-      <w:r>
-        <w:rPr>
-          <w:lang w:val="en-US"/>
-        </w:rPr>
-        <w:t>References</w:t>
-      </w:r>
-      <w:bookmarkEnd w:id="6"/>
-    </w:p>
-    <w:p>
-      <w:pPr>
-        <w:rPr>
-          <w:lang w:val="en-US"/>
-        </w:rPr>
-      </w:pPr>
-    </w:p>
-    <w:p>
-      <w:pPr>
-        <w:pStyle w:val="Balk2"/>
-        <w:rPr>
-          <w:lang w:val="en-US"/>
-        </w:rPr>
-      </w:pPr>
-      <w:bookmarkStart w:id="7" w:name="_Toc243343159"/>
-      <w:r>
-        <w:rPr>
-          <w:lang w:val="en-US"/>
-        </w:rPr>
-        <w:t>Overview</w:t>
-      </w:r>
-      <w:bookmarkEnd w:id="7"/>
-    </w:p>
-    <w:p>
-      <w:pPr>
-        <w:rPr>
-          <w:lang w:val="en-US"/>
-        </w:rPr>
-      </w:pPr>
-    </w:p>
-    <w:p>
-      <w:pPr>
-        <w:pStyle w:val="Balk1"/>
-        <w:ind w:left="431" w:hanging="431"/>
-        <w:rPr>
-          <w:lang w:val="en-US"/>
-        </w:rPr>
-      </w:pPr>
-      <w:bookmarkStart w:id="8" w:name="_Toc243343160"/>
-      <w:r>
-        <w:rPr>
-          <w:lang w:val="en-US"/>
-        </w:rPr>
-        <w:t>Current system</w:t>
-      </w:r>
-      <w:bookmarkEnd w:id="8"/>
-    </w:p>
-    <w:p>
-      <w:pPr>
+      <w:r>
         <w:rPr>
           <w:i/>
           <w:iCs/>
           <w:lang w:val="en-US"/>
         </w:rPr>
-      </w:pPr>
-      <w:r>
+        <w:t>The third section documents the requirements elicitation and the analysis model of the new system.</w:t>
+      </w:r>
+    </w:p>
+    <w:p>
+      <w:pPr>
+        <w:rPr>
+          <w:lang w:val="en-US"/>
+        </w:rPr>
+      </w:pPr>
+    </w:p>
+    <w:p>
+      <w:pPr>
+        <w:pStyle w:val="Balk2"/>
+        <w:rPr>
+          <w:lang w:val="en-US"/>
+        </w:rPr>
+      </w:pPr>
+      <w:bookmarkStart w:id="10" w:name="_Toc243343162"/>
+      <w:r>
+        <w:rPr>
+          <w:lang w:val="en-US"/>
+        </w:rPr>
+        <w:t>Overview</w:t>
+      </w:r>
+      <w:bookmarkEnd w:id="10"/>
+    </w:p>
+    <w:p>
+      <w:pPr>
         <w:rPr>
           <w:i/>
           <w:iCs/>
           <w:lang w:val="en-US"/>
         </w:rPr>
-        <w:t>The second section, Current system, describes the current state of affairs. If the new system will replace an existing system, this section describes the functionality and the problems of the current system. Otherwise, this section describes how the tasks supported by the new system are accomplished now.</w:t>
-      </w:r>
-    </w:p>
-    <w:p>
-      <w:pPr>
-        <w:rPr>
-          <w:lang w:val="en-US"/>
-        </w:rPr>
-      </w:pPr>
-      <w:r>
-        <w:rPr>
-          <w:lang w:val="en-US"/>
-        </w:rPr>
-        <w:t xml:space="preserve"> </w:t>
-      </w:r>
-    </w:p>
-    <w:p>
-      <w:pPr>
-        <w:pStyle w:val="Balk1"/>
-        <w:rPr>
-          <w:lang w:val="en-US"/>
-        </w:rPr>
-      </w:pPr>
-      <w:bookmarkStart w:id="9" w:name="_Toc243343161"/>
-      <w:r>
-        <w:rPr>
-          <w:lang w:val="en-US"/>
-        </w:rPr>
-        <w:t>Proposed syste</w:t>
-      </w:r>
-      <w:r>
-        <w:rPr>
-          <w:lang w:val="en-US"/>
-        </w:rPr>
-        <w:t>m</w:t>
-      </w:r>
-      <w:bookmarkEnd w:id="9"/>
-    </w:p>
-    <w:p>
-      <w:pPr>
+      </w:pPr>
+      <w:r>
         <w:rPr>
           <w:i/>
           <w:iCs/>
           <w:lang w:val="en-US"/>
         </w:rPr>
-      </w:pPr>
-      <w:r>
+        <w:t>The overview presents a functional overview of the system.</w:t>
+      </w:r>
+    </w:p>
+    <w:p>
+      <w:pPr>
+        <w:rPr>
+          <w:lang w:val="en-US"/>
+        </w:rPr>
+      </w:pPr>
+    </w:p>
+    <w:p>
+      <w:pPr>
+        <w:pStyle w:val="Balk2"/>
+        <w:rPr>
+          <w:lang w:val="en-US"/>
+        </w:rPr>
+      </w:pPr>
+      <w:bookmarkStart w:id="11" w:name="_Toc243343163"/>
+      <w:r>
+        <w:rPr>
+          <w:lang w:val="en-US"/>
+        </w:rPr>
+        <w:t>Functional requirements</w:t>
+      </w:r>
+      <w:bookmarkEnd w:id="11"/>
+    </w:p>
+    <w:p>
+      <w:pPr>
         <w:rPr>
           <w:i/>
           <w:iCs/>
           <w:lang w:val="en-US"/>
         </w:rPr>
-        <w:t>The third section documents the requirements elicitation and the analysis model of the new system.</w:t>
-      </w:r>
-    </w:p>
-    <w:p>
-      <w:pPr>
-        <w:rPr>
-          <w:lang w:val="en-US"/>
-        </w:rPr>
-      </w:pPr>
-    </w:p>
-    <w:p>
-      <w:pPr>
-        <w:pStyle w:val="Balk2"/>
-        <w:rPr>
-          <w:lang w:val="en-US"/>
-        </w:rPr>
-      </w:pPr>
-      <w:bookmarkStart w:id="10" w:name="_Toc243343162"/>
-      <w:r>
-        <w:rPr>
-          <w:lang w:val="en-US"/>
-        </w:rPr>
-        <w:t>Overview</w:t>
-      </w:r>
-      <w:bookmarkEnd w:id="10"/>
-    </w:p>
-    <w:p>
-      <w:pPr>
+      </w:pPr>
+      <w:r>
         <w:rPr>
           <w:i/>
           <w:iCs/>
           <w:lang w:val="en-US"/>
         </w:rPr>
-      </w:pPr>
+        <w:t xml:space="preserve">Functional requirements </w:t>
+      </w:r>
+      <w:proofErr w:type="gramStart"/>
       <w:r>
         <w:rPr>
           <w:i/>
           <w:iCs/>
           <w:lang w:val="en-US"/>
         </w:rPr>
-        <w:t>The overview presents a functional overview of the system.</w:t>
-      </w:r>
-    </w:p>
-    <w:p>
-      <w:pPr>
-        <w:rPr>
-          <w:lang w:val="en-US"/>
-        </w:rPr>
-      </w:pPr>
-    </w:p>
-    <w:p>
-      <w:pPr>
-        <w:pStyle w:val="Balk2"/>
-        <w:rPr>
-          <w:lang w:val="en-US"/>
-        </w:rPr>
-      </w:pPr>
-      <w:bookmarkStart w:id="11" w:name="_Toc243343163"/>
-      <w:r>
-        <w:rPr>
-          <w:lang w:val="en-US"/>
-        </w:rPr>
-        <w:t>Functional requirements</w:t>
-      </w:r>
-      <w:bookmarkEnd w:id="11"/>
-    </w:p>
-    <w:p>
-      <w:pPr>
+        <w:t>describes</w:t>
+      </w:r>
+      <w:proofErr w:type="gramEnd"/>
+      <w:r>
         <w:rPr>
           <w:i/>
           <w:iCs/>
           <w:lang w:val="en-US"/>
         </w:rPr>
-      </w:pPr>
-      <w:r>
+        <w:t xml:space="preserve"> the high-level functionality of the system.</w:t>
+      </w:r>
+    </w:p>
+    <w:p>
+      <w:pPr>
+        <w:rPr>
+          <w:lang w:val="en-US"/>
+        </w:rPr>
+      </w:pPr>
+      <w:r>
+        <w:rPr>
+          <w:lang w:val="en-US"/>
+        </w:rPr>
+        <w:t xml:space="preserve"> </w:t>
+      </w:r>
+    </w:p>
+    <w:p>
+      <w:pPr>
+        <w:pStyle w:val="Balk2"/>
+        <w:rPr>
+          <w:lang w:val="en-US"/>
+        </w:rPr>
+      </w:pPr>
+      <w:bookmarkStart w:id="12" w:name="_Toc243343164"/>
+      <w:r>
+        <w:rPr>
+          <w:lang w:val="en-US"/>
+        </w:rPr>
+        <w:t>Nonfunctional requirements</w:t>
+      </w:r>
+      <w:bookmarkEnd w:id="12"/>
+    </w:p>
+    <w:p>
+      <w:pPr>
         <w:rPr>
           <w:i/>
           <w:iCs/>
           <w:lang w:val="en-US"/>
         </w:rPr>
-        <w:t>Functional requirements describes the high-level functionality of the system.</w:t>
-      </w:r>
-    </w:p>
-    <w:p>
-      <w:pPr>
-        <w:rPr>
-          <w:lang w:val="en-US"/>
-        </w:rPr>
-      </w:pPr>
-      <w:r>
-        <w:rPr>
-          <w:lang w:val="en-US"/>
-        </w:rPr>
-        <w:t xml:space="preserve"> </w:t>
-      </w:r>
-    </w:p>
-    <w:p>
-      <w:pPr>
-        <w:pStyle w:val="Balk2"/>
-        <w:rPr>
-          <w:lang w:val="en-US"/>
-        </w:rPr>
-      </w:pPr>
-      <w:bookmarkStart w:id="12" w:name="_Toc243343164"/>
-      <w:r>
-        <w:rPr>
-          <w:lang w:val="en-US"/>
-        </w:rPr>
-        <w:lastRenderedPageBreak/>
-        <w:t>Nonfunctional requirements</w:t>
-      </w:r>
-      <w:bookmarkEnd w:id="12"/>
-    </w:p>
-    <w:p>
-      <w:pPr>
+      </w:pPr>
+      <w:r>
         <w:rPr>
           <w:i/>
           <w:iCs/>
           <w:lang w:val="en-US"/>
         </w:rPr>
-      </w:pPr>
+        <w:t xml:space="preserve">Nonfunctional requirements </w:t>
+      </w:r>
+      <w:proofErr w:type="gramStart"/>
       <w:r>
         <w:rPr>
           <w:i/>
           <w:iCs/>
           <w:lang w:val="en-US"/>
         </w:rPr>
-        <w:t>Nonfunctional requirements describes user-level requirements that are not directly related to functionality. This includes usability, reliability, performance, supportability, implementation, interface, operational, packaging, and legal requirements.</w:t>
-      </w:r>
-    </w:p>
-    <w:p>
-      <w:pPr>
-        <w:rPr>
-          <w:lang w:val="en-US"/>
-        </w:rPr>
-      </w:pPr>
-    </w:p>
-    <w:p>
-      <w:pPr>
-        <w:pStyle w:val="Balk3"/>
-        <w:rPr>
-          <w:lang w:val="en-US"/>
-        </w:rPr>
-      </w:pPr>
-      <w:bookmarkStart w:id="13" w:name="_Toc243343165"/>
-      <w:r>
-        <w:rPr>
-          <w:lang w:val="en-US"/>
-        </w:rPr>
-        <w:t>Usability</w:t>
-      </w:r>
-      <w:bookmarkEnd w:id="13"/>
-    </w:p>
-    <w:p>
-      <w:pPr>
-        <w:rPr>
-          <w:lang w:val="en-US"/>
-        </w:rPr>
-      </w:pPr>
-    </w:p>
-    <w:p>
-      <w:pPr>
-        <w:pStyle w:val="Balk3"/>
-        <w:rPr>
-          <w:lang w:val="en-US"/>
-        </w:rPr>
-      </w:pPr>
-      <w:bookmarkStart w:id="14" w:name="_Toc243343166"/>
-      <w:r>
-        <w:rPr>
-          <w:lang w:val="en-US"/>
-        </w:rPr>
-        <w:t>Reliability</w:t>
-      </w:r>
-      <w:bookmarkEnd w:id="14"/>
-    </w:p>
-    <w:p>
-      <w:pPr>
-        <w:rPr>
-          <w:lang w:val="en-US"/>
-        </w:rPr>
-      </w:pPr>
-    </w:p>
-    <w:p>
-      <w:pPr>
-        <w:pStyle w:val="Balk3"/>
-        <w:rPr>
-          <w:lang w:val="en-US"/>
-        </w:rPr>
-      </w:pPr>
-      <w:bookmarkStart w:id="15" w:name="_Toc243343167"/>
-      <w:r>
-        <w:rPr>
-          <w:lang w:val="en-US"/>
-        </w:rPr>
-        <w:t>Performance</w:t>
-      </w:r>
-      <w:bookmarkEnd w:id="15"/>
-    </w:p>
-    <w:p>
-      <w:pPr>
-        <w:rPr>
-          <w:lang w:val="en-US"/>
-        </w:rPr>
-      </w:pPr>
-    </w:p>
-    <w:p>
-      <w:pPr>
-        <w:pStyle w:val="Balk3"/>
-        <w:rPr>
-          <w:lang w:val="en-US"/>
-        </w:rPr>
-      </w:pPr>
-      <w:bookmarkStart w:id="16" w:name="_Toc243343168"/>
-      <w:r>
-        <w:rPr>
-          <w:lang w:val="en-US"/>
-        </w:rPr>
-        <w:t>Supportability</w:t>
-      </w:r>
-      <w:bookmarkEnd w:id="16"/>
-    </w:p>
-    <w:p>
-      <w:pPr>
-        <w:rPr>
-          <w:lang w:val="en-US"/>
-        </w:rPr>
-      </w:pPr>
-    </w:p>
-    <w:p>
-      <w:pPr>
-        <w:pStyle w:val="Balk3"/>
-        <w:rPr>
-          <w:lang w:val="en-US"/>
-        </w:rPr>
-      </w:pPr>
-      <w:bookmarkStart w:id="17" w:name="_Toc243343169"/>
-      <w:r>
-        <w:rPr>
-          <w:lang w:val="en-US"/>
-        </w:rPr>
-        <w:t>Implementation</w:t>
-      </w:r>
-      <w:bookmarkEnd w:id="17"/>
-    </w:p>
-    <w:p>
-      <w:pPr>
-        <w:rPr>
-          <w:lang w:val="en-US"/>
-        </w:rPr>
-      </w:pPr>
-    </w:p>
-    <w:p>
-      <w:pPr>
-        <w:pStyle w:val="Balk3"/>
-        <w:rPr>
-          <w:lang w:val="en-US"/>
-        </w:rPr>
-      </w:pPr>
-      <w:bookmarkStart w:id="18" w:name="_Toc243343170"/>
-      <w:r>
-        <w:rPr>
-          <w:lang w:val="en-US"/>
-        </w:rPr>
-        <w:t>Interface</w:t>
-      </w:r>
-      <w:bookmarkEnd w:id="18"/>
-    </w:p>
-    <w:p>
-      <w:pPr>
-        <w:rPr>
-          <w:lang w:val="en-US"/>
-        </w:rPr>
-      </w:pPr>
-    </w:p>
-    <w:p>
-      <w:pPr>
-        <w:pStyle w:val="Balk3"/>
-        <w:rPr>
-          <w:lang w:val="en-US"/>
-        </w:rPr>
-      </w:pPr>
-      <w:bookmarkStart w:id="19" w:name="_Toc243343171"/>
-      <w:r>
-        <w:rPr>
-          <w:lang w:val="en-US"/>
-        </w:rPr>
-        <w:t>Packaging</w:t>
-      </w:r>
-      <w:bookmarkEnd w:id="19"/>
-    </w:p>
-    <w:p>
-      <w:pPr>
-        <w:rPr>
-          <w:lang w:val="en-US"/>
-        </w:rPr>
-      </w:pPr>
-    </w:p>
-    <w:p>
-      <w:pPr>
-        <w:pStyle w:val="Balk3"/>
-        <w:rPr>
-          <w:lang w:val="en-US"/>
-        </w:rPr>
-      </w:pPr>
-      <w:bookmarkStart w:id="20" w:name="_Toc243343172"/>
-      <w:r>
-        <w:rPr>
-          <w:lang w:val="en-US"/>
-        </w:rPr>
-        <w:t>Legal</w:t>
-      </w:r>
-      <w:bookmarkEnd w:id="20"/>
-    </w:p>
-    <w:p>
-      <w:pPr>
-        <w:rPr>
-          <w:lang w:val="en-US"/>
-        </w:rPr>
-      </w:pPr>
-    </w:p>
-    <w:p>
-      <w:pPr>
-        <w:pStyle w:val="Balk2"/>
-        <w:rPr>
-          <w:lang w:val="en-US"/>
-        </w:rPr>
-      </w:pPr>
-      <w:bookmarkStart w:id="21" w:name="_Toc243343173"/>
-      <w:r>
-        <w:rPr>
-          <w:lang w:val="en-US"/>
-        </w:rPr>
-        <w:t>System models</w:t>
-      </w:r>
-      <w:bookmarkEnd w:id="21"/>
-    </w:p>
-    <w:p>
-      <w:pPr>
+        <w:t>describes</w:t>
+      </w:r>
+      <w:proofErr w:type="gramEnd"/>
+      <w:r>
         <w:rPr>
           <w:i/>
           <w:iCs/>
           <w:lang w:val="en-US"/>
         </w:rPr>
-      </w:pPr>
-      <w:r>
+        <w:t xml:space="preserve"> user-level requirements that are not directly related to functionality. This includes usability, reliability, performance, supportability, implementation, interface, operational, packaging, and legal requirements.</w:t>
+      </w:r>
+    </w:p>
+    <w:p>
+      <w:pPr>
+        <w:rPr>
+          <w:lang w:val="en-US"/>
+        </w:rPr>
+      </w:pPr>
+    </w:p>
+    <w:p>
+      <w:pPr>
+        <w:pStyle w:val="Balk3"/>
+        <w:rPr>
+          <w:lang w:val="en-US"/>
+        </w:rPr>
+      </w:pPr>
+      <w:bookmarkStart w:id="13" w:name="_Toc243343165"/>
+      <w:r>
+        <w:rPr>
+          <w:lang w:val="en-US"/>
+        </w:rPr>
+        <w:t>Usability</w:t>
+      </w:r>
+      <w:bookmarkEnd w:id="13"/>
+    </w:p>
+    <w:p>
+      <w:pPr>
+        <w:rPr>
+          <w:lang w:val="en-US"/>
+        </w:rPr>
+      </w:pPr>
+    </w:p>
+    <w:p>
+      <w:pPr>
+        <w:pStyle w:val="Balk3"/>
+        <w:rPr>
+          <w:lang w:val="en-US"/>
+        </w:rPr>
+      </w:pPr>
+      <w:bookmarkStart w:id="14" w:name="_Toc243343166"/>
+      <w:r>
+        <w:rPr>
+          <w:lang w:val="en-US"/>
+        </w:rPr>
+        <w:t>Reliability</w:t>
+      </w:r>
+      <w:bookmarkEnd w:id="14"/>
+    </w:p>
+    <w:p>
+      <w:pPr>
+        <w:rPr>
+          <w:lang w:val="en-US"/>
+        </w:rPr>
+      </w:pPr>
+    </w:p>
+    <w:p>
+      <w:pPr>
+        <w:pStyle w:val="Balk3"/>
+        <w:rPr>
+          <w:lang w:val="en-US"/>
+        </w:rPr>
+      </w:pPr>
+      <w:bookmarkStart w:id="15" w:name="_Toc243343167"/>
+      <w:r>
+        <w:rPr>
+          <w:lang w:val="en-US"/>
+        </w:rPr>
+        <w:t>Performance</w:t>
+      </w:r>
+      <w:bookmarkEnd w:id="15"/>
+    </w:p>
+    <w:p>
+      <w:pPr>
+        <w:rPr>
+          <w:lang w:val="en-US"/>
+        </w:rPr>
+      </w:pPr>
+    </w:p>
+    <w:p>
+      <w:pPr>
+        <w:pStyle w:val="Balk3"/>
+        <w:rPr>
+          <w:lang w:val="en-US"/>
+        </w:rPr>
+      </w:pPr>
+      <w:bookmarkStart w:id="16" w:name="_Toc243343168"/>
+      <w:r>
+        <w:rPr>
+          <w:lang w:val="en-US"/>
+        </w:rPr>
+        <w:t>Supportability</w:t>
+      </w:r>
+      <w:bookmarkEnd w:id="16"/>
+    </w:p>
+    <w:p>
+      <w:pPr>
+        <w:rPr>
+          <w:lang w:val="en-US"/>
+        </w:rPr>
+      </w:pPr>
+    </w:p>
+    <w:p>
+      <w:pPr>
+        <w:pStyle w:val="Balk3"/>
+        <w:rPr>
+          <w:lang w:val="en-US"/>
+        </w:rPr>
+      </w:pPr>
+      <w:bookmarkStart w:id="17" w:name="_Toc243343169"/>
+      <w:r>
+        <w:rPr>
+          <w:lang w:val="en-US"/>
+        </w:rPr>
+        <w:t>Implementation</w:t>
+      </w:r>
+      <w:bookmarkEnd w:id="17"/>
+    </w:p>
+    <w:p>
+      <w:pPr>
+        <w:rPr>
+          <w:lang w:val="en-US"/>
+        </w:rPr>
+      </w:pPr>
+    </w:p>
+    <w:p>
+      <w:pPr>
+        <w:pStyle w:val="Balk3"/>
+        <w:rPr>
+          <w:lang w:val="en-US"/>
+        </w:rPr>
+      </w:pPr>
+      <w:bookmarkStart w:id="18" w:name="_Toc243343170"/>
+      <w:r>
+        <w:rPr>
+          <w:lang w:val="en-US"/>
+        </w:rPr>
+        <w:lastRenderedPageBreak/>
+        <w:t>Interface</w:t>
+      </w:r>
+      <w:bookmarkEnd w:id="18"/>
+    </w:p>
+    <w:p>
+      <w:pPr>
+        <w:rPr>
+          <w:lang w:val="en-US"/>
+        </w:rPr>
+      </w:pPr>
+    </w:p>
+    <w:p>
+      <w:pPr>
+        <w:pStyle w:val="Balk3"/>
+        <w:rPr>
+          <w:lang w:val="en-US"/>
+        </w:rPr>
+      </w:pPr>
+      <w:bookmarkStart w:id="19" w:name="_Toc243343171"/>
+      <w:r>
+        <w:rPr>
+          <w:lang w:val="en-US"/>
+        </w:rPr>
+        <w:t>Packaging</w:t>
+      </w:r>
+      <w:bookmarkEnd w:id="19"/>
+    </w:p>
+    <w:p>
+      <w:pPr>
+        <w:rPr>
+          <w:lang w:val="en-US"/>
+        </w:rPr>
+      </w:pPr>
+    </w:p>
+    <w:p>
+      <w:pPr>
+        <w:pStyle w:val="Balk3"/>
+        <w:rPr>
+          <w:lang w:val="en-US"/>
+        </w:rPr>
+      </w:pPr>
+      <w:bookmarkStart w:id="20" w:name="_Toc243343172"/>
+      <w:r>
+        <w:rPr>
+          <w:lang w:val="en-US"/>
+        </w:rPr>
+        <w:t>Legal</w:t>
+      </w:r>
+      <w:bookmarkEnd w:id="20"/>
+    </w:p>
+    <w:p>
+      <w:pPr>
+        <w:rPr>
+          <w:lang w:val="en-US"/>
+        </w:rPr>
+      </w:pPr>
+    </w:p>
+    <w:p>
+      <w:pPr>
+        <w:pStyle w:val="Balk2"/>
+        <w:rPr>
+          <w:lang w:val="en-US"/>
+        </w:rPr>
+      </w:pPr>
+      <w:bookmarkStart w:id="21" w:name="_Toc243343173"/>
+      <w:r>
+        <w:rPr>
+          <w:lang w:val="en-US"/>
+        </w:rPr>
+        <w:t>System models</w:t>
+      </w:r>
+      <w:bookmarkEnd w:id="21"/>
+    </w:p>
+    <w:p>
+      <w:pPr>
         <w:rPr>
           <w:i/>
           <w:iCs/>
           <w:lang w:val="en-US"/>
         </w:rPr>
-        <w:t>System models describes the scenarios, use cases, object model, and dynamic models for the system. This section contains the complete functional specification, including mock-ups illustrating the user interface of the system and navigational paths representing the sequence of screens. The subsections Object model and Dynamic model are written during the Analysis activity.</w:t>
-      </w:r>
-    </w:p>
-    <w:p>
-      <w:pPr>
+      </w:pPr>
+      <w:r>
         <w:rPr>
           <w:i/>
           <w:iCs/>
           <w:lang w:val="en-US"/>
         </w:rPr>
-      </w:pPr>
-    </w:p>
-    <w:p>
-      <w:pPr>
-        <w:pStyle w:val="Balk3"/>
-        <w:rPr>
-          <w:lang w:val="en-US"/>
-        </w:rPr>
-      </w:pPr>
-      <w:bookmarkStart w:id="22" w:name="_Toc243343174"/>
-      <w:r>
-        <w:rPr>
-          <w:lang w:val="en-US"/>
-        </w:rPr>
-        <w:t>Scenarios</w:t>
-      </w:r>
-      <w:bookmarkEnd w:id="22"/>
-    </w:p>
-    <w:p>
-      <w:pPr>
-        <w:rPr>
-          <w:lang w:val="en-US"/>
-        </w:rPr>
-      </w:pPr>
-    </w:p>
-    <w:p>
-      <w:pPr>
-        <w:pStyle w:val="Balk3"/>
-        <w:rPr>
-          <w:lang w:val="en-US"/>
-        </w:rPr>
-      </w:pPr>
-      <w:bookmarkStart w:id="23" w:name="_Toc243343175"/>
-      <w:r>
-        <w:rPr>
-          <w:lang w:val="en-US"/>
-        </w:rPr>
-        <w:t>Use case model</w:t>
-      </w:r>
-      <w:bookmarkEnd w:id="23"/>
-    </w:p>
-    <w:p>
-      <w:pPr>
-        <w:rPr>
-          <w:lang w:val="en-US"/>
-        </w:rPr>
-      </w:pPr>
-    </w:p>
-    <w:p>
-      <w:pPr>
-        <w:pStyle w:val="Balk3"/>
-        <w:rPr>
-          <w:lang w:val="en-US"/>
-        </w:rPr>
-      </w:pPr>
-      <w:bookmarkStart w:id="24" w:name="_Toc243343176"/>
-      <w:r>
-        <w:rPr>
-          <w:lang w:val="en-US"/>
-        </w:rPr>
-        <w:t>Object model</w:t>
-      </w:r>
-      <w:bookmarkEnd w:id="24"/>
-    </w:p>
-    <w:p>
-      <w:pPr>
-        <w:rPr>
-          <w:lang w:val="en-US"/>
-        </w:rPr>
-      </w:pPr>
-    </w:p>
-    <w:p>
-      <w:pPr>
-        <w:pStyle w:val="Balk3"/>
-        <w:rPr>
-          <w:lang w:val="en-US"/>
-        </w:rPr>
-      </w:pPr>
-      <w:bookmarkStart w:id="25" w:name="_Toc243343177"/>
-      <w:r>
-        <w:rPr>
-          <w:lang w:val="en-US"/>
-        </w:rPr>
-        <w:t>Dynamic model</w:t>
-      </w:r>
-      <w:bookmarkEnd w:id="25"/>
-    </w:p>
-    <w:p>
-      <w:pPr>
-        <w:rPr>
-          <w:lang w:val="en-US"/>
-        </w:rPr>
-      </w:pPr>
-    </w:p>
-    <w:p>
-      <w:pPr>
-        <w:pStyle w:val="Balk3"/>
-        <w:rPr>
-          <w:lang w:val="en-US"/>
-        </w:rPr>
-      </w:pPr>
-      <w:bookmarkStart w:id="26" w:name="_Toc243343178"/>
-      <w:r>
-        <w:rPr>
-          <w:lang w:val="en-US"/>
-        </w:rPr>
-        <w:lastRenderedPageBreak/>
-        <w:t>User interface</w:t>
-      </w:r>
-      <w:r>
-        <w:rPr>
-          <w:lang w:val="en-US"/>
-        </w:rPr>
-        <w:t>s and Mock-ups</w:t>
-      </w:r>
-      <w:bookmarkEnd w:id="26"/>
-    </w:p>
-    <w:p>
-      <w:pPr>
-        <w:rPr>
-          <w:lang w:val="en-US"/>
-        </w:rPr>
-      </w:pPr>
-    </w:p>
-    <w:p>
-      <w:pPr>
-        <w:pStyle w:val="Balk1"/>
-        <w:rPr>
-          <w:lang w:val="en-US"/>
-        </w:rPr>
-      </w:pPr>
-      <w:bookmarkStart w:id="27" w:name="_Toc243343179"/>
-      <w:r>
-        <w:rPr>
-          <w:lang w:val="en-US"/>
-        </w:rPr>
-        <w:t>Glossary</w:t>
-      </w:r>
-      <w:r>
-        <w:rPr>
-          <w:lang w:val="en-US"/>
-        </w:rPr>
-        <w:t xml:space="preserve"> of Terms</w:t>
-      </w:r>
-      <w:bookmarkEnd w:id="27"/>
-    </w:p>
-    <w:p>
-      <w:pPr>
+        <w:t xml:space="preserve">System models </w:t>
+      </w:r>
+      <w:proofErr w:type="gramStart"/>
+      <w:r>
         <w:rPr>
           <w:i/>
           <w:iCs/>
           <w:lang w:val="en-US"/>
         </w:rPr>
-      </w:pPr>
+        <w:t>describes</w:t>
+      </w:r>
+      <w:proofErr w:type="gramEnd"/>
       <w:r>
         <w:rPr>
           <w:i/>
           <w:iCs/>
           <w:lang w:val="en-US"/>
         </w:rPr>
-        <w:t>A</w:t>
-      </w:r>
+        <w:t xml:space="preserve"> the scenarios, use cases, object </w:t>
+      </w:r>
+      <w:proofErr w:type="gramStart"/>
       <w:r>
         <w:rPr>
           <w:i/>
           <w:iCs/>
           <w:lang w:val="en-US"/>
         </w:rPr>
-        <w:t xml:space="preserve"> glossary of important terms, to ensure consistency in the specification and to ensure that we use the client’s terms.</w:t>
-      </w:r>
-    </w:p>
-    <w:p>
-      <w:pPr>
+        <w:t>model</w:t>
+      </w:r>
+      <w:proofErr w:type="gramEnd"/>
+      <w:r>
         <w:rPr>
           <w:i/>
           <w:iCs/>
           <w:lang w:val="en-US"/>
         </w:rPr>
-      </w:pPr>
-    </w:p>
-    <w:p>
-      <w:pPr>
-        <w:pStyle w:val="Balk1"/>
-        <w:rPr>
-          <w:lang w:val="en-US"/>
-        </w:rPr>
-      </w:pPr>
-      <w:bookmarkStart w:id="28" w:name="_Toc243343180"/>
-      <w:r>
-        <w:rPr>
-          <w:lang w:val="en-US"/>
-        </w:rPr>
-        <w:t>Priority</w:t>
-      </w:r>
-      <w:bookmarkEnd w:id="28"/>
-    </w:p>
-    <w:p>
-      <w:pPr>
+        <w:t xml:space="preserve">, and dynamic models for the system. This section contains </w:t>
+      </w:r>
+      <w:proofErr w:type="gramStart"/>
+      <w:r>
         <w:rPr>
           <w:i/>
           <w:iCs/>
           <w:lang w:val="en-US"/>
         </w:rPr>
-      </w:pPr>
+        <w:t>the complete functional specification</w:t>
+      </w:r>
+      <w:proofErr w:type="gramEnd"/>
       <w:r>
         <w:rPr>
           <w:i/>
           <w:iCs/>
           <w:lang w:val="en-US"/>
         </w:rPr>
-        <w:t>Priority of the requirements</w:t>
-      </w:r>
-      <w:r>
+        <w:t>, including mock-ups illustrating the user interface of the system and navigational paths representing the sequence of screens. The subsections Object model and Dynamic model are written during the Analysis activity.</w:t>
+      </w:r>
+    </w:p>
+    <w:p>
+      <w:pPr>
         <w:rPr>
           <w:i/>
           <w:iCs/>
           <w:lang w:val="en-US"/>
         </w:rPr>
-        <w:t>.</w:t>
-      </w:r>
+      </w:pPr>
+    </w:p>
+    <w:p>
+      <w:pPr>
+        <w:pStyle w:val="Balk3"/>
+        <w:rPr>
+          <w:lang w:val="en-US"/>
+        </w:rPr>
+      </w:pPr>
+      <w:bookmarkStart w:id="22" w:name="_Toc243343174"/>
+      <w:r>
+        <w:rPr>
+          <w:lang w:val="en-US"/>
+        </w:rPr>
+        <w:t>Scenarios</w:t>
+      </w:r>
+      <w:bookmarkEnd w:id="22"/>
+    </w:p>
+    <w:p>
+      <w:pPr>
+        <w:rPr>
+          <w:lang w:val="en-US"/>
+        </w:rPr>
+      </w:pPr>
+    </w:p>
+    <w:p>
+      <w:pPr>
+        <w:pStyle w:val="Balk3"/>
+        <w:rPr>
+          <w:lang w:val="en-US"/>
+        </w:rPr>
+      </w:pPr>
+      <w:bookmarkStart w:id="23" w:name="_Toc243343175"/>
+      <w:r>
+        <w:rPr>
+          <w:lang w:val="en-US"/>
+        </w:rPr>
+        <w:t>Use case model</w:t>
+      </w:r>
+      <w:bookmarkEnd w:id="23"/>
+    </w:p>
+    <w:p>
+      <w:pPr>
+        <w:rPr>
+          <w:lang w:val="en-US"/>
+        </w:rPr>
+      </w:pPr>
+    </w:p>
+    <w:p>
+      <w:pPr>
+        <w:pStyle w:val="Balk3"/>
+        <w:rPr>
+          <w:lang w:val="en-US"/>
+        </w:rPr>
+      </w:pPr>
+      <w:bookmarkStart w:id="24" w:name="_Toc243343176"/>
+      <w:r>
+        <w:rPr>
+          <w:lang w:val="en-US"/>
+        </w:rPr>
+        <w:t>Object model</w:t>
+      </w:r>
+      <w:bookmarkEnd w:id="24"/>
+    </w:p>
+    <w:p>
+      <w:pPr>
+        <w:rPr>
+          <w:lang w:val="en-US"/>
+        </w:rPr>
+      </w:pPr>
+    </w:p>
+    <w:p>
+      <w:pPr>
+        <w:pStyle w:val="Balk3"/>
+        <w:rPr>
+          <w:lang w:val="en-US"/>
+        </w:rPr>
+      </w:pPr>
+      <w:bookmarkStart w:id="25" w:name="_Toc243343177"/>
+      <w:r>
+        <w:rPr>
+          <w:lang w:val="en-US"/>
+        </w:rPr>
+        <w:t>Dynamic model</w:t>
+      </w:r>
+      <w:bookmarkEnd w:id="25"/>
+    </w:p>
+    <w:p>
+      <w:pPr>
+        <w:rPr>
+          <w:lang w:val="en-US"/>
+        </w:rPr>
+      </w:pPr>
+    </w:p>
+    <w:p>
+      <w:pPr>
+        <w:pStyle w:val="Balk3"/>
+        <w:rPr>
+          <w:lang w:val="en-US"/>
+        </w:rPr>
+      </w:pPr>
+      <w:bookmarkStart w:id="26" w:name="_Toc243343178"/>
+      <w:r>
+        <w:rPr>
+          <w:lang w:val="en-US"/>
+        </w:rPr>
+        <w:t>User interface</w:t>
+      </w:r>
+      <w:r>
+        <w:rPr>
+          <w:lang w:val="en-US"/>
+        </w:rPr>
+        <w:t>s and Mock-ups</w:t>
+      </w:r>
+      <w:bookmarkEnd w:id="26"/>
+    </w:p>
+    <w:p>
+      <w:pPr>
+        <w:rPr>
+          <w:lang w:val="en-US"/>
+        </w:rPr>
+      </w:pPr>
+    </w:p>
+    <w:p>
+      <w:pPr>
+        <w:pStyle w:val="Balk1"/>
+        <w:rPr>
+          <w:lang w:val="en-US"/>
+        </w:rPr>
+      </w:pPr>
+      <w:bookmarkStart w:id="27" w:name="_Toc243343179"/>
+      <w:r>
+        <w:rPr>
+          <w:lang w:val="en-US"/>
+        </w:rPr>
+        <w:t>Glossary</w:t>
+      </w:r>
+      <w:r>
+        <w:rPr>
+          <w:lang w:val="en-US"/>
+        </w:rPr>
+        <w:t xml:space="preserve"> of Terms</w:t>
+      </w:r>
+      <w:bookmarkEnd w:id="27"/>
     </w:p>
     <w:p>
       <w:pPr>
@@ -3669,68 +4628,143 @@
           <w:lang w:val="en-US"/>
         </w:rPr>
       </w:pPr>
-    </w:p>
-    <w:p>
-      <w:pPr>
-        <w:pStyle w:val="Balk1"/>
-        <w:rPr>
-          <w:lang w:val="en-US"/>
-        </w:rPr>
-      </w:pPr>
-      <w:bookmarkStart w:id="29" w:name="_Toc243343181"/>
-      <w:r>
-        <w:rPr>
-          <w:lang w:val="en-US"/>
-        </w:rPr>
-        <w:t>Traceability</w:t>
-      </w:r>
-      <w:bookmarkEnd w:id="29"/>
-    </w:p>
-    <w:p>
-      <w:pPr>
+      <w:r>
         <w:rPr>
           <w:i/>
           <w:iCs/>
           <w:lang w:val="en-US"/>
         </w:rPr>
-      </w:pPr>
+        <w:t>A</w:t>
+      </w:r>
       <w:r>
         <w:rPr>
           <w:i/>
           <w:iCs/>
           <w:lang w:val="en-US"/>
         </w:rPr>
-        <w:t xml:space="preserve">Traceability to project problem </w:t>
-      </w:r>
-      <w:r>
+        <w:t xml:space="preserve"> glossary of important terms, to ensure consistency in the specification and to ensure that we use the client’s terms.</w:t>
+      </w:r>
+    </w:p>
+    <w:p>
+      <w:pPr>
         <w:rPr>
           <w:i/>
           <w:iCs/>
           <w:lang w:val="en-US"/>
         </w:rPr>
-        <w:t>statement</w:t>
-      </w:r>
-      <w:r>
+      </w:pPr>
+    </w:p>
+    <w:p>
+      <w:pPr>
+        <w:pStyle w:val="Balk1"/>
+        <w:rPr>
+          <w:lang w:val="en-US"/>
+        </w:rPr>
+      </w:pPr>
+      <w:bookmarkStart w:id="28" w:name="_Toc243343180"/>
+      <w:r>
+        <w:rPr>
+          <w:lang w:val="en-US"/>
+        </w:rPr>
+        <w:t>Priority</w:t>
+      </w:r>
+      <w:bookmarkEnd w:id="28"/>
+    </w:p>
+    <w:p>
+      <w:pPr>
         <w:rPr>
           <w:i/>
           <w:iCs/>
           <w:lang w:val="en-US"/>
         </w:rPr>
-        <w:t>.</w:t>
-      </w:r>
-    </w:p>
-    <w:p>
-      <w:pPr>
+      </w:pPr>
+      <w:r>
         <w:rPr>
           <w:i/>
           <w:iCs/>
           <w:lang w:val="en-US"/>
         </w:rPr>
+        <w:t>Priority of the requirements</w:t>
+      </w:r>
+      <w:r>
+        <w:rPr>
+          <w:i/>
+          <w:iCs/>
+          <w:lang w:val="en-US"/>
+        </w:rPr>
+        <w:t>.</w:t>
+      </w:r>
+    </w:p>
+    <w:p>
+      <w:pPr>
+        <w:rPr>
+          <w:i/>
+          <w:iCs/>
+          <w:lang w:val="en-US"/>
+        </w:rPr>
+      </w:pPr>
+    </w:p>
+    <w:p>
+      <w:pPr>
+        <w:pStyle w:val="Balk1"/>
+        <w:rPr>
+          <w:lang w:val="en-US"/>
+        </w:rPr>
+      </w:pPr>
+      <w:bookmarkStart w:id="29" w:name="_Toc243343181"/>
+      <w:r>
+        <w:rPr>
+          <w:lang w:val="en-US"/>
+        </w:rPr>
+        <w:t>Traceability</w:t>
+      </w:r>
+      <w:bookmarkEnd w:id="29"/>
+    </w:p>
+    <w:p>
+      <w:pPr>
+        <w:rPr>
+          <w:i/>
+          <w:iCs/>
+          <w:lang w:val="en-US"/>
+        </w:rPr>
+      </w:pPr>
+      <w:r>
+        <w:rPr>
+          <w:i/>
+          <w:iCs/>
+          <w:lang w:val="en-US"/>
+        </w:rPr>
+        <w:t xml:space="preserve">Traceability to project problem </w:t>
+      </w:r>
+      <w:r>
+        <w:rPr>
+          <w:i/>
+          <w:iCs/>
+          <w:lang w:val="en-US"/>
+        </w:rPr>
+        <w:t>statement</w:t>
+      </w:r>
+      <w:r>
+        <w:rPr>
+          <w:i/>
+          <w:iCs/>
+          <w:lang w:val="en-US"/>
+        </w:rPr>
+        <w:t>.</w:t>
+      </w:r>
+    </w:p>
+    <w:p>
+      <w:pPr>
+        <w:rPr>
+          <w:i/>
+          <w:iCs/>
+          <w:lang w:val="en-US"/>
+        </w:rPr>
       </w:pPr>
     </w:p>
     <w:sectPr>
-      <w:headerReference w:type="default" r:id="rId11"/>
-      <w:footerReference w:type="default" r:id="rId12"/>
+      <w:headerReference w:type="default" r:id="rId13"/>
+      <w:footerReference w:type="default" r:id="rId14"/>
       <w:pgSz w:w="11906" w:h="16838"/>
       <w:pgMar w:top="1417" w:right="1417" w:bottom="1417" w:left="1417" w:header="708" w:footer="708" w:gutter="0"/>
       <w:cols w:space="708"/>
@@ -3982,9 +5016,43 @@
             </w:rPr>
             <w:br/>
           </w:r>
+          <w:proofErr w:type="spellStart"/>
           <w:r>
-            <w:t>Automated Gherkin and BDD Test Scenario Generator</w:t>
+            <w:t>Automated</w:t>
           </w:r>
+          <w:proofErr w:type="spellEnd"/>
+          <w:r>
+            <w:t xml:space="preserve"> </w:t>
+          </w:r>
+          <w:proofErr w:type="spellStart"/>
+          <w:r>
+            <w:t>Gherkin</w:t>
+          </w:r>
+          <w:proofErr w:type="spellEnd"/>
+          <w:r>
+            <w:t xml:space="preserve"> </w:t>
+          </w:r>
+          <w:proofErr w:type="spellStart"/>
+          <w:r>
+            <w:t>and</w:t>
+          </w:r>
+          <w:proofErr w:type="spellEnd"/>
+          <w:r>
+            <w:t xml:space="preserve"> BDD Test </w:t>
+          </w:r>
+          <w:proofErr w:type="spellStart"/>
+          <w:r>
+            <w:t>Scenario</w:t>
+          </w:r>
+          <w:proofErr w:type="spellEnd"/>
+          <w:r>
+            <w:t xml:space="preserve"> </w:t>
+          </w:r>
+          <w:proofErr w:type="spellStart"/>
+          <w:r>
+            <w:t>Generator</w:t>
+          </w:r>
+          <w:proofErr w:type="spellEnd"/>
         </w:p>
       </w:tc>
       <w:tc>
@@ -4153,6 +5221,118 @@
     </w:lvl>
   </w:abstractNum>
   <w:abstractNum w:abstractNumId="1" w15:restartNumberingAfterBreak="0">
+    <w:nsid w:val="176401CD"/>
+    <w:multiLevelType w:val="hybridMultilevel"/>
+    <w:tmpl w:val="F894CABA"/>
+    <w:lvl w:ilvl="0" w:tplc="FFA065A6">
+      <w:numFmt w:val="bullet"/>
+      <w:lvlText w:val="-"/>
+      <w:lvlJc w:val="left"/>
+      <w:pPr>
+        <w:ind w:left="720" w:hanging="360"/>
+      </w:pPr>
+      <w:rPr>
+        <w:rFonts w:ascii="Arial" w:eastAsiaTheme="minorHAnsi" w:hAnsi="Arial" w:cs="Arial" w:hint="default"/>
+      </w:rPr>
+    </w:lvl>
+    <w:lvl w:ilvl="1" w:tplc="041F0003" w:tentative="1">
+      <w:start w:val="1"/>
+      <w:numFmt w:val="bullet"/>
+      <w:lvlText w:val="o"/>
+      <w:lvlJc w:val="left"/>
+      <w:pPr>
+        <w:ind w:left="1440" w:hanging="360"/>
+      </w:pPr>
+      <w:rPr>
+        <w:rFonts w:ascii="Courier New" w:hAnsi="Courier New" w:cs="Courier New" w:hint="default"/>
+      </w:rPr>
+    </w:lvl>
+    <w:lvl w:ilvl="2" w:tplc="041F0005" w:tentative="1">
+      <w:start w:val="1"/>
+      <w:numFmt w:val="bullet"/>
+      <w:lvlText w:val=""/>
+      <w:lvlJc w:val="left"/>
+      <w:pPr>
+        <w:ind w:left="2160" w:hanging="360"/>
+      </w:pPr>
+      <w:rPr>
+        <w:rFonts w:ascii="Wingdings" w:hAnsi="Wingdings" w:hint="default"/>
+      </w:rPr>
+    </w:lvl>
+    <w:lvl w:ilvl="3" w:tplc="041F0001" w:tentative="1">
+      <w:start w:val="1"/>
+      <w:numFmt w:val="bullet"/>
+      <w:lvlText w:val=""/>
+      <w:lvlJc w:val="left"/>
+      <w:pPr>
+        <w:ind w:left="2880" w:hanging="360"/>
+      </w:pPr>
+      <w:rPr>
+        <w:rFonts w:ascii="Symbol" w:hAnsi="Symbol" w:hint="default"/>
+      </w:rPr>
+    </w:lvl>
+    <w:lvl w:ilvl="4" w:tplc="041F0003" w:tentative="1">
+      <w:start w:val="1"/>
+      <w:numFmt w:val="bullet"/>
+      <w:lvlText w:val="o"/>
+      <w:lvlJc w:val="left"/>
+      <w:pPr>
+        <w:ind w:left="3600" w:hanging="360"/>
+      </w:pPr>
+      <w:rPr>
+        <w:rFonts w:ascii="Courier New" w:hAnsi="Courier New" w:cs="Courier New" w:hint="default"/>
+      </w:rPr>
+    </w:lvl>
+    <w:lvl w:ilvl="5" w:tplc="041F0005" w:tentative="1">
+      <w:start w:val="1"/>
+      <w:numFmt w:val="bullet"/>
+      <w:lvlText w:val=""/>
+      <w:lvlJc w:val="left"/>
+      <w:pPr>
+        <w:ind w:left="4320" w:hanging="360"/>
+      </w:pPr>
+      <w:rPr>
+        <w:rFonts w:ascii="Wingdings" w:hAnsi="Wingdings" w:hint="default"/>
+      </w:rPr>
+    </w:lvl>
+    <w:lvl w:ilvl="6" w:tplc="041F0001" w:tentative="1">
+      <w:start w:val="1"/>
+      <w:numFmt w:val="bullet"/>
+      <w:lvlText w:val=""/>
+      <w:lvlJc w:val="left"/>
+      <w:pPr>
+        <w:ind w:left="5040" w:hanging="360"/>
+      </w:pPr>
+      <w:rPr>
+        <w:rFonts w:ascii="Symbol" w:hAnsi="Symbol" w:hint="default"/>
+      </w:rPr>
+    </w:lvl>
+    <w:lvl w:ilvl="7" w:tplc="041F0003" w:tentative="1">
+      <w:start w:val="1"/>
+      <w:numFmt w:val="bullet"/>
+      <w:lvlText w:val="o"/>
+      <w:lvlJc w:val="left"/>
+      <w:pPr>
+        <w:ind w:left="5760" w:hanging="360"/>
+      </w:pPr>
+      <w:rPr>
+        <w:rFonts w:ascii="Courier New" w:hAnsi="Courier New" w:cs="Courier New" w:hint="default"/>
+      </w:rPr>
+    </w:lvl>
+    <w:lvl w:ilvl="8" w:tplc="041F0005" w:tentative="1">
+      <w:start w:val="1"/>
+      <w:numFmt w:val="bullet"/>
+      <w:lvlText w:val=""/>
+      <w:lvlJc w:val="left"/>
+      <w:pPr>
+        <w:ind w:left="6480" w:hanging="360"/>
+      </w:pPr>
+      <w:rPr>
+        <w:rFonts w:ascii="Wingdings" w:hAnsi="Wingdings" w:hint="default"/>
+      </w:rPr>
+    </w:lvl>
+  </w:abstractNum>
+  <w:abstractNum w:abstractNumId="2" w15:restartNumberingAfterBreak="0">
     <w:nsid w:val="3BF0298F"/>
     <w:multiLevelType w:val="multilevel"/>
     <w:tmpl w:val="041F001F"/>
@@ -4238,7 +5418,7 @@
       </w:pPr>
     </w:lvl>
   </w:abstractNum>
-  <w:abstractNum w:abstractNumId="2" w15:restartNumberingAfterBreak="0">
+  <w:abstractNum w:abstractNumId="3" w15:restartNumberingAfterBreak="0">
     <w:nsid w:val="40B235E1"/>
     <w:multiLevelType w:val="multilevel"/>
     <w:tmpl w:val="041F0025"/>
@@ -4333,7 +5513,7 @@
       </w:pPr>
     </w:lvl>
   </w:abstractNum>
-  <w:abstractNum w:abstractNumId="3" w15:restartNumberingAfterBreak="0">
+  <w:abstractNum w:abstractNumId="4" w15:restartNumberingAfterBreak="0">
     <w:nsid w:val="4C6E53C5"/>
     <w:multiLevelType w:val="hybridMultilevel"/>
     <w:tmpl w:val="D1682FFC"/>
@@ -4446,7 +5626,7 @@
       </w:rPr>
     </w:lvl>
   </w:abstractNum>
-  <w:abstractNum w:abstractNumId="4" w15:restartNumberingAfterBreak="0">
+  <w:abstractNum w:abstractNumId="5" w15:restartNumberingAfterBreak="0">
     <w:nsid w:val="503827B7"/>
     <w:multiLevelType w:val="hybridMultilevel"/>
     <w:tmpl w:val="C2CA355A"/>
@@ -4559,7 +5739,232 @@
       </w:rPr>
     </w:lvl>
   </w:abstractNum>
-  <w:abstractNum w:abstractNumId="5" w15:restartNumberingAfterBreak="0">
+  <w:abstractNum w:abstractNumId="6" w15:restartNumberingAfterBreak="0">
+    <w:nsid w:val="56832ABC"/>
+    <w:multiLevelType w:val="hybridMultilevel"/>
+    <w:tmpl w:val="472EFE2E"/>
+    <w:lvl w:ilvl="0" w:tplc="FFA065A6">
+      <w:numFmt w:val="bullet"/>
+      <w:lvlText w:val="-"/>
+      <w:lvlJc w:val="left"/>
+      <w:pPr>
+        <w:ind w:left="720" w:hanging="360"/>
+      </w:pPr>
+      <w:rPr>
+        <w:rFonts w:ascii="Arial" w:eastAsiaTheme="minorHAnsi" w:hAnsi="Arial" w:cs="Arial" w:hint="default"/>
+      </w:rPr>
+    </w:lvl>
+    <w:lvl w:ilvl="1" w:tplc="041F0003" w:tentative="1">
+      <w:start w:val="1"/>
+      <w:numFmt w:val="bullet"/>
+      <w:lvlText w:val="o"/>
+      <w:lvlJc w:val="left"/>
+      <w:pPr>
+        <w:ind w:left="1440" w:hanging="360"/>
+      </w:pPr>
+      <w:rPr>
+        <w:rFonts w:ascii="Courier New" w:hAnsi="Courier New" w:cs="Courier New" w:hint="default"/>
+      </w:rPr>
+    </w:lvl>
+    <w:lvl w:ilvl="2" w:tplc="041F0005" w:tentative="1">
+      <w:start w:val="1"/>
+      <w:numFmt w:val="bullet"/>
+      <w:lvlText w:val=""/>
+      <w:lvlJc w:val="left"/>
+      <w:pPr>
+        <w:ind w:left="2160" w:hanging="360"/>
+      </w:pPr>
+      <w:rPr>
+        <w:rFonts w:ascii="Wingdings" w:hAnsi="Wingdings" w:hint="default"/>
+      </w:rPr>
+    </w:lvl>
+    <w:lvl w:ilvl="3" w:tplc="041F0001" w:tentative="1">
+      <w:start w:val="1"/>
+      <w:numFmt w:val="bullet"/>
+      <w:lvlText w:val=""/>
+      <w:lvlJc w:val="left"/>
+      <w:pPr>
+        <w:ind w:left="2880" w:hanging="360"/>
+      </w:pPr>
+      <w:rPr>
+        <w:rFonts w:ascii="Symbol" w:hAnsi="Symbol" w:hint="default"/>
+      </w:rPr>
+    </w:lvl>
+    <w:lvl w:ilvl="4" w:tplc="041F0003" w:tentative="1">
+      <w:start w:val="1"/>
+      <w:numFmt w:val="bullet"/>
+      <w:lvlText w:val="o"/>
+      <w:lvlJc w:val="left"/>
+      <w:pPr>
+        <w:ind w:left="3600" w:hanging="360"/>
+      </w:pPr>
+      <w:rPr>
+        <w:rFonts w:ascii="Courier New" w:hAnsi="Courier New" w:cs="Courier New" w:hint="default"/>
+      </w:rPr>
+    </w:lvl>
+    <w:lvl w:ilvl="5" w:tplc="041F0005" w:tentative="1">
+      <w:start w:val="1"/>
+      <w:numFmt w:val="bullet"/>
+      <w:lvlText w:val=""/>
+      <w:lvlJc w:val="left"/>
+      <w:pPr>
+        <w:ind w:left="4320" w:hanging="360"/>
+      </w:pPr>
+      <w:rPr>
+        <w:rFonts w:ascii="Wingdings" w:hAnsi="Wingdings" w:hint="default"/>
+      </w:rPr>
+    </w:lvl>
+    <w:lvl w:ilvl="6" w:tplc="041F0001" w:tentative="1">
+      <w:start w:val="1"/>
+      <w:numFmt w:val="bullet"/>
+      <w:lvlText w:val=""/>
+      <w:lvlJc w:val="left"/>
+      <w:pPr>
+        <w:ind w:left="5040" w:hanging="360"/>
+      </w:pPr>
+      <w:rPr>
+        <w:rFonts w:ascii="Symbol" w:hAnsi="Symbol" w:hint="default"/>
+      </w:rPr>
+    </w:lvl>
+    <w:lvl w:ilvl="7" w:tplc="041F0003" w:tentative="1">
+      <w:start w:val="1"/>
+      <w:numFmt w:val="bullet"/>
+      <w:lvlText w:val="o"/>
+      <w:lvlJc w:val="left"/>
+      <w:pPr>
+        <w:ind w:left="5760" w:hanging="360"/>
+      </w:pPr>
+      <w:rPr>
+        <w:rFonts w:ascii="Courier New" w:hAnsi="Courier New" w:cs="Courier New" w:hint="default"/>
+      </w:rPr>
+    </w:lvl>
+    <w:lvl w:ilvl="8" w:tplc="041F0005" w:tentative="1">
+      <w:start w:val="1"/>
+      <w:numFmt w:val="bullet"/>
+      <w:lvlText w:val=""/>
+      <w:lvlJc w:val="left"/>
+      <w:pPr>
+        <w:ind w:left="6480" w:hanging="360"/>
+      </w:pPr>
+      <w:rPr>
+        <w:rFonts w:ascii="Wingdings" w:hAnsi="Wingdings" w:hint="default"/>
+      </w:rPr>
+    </w:lvl>
+  </w:abstractNum>
+  <w:abstractNum w:abstractNumId="7" w15:restartNumberingAfterBreak="0">
+    <w:nsid w:val="59B40932"/>
+    <w:multiLevelType w:val="hybridMultilevel"/>
+    <w:tmpl w:val="F9666740"/>
+    <w:lvl w:ilvl="0" w:tplc="041F0001">
+      <w:start w:val="1"/>
+      <w:numFmt w:val="bullet"/>
+      <w:lvlText w:val=""/>
+      <w:lvlJc w:val="left"/>
+      <w:pPr>
+        <w:ind w:left="720" w:hanging="360"/>
+      </w:pPr>
+      <w:rPr>
+        <w:rFonts w:ascii="Symbol" w:hAnsi="Symbol" w:hint="default"/>
+      </w:rPr>
+    </w:lvl>
+    <w:lvl w:ilvl="1" w:tplc="041F0003" w:tentative="1">
+      <w:start w:val="1"/>
+      <w:numFmt w:val="bullet"/>
+      <w:lvlText w:val="o"/>
+      <w:lvlJc w:val="left"/>
+      <w:pPr>
+        <w:ind w:left="1440" w:hanging="360"/>
+      </w:pPr>
+      <w:rPr>
+        <w:rFonts w:ascii="Courier New" w:hAnsi="Courier New" w:cs="Courier New" w:hint="default"/>
+      </w:rPr>
+    </w:lvl>
+    <w:lvl w:ilvl="2" w:tplc="041F0005" w:tentative="1">
+      <w:start w:val="1"/>
+      <w:numFmt w:val="bullet"/>
+      <w:lvlText w:val=""/>
+      <w:lvlJc w:val="left"/>
+      <w:pPr>
+        <w:ind w:left="2160" w:hanging="360"/>
+      </w:pPr>
+      <w:rPr>
+        <w:rFonts w:ascii="Wingdings" w:hAnsi="Wingdings" w:hint="default"/>
+      </w:rPr>
+    </w:lvl>
+    <w:lvl w:ilvl="3" w:tplc="041F0001" w:tentative="1">
+      <w:start w:val="1"/>
+      <w:numFmt w:val="bullet"/>
+      <w:lvlText w:val=""/>
+      <w:lvlJc w:val="left"/>
+      <w:pPr>
+        <w:ind w:left="2880" w:hanging="360"/>
+      </w:pPr>
+      <w:rPr>
+        <w:rFonts w:ascii="Symbol" w:hAnsi="Symbol" w:hint="default"/>
+      </w:rPr>
+    </w:lvl>
+    <w:lvl w:ilvl="4" w:tplc="041F0003" w:tentative="1">
+      <w:start w:val="1"/>
+      <w:numFmt w:val="bullet"/>
+      <w:lvlText w:val="o"/>
+      <w:lvlJc w:val="left"/>
+      <w:pPr>
+        <w:ind w:left="3600" w:hanging="360"/>
+      </w:pPr>
+      <w:rPr>
+        <w:rFonts w:ascii="Courier New" w:hAnsi="Courier New" w:cs="Courier New" w:hint="default"/>
+      </w:rPr>
+    </w:lvl>
+    <w:lvl w:ilvl="5" w:tplc="041F0005" w:tentative="1">
+      <w:start w:val="1"/>
+      <w:numFmt w:val="bullet"/>
+      <w:lvlText w:val=""/>
+      <w:lvlJc w:val="left"/>
+      <w:pPr>
+        <w:ind w:left="4320" w:hanging="360"/>
+      </w:pPr>
+      <w:rPr>
+        <w:rFonts w:ascii="Wingdings" w:hAnsi="Wingdings" w:hint="default"/>
+      </w:rPr>
+    </w:lvl>
+    <w:lvl w:ilvl="6" w:tplc="041F0001" w:tentative="1">
+      <w:start w:val="1"/>
+      <w:numFmt w:val="bullet"/>
+      <w:lvlText w:val=""/>
+      <w:lvlJc w:val="left"/>
+      <w:pPr>
+        <w:ind w:left="5040" w:hanging="360"/>
+      </w:pPr>
+      <w:rPr>
+        <w:rFonts w:ascii="Symbol" w:hAnsi="Symbol" w:hint="default"/>
+      </w:rPr>
+    </w:lvl>
+    <w:lvl w:ilvl="7" w:tplc="041F0003" w:tentative="1">
+      <w:start w:val="1"/>
+      <w:numFmt w:val="bullet"/>
+      <w:lvlText w:val="o"/>
+      <w:lvlJc w:val="left"/>
+      <w:pPr>
+        <w:ind w:left="5760" w:hanging="360"/>
+      </w:pPr>
+      <w:rPr>
+        <w:rFonts w:ascii="Courier New" w:hAnsi="Courier New" w:cs="Courier New" w:hint="default"/>
+      </w:rPr>
+    </w:lvl>
+    <w:lvl w:ilvl="8" w:tplc="041F0005" w:tentative="1">
+      <w:start w:val="1"/>
+      <w:numFmt w:val="bullet"/>
+      <w:lvlText w:val=""/>
+      <w:lvlJc w:val="left"/>
+      <w:pPr>
+        <w:ind w:left="6480" w:hanging="360"/>
+      </w:pPr>
+      <w:rPr>
+        <w:rFonts w:ascii="Wingdings" w:hAnsi="Wingdings" w:hint="default"/>
+      </w:rPr>
+    </w:lvl>
+  </w:abstractNum>
+  <w:abstractNum w:abstractNumId="8" w15:restartNumberingAfterBreak="0">
     <w:nsid w:val="606E24C9"/>
     <w:multiLevelType w:val="hybridMultilevel"/>
     <w:tmpl w:val="D804C842"/>
@@ -4672,7 +6077,7 @@
       </w:rPr>
     </w:lvl>
   </w:abstractNum>
-  <w:abstractNum w:abstractNumId="6" w15:restartNumberingAfterBreak="0">
+  <w:abstractNum w:abstractNumId="9" w15:restartNumberingAfterBreak="0">
     <w:nsid w:val="68165764"/>
     <w:multiLevelType w:val="hybridMultilevel"/>
     <w:tmpl w:val="C144CEB0"/>
@@ -4785,7 +6190,96 @@
       </w:rPr>
     </w:lvl>
   </w:abstractNum>
-  <w:abstractNum w:abstractNumId="7" w15:restartNumberingAfterBreak="0">
+  <w:abstractNum w:abstractNumId="10" w15:restartNumberingAfterBreak="0">
+    <w:nsid w:val="6CC1056C"/>
+    <w:multiLevelType w:val="hybridMultilevel"/>
+    <w:tmpl w:val="522247C2"/>
+    <w:lvl w:ilvl="0" w:tplc="041F000F">
+      <w:start w:val="1"/>
+      <w:numFmt w:val="decimal"/>
+      <w:lvlText w:val="%1."/>
+      <w:lvlJc w:val="left"/>
+      <w:pPr>
+        <w:ind w:left="720" w:hanging="360"/>
+      </w:pPr>
+      <w:rPr>
+        <w:rFonts w:hint="default"/>
+      </w:rPr>
+    </w:lvl>
+    <w:lvl w:ilvl="1" w:tplc="041F0019" w:tentative="1">
+      <w:start w:val="1"/>
+      <w:numFmt w:val="lowerLetter"/>
+      <w:lvlText w:val="%2."/>
+      <w:lvlJc w:val="left"/>
+      <w:pPr>
+        <w:ind w:left="1440" w:hanging="360"/>
+      </w:pPr>
+    </w:lvl>
+    <w:lvl w:ilvl="2" w:tplc="041F001B" w:tentative="1">
+      <w:start w:val="1"/>
+      <w:numFmt w:val="lowerRoman"/>
+      <w:lvlText w:val="%3."/>
+      <w:lvlJc w:val="right"/>
+      <w:pPr>
+        <w:ind w:left="2160" w:hanging="180"/>
+      </w:pPr>
+    </w:lvl>
+    <w:lvl w:ilvl="3" w:tplc="041F000F" w:tentative="1">
+      <w:start w:val="1"/>
+      <w:numFmt w:val="decimal"/>
+      <w:lvlText w:val="%4."/>
+      <w:lvlJc w:val="left"/>
+      <w:pPr>
+        <w:ind w:left="2880" w:hanging="360"/>
+      </w:pPr>
+    </w:lvl>
+    <w:lvl w:ilvl="4" w:tplc="041F0019" w:tentative="1">
+      <w:start w:val="1"/>
+      <w:numFmt w:val="lowerLetter"/>
+      <w:lvlText w:val="%5."/>
+      <w:lvlJc w:val="left"/>
+      <w:pPr>
+        <w:ind w:left="3600" w:hanging="360"/>
+      </w:pPr>
+    </w:lvl>
+    <w:lvl w:ilvl="5" w:tplc="041F001B" w:tentative="1">
+      <w:start w:val="1"/>
+      <w:numFmt w:val="lowerRoman"/>
+      <w:lvlText w:val="%6."/>
+      <w:lvlJc w:val="right"/>
+      <w:pPr>
+        <w:ind w:left="4320" w:hanging="180"/>
+      </w:pPr>
+    </w:lvl>
+    <w:lvl w:ilvl="6" w:tplc="041F000F" w:tentative="1">
+      <w:start w:val="1"/>
+      <w:numFmt w:val="decimal"/>
+      <w:lvlText w:val="%7."/>
+      <w:lvlJc w:val="left"/>
+      <w:pPr>
+        <w:ind w:left="5040" w:hanging="360"/>
+      </w:pPr>
+    </w:lvl>
+    <w:lvl w:ilvl="7" w:tplc="041F0019" w:tentative="1">
+      <w:start w:val="1"/>
+      <w:numFmt w:val="lowerLetter"/>
+      <w:lvlText w:val="%8."/>
+      <w:lvlJc w:val="left"/>
+      <w:pPr>
+        <w:ind w:left="5760" w:hanging="360"/>
+      </w:pPr>
+    </w:lvl>
+    <w:lvl w:ilvl="8" w:tplc="041F001B" w:tentative="1">
+      <w:start w:val="1"/>
+      <w:numFmt w:val="lowerRoman"/>
+      <w:lvlText w:val="%9."/>
+      <w:lvlJc w:val="right"/>
+      <w:pPr>
+        <w:ind w:left="6480" w:hanging="180"/>
+      </w:pPr>
+    </w:lvl>
+  </w:abstractNum>
+  <w:abstractNum w:abstractNumId="11" w15:restartNumberingAfterBreak="0">
     <w:nsid w:val="740E17E7"/>
     <w:multiLevelType w:val="hybridMultilevel"/>
     <w:tmpl w:val="7258390A"/>
@@ -4871,7 +6365,7 @@
       </w:pPr>
     </w:lvl>
   </w:abstractNum>
-  <w:abstractNum w:abstractNumId="8" w15:restartNumberingAfterBreak="0">
+  <w:abstractNum w:abstractNumId="12" w15:restartNumberingAfterBreak="0">
     <w:nsid w:val="795D38E2"/>
     <w:multiLevelType w:val="hybridMultilevel"/>
     <w:tmpl w:val="F0B27F3E"/>
@@ -4958,76 +6452,88 @@
     </w:lvl>
   </w:abstractNum>
   <w:num w:numId="1" w16cid:durableId="571893156">
-    <w:abstractNumId w:val="7"/>
+    <w:abstractNumId w:val="11"/>
   </w:num>
   <w:num w:numId="2" w16cid:durableId="954367949">
-    <w:abstractNumId w:val="8"/>
+    <w:abstractNumId w:val="12"/>
   </w:num>
   <w:num w:numId="3" w16cid:durableId="1432700190">
-    <w:abstractNumId w:val="1"/>
+    <w:abstractNumId w:val="2"/>
   </w:num>
   <w:num w:numId="4" w16cid:durableId="957953346">
     <w:abstractNumId w:val="0"/>
   </w:num>
   <w:num w:numId="5" w16cid:durableId="1395422613">
-    <w:abstractNumId w:val="2"/>
+    <w:abstractNumId w:val="3"/>
   </w:num>
   <w:num w:numId="6" w16cid:durableId="1505632676">
+    <w:abstractNumId w:val="9"/>
+  </w:num>
+  <w:num w:numId="7" w16cid:durableId="1229609474">
+    <w:abstractNumId w:val="3"/>
+  </w:num>
+  <w:num w:numId="8" w16cid:durableId="993991673">
+    <w:abstractNumId w:val="3"/>
+  </w:num>
+  <w:num w:numId="9" w16cid:durableId="1039747132">
+    <w:abstractNumId w:val="3"/>
+  </w:num>
+  <w:num w:numId="10" w16cid:durableId="53283771">
+    <w:abstractNumId w:val="4"/>
+  </w:num>
+  <w:num w:numId="11" w16cid:durableId="925528599">
+    <w:abstractNumId w:val="8"/>
+  </w:num>
+  <w:num w:numId="12" w16cid:durableId="1692685974">
+    <w:abstractNumId w:val="3"/>
+  </w:num>
+  <w:num w:numId="13" w16cid:durableId="547759718">
+    <w:abstractNumId w:val="3"/>
+  </w:num>
+  <w:num w:numId="14" w16cid:durableId="842161480">
+    <w:abstractNumId w:val="3"/>
+  </w:num>
+  <w:num w:numId="15" w16cid:durableId="1867015602">
+    <w:abstractNumId w:val="3"/>
+  </w:num>
+  <w:num w:numId="16" w16cid:durableId="1139496860">
+    <w:abstractNumId w:val="3"/>
+  </w:num>
+  <w:num w:numId="17" w16cid:durableId="1729448951">
+    <w:abstractNumId w:val="3"/>
+  </w:num>
+  <w:num w:numId="18" w16cid:durableId="1829901044">
+    <w:abstractNumId w:val="5"/>
+  </w:num>
+  <w:num w:numId="19" w16cid:durableId="1399093683">
+    <w:abstractNumId w:val="3"/>
+  </w:num>
+  <w:num w:numId="20" w16cid:durableId="2134858568">
+    <w:abstractNumId w:val="3"/>
+  </w:num>
+  <w:num w:numId="21" w16cid:durableId="962153588">
+    <w:abstractNumId w:val="3"/>
+  </w:num>
+  <w:num w:numId="22" w16cid:durableId="1819880214">
+    <w:abstractNumId w:val="3"/>
+  </w:num>
+  <w:num w:numId="23" w16cid:durableId="1387997610">
+    <w:abstractNumId w:val="3"/>
+  </w:num>
+  <w:num w:numId="24" w16cid:durableId="2244743">
+    <w:abstractNumId w:val="3"/>
+  </w:num>
+  <w:num w:numId="25" w16cid:durableId="450168624">
+    <w:abstractNumId w:val="7"/>
+  </w:num>
+  <w:num w:numId="26" w16cid:durableId="1471436868">
+    <w:abstractNumId w:val="1"/>
+  </w:num>
+  <w:num w:numId="27" w16cid:durableId="1265041866">
     <w:abstractNumId w:val="6"/>
   </w:num>
-  <w:num w:numId="7" w16cid:durableId="1229609474">
-    <w:abstractNumId w:val="2"/>
-  </w:num>
-  <w:num w:numId="8" w16cid:durableId="993991673">
-    <w:abstractNumId w:val="2"/>
-  </w:num>
-  <w:num w:numId="9" w16cid:durableId="1039747132">
-    <w:abstractNumId w:val="2"/>
-  </w:num>
-  <w:num w:numId="10" w16cid:durableId="53283771">
-    <w:abstractNumId w:val="3"/>
-  </w:num>
-  <w:num w:numId="11" w16cid:durableId="925528599">
-    <w:abstractNumId w:val="5"/>
-  </w:num>
-  <w:num w:numId="12" w16cid:durableId="1692685974">
-    <w:abstractNumId w:val="2"/>
-  </w:num>
-  <w:num w:numId="13" w16cid:durableId="547759718">
-    <w:abstractNumId w:val="2"/>
-  </w:num>
-  <w:num w:numId="14" w16cid:durableId="842161480">
-    <w:abstractNumId w:val="2"/>
-  </w:num>
-  <w:num w:numId="15" w16cid:durableId="1867015602">
-    <w:abstractNumId w:val="2"/>
-  </w:num>
-  <w:num w:numId="16" w16cid:durableId="1139496860">
-    <w:abstractNumId w:val="2"/>
-  </w:num>
-  <w:num w:numId="17" w16cid:durableId="1729448951">
-    <w:abstractNumId w:val="2"/>
-  </w:num>
-  <w:num w:numId="18" w16cid:durableId="1829901044">
-    <w:abstractNumId w:val="4"/>
-  </w:num>
-  <w:num w:numId="19" w16cid:durableId="1399093683">
-    <w:abstractNumId w:val="2"/>
-  </w:num>
-  <w:num w:numId="20" w16cid:durableId="2134858568">
-    <w:abstractNumId w:val="2"/>
-  </w:num>
-  <w:num w:numId="21" w16cid:durableId="962153588">
-    <w:abstractNumId w:val="2"/>
-  </w:num>
-  <w:num w:numId="22" w16cid:durableId="1819880214">
-    <w:abstractNumId w:val="2"/>
-  </w:num>
-  <w:num w:numId="23" w16cid:durableId="1387997610">
-    <w:abstractNumId w:val="2"/>
-  </w:num>
-  <w:num w:numId="24" w16cid:durableId="2244743">
-    <w:abstractNumId w:val="2"/>
+  <w:num w:numId="28" w16cid:durableId="313145721">
+    <w:abstractNumId w:val="10"/>
   </w:num>
 </w:numbering>
 </file>
@@ -5530,7 +7036,6 @@
         <w:numId w:val="5"/>
       </w:numPr>
       <w:spacing w:before="40"/>
-      <w:ind w:left="862" w:hanging="862"/>
       <w:outlineLvl w:val="3"/>
     </w:pPr>
     <w:rPr>
@@ -6110,6 +7615,41 @@
       <w:ind w:left="440"/>
     </w:pPr>
   </w:style>
+  <w:style w:type="character" w:styleId="Kpr">
+    <w:name w:val="Hyperlink"/>
+    <w:basedOn w:val="VarsaylanParagrafYazTipi"/>
+    <w:uiPriority w:val="99"/>
+    <w:unhideWhenUsed/>
+    <w:rsid w:val="00D00970"/>
+    <w:rPr>
+      <w:color w:val="0563C1" w:themeColor="hyperlink"/>
+      <w:u w:val="single"/>
+    </w:rPr>
+  </w:style>
+  <w:style w:type="character" w:styleId="zmlenmeyenBahsetme">
+    <w:name w:val="Unresolved Mention"/>
+    <w:basedOn w:val="VarsaylanParagrafYazTipi"/>
+    <w:uiPriority w:val="99"/>
+    <w:semiHidden/>
+    <w:unhideWhenUsed/>
+    <w:rsid w:val="00D00970"/>
+    <w:rPr>
+      <w:color w:val="605E5C"/>
+      <w:shd w:val="clear" w:color="auto" w:fill="E1DFDD"/>
+    </w:rPr>
+  </w:style>
+  <w:style w:type="character" w:styleId="zlenenKpr">
+    <w:name w:val="FollowedHyperlink"/>
+    <w:basedOn w:val="VarsaylanParagrafYazTipi"/>
+    <w:uiPriority w:val="99"/>
+    <w:semiHidden/>
+    <w:unhideWhenUsed/>
+    <w:rsid w:val="009F7831"/>
+    <w:rPr>
+      <w:color w:val="954F72" w:themeColor="followedHyperlink"/>
+      <w:u w:val="single"/>
+    </w:rPr>
+  </w:style>
 </w:styles>
 </file>
 

</xml_diff>

<commit_message>
Döküman referans sayfası güncellendi
</commit_message>
<xml_diff>
--- a/CSE443 - RAD_Template.docx
+++ b/CSE443 - RAD_Template.docx
@@ -270,16 +270,8 @@
         <w:rPr>
           <w:lang w:val="en-US"/>
         </w:rPr>
-        <w:t xml:space="preserve">Emircan </w:t>
-      </w:r>
-      <w:proofErr w:type="spellStart"/>
-      <w:r>
-        <w:rPr>
-          <w:lang w:val="en-US"/>
-        </w:rPr>
-        <w:t>Badur</w:t>
-      </w:r>
-      <w:proofErr w:type="spellEnd"/>
+        <w:t>Emircan Badur</w:t>
+      </w:r>
     </w:p>
     <w:p>
       <w:pPr>
@@ -323,7 +315,7 @@
           <w:kern w:val="2"/>
           <w:sz w:val="24"/>
           <w:szCs w:val="24"/>
-          <w:lang w:val="en-US"/>
+          <w:lang w:eastAsia="tr-TR"/>
           <w14:ligatures w14:val="standardContextual"/>
         </w:rPr>
       </w:pPr>
@@ -359,7 +351,7 @@
           <w:kern w:val="2"/>
           <w:sz w:val="24"/>
           <w:szCs w:val="24"/>
-          <w:lang w:val="en-US"/>
+          <w:lang w:eastAsia="tr-TR"/>
           <w14:ligatures w14:val="standardContextual"/>
         </w:rPr>
         <w:tab/>
@@ -387,7 +379,7 @@
         <w:rPr>
           <w:noProof/>
         </w:rPr>
-        <w:instrText xml:space="preserve"> PAGEREF _Toc243343153 \h </w:instrText>
+        <w:instrText xml:space="preserve"> PAGEREF _Toc243748910 \h </w:instrText>
       </w:r>
       <w:r>
         <w:rPr>
@@ -426,7 +418,7 @@
           <w:kern w:val="2"/>
           <w:sz w:val="24"/>
           <w:szCs w:val="24"/>
-          <w:lang w:val="en-US"/>
+          <w:lang w:eastAsia="tr-TR"/>
           <w14:ligatures w14:val="standardContextual"/>
         </w:rPr>
       </w:pPr>
@@ -444,7 +436,7 @@
           <w:kern w:val="2"/>
           <w:sz w:val="24"/>
           <w:szCs w:val="24"/>
-          <w:lang w:val="en-US"/>
+          <w:lang w:eastAsia="tr-TR"/>
           <w14:ligatures w14:val="standardContextual"/>
         </w:rPr>
         <w:tab/>
@@ -472,7 +464,7 @@
         <w:rPr>
           <w:noProof/>
         </w:rPr>
-        <w:instrText xml:space="preserve"> PAGEREF _Toc243343154 \h </w:instrText>
+        <w:instrText xml:space="preserve"> PAGEREF _Toc243748911 \h </w:instrText>
       </w:r>
       <w:r>
         <w:rPr>
@@ -511,7 +503,7 @@
           <w:kern w:val="2"/>
           <w:sz w:val="24"/>
           <w:szCs w:val="24"/>
-          <w:lang w:val="en-US"/>
+          <w:lang w:eastAsia="tr-TR"/>
           <w14:ligatures w14:val="standardContextual"/>
         </w:rPr>
       </w:pPr>
@@ -529,7 +521,7 @@
           <w:kern w:val="2"/>
           <w:sz w:val="24"/>
           <w:szCs w:val="24"/>
-          <w:lang w:val="en-US"/>
+          <w:lang w:eastAsia="tr-TR"/>
           <w14:ligatures w14:val="standardContextual"/>
         </w:rPr>
         <w:tab/>
@@ -557,7 +549,7 @@
         <w:rPr>
           <w:noProof/>
         </w:rPr>
-        <w:instrText xml:space="preserve"> PAGEREF _Toc243343155 \h </w:instrText>
+        <w:instrText xml:space="preserve"> PAGEREF _Toc243748912 \h </w:instrText>
       </w:r>
       <w:r>
         <w:rPr>
@@ -596,7 +588,7 @@
           <w:kern w:val="2"/>
           <w:sz w:val="24"/>
           <w:szCs w:val="24"/>
-          <w:lang w:val="en-US"/>
+          <w:lang w:eastAsia="tr-TR"/>
           <w14:ligatures w14:val="standardContextual"/>
         </w:rPr>
       </w:pPr>
@@ -614,7 +606,7 @@
           <w:kern w:val="2"/>
           <w:sz w:val="24"/>
           <w:szCs w:val="24"/>
-          <w:lang w:val="en-US"/>
+          <w:lang w:eastAsia="tr-TR"/>
           <w14:ligatures w14:val="standardContextual"/>
         </w:rPr>
         <w:tab/>
@@ -642,7 +634,7 @@
         <w:rPr>
           <w:noProof/>
         </w:rPr>
-        <w:instrText xml:space="preserve"> PAGEREF _Toc243343156 \h </w:instrText>
+        <w:instrText xml:space="preserve"> PAGEREF _Toc243748913 \h </w:instrText>
       </w:r>
       <w:r>
         <w:rPr>
@@ -660,6 +652,152 @@
           <w:noProof/>
         </w:rPr>
         <w:t>3</w:t>
+      </w:r>
+      <w:r>
+        <w:rPr>
+          <w:noProof/>
+        </w:rPr>
+        <w:fldChar w:fldCharType="end"/>
+      </w:r>
+    </w:p>
+    <w:p>
+      <w:pPr>
+        <w:pStyle w:val="T4"/>
+        <w:tabs>
+          <w:tab w:val="left" w:pos="1680"/>
+          <w:tab w:val="right" w:leader="dot" w:pos="9062"/>
+        </w:tabs>
+        <w:rPr>
+          <w:noProof/>
+        </w:rPr>
+      </w:pPr>
+      <w:r>
+        <w:rPr>
+          <w:noProof/>
+          <w:lang w:val="en-US"/>
+        </w:rPr>
+        <w:t>1.3.1.1</w:t>
+      </w:r>
+      <w:r>
+        <w:rPr>
+          <w:noProof/>
+        </w:rPr>
+        <w:tab/>
+      </w:r>
+      <w:r>
+        <w:rPr>
+          <w:noProof/>
+          <w:lang w:val="en-US"/>
+        </w:rPr>
+        <w:t>Objectives</w:t>
+      </w:r>
+      <w:r>
+        <w:rPr>
+          <w:noProof/>
+        </w:rPr>
+        <w:tab/>
+      </w:r>
+      <w:r>
+        <w:rPr>
+          <w:noProof/>
+        </w:rPr>
+        <w:fldChar w:fldCharType="begin"/>
+      </w:r>
+      <w:r>
+        <w:rPr>
+          <w:noProof/>
+        </w:rPr>
+        <w:instrText xml:space="preserve"> PAGEREF _Toc243748914 \h </w:instrText>
+      </w:r>
+      <w:r>
+        <w:rPr>
+          <w:noProof/>
+        </w:rPr>
+      </w:r>
+      <w:r>
+        <w:rPr>
+          <w:noProof/>
+        </w:rPr>
+        <w:fldChar w:fldCharType="separate"/>
+      </w:r>
+      <w:r>
+        <w:rPr>
+          <w:noProof/>
+        </w:rPr>
+        <w:t>3</w:t>
+      </w:r>
+      <w:r>
+        <w:rPr>
+          <w:noProof/>
+        </w:rPr>
+        <w:fldChar w:fldCharType="end"/>
+      </w:r>
+    </w:p>
+    <w:p>
+      <w:pPr>
+        <w:pStyle w:val="T4"/>
+        <w:tabs>
+          <w:tab w:val="left" w:pos="1680"/>
+          <w:tab w:val="right" w:leader="dot" w:pos="9062"/>
+        </w:tabs>
+        <w:rPr>
+          <w:noProof/>
+        </w:rPr>
+      </w:pPr>
+      <w:r>
+        <w:rPr>
+          <w:noProof/>
+          <w:lang w:val="en-US"/>
+        </w:rPr>
+        <w:t>1.3.1.2</w:t>
+      </w:r>
+      <w:r>
+        <w:rPr>
+          <w:noProof/>
+        </w:rPr>
+        <w:tab/>
+      </w:r>
+      <w:r>
+        <w:rPr>
+          <w:noProof/>
+          <w:lang w:val="en-US"/>
+        </w:rPr>
+        <w:t>Success criteria</w:t>
+      </w:r>
+      <w:r>
+        <w:rPr>
+          <w:noProof/>
+        </w:rPr>
+        <w:tab/>
+      </w:r>
+      <w:r>
+        <w:rPr>
+          <w:noProof/>
+        </w:rPr>
+        <w:fldChar w:fldCharType="begin"/>
+      </w:r>
+      <w:r>
+        <w:rPr>
+          <w:noProof/>
+        </w:rPr>
+        <w:instrText xml:space="preserve"> PAGEREF _Toc243748915 \h </w:instrText>
+      </w:r>
+      <w:r>
+        <w:rPr>
+          <w:noProof/>
+        </w:rPr>
+      </w:r>
+      <w:r>
+        <w:rPr>
+          <w:noProof/>
+        </w:rPr>
+        <w:fldChar w:fldCharType="separate"/>
+      </w:r>
+      <w:r>
+        <w:rPr>
+          <w:noProof/>
+        </w:rPr>
+        <w:t>4</w:t>
       </w:r>
       <w:r>
         <w:rPr>
@@ -681,7 +819,7 @@
           <w:kern w:val="2"/>
           <w:sz w:val="24"/>
           <w:szCs w:val="24"/>
-          <w:lang w:val="en-US"/>
+          <w:lang w:eastAsia="tr-TR"/>
           <w14:ligatures w14:val="standardContextual"/>
         </w:rPr>
       </w:pPr>
@@ -699,7 +837,7 @@
           <w:kern w:val="2"/>
           <w:sz w:val="24"/>
           <w:szCs w:val="24"/>
-          <w:lang w:val="en-US"/>
+          <w:lang w:eastAsia="tr-TR"/>
           <w14:ligatures w14:val="standardContextual"/>
         </w:rPr>
         <w:tab/>
@@ -727,7 +865,7 @@
         <w:rPr>
           <w:noProof/>
         </w:rPr>
-        <w:instrText xml:space="preserve"> PAGEREF _Toc243343157 \h </w:instrText>
+        <w:instrText xml:space="preserve"> PAGEREF _Toc243748916 \h </w:instrText>
       </w:r>
       <w:r>
         <w:rPr>
@@ -744,7 +882,7 @@
         <w:rPr>
           <w:noProof/>
         </w:rPr>
-        <w:t>3</w:t>
+        <w:t>4</w:t>
       </w:r>
       <w:r>
         <w:rPr>
@@ -766,7 +904,7 @@
           <w:kern w:val="2"/>
           <w:sz w:val="24"/>
           <w:szCs w:val="24"/>
-          <w:lang w:val="en-US"/>
+          <w:lang w:eastAsia="tr-TR"/>
           <w14:ligatures w14:val="standardContextual"/>
         </w:rPr>
       </w:pPr>
@@ -784,7 +922,7 @@
           <w:kern w:val="2"/>
           <w:sz w:val="24"/>
           <w:szCs w:val="24"/>
-          <w:lang w:val="en-US"/>
+          <w:lang w:eastAsia="tr-TR"/>
           <w14:ligatures w14:val="standardContextual"/>
         </w:rPr>
         <w:tab/>
@@ -812,7 +950,7 @@
         <w:rPr>
           <w:noProof/>
         </w:rPr>
-        <w:instrText xml:space="preserve"> PAGEREF _Toc243343158 \h </w:instrText>
+        <w:instrText xml:space="preserve"> PAGEREF _Toc243748917 \h </w:instrText>
       </w:r>
       <w:r>
         <w:rPr>
@@ -829,7 +967,7 @@
         <w:rPr>
           <w:noProof/>
         </w:rPr>
-        <w:t>3</w:t>
+        <w:t>4</w:t>
       </w:r>
       <w:r>
         <w:rPr>
@@ -851,7 +989,7 @@
           <w:kern w:val="2"/>
           <w:sz w:val="24"/>
           <w:szCs w:val="24"/>
-          <w:lang w:val="en-US"/>
+          <w:lang w:eastAsia="tr-TR"/>
           <w14:ligatures w14:val="standardContextual"/>
         </w:rPr>
       </w:pPr>
@@ -869,7 +1007,7 @@
           <w:kern w:val="2"/>
           <w:sz w:val="24"/>
           <w:szCs w:val="24"/>
-          <w:lang w:val="en-US"/>
+          <w:lang w:eastAsia="tr-TR"/>
           <w14:ligatures w14:val="standardContextual"/>
         </w:rPr>
         <w:tab/>
@@ -897,7 +1035,7 @@
         <w:rPr>
           <w:noProof/>
         </w:rPr>
-        <w:instrText xml:space="preserve"> PAGEREF _Toc243343159 \h </w:instrText>
+        <w:instrText xml:space="preserve"> PAGEREF _Toc243748918 \h </w:instrText>
       </w:r>
       <w:r>
         <w:rPr>
@@ -914,7 +1052,7 @@
         <w:rPr>
           <w:noProof/>
         </w:rPr>
-        <w:t>3</w:t>
+        <w:t>4</w:t>
       </w:r>
       <w:r>
         <w:rPr>
@@ -932,7 +1070,7 @@
           <w:kern w:val="2"/>
           <w:sz w:val="24"/>
           <w:szCs w:val="24"/>
-          <w:lang w:val="en-US"/>
+          <w:lang w:eastAsia="tr-TR"/>
           <w14:ligatures w14:val="standardContextual"/>
         </w:rPr>
       </w:pPr>
@@ -950,7 +1088,7 @@
           <w:kern w:val="2"/>
           <w:sz w:val="24"/>
           <w:szCs w:val="24"/>
-          <w:lang w:val="en-US"/>
+          <w:lang w:eastAsia="tr-TR"/>
           <w14:ligatures w14:val="standardContextual"/>
         </w:rPr>
         <w:tab/>
@@ -978,7 +1116,7 @@
         <w:rPr>
           <w:noProof/>
         </w:rPr>
-        <w:instrText xml:space="preserve"> PAGEREF _Toc243343160 \h </w:instrText>
+        <w:instrText xml:space="preserve"> PAGEREF _Toc243748919 \h </w:instrText>
       </w:r>
       <w:r>
         <w:rPr>
@@ -995,7 +1133,7 @@
         <w:rPr>
           <w:noProof/>
         </w:rPr>
-        <w:t>3</w:t>
+        <w:t>5</w:t>
       </w:r>
       <w:r>
         <w:rPr>
@@ -1013,7 +1151,7 @@
           <w:kern w:val="2"/>
           <w:sz w:val="24"/>
           <w:szCs w:val="24"/>
-          <w:lang w:val="en-US"/>
+          <w:lang w:eastAsia="tr-TR"/>
           <w14:ligatures w14:val="standardContextual"/>
         </w:rPr>
       </w:pPr>
@@ -1031,7 +1169,7 @@
           <w:kern w:val="2"/>
           <w:sz w:val="24"/>
           <w:szCs w:val="24"/>
-          <w:lang w:val="en-US"/>
+          <w:lang w:eastAsia="tr-TR"/>
           <w14:ligatures w14:val="standardContextual"/>
         </w:rPr>
         <w:tab/>
@@ -1059,7 +1197,7 @@
         <w:rPr>
           <w:noProof/>
         </w:rPr>
-        <w:instrText xml:space="preserve"> PAGEREF _Toc243343161 \h </w:instrText>
+        <w:instrText xml:space="preserve"> PAGEREF _Toc243748920 \h </w:instrText>
       </w:r>
       <w:r>
         <w:rPr>
@@ -1076,7 +1214,7 @@
         <w:rPr>
           <w:noProof/>
         </w:rPr>
-        <w:t>3</w:t>
+        <w:t>5</w:t>
       </w:r>
       <w:r>
         <w:rPr>
@@ -1098,7 +1236,7 @@
           <w:kern w:val="2"/>
           <w:sz w:val="24"/>
           <w:szCs w:val="24"/>
-          <w:lang w:val="en-US"/>
+          <w:lang w:eastAsia="tr-TR"/>
           <w14:ligatures w14:val="standardContextual"/>
         </w:rPr>
       </w:pPr>
@@ -1116,7 +1254,7 @@
           <w:kern w:val="2"/>
           <w:sz w:val="24"/>
           <w:szCs w:val="24"/>
-          <w:lang w:val="en-US"/>
+          <w:lang w:eastAsia="tr-TR"/>
           <w14:ligatures w14:val="standardContextual"/>
         </w:rPr>
         <w:tab/>
@@ -1144,7 +1282,7 @@
         <w:rPr>
           <w:noProof/>
         </w:rPr>
-        <w:instrText xml:space="preserve"> PAGEREF _Toc243343162 \h </w:instrText>
+        <w:instrText xml:space="preserve"> PAGEREF _Toc243748921 \h </w:instrText>
       </w:r>
       <w:r>
         <w:rPr>
@@ -1161,7 +1299,7 @@
         <w:rPr>
           <w:noProof/>
         </w:rPr>
-        <w:t>3</w:t>
+        <w:t>5</w:t>
       </w:r>
       <w:r>
         <w:rPr>
@@ -1183,7 +1321,7 @@
           <w:kern w:val="2"/>
           <w:sz w:val="24"/>
           <w:szCs w:val="24"/>
-          <w:lang w:val="en-US"/>
+          <w:lang w:eastAsia="tr-TR"/>
           <w14:ligatures w14:val="standardContextual"/>
         </w:rPr>
       </w:pPr>
@@ -1201,7 +1339,7 @@
           <w:kern w:val="2"/>
           <w:sz w:val="24"/>
           <w:szCs w:val="24"/>
-          <w:lang w:val="en-US"/>
+          <w:lang w:eastAsia="tr-TR"/>
           <w14:ligatures w14:val="standardContextual"/>
         </w:rPr>
         <w:tab/>
@@ -1229,7 +1367,7 @@
         <w:rPr>
           <w:noProof/>
         </w:rPr>
-        <w:instrText xml:space="preserve"> PAGEREF _Toc243343163 \h </w:instrText>
+        <w:instrText xml:space="preserve"> PAGEREF _Toc243748922 \h </w:instrText>
       </w:r>
       <w:r>
         <w:rPr>
@@ -1246,7 +1384,7 @@
         <w:rPr>
           <w:noProof/>
         </w:rPr>
-        <w:t>3</w:t>
+        <w:t>5</w:t>
       </w:r>
       <w:r>
         <w:rPr>
@@ -1268,7 +1406,7 @@
           <w:kern w:val="2"/>
           <w:sz w:val="24"/>
           <w:szCs w:val="24"/>
-          <w:lang w:val="en-US"/>
+          <w:lang w:eastAsia="tr-TR"/>
           <w14:ligatures w14:val="standardContextual"/>
         </w:rPr>
       </w:pPr>
@@ -1286,7 +1424,7 @@
           <w:kern w:val="2"/>
           <w:sz w:val="24"/>
           <w:szCs w:val="24"/>
-          <w:lang w:val="en-US"/>
+          <w:lang w:eastAsia="tr-TR"/>
           <w14:ligatures w14:val="standardContextual"/>
         </w:rPr>
         <w:tab/>
@@ -1314,7 +1452,7 @@
         <w:rPr>
           <w:noProof/>
         </w:rPr>
-        <w:instrText xml:space="preserve"> PAGEREF _Toc243343164 \h </w:instrText>
+        <w:instrText xml:space="preserve"> PAGEREF _Toc243748923 \h </w:instrText>
       </w:r>
       <w:r>
         <w:rPr>
@@ -1331,7 +1469,7 @@
         <w:rPr>
           <w:noProof/>
         </w:rPr>
-        <w:t>4</w:t>
+        <w:t>5</w:t>
       </w:r>
       <w:r>
         <w:rPr>
@@ -1353,7 +1491,7 @@
           <w:kern w:val="2"/>
           <w:sz w:val="24"/>
           <w:szCs w:val="24"/>
-          <w:lang w:val="en-US"/>
+          <w:lang w:eastAsia="tr-TR"/>
           <w14:ligatures w14:val="standardContextual"/>
         </w:rPr>
       </w:pPr>
@@ -1371,7 +1509,7 @@
           <w:kern w:val="2"/>
           <w:sz w:val="24"/>
           <w:szCs w:val="24"/>
-          <w:lang w:val="en-US"/>
+          <w:lang w:eastAsia="tr-TR"/>
           <w14:ligatures w14:val="standardContextual"/>
         </w:rPr>
         <w:tab/>
@@ -1399,7 +1537,7 @@
         <w:rPr>
           <w:noProof/>
         </w:rPr>
-        <w:instrText xml:space="preserve"> PAGEREF _Toc243343165 \h </w:instrText>
+        <w:instrText xml:space="preserve"> PAGEREF _Toc243748924 \h </w:instrText>
       </w:r>
       <w:r>
         <w:rPr>
@@ -1416,7 +1554,7 @@
         <w:rPr>
           <w:noProof/>
         </w:rPr>
-        <w:t>4</w:t>
+        <w:t>5</w:t>
       </w:r>
       <w:r>
         <w:rPr>
@@ -1438,7 +1576,7 @@
           <w:kern w:val="2"/>
           <w:sz w:val="24"/>
           <w:szCs w:val="24"/>
-          <w:lang w:val="en-US"/>
+          <w:lang w:eastAsia="tr-TR"/>
           <w14:ligatures w14:val="standardContextual"/>
         </w:rPr>
       </w:pPr>
@@ -1456,7 +1594,7 @@
           <w:kern w:val="2"/>
           <w:sz w:val="24"/>
           <w:szCs w:val="24"/>
-          <w:lang w:val="en-US"/>
+          <w:lang w:eastAsia="tr-TR"/>
           <w14:ligatures w14:val="standardContextual"/>
         </w:rPr>
         <w:tab/>
@@ -1484,7 +1622,7 @@
         <w:rPr>
           <w:noProof/>
         </w:rPr>
-        <w:instrText xml:space="preserve"> PAGEREF _Toc243343166 \h </w:instrText>
+        <w:instrText xml:space="preserve"> PAGEREF _Toc243748925 \h </w:instrText>
       </w:r>
       <w:r>
         <w:rPr>
@@ -1501,7 +1639,7 @@
         <w:rPr>
           <w:noProof/>
         </w:rPr>
-        <w:t>4</w:t>
+        <w:t>5</w:t>
       </w:r>
       <w:r>
         <w:rPr>
@@ -1523,7 +1661,7 @@
           <w:kern w:val="2"/>
           <w:sz w:val="24"/>
           <w:szCs w:val="24"/>
-          <w:lang w:val="en-US"/>
+          <w:lang w:eastAsia="tr-TR"/>
           <w14:ligatures w14:val="standardContextual"/>
         </w:rPr>
       </w:pPr>
@@ -1541,7 +1679,7 @@
           <w:kern w:val="2"/>
           <w:sz w:val="24"/>
           <w:szCs w:val="24"/>
-          <w:lang w:val="en-US"/>
+          <w:lang w:eastAsia="tr-TR"/>
           <w14:ligatures w14:val="standardContextual"/>
         </w:rPr>
         <w:tab/>
@@ -1569,7 +1707,7 @@
         <w:rPr>
           <w:noProof/>
         </w:rPr>
-        <w:instrText xml:space="preserve"> PAGEREF _Toc243343167 \h </w:instrText>
+        <w:instrText xml:space="preserve"> PAGEREF _Toc243748926 \h </w:instrText>
       </w:r>
       <w:r>
         <w:rPr>
@@ -1586,7 +1724,7 @@
         <w:rPr>
           <w:noProof/>
         </w:rPr>
-        <w:t>4</w:t>
+        <w:t>5</w:t>
       </w:r>
       <w:r>
         <w:rPr>
@@ -1608,7 +1746,7 @@
           <w:kern w:val="2"/>
           <w:sz w:val="24"/>
           <w:szCs w:val="24"/>
-          <w:lang w:val="en-US"/>
+          <w:lang w:eastAsia="tr-TR"/>
           <w14:ligatures w14:val="standardContextual"/>
         </w:rPr>
       </w:pPr>
@@ -1626,7 +1764,7 @@
           <w:kern w:val="2"/>
           <w:sz w:val="24"/>
           <w:szCs w:val="24"/>
-          <w:lang w:val="en-US"/>
+          <w:lang w:eastAsia="tr-TR"/>
           <w14:ligatures w14:val="standardContextual"/>
         </w:rPr>
         <w:tab/>
@@ -1654,7 +1792,7 @@
         <w:rPr>
           <w:noProof/>
         </w:rPr>
-        <w:instrText xml:space="preserve"> PAGEREF _Toc243343168 \h </w:instrText>
+        <w:instrText xml:space="preserve"> PAGEREF _Toc243748927 \h </w:instrText>
       </w:r>
       <w:r>
         <w:rPr>
@@ -1671,7 +1809,7 @@
         <w:rPr>
           <w:noProof/>
         </w:rPr>
-        <w:t>4</w:t>
+        <w:t>5</w:t>
       </w:r>
       <w:r>
         <w:rPr>
@@ -1693,7 +1831,7 @@
           <w:kern w:val="2"/>
           <w:sz w:val="24"/>
           <w:szCs w:val="24"/>
-          <w:lang w:val="en-US"/>
+          <w:lang w:eastAsia="tr-TR"/>
           <w14:ligatures w14:val="standardContextual"/>
         </w:rPr>
       </w:pPr>
@@ -1711,7 +1849,7 @@
           <w:kern w:val="2"/>
           <w:sz w:val="24"/>
           <w:szCs w:val="24"/>
-          <w:lang w:val="en-US"/>
+          <w:lang w:eastAsia="tr-TR"/>
           <w14:ligatures w14:val="standardContextual"/>
         </w:rPr>
         <w:tab/>
@@ -1739,7 +1877,7 @@
         <w:rPr>
           <w:noProof/>
         </w:rPr>
-        <w:instrText xml:space="preserve"> PAGEREF _Toc243343169 \h </w:instrText>
+        <w:instrText xml:space="preserve"> PAGEREF _Toc243748928 \h </w:instrText>
       </w:r>
       <w:r>
         <w:rPr>
@@ -1756,7 +1894,7 @@
         <w:rPr>
           <w:noProof/>
         </w:rPr>
-        <w:t>4</w:t>
+        <w:t>5</w:t>
       </w:r>
       <w:r>
         <w:rPr>
@@ -1778,7 +1916,7 @@
           <w:kern w:val="2"/>
           <w:sz w:val="24"/>
           <w:szCs w:val="24"/>
-          <w:lang w:val="en-US"/>
+          <w:lang w:eastAsia="tr-TR"/>
           <w14:ligatures w14:val="standardContextual"/>
         </w:rPr>
       </w:pPr>
@@ -1796,7 +1934,7 @@
           <w:kern w:val="2"/>
           <w:sz w:val="24"/>
           <w:szCs w:val="24"/>
-          <w:lang w:val="en-US"/>
+          <w:lang w:eastAsia="tr-TR"/>
           <w14:ligatures w14:val="standardContextual"/>
         </w:rPr>
         <w:tab/>
@@ -1824,7 +1962,7 @@
         <w:rPr>
           <w:noProof/>
         </w:rPr>
-        <w:instrText xml:space="preserve"> PAGEREF _Toc243343170 \h </w:instrText>
+        <w:instrText xml:space="preserve"> PAGEREF _Toc243748929 \h </w:instrText>
       </w:r>
       <w:r>
         <w:rPr>
@@ -1841,7 +1979,7 @@
         <w:rPr>
           <w:noProof/>
         </w:rPr>
-        <w:t>4</w:t>
+        <w:t>6</w:t>
       </w:r>
       <w:r>
         <w:rPr>
@@ -1863,7 +2001,7 @@
           <w:kern w:val="2"/>
           <w:sz w:val="24"/>
           <w:szCs w:val="24"/>
-          <w:lang w:val="en-US"/>
+          <w:lang w:eastAsia="tr-TR"/>
           <w14:ligatures w14:val="standardContextual"/>
         </w:rPr>
       </w:pPr>
@@ -1881,7 +2019,7 @@
           <w:kern w:val="2"/>
           <w:sz w:val="24"/>
           <w:szCs w:val="24"/>
-          <w:lang w:val="en-US"/>
+          <w:lang w:eastAsia="tr-TR"/>
           <w14:ligatures w14:val="standardContextual"/>
         </w:rPr>
         <w:tab/>
@@ -1909,7 +2047,7 @@
         <w:rPr>
           <w:noProof/>
         </w:rPr>
-        <w:instrText xml:space="preserve"> PAGEREF _Toc243343171 \h </w:instrText>
+        <w:instrText xml:space="preserve"> PAGEREF _Toc243748930 \h </w:instrText>
       </w:r>
       <w:r>
         <w:rPr>
@@ -1926,7 +2064,7 @@
         <w:rPr>
           <w:noProof/>
         </w:rPr>
-        <w:t>4</w:t>
+        <w:t>6</w:t>
       </w:r>
       <w:r>
         <w:rPr>
@@ -1948,7 +2086,7 @@
           <w:kern w:val="2"/>
           <w:sz w:val="24"/>
           <w:szCs w:val="24"/>
-          <w:lang w:val="en-US"/>
+          <w:lang w:eastAsia="tr-TR"/>
           <w14:ligatures w14:val="standardContextual"/>
         </w:rPr>
       </w:pPr>
@@ -1966,7 +2104,7 @@
           <w:kern w:val="2"/>
           <w:sz w:val="24"/>
           <w:szCs w:val="24"/>
-          <w:lang w:val="en-US"/>
+          <w:lang w:eastAsia="tr-TR"/>
           <w14:ligatures w14:val="standardContextual"/>
         </w:rPr>
         <w:tab/>
@@ -1994,7 +2132,7 @@
         <w:rPr>
           <w:noProof/>
         </w:rPr>
-        <w:instrText xml:space="preserve"> PAGEREF _Toc243343172 \h </w:instrText>
+        <w:instrText xml:space="preserve"> PAGEREF _Toc243748931 \h </w:instrText>
       </w:r>
       <w:r>
         <w:rPr>
@@ -2011,7 +2149,7 @@
         <w:rPr>
           <w:noProof/>
         </w:rPr>
-        <w:t>4</w:t>
+        <w:t>6</w:t>
       </w:r>
       <w:r>
         <w:rPr>
@@ -2033,7 +2171,7 @@
           <w:kern w:val="2"/>
           <w:sz w:val="24"/>
           <w:szCs w:val="24"/>
-          <w:lang w:val="en-US"/>
+          <w:lang w:eastAsia="tr-TR"/>
           <w14:ligatures w14:val="standardContextual"/>
         </w:rPr>
       </w:pPr>
@@ -2051,7 +2189,7 @@
           <w:kern w:val="2"/>
           <w:sz w:val="24"/>
           <w:szCs w:val="24"/>
-          <w:lang w:val="en-US"/>
+          <w:lang w:eastAsia="tr-TR"/>
           <w14:ligatures w14:val="standardContextual"/>
         </w:rPr>
         <w:tab/>
@@ -2079,7 +2217,7 @@
         <w:rPr>
           <w:noProof/>
         </w:rPr>
-        <w:instrText xml:space="preserve"> PAGEREF _Toc243343173 \h </w:instrText>
+        <w:instrText xml:space="preserve"> PAGEREF _Toc243748932 \h </w:instrText>
       </w:r>
       <w:r>
         <w:rPr>
@@ -2096,7 +2234,7 @@
         <w:rPr>
           <w:noProof/>
         </w:rPr>
-        <w:t>4</w:t>
+        <w:t>6</w:t>
       </w:r>
       <w:r>
         <w:rPr>
@@ -2118,7 +2256,7 @@
           <w:kern w:val="2"/>
           <w:sz w:val="24"/>
           <w:szCs w:val="24"/>
-          <w:lang w:val="en-US"/>
+          <w:lang w:eastAsia="tr-TR"/>
           <w14:ligatures w14:val="standardContextual"/>
         </w:rPr>
       </w:pPr>
@@ -2136,7 +2274,7 @@
           <w:kern w:val="2"/>
           <w:sz w:val="24"/>
           <w:szCs w:val="24"/>
-          <w:lang w:val="en-US"/>
+          <w:lang w:eastAsia="tr-TR"/>
           <w14:ligatures w14:val="standardContextual"/>
         </w:rPr>
         <w:tab/>
@@ -2164,7 +2302,7 @@
         <w:rPr>
           <w:noProof/>
         </w:rPr>
-        <w:instrText xml:space="preserve"> PAGEREF _Toc243343174 \h </w:instrText>
+        <w:instrText xml:space="preserve"> PAGEREF _Toc243748933 \h </w:instrText>
       </w:r>
       <w:r>
         <w:rPr>
@@ -2181,7 +2319,7 @@
         <w:rPr>
           <w:noProof/>
         </w:rPr>
-        <w:t>4</w:t>
+        <w:t>6</w:t>
       </w:r>
       <w:r>
         <w:rPr>
@@ -2203,7 +2341,7 @@
           <w:kern w:val="2"/>
           <w:sz w:val="24"/>
           <w:szCs w:val="24"/>
-          <w:lang w:val="en-US"/>
+          <w:lang w:eastAsia="tr-TR"/>
           <w14:ligatures w14:val="standardContextual"/>
         </w:rPr>
       </w:pPr>
@@ -2221,7 +2359,7 @@
           <w:kern w:val="2"/>
           <w:sz w:val="24"/>
           <w:szCs w:val="24"/>
-          <w:lang w:val="en-US"/>
+          <w:lang w:eastAsia="tr-TR"/>
           <w14:ligatures w14:val="standardContextual"/>
         </w:rPr>
         <w:tab/>
@@ -2249,7 +2387,7 @@
         <w:rPr>
           <w:noProof/>
         </w:rPr>
-        <w:instrText xml:space="preserve"> PAGEREF _Toc243343175 \h </w:instrText>
+        <w:instrText xml:space="preserve"> PAGEREF _Toc243748934 \h </w:instrText>
       </w:r>
       <w:r>
         <w:rPr>
@@ -2266,7 +2404,7 @@
         <w:rPr>
           <w:noProof/>
         </w:rPr>
-        <w:t>4</w:t>
+        <w:t>6</w:t>
       </w:r>
       <w:r>
         <w:rPr>
@@ -2288,7 +2426,7 @@
           <w:kern w:val="2"/>
           <w:sz w:val="24"/>
           <w:szCs w:val="24"/>
-          <w:lang w:val="en-US"/>
+          <w:lang w:eastAsia="tr-TR"/>
           <w14:ligatures w14:val="standardContextual"/>
         </w:rPr>
       </w:pPr>
@@ -2306,7 +2444,7 @@
           <w:kern w:val="2"/>
           <w:sz w:val="24"/>
           <w:szCs w:val="24"/>
-          <w:lang w:val="en-US"/>
+          <w:lang w:eastAsia="tr-TR"/>
           <w14:ligatures w14:val="standardContextual"/>
         </w:rPr>
         <w:tab/>
@@ -2334,7 +2472,7 @@
         <w:rPr>
           <w:noProof/>
         </w:rPr>
-        <w:instrText xml:space="preserve"> PAGEREF _Toc243343176 \h </w:instrText>
+        <w:instrText xml:space="preserve"> PAGEREF _Toc243748935 \h </w:instrText>
       </w:r>
       <w:r>
         <w:rPr>
@@ -2351,7 +2489,7 @@
         <w:rPr>
           <w:noProof/>
         </w:rPr>
-        <w:t>4</w:t>
+        <w:t>6</w:t>
       </w:r>
       <w:r>
         <w:rPr>
@@ -2373,7 +2511,7 @@
           <w:kern w:val="2"/>
           <w:sz w:val="24"/>
           <w:szCs w:val="24"/>
-          <w:lang w:val="en-US"/>
+          <w:lang w:eastAsia="tr-TR"/>
           <w14:ligatures w14:val="standardContextual"/>
         </w:rPr>
       </w:pPr>
@@ -2391,7 +2529,7 @@
           <w:kern w:val="2"/>
           <w:sz w:val="24"/>
           <w:szCs w:val="24"/>
-          <w:lang w:val="en-US"/>
+          <w:lang w:eastAsia="tr-TR"/>
           <w14:ligatures w14:val="standardContextual"/>
         </w:rPr>
         <w:tab/>
@@ -2419,7 +2557,7 @@
         <w:rPr>
           <w:noProof/>
         </w:rPr>
-        <w:instrText xml:space="preserve"> PAGEREF _Toc243343177 \h </w:instrText>
+        <w:instrText xml:space="preserve"> PAGEREF _Toc243748936 \h </w:instrText>
       </w:r>
       <w:r>
         <w:rPr>
@@ -2436,7 +2574,7 @@
         <w:rPr>
           <w:noProof/>
         </w:rPr>
-        <w:t>4</w:t>
+        <w:t>6</w:t>
       </w:r>
       <w:r>
         <w:rPr>
@@ -2458,7 +2596,7 @@
           <w:kern w:val="2"/>
           <w:sz w:val="24"/>
           <w:szCs w:val="24"/>
-          <w:lang w:val="en-US"/>
+          <w:lang w:eastAsia="tr-TR"/>
           <w14:ligatures w14:val="standardContextual"/>
         </w:rPr>
       </w:pPr>
@@ -2476,7 +2614,7 @@
           <w:kern w:val="2"/>
           <w:sz w:val="24"/>
           <w:szCs w:val="24"/>
-          <w:lang w:val="en-US"/>
+          <w:lang w:eastAsia="tr-TR"/>
           <w14:ligatures w14:val="standardContextual"/>
         </w:rPr>
         <w:tab/>
@@ -2504,7 +2642,7 @@
         <w:rPr>
           <w:noProof/>
         </w:rPr>
-        <w:instrText xml:space="preserve"> PAGEREF _Toc243343178 \h </w:instrText>
+        <w:instrText xml:space="preserve"> PAGEREF _Toc243748937 \h </w:instrText>
       </w:r>
       <w:r>
         <w:rPr>
@@ -2521,7 +2659,7 @@
         <w:rPr>
           <w:noProof/>
         </w:rPr>
-        <w:t>5</w:t>
+        <w:t>6</w:t>
       </w:r>
       <w:r>
         <w:rPr>
@@ -2539,7 +2677,7 @@
           <w:kern w:val="2"/>
           <w:sz w:val="24"/>
           <w:szCs w:val="24"/>
-          <w:lang w:val="en-US"/>
+          <w:lang w:eastAsia="tr-TR"/>
           <w14:ligatures w14:val="standardContextual"/>
         </w:rPr>
       </w:pPr>
@@ -2557,7 +2695,7 @@
           <w:kern w:val="2"/>
           <w:sz w:val="24"/>
           <w:szCs w:val="24"/>
-          <w:lang w:val="en-US"/>
+          <w:lang w:eastAsia="tr-TR"/>
           <w14:ligatures w14:val="standardContextual"/>
         </w:rPr>
         <w:tab/>
@@ -2585,7 +2723,7 @@
         <w:rPr>
           <w:noProof/>
         </w:rPr>
-        <w:instrText xml:space="preserve"> PAGEREF _Toc243343179 \h </w:instrText>
+        <w:instrText xml:space="preserve"> PAGEREF _Toc243748938 \h </w:instrText>
       </w:r>
       <w:r>
         <w:rPr>
@@ -2602,7 +2740,7 @@
         <w:rPr>
           <w:noProof/>
         </w:rPr>
-        <w:t>5</w:t>
+        <w:t>6</w:t>
       </w:r>
       <w:r>
         <w:rPr>
@@ -2620,7 +2758,7 @@
           <w:kern w:val="2"/>
           <w:sz w:val="24"/>
           <w:szCs w:val="24"/>
-          <w:lang w:val="en-US"/>
+          <w:lang w:eastAsia="tr-TR"/>
           <w14:ligatures w14:val="standardContextual"/>
         </w:rPr>
       </w:pPr>
@@ -2638,7 +2776,7 @@
           <w:kern w:val="2"/>
           <w:sz w:val="24"/>
           <w:szCs w:val="24"/>
-          <w:lang w:val="en-US"/>
+          <w:lang w:eastAsia="tr-TR"/>
           <w14:ligatures w14:val="standardContextual"/>
         </w:rPr>
         <w:tab/>
@@ -2666,7 +2804,7 @@
         <w:rPr>
           <w:noProof/>
         </w:rPr>
-        <w:instrText xml:space="preserve"> PAGEREF _Toc243343180 \h </w:instrText>
+        <w:instrText xml:space="preserve"> PAGEREF _Toc243748939 \h </w:instrText>
       </w:r>
       <w:r>
         <w:rPr>
@@ -2683,7 +2821,7 @@
         <w:rPr>
           <w:noProof/>
         </w:rPr>
-        <w:t>5</w:t>
+        <w:t>6</w:t>
       </w:r>
       <w:r>
         <w:rPr>
@@ -2701,7 +2839,7 @@
           <w:kern w:val="2"/>
           <w:sz w:val="24"/>
           <w:szCs w:val="24"/>
-          <w:lang w:val="en-US"/>
+          <w:lang w:eastAsia="tr-TR"/>
           <w14:ligatures w14:val="standardContextual"/>
         </w:rPr>
       </w:pPr>
@@ -2719,7 +2857,7 @@
           <w:kern w:val="2"/>
           <w:sz w:val="24"/>
           <w:szCs w:val="24"/>
-          <w:lang w:val="en-US"/>
+          <w:lang w:eastAsia="tr-TR"/>
           <w14:ligatures w14:val="standardContextual"/>
         </w:rPr>
         <w:tab/>
@@ -2747,7 +2885,7 @@
         <w:rPr>
           <w:noProof/>
         </w:rPr>
-        <w:instrText xml:space="preserve"> PAGEREF _Toc243343181 \h </w:instrText>
+        <w:instrText xml:space="preserve"> PAGEREF _Toc243748940 \h </w:instrText>
       </w:r>
       <w:r>
         <w:rPr>
@@ -2764,7 +2902,7 @@
         <w:rPr>
           <w:noProof/>
         </w:rPr>
-        <w:t>5</w:t>
+        <w:t>6</w:t>
       </w:r>
       <w:r>
         <w:rPr>
@@ -2804,7 +2942,7 @@
           <w:lang w:val="en-US"/>
         </w:rPr>
       </w:pPr>
-      <w:bookmarkStart w:id="0" w:name="_Toc243343153"/>
+      <w:bookmarkStart w:id="0" w:name="_Toc243748910"/>
       <w:r>
         <w:rPr>
           <w:lang w:val="en-US"/>
@@ -2845,7 +2983,7 @@
           <w:lang w:val="en-US"/>
         </w:rPr>
       </w:pPr>
-      <w:bookmarkStart w:id="2" w:name="_Toc243343154"/>
+      <w:bookmarkStart w:id="2" w:name="_Toc243748911"/>
       <w:r>
         <w:rPr>
           <w:lang w:val="en-US"/>
@@ -2905,7 +3043,7 @@
           <w:lang w:val="en-US"/>
         </w:rPr>
       </w:pPr>
-      <w:bookmarkStart w:id="3" w:name="_Toc243343155"/>
+      <w:bookmarkStart w:id="3" w:name="_Toc243748912"/>
       <w:r>
         <w:rPr>
           <w:lang w:val="en-US"/>
@@ -3080,26 +3218,12 @@
           <w:lang w:val="en-US"/>
         </w:rPr>
       </w:pPr>
-      <w:bookmarkStart w:id="4" w:name="_Toc243343156"/>
-      <w:r>
-        <w:rPr>
-          <w:lang w:val="en-US"/>
-        </w:rPr>
-        <w:t xml:space="preserve">Objectives and success criteria </w:t>
-      </w:r>
-      <w:proofErr w:type="gramStart"/>
-      <w:r>
-        <w:rPr>
-          <w:lang w:val="en-US"/>
-        </w:rPr>
-        <w:t>of</w:t>
-      </w:r>
-      <w:proofErr w:type="gramEnd"/>
-      <w:r>
-        <w:rPr>
-          <w:lang w:val="en-US"/>
-        </w:rPr>
-        <w:t xml:space="preserve"> the project</w:t>
+      <w:bookmarkStart w:id="4" w:name="_Toc243748913"/>
+      <w:r>
+        <w:rPr>
+          <w:lang w:val="en-US"/>
+        </w:rPr>
+        <w:t>Objectives and success criteria of the project</w:t>
       </w:r>
       <w:bookmarkEnd w:id="4"/>
     </w:p>
@@ -3110,12 +3234,14 @@
           <w:lang w:val="en-US"/>
         </w:rPr>
       </w:pPr>
+      <w:bookmarkStart w:id="5" w:name="_Toc243748914"/>
       <w:r>
         <w:rPr>
           <w:lang w:val="en-US"/>
         </w:rPr>
         <w:t>Objectives</w:t>
       </w:r>
+      <w:bookmarkEnd w:id="5"/>
     </w:p>
     <w:p>
       <w:pPr>
@@ -3221,12 +3347,14 @@
           <w:lang w:val="en-US"/>
         </w:rPr>
       </w:pPr>
+      <w:bookmarkStart w:id="6" w:name="_Toc243748915"/>
       <w:r>
         <w:rPr>
           <w:lang w:val="en-US"/>
         </w:rPr>
         <w:t>Success criteria</w:t>
       </w:r>
+      <w:bookmarkEnd w:id="6"/>
     </w:p>
     <w:p>
       <w:pPr>
@@ -3320,14 +3448,14 @@
           <w:lang w:val="en-US"/>
         </w:rPr>
       </w:pPr>
-      <w:bookmarkStart w:id="5" w:name="_Toc243343157"/>
+      <w:bookmarkStart w:id="7" w:name="_Toc243748916"/>
       <w:r>
         <w:rPr>
           <w:lang w:val="en-US"/>
         </w:rPr>
         <w:t>Definitions, acronyms, and abbreviations</w:t>
       </w:r>
-      <w:bookmarkEnd w:id="5"/>
+      <w:bookmarkEnd w:id="7"/>
     </w:p>
     <w:tbl>
       <w:tblPr>
@@ -3410,21 +3538,7 @@
               <w:rPr>
                 <w:lang w:val="en-US"/>
               </w:rPr>
-              <w:t xml:space="preserve">In this document, </w:t>
-            </w:r>
-            <w:proofErr w:type="gramStart"/>
-            <w:r>
-              <w:rPr>
-                <w:lang w:val="en-US"/>
-              </w:rPr>
-              <w:t>a Jira</w:t>
-            </w:r>
-            <w:proofErr w:type="gramEnd"/>
-            <w:r>
-              <w:rPr>
-                <w:lang w:val="en-US"/>
-              </w:rPr>
-              <w:t xml:space="preserve"> backlog item of type Story. Its Summary contains a requirement.</w:t>
+              <w:t>In this document, a Jira backlog item of type Story. Its Summary contains a requirement.</w:t>
             </w:r>
           </w:p>
         </w:tc>
@@ -3658,21 +3772,7 @@
               <w:rPr>
                 <w:lang w:val="en-US"/>
               </w:rPr>
-              <w:t xml:space="preserve">A plain-text language </w:t>
-            </w:r>
-            <w:proofErr w:type="gramStart"/>
-            <w:r>
-              <w:rPr>
-                <w:lang w:val="en-US"/>
-              </w:rPr>
-              <w:t>used</w:t>
-            </w:r>
-            <w:proofErr w:type="gramEnd"/>
-            <w:r>
-              <w:rPr>
-                <w:lang w:val="en-US"/>
-              </w:rPr>
-              <w:t xml:space="preserve"> to describe behavior with the keywords Feature, Scenario, Given, When, and Then.</w:t>
+              <w:t>A plain-text language used to describe behavior with the keywords Feature, Scenario, Given, When, and Then.</w:t>
             </w:r>
           </w:p>
         </w:tc>
@@ -3768,14 +3868,14 @@
           <w:lang w:val="en-US"/>
         </w:rPr>
       </w:pPr>
-      <w:bookmarkStart w:id="6" w:name="_Toc243343158"/>
+      <w:bookmarkStart w:id="8" w:name="_Toc243748917"/>
       <w:r>
         <w:rPr>
           <w:lang w:val="en-US"/>
         </w:rPr>
         <w:t>References</w:t>
       </w:r>
-      <w:bookmarkEnd w:id="6"/>
+      <w:bookmarkEnd w:id="8"/>
     </w:p>
     <w:p>
       <w:pPr>
@@ -3869,21 +3969,7 @@
             <w:rStyle w:val="Kpr"/>
             <w:lang w:val="en-US"/>
           </w:rPr>
-          <w:t>https://alistairmavin.c</w:t>
-        </w:r>
-        <w:r>
-          <w:rPr>
-            <w:rStyle w:val="Kpr"/>
-            <w:lang w:val="en-US"/>
-          </w:rPr>
-          <w:t>o</w:t>
-        </w:r>
-        <w:r>
-          <w:rPr>
-            <w:rStyle w:val="Kpr"/>
-            <w:lang w:val="en-US"/>
-          </w:rPr>
-          <w:t>m/ears/</w:t>
+          <w:t>https://alistairmavin.com/ears/</w:t>
         </w:r>
       </w:hyperlink>
     </w:p>
@@ -3894,14 +3980,14 @@
           <w:lang w:val="en-US"/>
         </w:rPr>
       </w:pPr>
-      <w:bookmarkStart w:id="7" w:name="_Toc243343159"/>
+      <w:bookmarkStart w:id="9" w:name="_Toc243748918"/>
       <w:r>
         <w:rPr>
           <w:lang w:val="en-US"/>
         </w:rPr>
         <w:t>Overview</w:t>
       </w:r>
-      <w:bookmarkEnd w:id="7"/>
+      <w:bookmarkEnd w:id="9"/>
     </w:p>
     <w:p>
       <w:pPr>
@@ -3931,14 +4017,14 @@
           <w:lang w:val="en-US"/>
         </w:rPr>
       </w:pPr>
-      <w:bookmarkStart w:id="8" w:name="_Toc243343160"/>
+      <w:bookmarkStart w:id="10" w:name="_Toc243748919"/>
       <w:r>
         <w:rPr>
           <w:lang w:val="en-US"/>
         </w:rPr>
         <w:t>Current system</w:t>
       </w:r>
-      <w:bookmarkEnd w:id="8"/>
+      <w:bookmarkEnd w:id="10"/>
     </w:p>
     <w:p>
       <w:pPr>
@@ -3954,61 +4040,83 @@
           <w:iCs/>
           <w:lang w:val="en-US"/>
         </w:rPr>
-        <w:t xml:space="preserve">The second section, Current system, describes the current </w:t>
-      </w:r>
-      <w:proofErr w:type="gramStart"/>
-      <w:r>
+        <w:t>The second section, Current system, describes the current state of affairs. If the new system will replace an existing system, this section describes the functionality and the problems of the current system. Otherwise, this section describes how the tasks supported by the new system are accomplished now.</w:t>
+      </w:r>
+    </w:p>
+    <w:p>
+      <w:pPr>
+        <w:rPr>
+          <w:lang w:val="en-US"/>
+        </w:rPr>
+      </w:pPr>
+      <w:r>
+        <w:rPr>
+          <w:lang w:val="en-US"/>
+        </w:rPr>
+        <w:t xml:space="preserve"> </w:t>
+      </w:r>
+    </w:p>
+    <w:p>
+      <w:pPr>
+        <w:pStyle w:val="Balk1"/>
+        <w:rPr>
+          <w:lang w:val="en-US"/>
+        </w:rPr>
+      </w:pPr>
+      <w:bookmarkStart w:id="11" w:name="_Toc243748920"/>
+      <w:r>
+        <w:rPr>
+          <w:lang w:val="en-US"/>
+        </w:rPr>
+        <w:t>Proposed syste</w:t>
+      </w:r>
+      <w:r>
+        <w:rPr>
+          <w:lang w:val="en-US"/>
+        </w:rPr>
+        <w:t>m</w:t>
+      </w:r>
+      <w:bookmarkEnd w:id="11"/>
+    </w:p>
+    <w:p>
+      <w:pPr>
         <w:rPr>
           <w:i/>
           <w:iCs/>
           <w:lang w:val="en-US"/>
         </w:rPr>
-        <w:t>state of affairs</w:t>
-      </w:r>
-      <w:proofErr w:type="gramEnd"/>
+      </w:pPr>
       <w:r>
         <w:rPr>
           <w:i/>
           <w:iCs/>
           <w:lang w:val="en-US"/>
         </w:rPr>
-        <w:t>. If the new system will replace an existing system, this section describes the functionality and the problems of the current system. Otherwise, this section describes how the tasks supported by the new system are accomplished now.</w:t>
-      </w:r>
-    </w:p>
-    <w:p>
-      <w:pPr>
-        <w:rPr>
-          <w:lang w:val="en-US"/>
-        </w:rPr>
-      </w:pPr>
-      <w:r>
-        <w:rPr>
-          <w:lang w:val="en-US"/>
-        </w:rPr>
-        <w:t xml:space="preserve"> </w:t>
-      </w:r>
-    </w:p>
-    <w:p>
-      <w:pPr>
-        <w:pStyle w:val="Balk1"/>
-        <w:rPr>
-          <w:lang w:val="en-US"/>
-        </w:rPr>
-      </w:pPr>
-      <w:bookmarkStart w:id="9" w:name="_Toc243343161"/>
-      <w:r>
-        <w:rPr>
-          <w:lang w:val="en-US"/>
-        </w:rPr>
-        <w:t>Proposed syste</w:t>
-      </w:r>
-      <w:r>
-        <w:rPr>
-          <w:lang w:val="en-US"/>
-        </w:rPr>
-        <w:t>m</w:t>
-      </w:r>
-      <w:bookmarkEnd w:id="9"/>
+        <w:t>The third section documents the requirements elicitation and the analysis model of the new system.</w:t>
+      </w:r>
+    </w:p>
+    <w:p>
+      <w:pPr>
+        <w:rPr>
+          <w:lang w:val="en-US"/>
+        </w:rPr>
+      </w:pPr>
+    </w:p>
+    <w:p>
+      <w:pPr>
+        <w:pStyle w:val="Balk2"/>
+        <w:rPr>
+          <w:lang w:val="en-US"/>
+        </w:rPr>
+      </w:pPr>
+      <w:bookmarkStart w:id="12" w:name="_Toc243748921"/>
+      <w:r>
+        <w:rPr>
+          <w:lang w:val="en-US"/>
+        </w:rPr>
+        <w:t>Overview</w:t>
+      </w:r>
+      <w:bookmarkEnd w:id="12"/>
     </w:p>
     <w:p>
       <w:pPr>
@@ -4024,7 +4132,7 @@
           <w:iCs/>
           <w:lang w:val="en-US"/>
         </w:rPr>
-        <w:t>The third section documents the requirements elicitation and the analysis model of the new system.</w:t>
+        <w:t>The overview presents a functional overview of the system.</w:t>
       </w:r>
     </w:p>
     <w:p>
@@ -4041,14 +4149,14 @@
           <w:lang w:val="en-US"/>
         </w:rPr>
       </w:pPr>
-      <w:bookmarkStart w:id="10" w:name="_Toc243343162"/>
-      <w:r>
-        <w:rPr>
-          <w:lang w:val="en-US"/>
-        </w:rPr>
-        <w:t>Overview</w:t>
-      </w:r>
-      <w:bookmarkEnd w:id="10"/>
+      <w:bookmarkStart w:id="13" w:name="_Toc243748922"/>
+      <w:r>
+        <w:rPr>
+          <w:lang w:val="en-US"/>
+        </w:rPr>
+        <w:t>Functional requirements</w:t>
+      </w:r>
+      <w:bookmarkEnd w:id="13"/>
     </w:p>
     <w:p>
       <w:pPr>
@@ -4064,15 +4172,21 @@
           <w:iCs/>
           <w:lang w:val="en-US"/>
         </w:rPr>
-        <w:t>The overview presents a functional overview of the system.</w:t>
-      </w:r>
-    </w:p>
-    <w:p>
-      <w:pPr>
-        <w:rPr>
-          <w:lang w:val="en-US"/>
-        </w:rPr>
-      </w:pPr>
+        <w:t>Functional requirements describes the high-level functionality of the system.</w:t>
+      </w:r>
+    </w:p>
+    <w:p>
+      <w:pPr>
+        <w:rPr>
+          <w:lang w:val="en-US"/>
+        </w:rPr>
+      </w:pPr>
+      <w:r>
+        <w:rPr>
+          <w:lang w:val="en-US"/>
+        </w:rPr>
+        <w:t xml:space="preserve"> </w:t>
+      </w:r>
     </w:p>
     <w:p>
       <w:pPr>
@@ -4081,14 +4195,14 @@
           <w:lang w:val="en-US"/>
         </w:rPr>
       </w:pPr>
-      <w:bookmarkStart w:id="11" w:name="_Toc243343163"/>
-      <w:r>
-        <w:rPr>
-          <w:lang w:val="en-US"/>
-        </w:rPr>
-        <w:t>Functional requirements</w:t>
-      </w:r>
-      <w:bookmarkEnd w:id="11"/>
+      <w:bookmarkStart w:id="14" w:name="_Toc243748923"/>
+      <w:r>
+        <w:rPr>
+          <w:lang w:val="en-US"/>
+        </w:rPr>
+        <w:t>Nonfunctional requirements</w:t>
+      </w:r>
+      <w:bookmarkEnd w:id="14"/>
     </w:p>
     <w:p>
       <w:pPr>
@@ -4104,55 +4218,233 @@
           <w:iCs/>
           <w:lang w:val="en-US"/>
         </w:rPr>
-        <w:t xml:space="preserve">Functional requirements </w:t>
-      </w:r>
-      <w:proofErr w:type="gramStart"/>
-      <w:r>
+        <w:t>Nonfunctional requirements describes user-level requirements that are not directly related to functionality. This includes usability, reliability, performance, supportability, implementation, interface, operational, packaging, and legal requirements.</w:t>
+      </w:r>
+    </w:p>
+    <w:p>
+      <w:pPr>
+        <w:rPr>
+          <w:lang w:val="en-US"/>
+        </w:rPr>
+      </w:pPr>
+    </w:p>
+    <w:p>
+      <w:pPr>
+        <w:pStyle w:val="Balk3"/>
+        <w:rPr>
+          <w:lang w:val="en-US"/>
+        </w:rPr>
+      </w:pPr>
+      <w:bookmarkStart w:id="15" w:name="_Toc243748924"/>
+      <w:r>
+        <w:rPr>
+          <w:lang w:val="en-US"/>
+        </w:rPr>
+        <w:t>Usability</w:t>
+      </w:r>
+      <w:bookmarkEnd w:id="15"/>
+    </w:p>
+    <w:p>
+      <w:pPr>
+        <w:rPr>
+          <w:lang w:val="en-US"/>
+        </w:rPr>
+      </w:pPr>
+    </w:p>
+    <w:p>
+      <w:pPr>
+        <w:pStyle w:val="Balk3"/>
+        <w:rPr>
+          <w:lang w:val="en-US"/>
+        </w:rPr>
+      </w:pPr>
+      <w:bookmarkStart w:id="16" w:name="_Toc243748925"/>
+      <w:r>
+        <w:rPr>
+          <w:lang w:val="en-US"/>
+        </w:rPr>
+        <w:t>Reliability</w:t>
+      </w:r>
+      <w:bookmarkEnd w:id="16"/>
+    </w:p>
+    <w:p>
+      <w:pPr>
+        <w:rPr>
+          <w:lang w:val="en-US"/>
+        </w:rPr>
+      </w:pPr>
+    </w:p>
+    <w:p>
+      <w:pPr>
+        <w:pStyle w:val="Balk3"/>
+        <w:rPr>
+          <w:lang w:val="en-US"/>
+        </w:rPr>
+      </w:pPr>
+      <w:bookmarkStart w:id="17" w:name="_Toc243748926"/>
+      <w:r>
+        <w:rPr>
+          <w:lang w:val="en-US"/>
+        </w:rPr>
+        <w:t>Performance</w:t>
+      </w:r>
+      <w:bookmarkEnd w:id="17"/>
+    </w:p>
+    <w:p>
+      <w:pPr>
+        <w:rPr>
+          <w:lang w:val="en-US"/>
+        </w:rPr>
+      </w:pPr>
+    </w:p>
+    <w:p>
+      <w:pPr>
+        <w:pStyle w:val="Balk3"/>
+        <w:rPr>
+          <w:lang w:val="en-US"/>
+        </w:rPr>
+      </w:pPr>
+      <w:bookmarkStart w:id="18" w:name="_Toc243748927"/>
+      <w:r>
+        <w:rPr>
+          <w:lang w:val="en-US"/>
+        </w:rPr>
+        <w:t>Supportability</w:t>
+      </w:r>
+      <w:bookmarkEnd w:id="18"/>
+    </w:p>
+    <w:p>
+      <w:pPr>
+        <w:rPr>
+          <w:lang w:val="en-US"/>
+        </w:rPr>
+      </w:pPr>
+    </w:p>
+    <w:p>
+      <w:pPr>
+        <w:pStyle w:val="Balk3"/>
+        <w:rPr>
+          <w:lang w:val="en-US"/>
+        </w:rPr>
+      </w:pPr>
+      <w:bookmarkStart w:id="19" w:name="_Toc243748928"/>
+      <w:r>
+        <w:rPr>
+          <w:lang w:val="en-US"/>
+        </w:rPr>
+        <w:t>Implementation</w:t>
+      </w:r>
+      <w:bookmarkEnd w:id="19"/>
+    </w:p>
+    <w:p>
+      <w:pPr>
+        <w:rPr>
+          <w:lang w:val="en-US"/>
+        </w:rPr>
+      </w:pPr>
+    </w:p>
+    <w:p>
+      <w:pPr>
+        <w:pStyle w:val="Balk3"/>
+        <w:rPr>
+          <w:lang w:val="en-US"/>
+        </w:rPr>
+      </w:pPr>
+      <w:bookmarkStart w:id="20" w:name="_Toc243748929"/>
+      <w:r>
+        <w:rPr>
+          <w:lang w:val="en-US"/>
+        </w:rPr>
+        <w:lastRenderedPageBreak/>
+        <w:t>Interface</w:t>
+      </w:r>
+      <w:bookmarkEnd w:id="20"/>
+    </w:p>
+    <w:p>
+      <w:pPr>
+        <w:rPr>
+          <w:lang w:val="en-US"/>
+        </w:rPr>
+      </w:pPr>
+    </w:p>
+    <w:p>
+      <w:pPr>
+        <w:pStyle w:val="Balk3"/>
+        <w:rPr>
+          <w:lang w:val="en-US"/>
+        </w:rPr>
+      </w:pPr>
+      <w:bookmarkStart w:id="21" w:name="_Toc243748930"/>
+      <w:r>
+        <w:rPr>
+          <w:lang w:val="en-US"/>
+        </w:rPr>
+        <w:t>Packaging</w:t>
+      </w:r>
+      <w:bookmarkEnd w:id="21"/>
+    </w:p>
+    <w:p>
+      <w:pPr>
+        <w:rPr>
+          <w:lang w:val="en-US"/>
+        </w:rPr>
+      </w:pPr>
+    </w:p>
+    <w:p>
+      <w:pPr>
+        <w:pStyle w:val="Balk3"/>
+        <w:rPr>
+          <w:lang w:val="en-US"/>
+        </w:rPr>
+      </w:pPr>
+      <w:bookmarkStart w:id="22" w:name="_Toc243748931"/>
+      <w:r>
+        <w:rPr>
+          <w:lang w:val="en-US"/>
+        </w:rPr>
+        <w:t>Legal</w:t>
+      </w:r>
+      <w:bookmarkEnd w:id="22"/>
+    </w:p>
+    <w:p>
+      <w:pPr>
+        <w:rPr>
+          <w:lang w:val="en-US"/>
+        </w:rPr>
+      </w:pPr>
+    </w:p>
+    <w:p>
+      <w:pPr>
+        <w:pStyle w:val="Balk2"/>
+        <w:rPr>
+          <w:lang w:val="en-US"/>
+        </w:rPr>
+      </w:pPr>
+      <w:bookmarkStart w:id="23" w:name="_Toc243748932"/>
+      <w:r>
+        <w:rPr>
+          <w:lang w:val="en-US"/>
+        </w:rPr>
+        <w:t>System models</w:t>
+      </w:r>
+      <w:bookmarkEnd w:id="23"/>
+    </w:p>
+    <w:p>
+      <w:pPr>
         <w:rPr>
           <w:i/>
           <w:iCs/>
           <w:lang w:val="en-US"/>
         </w:rPr>
-        <w:t>describes</w:t>
-      </w:r>
-      <w:proofErr w:type="gramEnd"/>
+      </w:pPr>
       <w:r>
         <w:rPr>
           <w:i/>
           <w:iCs/>
           <w:lang w:val="en-US"/>
         </w:rPr>
-        <w:t xml:space="preserve"> the high-level functionality of the system.</w:t>
-      </w:r>
-    </w:p>
-    <w:p>
-      <w:pPr>
-        <w:rPr>
-          <w:lang w:val="en-US"/>
-        </w:rPr>
-      </w:pPr>
-      <w:r>
-        <w:rPr>
-          <w:lang w:val="en-US"/>
-        </w:rPr>
-        <w:t xml:space="preserve"> </w:t>
-      </w:r>
-    </w:p>
-    <w:p>
-      <w:pPr>
-        <w:pStyle w:val="Balk2"/>
-        <w:rPr>
-          <w:lang w:val="en-US"/>
-        </w:rPr>
-      </w:pPr>
-      <w:bookmarkStart w:id="12" w:name="_Toc243343164"/>
-      <w:r>
-        <w:rPr>
-          <w:lang w:val="en-US"/>
-        </w:rPr>
-        <w:t>Nonfunctional requirements</w:t>
-      </w:r>
-      <w:bookmarkEnd w:id="12"/>
+        <w:t>System models describes the scenarios, use cases, object model, and dynamic models for the system. This section contains the complete functional specification, including mock-ups illustrating the user interface of the system and navigational paths representing the sequence of screens. The subsections Object model and Dynamic model are written during the Analysis activity.</w:t>
+      </w:r>
     </w:p>
     <w:p>
       <w:pPr>
@@ -4162,240 +4454,174 @@
           <w:lang w:val="en-US"/>
         </w:rPr>
       </w:pPr>
-      <w:r>
+    </w:p>
+    <w:p>
+      <w:pPr>
+        <w:pStyle w:val="Balk3"/>
+        <w:rPr>
+          <w:lang w:val="en-US"/>
+        </w:rPr>
+      </w:pPr>
+      <w:bookmarkStart w:id="24" w:name="_Toc243748933"/>
+      <w:r>
+        <w:rPr>
+          <w:lang w:val="en-US"/>
+        </w:rPr>
+        <w:t>Scenarios</w:t>
+      </w:r>
+      <w:bookmarkEnd w:id="24"/>
+    </w:p>
+    <w:p>
+      <w:pPr>
+        <w:rPr>
+          <w:lang w:val="en-US"/>
+        </w:rPr>
+      </w:pPr>
+    </w:p>
+    <w:p>
+      <w:pPr>
+        <w:pStyle w:val="Balk3"/>
+        <w:rPr>
+          <w:lang w:val="en-US"/>
+        </w:rPr>
+      </w:pPr>
+      <w:bookmarkStart w:id="25" w:name="_Toc243748934"/>
+      <w:r>
+        <w:rPr>
+          <w:lang w:val="en-US"/>
+        </w:rPr>
+        <w:t>Use case model</w:t>
+      </w:r>
+      <w:bookmarkEnd w:id="25"/>
+    </w:p>
+    <w:p>
+      <w:pPr>
+        <w:rPr>
+          <w:lang w:val="en-US"/>
+        </w:rPr>
+      </w:pPr>
+    </w:p>
+    <w:p>
+      <w:pPr>
+        <w:pStyle w:val="Balk3"/>
+        <w:rPr>
+          <w:lang w:val="en-US"/>
+        </w:rPr>
+      </w:pPr>
+      <w:bookmarkStart w:id="26" w:name="_Toc243748935"/>
+      <w:r>
+        <w:rPr>
+          <w:lang w:val="en-US"/>
+        </w:rPr>
+        <w:t>Object model</w:t>
+      </w:r>
+      <w:bookmarkEnd w:id="26"/>
+    </w:p>
+    <w:p>
+      <w:pPr>
+        <w:rPr>
+          <w:lang w:val="en-US"/>
+        </w:rPr>
+      </w:pPr>
+    </w:p>
+    <w:p>
+      <w:pPr>
+        <w:pStyle w:val="Balk3"/>
+        <w:rPr>
+          <w:lang w:val="en-US"/>
+        </w:rPr>
+      </w:pPr>
+      <w:bookmarkStart w:id="27" w:name="_Toc243748936"/>
+      <w:r>
+        <w:rPr>
+          <w:lang w:val="en-US"/>
+        </w:rPr>
+        <w:t>Dynamic model</w:t>
+      </w:r>
+      <w:bookmarkEnd w:id="27"/>
+    </w:p>
+    <w:p>
+      <w:pPr>
+        <w:rPr>
+          <w:lang w:val="en-US"/>
+        </w:rPr>
+      </w:pPr>
+    </w:p>
+    <w:p>
+      <w:pPr>
+        <w:pStyle w:val="Balk3"/>
+        <w:rPr>
+          <w:lang w:val="en-US"/>
+        </w:rPr>
+      </w:pPr>
+      <w:bookmarkStart w:id="28" w:name="_Toc243748937"/>
+      <w:r>
+        <w:rPr>
+          <w:lang w:val="en-US"/>
+        </w:rPr>
+        <w:t>User interface</w:t>
+      </w:r>
+      <w:r>
+        <w:rPr>
+          <w:lang w:val="en-US"/>
+        </w:rPr>
+        <w:t>s and Mock-ups</w:t>
+      </w:r>
+      <w:bookmarkEnd w:id="28"/>
+    </w:p>
+    <w:p>
+      <w:pPr>
+        <w:rPr>
+          <w:lang w:val="en-US"/>
+        </w:rPr>
+      </w:pPr>
+    </w:p>
+    <w:p>
+      <w:pPr>
+        <w:pStyle w:val="Balk1"/>
+        <w:rPr>
+          <w:lang w:val="en-US"/>
+        </w:rPr>
+      </w:pPr>
+      <w:bookmarkStart w:id="29" w:name="_Toc243748938"/>
+      <w:r>
+        <w:rPr>
+          <w:lang w:val="en-US"/>
+        </w:rPr>
+        <w:t>Glossary</w:t>
+      </w:r>
+      <w:r>
+        <w:rPr>
+          <w:lang w:val="en-US"/>
+        </w:rPr>
+        <w:t xml:space="preserve"> of Terms</w:t>
+      </w:r>
+      <w:bookmarkEnd w:id="29"/>
+    </w:p>
+    <w:p>
+      <w:pPr>
         <w:rPr>
           <w:i/>
           <w:iCs/>
           <w:lang w:val="en-US"/>
         </w:rPr>
-        <w:t xml:space="preserve">Nonfunctional requirements </w:t>
-      </w:r>
-      <w:proofErr w:type="gramStart"/>
+      </w:pPr>
       <w:r>
         <w:rPr>
           <w:i/>
           <w:iCs/>
           <w:lang w:val="en-US"/>
         </w:rPr>
-        <w:t>describes</w:t>
-      </w:r>
-      <w:proofErr w:type="gramEnd"/>
+        <w:t>A</w:t>
+      </w:r>
       <w:r>
         <w:rPr>
           <w:i/>
           <w:iCs/>
           <w:lang w:val="en-US"/>
         </w:rPr>
-        <w:t xml:space="preserve"> user-level requirements that are not directly related to functionality. This includes usability, reliability, performance, supportability, implementation, interface, operational, packaging, and legal requirements.</w:t>
-      </w:r>
-    </w:p>
-    <w:p>
-      <w:pPr>
-        <w:rPr>
-          <w:lang w:val="en-US"/>
-        </w:rPr>
-      </w:pPr>
-    </w:p>
-    <w:p>
-      <w:pPr>
-        <w:pStyle w:val="Balk3"/>
-        <w:rPr>
-          <w:lang w:val="en-US"/>
-        </w:rPr>
-      </w:pPr>
-      <w:bookmarkStart w:id="13" w:name="_Toc243343165"/>
-      <w:r>
-        <w:rPr>
-          <w:lang w:val="en-US"/>
-        </w:rPr>
-        <w:t>Usability</w:t>
-      </w:r>
-      <w:bookmarkEnd w:id="13"/>
-    </w:p>
-    <w:p>
-      <w:pPr>
-        <w:rPr>
-          <w:lang w:val="en-US"/>
-        </w:rPr>
-      </w:pPr>
-    </w:p>
-    <w:p>
-      <w:pPr>
-        <w:pStyle w:val="Balk3"/>
-        <w:rPr>
-          <w:lang w:val="en-US"/>
-        </w:rPr>
-      </w:pPr>
-      <w:bookmarkStart w:id="14" w:name="_Toc243343166"/>
-      <w:r>
-        <w:rPr>
-          <w:lang w:val="en-US"/>
-        </w:rPr>
-        <w:t>Reliability</w:t>
-      </w:r>
-      <w:bookmarkEnd w:id="14"/>
-    </w:p>
-    <w:p>
-      <w:pPr>
-        <w:rPr>
-          <w:lang w:val="en-US"/>
-        </w:rPr>
-      </w:pPr>
-    </w:p>
-    <w:p>
-      <w:pPr>
-        <w:pStyle w:val="Balk3"/>
-        <w:rPr>
-          <w:lang w:val="en-US"/>
-        </w:rPr>
-      </w:pPr>
-      <w:bookmarkStart w:id="15" w:name="_Toc243343167"/>
-      <w:r>
-        <w:rPr>
-          <w:lang w:val="en-US"/>
-        </w:rPr>
-        <w:t>Performance</w:t>
-      </w:r>
-      <w:bookmarkEnd w:id="15"/>
-    </w:p>
-    <w:p>
-      <w:pPr>
-        <w:rPr>
-          <w:lang w:val="en-US"/>
-        </w:rPr>
-      </w:pPr>
-    </w:p>
-    <w:p>
-      <w:pPr>
-        <w:pStyle w:val="Balk3"/>
-        <w:rPr>
-          <w:lang w:val="en-US"/>
-        </w:rPr>
-      </w:pPr>
-      <w:bookmarkStart w:id="16" w:name="_Toc243343168"/>
-      <w:r>
-        <w:rPr>
-          <w:lang w:val="en-US"/>
-        </w:rPr>
-        <w:t>Supportability</w:t>
-      </w:r>
-      <w:bookmarkEnd w:id="16"/>
-    </w:p>
-    <w:p>
-      <w:pPr>
-        <w:rPr>
-          <w:lang w:val="en-US"/>
-        </w:rPr>
-      </w:pPr>
-    </w:p>
-    <w:p>
-      <w:pPr>
-        <w:pStyle w:val="Balk3"/>
-        <w:rPr>
-          <w:lang w:val="en-US"/>
-        </w:rPr>
-      </w:pPr>
-      <w:bookmarkStart w:id="17" w:name="_Toc243343169"/>
-      <w:r>
-        <w:rPr>
-          <w:lang w:val="en-US"/>
-        </w:rPr>
-        <w:t>Implementation</w:t>
-      </w:r>
-      <w:bookmarkEnd w:id="17"/>
-    </w:p>
-    <w:p>
-      <w:pPr>
-        <w:rPr>
-          <w:lang w:val="en-US"/>
-        </w:rPr>
-      </w:pPr>
-    </w:p>
-    <w:p>
-      <w:pPr>
-        <w:pStyle w:val="Balk3"/>
-        <w:rPr>
-          <w:lang w:val="en-US"/>
-        </w:rPr>
-      </w:pPr>
-      <w:bookmarkStart w:id="18" w:name="_Toc243343170"/>
-      <w:r>
-        <w:rPr>
-          <w:lang w:val="en-US"/>
-        </w:rPr>
-        <w:lastRenderedPageBreak/>
-        <w:t>Interface</w:t>
-      </w:r>
-      <w:bookmarkEnd w:id="18"/>
-    </w:p>
-    <w:p>
-      <w:pPr>
-        <w:rPr>
-          <w:lang w:val="en-US"/>
-        </w:rPr>
-      </w:pPr>
-    </w:p>
-    <w:p>
-      <w:pPr>
-        <w:pStyle w:val="Balk3"/>
-        <w:rPr>
-          <w:lang w:val="en-US"/>
-        </w:rPr>
-      </w:pPr>
-      <w:bookmarkStart w:id="19" w:name="_Toc243343171"/>
-      <w:r>
-        <w:rPr>
-          <w:lang w:val="en-US"/>
-        </w:rPr>
-        <w:t>Packaging</w:t>
-      </w:r>
-      <w:bookmarkEnd w:id="19"/>
-    </w:p>
-    <w:p>
-      <w:pPr>
-        <w:rPr>
-          <w:lang w:val="en-US"/>
-        </w:rPr>
-      </w:pPr>
-    </w:p>
-    <w:p>
-      <w:pPr>
-        <w:pStyle w:val="Balk3"/>
-        <w:rPr>
-          <w:lang w:val="en-US"/>
-        </w:rPr>
-      </w:pPr>
-      <w:bookmarkStart w:id="20" w:name="_Toc243343172"/>
-      <w:r>
-        <w:rPr>
-          <w:lang w:val="en-US"/>
-        </w:rPr>
-        <w:t>Legal</w:t>
-      </w:r>
-      <w:bookmarkEnd w:id="20"/>
-    </w:p>
-    <w:p>
-      <w:pPr>
-        <w:rPr>
-          <w:lang w:val="en-US"/>
-        </w:rPr>
-      </w:pPr>
-    </w:p>
-    <w:p>
-      <w:pPr>
-        <w:pStyle w:val="Balk2"/>
-        <w:rPr>
-          <w:lang w:val="en-US"/>
-        </w:rPr>
-      </w:pPr>
-      <w:bookmarkStart w:id="21" w:name="_Toc243343173"/>
-      <w:r>
-        <w:rPr>
-          <w:lang w:val="en-US"/>
-        </w:rPr>
-        <w:t>System models</w:t>
-      </w:r>
-      <w:bookmarkEnd w:id="21"/>
+        <w:t xml:space="preserve"> glossary of important terms, to ensure consistency in the specification and to ensure that we use the client’s terms.</w:t>
+      </w:r>
     </w:p>
     <w:p>
       <w:pPr>
@@ -4405,197 +4631,55 @@
           <w:lang w:val="en-US"/>
         </w:rPr>
       </w:pPr>
-      <w:r>
+    </w:p>
+    <w:p>
+      <w:pPr>
+        <w:pStyle w:val="Balk1"/>
+        <w:rPr>
+          <w:lang w:val="en-US"/>
+        </w:rPr>
+      </w:pPr>
+      <w:bookmarkStart w:id="30" w:name="_Toc243748939"/>
+      <w:r>
+        <w:rPr>
+          <w:lang w:val="en-US"/>
+        </w:rPr>
+        <w:t>Priority</w:t>
+      </w:r>
+      <w:bookmarkEnd w:id="30"/>
+    </w:p>
+    <w:p>
+      <w:pPr>
         <w:rPr>
           <w:i/>
           <w:iCs/>
           <w:lang w:val="en-US"/>
         </w:rPr>
-        <w:t xml:space="preserve">System models </w:t>
-      </w:r>
-      <w:proofErr w:type="gramStart"/>
+      </w:pPr>
       <w:r>
         <w:rPr>
           <w:i/>
           <w:iCs/>
           <w:lang w:val="en-US"/>
         </w:rPr>
-        <w:t>describes</w:t>
-      </w:r>
-      <w:proofErr w:type="gramEnd"/>
+        <w:t>Priority of the requirements</w:t>
+      </w:r>
       <w:r>
         <w:rPr>
           <w:i/>
           <w:iCs/>
           <w:lang w:val="en-US"/>
         </w:rPr>
-        <w:t xml:space="preserve"> the scenarios, use cases, object </w:t>
-      </w:r>
-      <w:proofErr w:type="gramStart"/>
-      <w:r>
+        <w:t>.</w:t>
+      </w:r>
+    </w:p>
+    <w:p>
+      <w:pPr>
         <w:rPr>
           <w:i/>
           <w:iCs/>
           <w:lang w:val="en-US"/>
         </w:rPr>
-        <w:t>model</w:t>
-      </w:r>
-      <w:proofErr w:type="gramEnd"/>
-      <w:r>
-        <w:rPr>
-          <w:i/>
-          <w:iCs/>
-          <w:lang w:val="en-US"/>
-        </w:rPr>
-        <w:t xml:space="preserve">, and dynamic models for the system. This section contains </w:t>
-      </w:r>
-      <w:proofErr w:type="gramStart"/>
-      <w:r>
-        <w:rPr>
-          <w:i/>
-          <w:iCs/>
-          <w:lang w:val="en-US"/>
-        </w:rPr>
-        <w:t>the complete functional specification</w:t>
-      </w:r>
-      <w:proofErr w:type="gramEnd"/>
-      <w:r>
-        <w:rPr>
-          <w:i/>
-          <w:iCs/>
-          <w:lang w:val="en-US"/>
-        </w:rPr>
-        <w:t>, including mock-ups illustrating the user interface of the system and navigational paths representing the sequence of screens. The subsections Object model and Dynamic model are written during the Analysis activity.</w:t>
-      </w:r>
-    </w:p>
-    <w:p>
-      <w:pPr>
-        <w:rPr>
-          <w:i/>
-          <w:iCs/>
-          <w:lang w:val="en-US"/>
-        </w:rPr>
-      </w:pPr>
-    </w:p>
-    <w:p>
-      <w:pPr>
-        <w:pStyle w:val="Balk3"/>
-        <w:rPr>
-          <w:lang w:val="en-US"/>
-        </w:rPr>
-      </w:pPr>
-      <w:bookmarkStart w:id="22" w:name="_Toc243343174"/>
-      <w:r>
-        <w:rPr>
-          <w:lang w:val="en-US"/>
-        </w:rPr>
-        <w:t>Scenarios</w:t>
-      </w:r>
-      <w:bookmarkEnd w:id="22"/>
-    </w:p>
-    <w:p>
-      <w:pPr>
-        <w:rPr>
-          <w:lang w:val="en-US"/>
-        </w:rPr>
-      </w:pPr>
-    </w:p>
-    <w:p>
-      <w:pPr>
-        <w:pStyle w:val="Balk3"/>
-        <w:rPr>
-          <w:lang w:val="en-US"/>
-        </w:rPr>
-      </w:pPr>
-      <w:bookmarkStart w:id="23" w:name="_Toc243343175"/>
-      <w:r>
-        <w:rPr>
-          <w:lang w:val="en-US"/>
-        </w:rPr>
-        <w:t>Use case model</w:t>
-      </w:r>
-      <w:bookmarkEnd w:id="23"/>
-    </w:p>
-    <w:p>
-      <w:pPr>
-        <w:rPr>
-          <w:lang w:val="en-US"/>
-        </w:rPr>
-      </w:pPr>
-    </w:p>
-    <w:p>
-      <w:pPr>
-        <w:pStyle w:val="Balk3"/>
-        <w:rPr>
-          <w:lang w:val="en-US"/>
-        </w:rPr>
-      </w:pPr>
-      <w:bookmarkStart w:id="24" w:name="_Toc243343176"/>
-      <w:r>
-        <w:rPr>
-          <w:lang w:val="en-US"/>
-        </w:rPr>
-        <w:t>Object model</w:t>
-      </w:r>
-      <w:bookmarkEnd w:id="24"/>
-    </w:p>
-    <w:p>
-      <w:pPr>
-        <w:rPr>
-          <w:lang w:val="en-US"/>
-        </w:rPr>
-      </w:pPr>
-    </w:p>
-    <w:p>
-      <w:pPr>
-        <w:pStyle w:val="Balk3"/>
-        <w:rPr>
-          <w:lang w:val="en-US"/>
-        </w:rPr>
-      </w:pPr>
-      <w:bookmarkStart w:id="25" w:name="_Toc243343177"/>
-      <w:r>
-        <w:rPr>
-          <w:lang w:val="en-US"/>
-        </w:rPr>
-        <w:t>Dynamic model</w:t>
-      </w:r>
-      <w:bookmarkEnd w:id="25"/>
-    </w:p>
-    <w:p>
-      <w:pPr>
-        <w:rPr>
-          <w:lang w:val="en-US"/>
-        </w:rPr>
-      </w:pPr>
-    </w:p>
-    <w:p>
-      <w:pPr>
-        <w:pStyle w:val="Balk3"/>
-        <w:rPr>
-          <w:lang w:val="en-US"/>
-        </w:rPr>
-      </w:pPr>
-      <w:bookmarkStart w:id="26" w:name="_Toc243343178"/>
-      <w:r>
-        <w:rPr>
-          <w:lang w:val="en-US"/>
-        </w:rPr>
-        <w:t>User interface</w:t>
-      </w:r>
-      <w:r>
-        <w:rPr>
-          <w:lang w:val="en-US"/>
-        </w:rPr>
-        <w:t>s and Mock-ups</w:t>
-      </w:r>
-      <w:bookmarkEnd w:id="26"/>
-    </w:p>
-    <w:p>
-      <w:pPr>
-        <w:rPr>
-          <w:lang w:val="en-US"/>
-        </w:rPr>
       </w:pPr>
     </w:p>
     <w:p>
@@ -4605,120 +4689,14 @@
           <w:lang w:val="en-US"/>
         </w:rPr>
       </w:pPr>
-      <w:bookmarkStart w:id="27" w:name="_Toc243343179"/>
-      <w:r>
-        <w:rPr>
-          <w:lang w:val="en-US"/>
-        </w:rPr>
-        <w:t>Glossary</w:t>
-      </w:r>
-      <w:r>
-        <w:rPr>
-          <w:lang w:val="en-US"/>
-        </w:rPr>
-        <w:t xml:space="preserve"> of Terms</w:t>
-      </w:r>
-      <w:bookmarkEnd w:id="27"/>
-    </w:p>
-    <w:p>
-      <w:pPr>
-        <w:rPr>
-          <w:i/>
-          <w:iCs/>
-          <w:lang w:val="en-US"/>
-        </w:rPr>
-      </w:pPr>
-      <w:r>
-        <w:rPr>
-          <w:i/>
-          <w:iCs/>
-          <w:lang w:val="en-US"/>
-        </w:rPr>
-        <w:t>A</w:t>
-      </w:r>
-      <w:r>
-        <w:rPr>
-          <w:i/>
-          <w:iCs/>
-          <w:lang w:val="en-US"/>
-        </w:rPr>
-        <w:t xml:space="preserve"> glossary of important terms, to ensure consistency in the specification and to ensure that we use the client’s terms.</w:t>
-      </w:r>
-    </w:p>
-    <w:p>
-      <w:pPr>
-        <w:rPr>
-          <w:i/>
-          <w:iCs/>
-          <w:lang w:val="en-US"/>
-        </w:rPr>
-      </w:pPr>
-    </w:p>
-    <w:p>
-      <w:pPr>
-        <w:pStyle w:val="Balk1"/>
-        <w:rPr>
-          <w:lang w:val="en-US"/>
-        </w:rPr>
-      </w:pPr>
-      <w:bookmarkStart w:id="28" w:name="_Toc243343180"/>
-      <w:r>
-        <w:rPr>
-          <w:lang w:val="en-US"/>
-        </w:rPr>
-        <w:t>Priority</w:t>
-      </w:r>
-      <w:bookmarkEnd w:id="28"/>
-    </w:p>
-    <w:p>
-      <w:pPr>
-        <w:rPr>
-          <w:i/>
-          <w:iCs/>
-          <w:lang w:val="en-US"/>
-        </w:rPr>
-      </w:pPr>
-      <w:r>
-        <w:rPr>
-          <w:i/>
-          <w:iCs/>
-          <w:lang w:val="en-US"/>
-        </w:rPr>
-        <w:t>Priority of the requirements</w:t>
-      </w:r>
-      <w:r>
-        <w:rPr>
-          <w:i/>
-          <w:iCs/>
-          <w:lang w:val="en-US"/>
-        </w:rPr>
-        <w:t>.</w:t>
-      </w:r>
-    </w:p>
-    <w:p>
-      <w:pPr>
-        <w:rPr>
-          <w:i/>
-          <w:iCs/>
-          <w:lang w:val="en-US"/>
-        </w:rPr>
-      </w:pPr>
-    </w:p>
-    <w:p>
-      <w:pPr>
-        <w:pStyle w:val="Balk1"/>
-        <w:rPr>
-          <w:lang w:val="en-US"/>
-        </w:rPr>
-      </w:pPr>
-      <w:bookmarkStart w:id="29" w:name="_Toc243343181"/>
+      <w:bookmarkStart w:id="31" w:name="_Toc243748940"/>
       <w:r>
         <w:rPr>
           <w:lang w:val="en-US"/>
         </w:rPr>
         <w:t>Traceability</w:t>
       </w:r>
-      <w:bookmarkEnd w:id="29"/>
+      <w:bookmarkEnd w:id="31"/>
     </w:p>
     <w:p>
       <w:pPr>
@@ -5016,43 +4994,9 @@
             </w:rPr>
             <w:br/>
           </w:r>
-          <w:proofErr w:type="spellStart"/>
           <w:r>
-            <w:t>Automated</w:t>
+            <w:t>Automated Gherkin and BDD Test Scenario Generator</w:t>
           </w:r>
-          <w:proofErr w:type="spellEnd"/>
-          <w:r>
-            <w:t xml:space="preserve"> </w:t>
-          </w:r>
-          <w:proofErr w:type="spellStart"/>
-          <w:r>
-            <w:t>Gherkin</w:t>
-          </w:r>
-          <w:proofErr w:type="spellEnd"/>
-          <w:r>
-            <w:t xml:space="preserve"> </w:t>
-          </w:r>
-          <w:proofErr w:type="spellStart"/>
-          <w:r>
-            <w:t>and</w:t>
-          </w:r>
-          <w:proofErr w:type="spellEnd"/>
-          <w:r>
-            <w:t xml:space="preserve"> BDD Test </w:t>
-          </w:r>
-          <w:proofErr w:type="spellStart"/>
-          <w:r>
-            <w:t>Scenario</w:t>
-          </w:r>
-          <w:proofErr w:type="spellEnd"/>
-          <w:r>
-            <w:t xml:space="preserve"> </w:t>
-          </w:r>
-          <w:proofErr w:type="spellStart"/>
-          <w:r>
-            <w:t>Generator</w:t>
-          </w:r>
-          <w:proofErr w:type="spellEnd"/>
         </w:p>
       </w:tc>
       <w:tc>
@@ -7650,6 +7594,19 @@
       <w:u w:val="single"/>
     </w:rPr>
   </w:style>
+  <w:style w:type="paragraph" w:styleId="T4">
+    <w:name w:val="toc 4"/>
+    <w:basedOn w:val="Normal"/>
+    <w:next w:val="Normal"/>
+    <w:autoRedefine/>
+    <w:uiPriority w:val="39"/>
+    <w:unhideWhenUsed/>
+    <w:rsid w:val="00C52761"/>
+    <w:pPr>
+      <w:spacing w:after="100"/>
+      <w:ind w:left="660"/>
+    </w:pPr>
+  </w:style>
 </w:styles>
 </file>
 
@@ -7915,27 +7872,6 @@
 </file>
 
 <file path=customXml/item1.xml><?xml version="1.0" encoding="utf-8"?>
-<?mso-contentType ?>
-<FormTemplates xmlns="http://schemas.microsoft.com/sharepoint/v3/contenttype/forms">
-  <Display>DocumentLibraryForm</Display>
-  <Edit>DocumentLibraryForm</Edit>
-  <New>DocumentLibraryForm</New>
-</FormTemplates>
-</file>
-
-<file path=customXml/item2.xml><?xml version="1.0" encoding="utf-8"?>
-<b:Sources xmlns:b="http://schemas.openxmlformats.org/officeDocument/2006/bibliography" xmlns="http://schemas.openxmlformats.org/officeDocument/2006/bibliography" SelectedStyle="\APASixthEditionOfficeOnline.xsl" StyleName="APA" Version="6"/>
-</file>
-
-<file path=customXml/item3.xml><?xml version="1.0" encoding="utf-8"?>
-<p:properties xmlns:p="http://schemas.microsoft.com/office/2006/metadata/properties" xmlns:xsi="http://www.w3.org/2001/XMLSchema-instance" xmlns:pc="http://schemas.microsoft.com/office/infopath/2007/PartnerControls">
-  <documentManagement>
-    <ReferenceId xmlns="90f865b1-d0dc-4fc3-9a7d-0ca5134e2b59" xsi:nil="true"/>
-  </documentManagement>
-</p:properties>
-</file>
-
-<file path=customXml/item4.xml><?xml version="1.0" encoding="utf-8"?>
 <ct:contentTypeSchema xmlns:ct="http://schemas.microsoft.com/office/2006/metadata/contentType" xmlns:ma="http://schemas.microsoft.com/office/2006/metadata/properties/metaAttributes" ct:_="" ma:_="" ma:contentTypeName="Document" ma:contentTypeID="0x0101008BE8684AFEF24B43BDC1C06D85BDEF2A" ma:contentTypeVersion="1" ma:contentTypeDescription="Create a new document." ma:contentTypeScope="" ma:versionID="d8f372c71066d5d601edd8fd8e12d1ae">
   <xsd:schema xmlns:xsd="http://www.w3.org/2001/XMLSchema" xmlns:xs="http://www.w3.org/2001/XMLSchema" xmlns:p="http://schemas.microsoft.com/office/2006/metadata/properties" xmlns:ns2="90f865b1-d0dc-4fc3-9a7d-0ca5134e2b59" targetNamespace="http://schemas.microsoft.com/office/2006/metadata/properties" ma:root="true" ma:fieldsID="40051b93dd6605e12ef9716e9ea82d65" ns2:_="">
     <xsd:import namespace="90f865b1-d0dc-4fc3-9a7d-0ca5134e2b59"/>
@@ -8061,33 +7997,28 @@
 </ct:contentTypeSchema>
 </file>
 
-<file path=customXml/itemProps1.xml><?xml version="1.0" encoding="utf-8"?>
-<ds:datastoreItem xmlns:ds="http://schemas.openxmlformats.org/officeDocument/2006/customXml" ds:itemID="{7451EBBF-49FB-4295-BC57-7BAD6477FB01}">
-  <ds:schemaRefs>
-    <ds:schemaRef ds:uri="http://schemas.microsoft.com/sharepoint/v3/contenttype/forms"/>
-  </ds:schemaRefs>
-</ds:datastoreItem>
+<file path=customXml/item2.xml><?xml version="1.0" encoding="utf-8"?>
+<p:properties xmlns:p="http://schemas.microsoft.com/office/2006/metadata/properties" xmlns:xsi="http://www.w3.org/2001/XMLSchema-instance" xmlns:pc="http://schemas.microsoft.com/office/infopath/2007/PartnerControls">
+  <documentManagement>
+    <ReferenceId xmlns="90f865b1-d0dc-4fc3-9a7d-0ca5134e2b59" xsi:nil="true"/>
+  </documentManagement>
+</p:properties>
 </file>
 
-<file path=customXml/itemProps2.xml><?xml version="1.0" encoding="utf-8"?>
-<ds:datastoreItem xmlns:ds="http://schemas.openxmlformats.org/officeDocument/2006/customXml" ds:itemID="{D232513A-FA8F-400E-A60B-9B3070010DF2}">
-  <ds:schemaRefs>
-    <ds:schemaRef ds:uri="http://schemas.openxmlformats.org/officeDocument/2006/bibliography"/>
-  </ds:schemaRefs>
-</ds:datastoreItem>
+<file path=customXml/item3.xml><?xml version="1.0" encoding="utf-8"?>
+<b:Sources xmlns:b="http://schemas.openxmlformats.org/officeDocument/2006/bibliography" xmlns="http://schemas.openxmlformats.org/officeDocument/2006/bibliography" SelectedStyle="\APASixthEditionOfficeOnline.xsl" StyleName="APA" Version="6"/>
 </file>
 
-<file path=customXml/itemProps3.xml><?xml version="1.0" encoding="utf-8"?>
-<ds:datastoreItem xmlns:ds="http://schemas.openxmlformats.org/officeDocument/2006/customXml" ds:itemID="{96DEB25F-1766-4A55-BC0F-248365F4AA66}">
-  <ds:schemaRefs>
-    <ds:schemaRef ds:uri="http://schemas.microsoft.com/office/2006/metadata/properties"/>
-    <ds:schemaRef ds:uri="http://schemas.microsoft.com/office/infopath/2007/PartnerControls"/>
-    <ds:schemaRef ds:uri="90f865b1-d0dc-4fc3-9a7d-0ca5134e2b59"/>
-  </ds:schemaRefs>
-</ds:datastoreItem>
+<file path=customXml/item4.xml><?xml version="1.0" encoding="utf-8"?>
+<?mso-contentType ?>
+<FormTemplates xmlns="http://schemas.microsoft.com/sharepoint/v3/contenttype/forms">
+  <Display>DocumentLibraryForm</Display>
+  <Edit>DocumentLibraryForm</Edit>
+  <New>DocumentLibraryForm</New>
+</FormTemplates>
 </file>
 
-<file path=customXml/itemProps4.xml><?xml version="1.0" encoding="utf-8"?>
+<file path=customXml/itemProps1.xml><?xml version="1.0" encoding="utf-8"?>
 <ds:datastoreItem xmlns:ds="http://schemas.openxmlformats.org/officeDocument/2006/customXml" ds:itemID="{43DD4C89-4480-4C8F-A303-FEDEFF1C6FB9}">
   <ds:schemaRefs>
     <ds:schemaRef ds:uri="http://schemas.microsoft.com/office/2006/metadata/contentType"/>
@@ -8103,4 +8034,30 @@
     <ds:schemaRef ds:uri="http://schemas.microsoft.com/internal/obd"/>
   </ds:schemaRefs>
 </ds:datastoreItem>
+</file>
+
+<file path=customXml/itemProps2.xml><?xml version="1.0" encoding="utf-8"?>
+<ds:datastoreItem xmlns:ds="http://schemas.openxmlformats.org/officeDocument/2006/customXml" ds:itemID="{96DEB25F-1766-4A55-BC0F-248365F4AA66}">
+  <ds:schemaRefs>
+    <ds:schemaRef ds:uri="http://schemas.microsoft.com/office/2006/metadata/properties"/>
+    <ds:schemaRef ds:uri="http://schemas.microsoft.com/office/infopath/2007/PartnerControls"/>
+    <ds:schemaRef ds:uri="90f865b1-d0dc-4fc3-9a7d-0ca5134e2b59"/>
+  </ds:schemaRefs>
+</ds:datastoreItem>
+</file>
+
+<file path=customXml/itemProps3.xml><?xml version="1.0" encoding="utf-8"?>
+<ds:datastoreItem xmlns:ds="http://schemas.openxmlformats.org/officeDocument/2006/customXml" ds:itemID="{D232513A-FA8F-400E-A60B-9B3070010DF2}">
+  <ds:schemaRefs>
+    <ds:schemaRef ds:uri="http://schemas.openxmlformats.org/officeDocument/2006/bibliography"/>
+  </ds:schemaRefs>
+</ds:datastoreItem>
+</file>
+
+<file path=customXml/itemProps4.xml><?xml version="1.0" encoding="utf-8"?>
+<ds:datastoreItem xmlns:ds="http://schemas.openxmlformats.org/officeDocument/2006/customXml" ds:itemID="{7451EBBF-49FB-4295-BC57-7BAD6477FB01}">
+  <ds:schemaRefs>
+    <ds:schemaRef ds:uri="http://schemas.microsoft.com/sharepoint/v3/contenttype/forms"/>
+  </ds:schemaRefs>
+</ds:datastoreItem>
 </file>
</xml_diff>

<commit_message>
2-Current Status eklendi, döküman versiyon 1.1
</commit_message>
<xml_diff>
--- a/CSE443 - RAD_Template.docx
+++ b/CSE443 - RAD_Template.docx
@@ -126,7 +126,13 @@
         <w:rPr>
           <w:lang w:val="en-US"/>
         </w:rPr>
-        <w:t>1.0</w:t>
+        <w:t>1.</w:t>
+      </w:r>
+      <w:r>
+        <w:rPr>
+          <w:lang w:val="en-US"/>
+        </w:rPr>
+        <w:t>1</w:t>
       </w:r>
     </w:p>
     <w:p>
@@ -270,8 +276,16 @@
         <w:rPr>
           <w:lang w:val="en-US"/>
         </w:rPr>
-        <w:t>Emircan Badur</w:t>
-      </w:r>
+        <w:t xml:space="preserve">Emircan </w:t>
+      </w:r>
+      <w:proofErr w:type="spellStart"/>
+      <w:r>
+        <w:rPr>
+          <w:lang w:val="en-US"/>
+        </w:rPr>
+        <w:t>Badur</w:t>
+      </w:r>
+      <w:proofErr w:type="spellEnd"/>
     </w:p>
     <w:p>
       <w:pPr>
@@ -3223,7 +3237,21 @@
         <w:rPr>
           <w:lang w:val="en-US"/>
         </w:rPr>
-        <w:t>Objectives and success criteria of the project</w:t>
+        <w:t xml:space="preserve">Objectives and success criteria </w:t>
+      </w:r>
+      <w:proofErr w:type="gramStart"/>
+      <w:r>
+        <w:rPr>
+          <w:lang w:val="en-US"/>
+        </w:rPr>
+        <w:t>of</w:t>
+      </w:r>
+      <w:proofErr w:type="gramEnd"/>
+      <w:r>
+        <w:rPr>
+          <w:lang w:val="en-US"/>
+        </w:rPr>
+        <w:t xml:space="preserve"> the project</w:t>
       </w:r>
       <w:bookmarkEnd w:id="4"/>
     </w:p>
@@ -3538,7 +3566,21 @@
               <w:rPr>
                 <w:lang w:val="en-US"/>
               </w:rPr>
-              <w:t>In this document, a Jira backlog item of type Story. Its Summary contains a requirement.</w:t>
+              <w:t xml:space="preserve">In this document, </w:t>
+            </w:r>
+            <w:proofErr w:type="gramStart"/>
+            <w:r>
+              <w:rPr>
+                <w:lang w:val="en-US"/>
+              </w:rPr>
+              <w:t>a Jira</w:t>
+            </w:r>
+            <w:proofErr w:type="gramEnd"/>
+            <w:r>
+              <w:rPr>
+                <w:lang w:val="en-US"/>
+              </w:rPr>
+              <w:t xml:space="preserve"> backlog item of type Story. Its Summary contains a requirement.</w:t>
             </w:r>
           </w:p>
         </w:tc>
@@ -3772,7 +3814,21 @@
               <w:rPr>
                 <w:lang w:val="en-US"/>
               </w:rPr>
-              <w:t>A plain-text language used to describe behavior with the keywords Feature, Scenario, Given, When, and Then.</w:t>
+              <w:t xml:space="preserve">A plain-text language </w:t>
+            </w:r>
+            <w:proofErr w:type="gramStart"/>
+            <w:r>
+              <w:rPr>
+                <w:lang w:val="en-US"/>
+              </w:rPr>
+              <w:t>used</w:t>
+            </w:r>
+            <w:proofErr w:type="gramEnd"/>
+            <w:r>
+              <w:rPr>
+                <w:lang w:val="en-US"/>
+              </w:rPr>
+              <w:t xml:space="preserve"> to describe behavior with the keywords Feature, Scenario, Given, When, and Then.</w:t>
             </w:r>
           </w:p>
         </w:tc>
@@ -4029,6 +4085,326 @@
     <w:p>
       <w:pPr>
         <w:rPr>
+          <w:lang w:val="en-US"/>
+        </w:rPr>
+      </w:pPr>
+      <w:r>
+        <w:rPr>
+          <w:lang w:val="en-US"/>
+        </w:rPr>
+        <w:t>The Automated Gherkin and BDD Test Scenario Generator does not replace an existing software system. At present, BDD test scenarios are derived from backlog requirements manually by developers and testers. This section describes that manual process and its problems.</w:t>
+      </w:r>
+    </w:p>
+    <w:p>
+      <w:pPr>
+        <w:rPr>
+          <w:lang w:val="en-US"/>
+        </w:rPr>
+      </w:pPr>
+    </w:p>
+    <w:p>
+      <w:pPr>
+        <w:pStyle w:val="Balk2"/>
+        <w:rPr>
+          <w:lang w:val="en-US"/>
+        </w:rPr>
+      </w:pPr>
+      <w:r>
+        <w:rPr>
+          <w:lang w:val="en-US"/>
+        </w:rPr>
+        <w:t>Current process</w:t>
+      </w:r>
+    </w:p>
+    <w:p>
+      <w:pPr>
+        <w:pStyle w:val="ListeParagraf"/>
+        <w:numPr>
+          <w:ilvl w:val="0"/>
+          <w:numId w:val="29"/>
+        </w:numPr>
+        <w:rPr>
+          <w:lang w:val="en-US"/>
+        </w:rPr>
+      </w:pPr>
+      <w:r>
+        <w:rPr>
+          <w:lang w:val="en-US"/>
+        </w:rPr>
+        <w:t>The team maintains its requirements as user stories in a Jira backlog. Each user story contains a requirement, typically written in the user story template or in EARS syntax.</w:t>
+      </w:r>
+    </w:p>
+    <w:p>
+      <w:pPr>
+        <w:pStyle w:val="ListeParagraf"/>
+        <w:numPr>
+          <w:ilvl w:val="0"/>
+          <w:numId w:val="29"/>
+        </w:numPr>
+        <w:rPr>
+          <w:lang w:val="en-US"/>
+        </w:rPr>
+      </w:pPr>
+      <w:r>
+        <w:rPr>
+          <w:lang w:val="en-US"/>
+        </w:rPr>
+        <w:t xml:space="preserve">A developer or tester reads each </w:t>
+      </w:r>
+      <w:proofErr w:type="gramStart"/>
+      <w:r>
+        <w:rPr>
+          <w:lang w:val="en-US"/>
+        </w:rPr>
+        <w:t>user</w:t>
+      </w:r>
+      <w:proofErr w:type="gramEnd"/>
+      <w:r>
+        <w:rPr>
+          <w:lang w:val="en-US"/>
+        </w:rPr>
+        <w:t xml:space="preserve"> story and interprets it to identify the actor, the intended action, the expected outcome, and any preconditions or triggers.</w:t>
+      </w:r>
+    </w:p>
+    <w:p>
+      <w:pPr>
+        <w:pStyle w:val="ListeParagraf"/>
+        <w:numPr>
+          <w:ilvl w:val="0"/>
+          <w:numId w:val="29"/>
+        </w:numPr>
+        <w:rPr>
+          <w:lang w:val="en-US"/>
+        </w:rPr>
+      </w:pPr>
+      <w:r>
+        <w:rPr>
+          <w:lang w:val="en-US"/>
+        </w:rPr>
+        <w:t xml:space="preserve">The same person writes the Given, When, and Then steps of one or more Gherkin scenarios by hand in a text editor or an </w:t>
+      </w:r>
+      <w:proofErr w:type="gramStart"/>
+      <w:r>
+        <w:rPr>
+          <w:lang w:val="en-US"/>
+        </w:rPr>
+        <w:t>IDE, and</w:t>
+      </w:r>
+      <w:proofErr w:type="gramEnd"/>
+      <w:r>
+        <w:rPr>
+          <w:lang w:val="en-US"/>
+        </w:rPr>
+        <w:t xml:space="preserve"> groups them into a feature file.</w:t>
+      </w:r>
+    </w:p>
+    <w:p>
+      <w:pPr>
+        <w:pStyle w:val="ListeParagraf"/>
+        <w:numPr>
+          <w:ilvl w:val="0"/>
+          <w:numId w:val="29"/>
+        </w:numPr>
+        <w:rPr>
+          <w:lang w:val="en-US"/>
+        </w:rPr>
+      </w:pPr>
+      <w:r>
+        <w:rPr>
+          <w:lang w:val="en-US"/>
+        </w:rPr>
+        <w:t>Alternative and exceptional flows, such as invalid input or missing information, are added only if the author thinks of them.</w:t>
+      </w:r>
+    </w:p>
+    <w:p>
+      <w:pPr>
+        <w:pStyle w:val="ListeParagraf"/>
+        <w:numPr>
+          <w:ilvl w:val="0"/>
+          <w:numId w:val="29"/>
+        </w:numPr>
+        <w:rPr>
+          <w:lang w:val="en-US"/>
+        </w:rPr>
+      </w:pPr>
+      <w:r>
+        <w:rPr>
+          <w:lang w:val="en-US"/>
+        </w:rPr>
+        <w:t>The author checks the syntax and wording of the scenarios manually or by running them through a Gherkin-aware tool, and the feature files are then stored alongside the project source.</w:t>
+      </w:r>
+    </w:p>
+    <w:p>
+      <w:pPr>
+        <w:pStyle w:val="ListeParagraf"/>
+        <w:numPr>
+          <w:ilvl w:val="0"/>
+          <w:numId w:val="29"/>
+        </w:numPr>
+        <w:rPr>
+          <w:lang w:val="en-US"/>
+        </w:rPr>
+      </w:pPr>
+      <w:r>
+        <w:rPr>
+          <w:lang w:val="en-US"/>
+        </w:rPr>
+        <w:t>If a link between a scenario and its source user story is needed, it is maintained by hand, for example by copying the Jira issue key into a tag or comment.</w:t>
+      </w:r>
+    </w:p>
+    <w:p>
+      <w:pPr>
+        <w:rPr>
+          <w:lang w:val="en-US"/>
+        </w:rPr>
+      </w:pPr>
+    </w:p>
+    <w:p>
+      <w:pPr>
+        <w:rPr>
+          <w:lang w:val="en-US"/>
+        </w:rPr>
+      </w:pPr>
+      <w:r>
+        <w:rPr>
+          <w:lang w:val="en-US"/>
+        </w:rPr>
+        <w:t>Problems of the current process</w:t>
+      </w:r>
+    </w:p>
+    <w:p>
+      <w:pPr>
+        <w:pStyle w:val="ListeParagraf"/>
+        <w:numPr>
+          <w:ilvl w:val="0"/>
+          <w:numId w:val="26"/>
+        </w:numPr>
+        <w:rPr>
+          <w:lang w:val="en-US"/>
+        </w:rPr>
+      </w:pPr>
+      <w:r>
+        <w:rPr>
+          <w:lang w:val="en-US"/>
+        </w:rPr>
+        <w:t>Time-consuming: Every user story must be read, interpreted, and rewritten as scenarios by hand, which becomes costly as the backlog grows.</w:t>
+      </w:r>
+    </w:p>
+    <w:p>
+      <w:pPr>
+        <w:pStyle w:val="ListeParagraf"/>
+        <w:numPr>
+          <w:ilvl w:val="0"/>
+          <w:numId w:val="26"/>
+        </w:numPr>
+        <w:rPr>
+          <w:lang w:val="en-US"/>
+        </w:rPr>
+      </w:pPr>
+      <w:r>
+        <w:rPr>
+          <w:lang w:val="en-US"/>
+        </w:rPr>
+        <w:t>Inconsistent results: Different authors phrase steps and structure scenarios differently, even for similar requirements.</w:t>
+      </w:r>
+    </w:p>
+    <w:p>
+      <w:pPr>
+        <w:pStyle w:val="ListeParagraf"/>
+        <w:numPr>
+          <w:ilvl w:val="0"/>
+          <w:numId w:val="26"/>
+        </w:numPr>
+        <w:rPr>
+          <w:lang w:val="en-US"/>
+        </w:rPr>
+      </w:pPr>
+      <w:r>
+        <w:rPr>
+          <w:lang w:val="en-US"/>
+        </w:rPr>
+        <w:t>Missed alternative flows: Exceptional and boundary cases depend on the author's attention and are often omitted.</w:t>
+      </w:r>
+    </w:p>
+    <w:p>
+      <w:pPr>
+        <w:pStyle w:val="ListeParagraf"/>
+        <w:numPr>
+          <w:ilvl w:val="0"/>
+          <w:numId w:val="26"/>
+        </w:numPr>
+        <w:rPr>
+          <w:lang w:val="en-US"/>
+        </w:rPr>
+      </w:pPr>
+      <w:r>
+        <w:rPr>
+          <w:lang w:val="en-US"/>
+        </w:rPr>
+        <w:t>Late detection of incomplete requirements: Missing roles, actions, or outcomes in a user story are usually discovered only when someone tries to write its scenarios, or later during testing.</w:t>
+      </w:r>
+    </w:p>
+    <w:p>
+      <w:pPr>
+        <w:pStyle w:val="ListeParagraf"/>
+        <w:numPr>
+          <w:ilvl w:val="0"/>
+          <w:numId w:val="26"/>
+        </w:numPr>
+        <w:rPr>
+          <w:lang w:val="en-US"/>
+        </w:rPr>
+      </w:pPr>
+      <w:r>
+        <w:rPr>
+          <w:lang w:val="en-US"/>
+        </w:rPr>
+        <w:t>Weak traceability: Links between user stories and scenarios are easily lost or become outdated when stories change.</w:t>
+      </w:r>
+    </w:p>
+    <w:p>
+      <w:pPr>
+        <w:pStyle w:val="ListeParagraf"/>
+        <w:numPr>
+          <w:ilvl w:val="0"/>
+          <w:numId w:val="26"/>
+        </w:numPr>
+        <w:rPr>
+          <w:lang w:val="en-US"/>
+        </w:rPr>
+      </w:pPr>
+      <w:r>
+        <w:rPr>
+          <w:lang w:val="en-US"/>
+        </w:rPr>
+        <w:t>No history: There is no record of which scenarios were produced from which version of the backlog, so earlier results are difficult to review or reproduce.</w:t>
+      </w:r>
+    </w:p>
+    <w:p>
+      <w:pPr>
+        <w:pStyle w:val="Balk1"/>
+        <w:rPr>
+          <w:lang w:val="en-US"/>
+        </w:rPr>
+      </w:pPr>
+      <w:bookmarkStart w:id="11" w:name="_Toc243748920"/>
+      <w:r>
+        <w:rPr>
+          <w:lang w:val="en-US"/>
+        </w:rPr>
+        <w:t>Proposed syste</w:t>
+      </w:r>
+      <w:r>
+        <w:rPr>
+          <w:lang w:val="en-US"/>
+        </w:rPr>
+        <w:t>m</w:t>
+      </w:r>
+      <w:bookmarkEnd w:id="11"/>
+    </w:p>
+    <w:p>
+      <w:pPr>
+        <w:rPr>
           <w:i/>
           <w:iCs/>
           <w:lang w:val="en-US"/>
@@ -4040,43 +4416,31 @@
           <w:iCs/>
           <w:lang w:val="en-US"/>
         </w:rPr>
-        <w:t>The second section, Current system, describes the current state of affairs. If the new system will replace an existing system, this section describes the functionality and the problems of the current system. Otherwise, this section describes how the tasks supported by the new system are accomplished now.</w:t>
-      </w:r>
-    </w:p>
-    <w:p>
-      <w:pPr>
-        <w:rPr>
-          <w:lang w:val="en-US"/>
-        </w:rPr>
-      </w:pPr>
-      <w:r>
-        <w:rPr>
-          <w:lang w:val="en-US"/>
-        </w:rPr>
-        <w:t xml:space="preserve"> </w:t>
-      </w:r>
-    </w:p>
-    <w:p>
-      <w:pPr>
-        <w:pStyle w:val="Balk1"/>
-        <w:rPr>
-          <w:lang w:val="en-US"/>
-        </w:rPr>
-      </w:pPr>
-      <w:bookmarkStart w:id="11" w:name="_Toc243748920"/>
-      <w:r>
-        <w:rPr>
-          <w:lang w:val="en-US"/>
-        </w:rPr>
-        <w:t>Proposed syste</w:t>
-      </w:r>
-      <w:r>
-        <w:rPr>
-          <w:lang w:val="en-US"/>
-        </w:rPr>
-        <w:t>m</w:t>
-      </w:r>
-      <w:bookmarkEnd w:id="11"/>
+        <w:t>The third section documents the requirements elicitation and the analysis model of the new system.</w:t>
+      </w:r>
+    </w:p>
+    <w:p>
+      <w:pPr>
+        <w:rPr>
+          <w:lang w:val="en-US"/>
+        </w:rPr>
+      </w:pPr>
+    </w:p>
+    <w:p>
+      <w:pPr>
+        <w:pStyle w:val="Balk2"/>
+        <w:rPr>
+          <w:lang w:val="en-US"/>
+        </w:rPr>
+      </w:pPr>
+      <w:bookmarkStart w:id="12" w:name="_Toc243748921"/>
+      <w:r>
+        <w:rPr>
+          <w:lang w:val="en-US"/>
+        </w:rPr>
+        <w:t>Overview</w:t>
+      </w:r>
+      <w:bookmarkEnd w:id="12"/>
     </w:p>
     <w:p>
       <w:pPr>
@@ -4092,7 +4456,7 @@
           <w:iCs/>
           <w:lang w:val="en-US"/>
         </w:rPr>
-        <w:t>The third section documents the requirements elicitation and the analysis model of the new system.</w:t>
+        <w:t>The overview presents a functional overview of the system.</w:t>
       </w:r>
     </w:p>
     <w:p>
@@ -4109,14 +4473,14 @@
           <w:lang w:val="en-US"/>
         </w:rPr>
       </w:pPr>
-      <w:bookmarkStart w:id="12" w:name="_Toc243748921"/>
-      <w:r>
-        <w:rPr>
-          <w:lang w:val="en-US"/>
-        </w:rPr>
-        <w:t>Overview</w:t>
-      </w:r>
-      <w:bookmarkEnd w:id="12"/>
+      <w:bookmarkStart w:id="13" w:name="_Toc243748922"/>
+      <w:r>
+        <w:rPr>
+          <w:lang w:val="en-US"/>
+        </w:rPr>
+        <w:t>Functional requirements</w:t>
+      </w:r>
+      <w:bookmarkEnd w:id="13"/>
     </w:p>
     <w:p>
       <w:pPr>
@@ -4132,47 +4496,25 @@
           <w:iCs/>
           <w:lang w:val="en-US"/>
         </w:rPr>
-        <w:t>The overview presents a functional overview of the system.</w:t>
-      </w:r>
-    </w:p>
-    <w:p>
-      <w:pPr>
-        <w:rPr>
-          <w:lang w:val="en-US"/>
-        </w:rPr>
-      </w:pPr>
-    </w:p>
-    <w:p>
-      <w:pPr>
-        <w:pStyle w:val="Balk2"/>
-        <w:rPr>
-          <w:lang w:val="en-US"/>
-        </w:rPr>
-      </w:pPr>
-      <w:bookmarkStart w:id="13" w:name="_Toc243748922"/>
-      <w:r>
-        <w:rPr>
-          <w:lang w:val="en-US"/>
-        </w:rPr>
-        <w:t>Functional requirements</w:t>
-      </w:r>
-      <w:bookmarkEnd w:id="13"/>
-    </w:p>
-    <w:p>
-      <w:pPr>
+        <w:t xml:space="preserve">Functional requirements </w:t>
+      </w:r>
+      <w:proofErr w:type="gramStart"/>
+      <w:r>
         <w:rPr>
           <w:i/>
           <w:iCs/>
           <w:lang w:val="en-US"/>
         </w:rPr>
-      </w:pPr>
+        <w:t>describes</w:t>
+      </w:r>
+      <w:proofErr w:type="gramEnd"/>
       <w:r>
         <w:rPr>
           <w:i/>
           <w:iCs/>
           <w:lang w:val="en-US"/>
         </w:rPr>
-        <w:t>Functional requirements describes the high-level functionality of the system.</w:t>
+        <w:t xml:space="preserve"> the high-level functionality of the system.</w:t>
       </w:r>
     </w:p>
     <w:p>
@@ -4218,233 +4560,233 @@
           <w:iCs/>
           <w:lang w:val="en-US"/>
         </w:rPr>
-        <w:t>Nonfunctional requirements describes user-level requirements that are not directly related to functionality. This includes usability, reliability, performance, supportability, implementation, interface, operational, packaging, and legal requirements.</w:t>
-      </w:r>
-    </w:p>
-    <w:p>
-      <w:pPr>
-        <w:rPr>
-          <w:lang w:val="en-US"/>
-        </w:rPr>
-      </w:pPr>
-    </w:p>
-    <w:p>
-      <w:pPr>
-        <w:pStyle w:val="Balk3"/>
-        <w:rPr>
-          <w:lang w:val="en-US"/>
-        </w:rPr>
-      </w:pPr>
-      <w:bookmarkStart w:id="15" w:name="_Toc243748924"/>
-      <w:r>
-        <w:rPr>
-          <w:lang w:val="en-US"/>
-        </w:rPr>
-        <w:t>Usability</w:t>
-      </w:r>
-      <w:bookmarkEnd w:id="15"/>
-    </w:p>
-    <w:p>
-      <w:pPr>
-        <w:rPr>
-          <w:lang w:val="en-US"/>
-        </w:rPr>
-      </w:pPr>
-    </w:p>
-    <w:p>
-      <w:pPr>
-        <w:pStyle w:val="Balk3"/>
-        <w:rPr>
-          <w:lang w:val="en-US"/>
-        </w:rPr>
-      </w:pPr>
-      <w:bookmarkStart w:id="16" w:name="_Toc243748925"/>
-      <w:r>
-        <w:rPr>
-          <w:lang w:val="en-US"/>
-        </w:rPr>
-        <w:t>Reliability</w:t>
-      </w:r>
-      <w:bookmarkEnd w:id="16"/>
-    </w:p>
-    <w:p>
-      <w:pPr>
-        <w:rPr>
-          <w:lang w:val="en-US"/>
-        </w:rPr>
-      </w:pPr>
-    </w:p>
-    <w:p>
-      <w:pPr>
-        <w:pStyle w:val="Balk3"/>
-        <w:rPr>
-          <w:lang w:val="en-US"/>
-        </w:rPr>
-      </w:pPr>
-      <w:bookmarkStart w:id="17" w:name="_Toc243748926"/>
-      <w:r>
-        <w:rPr>
-          <w:lang w:val="en-US"/>
-        </w:rPr>
-        <w:t>Performance</w:t>
-      </w:r>
-      <w:bookmarkEnd w:id="17"/>
-    </w:p>
-    <w:p>
-      <w:pPr>
-        <w:rPr>
-          <w:lang w:val="en-US"/>
-        </w:rPr>
-      </w:pPr>
-    </w:p>
-    <w:p>
-      <w:pPr>
-        <w:pStyle w:val="Balk3"/>
-        <w:rPr>
-          <w:lang w:val="en-US"/>
-        </w:rPr>
-      </w:pPr>
-      <w:bookmarkStart w:id="18" w:name="_Toc243748927"/>
-      <w:r>
-        <w:rPr>
-          <w:lang w:val="en-US"/>
-        </w:rPr>
-        <w:t>Supportability</w:t>
-      </w:r>
-      <w:bookmarkEnd w:id="18"/>
-    </w:p>
-    <w:p>
-      <w:pPr>
-        <w:rPr>
-          <w:lang w:val="en-US"/>
-        </w:rPr>
-      </w:pPr>
-    </w:p>
-    <w:p>
-      <w:pPr>
-        <w:pStyle w:val="Balk3"/>
-        <w:rPr>
-          <w:lang w:val="en-US"/>
-        </w:rPr>
-      </w:pPr>
-      <w:bookmarkStart w:id="19" w:name="_Toc243748928"/>
-      <w:r>
-        <w:rPr>
-          <w:lang w:val="en-US"/>
-        </w:rPr>
-        <w:t>Implementation</w:t>
-      </w:r>
-      <w:bookmarkEnd w:id="19"/>
-    </w:p>
-    <w:p>
-      <w:pPr>
-        <w:rPr>
-          <w:lang w:val="en-US"/>
-        </w:rPr>
-      </w:pPr>
-    </w:p>
-    <w:p>
-      <w:pPr>
-        <w:pStyle w:val="Balk3"/>
-        <w:rPr>
-          <w:lang w:val="en-US"/>
-        </w:rPr>
-      </w:pPr>
-      <w:bookmarkStart w:id="20" w:name="_Toc243748929"/>
-      <w:r>
-        <w:rPr>
-          <w:lang w:val="en-US"/>
-        </w:rPr>
-        <w:lastRenderedPageBreak/>
-        <w:t>Interface</w:t>
-      </w:r>
-      <w:bookmarkEnd w:id="20"/>
-    </w:p>
-    <w:p>
-      <w:pPr>
-        <w:rPr>
-          <w:lang w:val="en-US"/>
-        </w:rPr>
-      </w:pPr>
-    </w:p>
-    <w:p>
-      <w:pPr>
-        <w:pStyle w:val="Balk3"/>
-        <w:rPr>
-          <w:lang w:val="en-US"/>
-        </w:rPr>
-      </w:pPr>
-      <w:bookmarkStart w:id="21" w:name="_Toc243748930"/>
-      <w:r>
-        <w:rPr>
-          <w:lang w:val="en-US"/>
-        </w:rPr>
-        <w:t>Packaging</w:t>
-      </w:r>
-      <w:bookmarkEnd w:id="21"/>
-    </w:p>
-    <w:p>
-      <w:pPr>
-        <w:rPr>
-          <w:lang w:val="en-US"/>
-        </w:rPr>
-      </w:pPr>
-    </w:p>
-    <w:p>
-      <w:pPr>
-        <w:pStyle w:val="Balk3"/>
-        <w:rPr>
-          <w:lang w:val="en-US"/>
-        </w:rPr>
-      </w:pPr>
-      <w:bookmarkStart w:id="22" w:name="_Toc243748931"/>
-      <w:r>
-        <w:rPr>
-          <w:lang w:val="en-US"/>
-        </w:rPr>
-        <w:t>Legal</w:t>
-      </w:r>
-      <w:bookmarkEnd w:id="22"/>
-    </w:p>
-    <w:p>
-      <w:pPr>
-        <w:rPr>
-          <w:lang w:val="en-US"/>
-        </w:rPr>
-      </w:pPr>
-    </w:p>
-    <w:p>
-      <w:pPr>
-        <w:pStyle w:val="Balk2"/>
-        <w:rPr>
-          <w:lang w:val="en-US"/>
-        </w:rPr>
-      </w:pPr>
-      <w:bookmarkStart w:id="23" w:name="_Toc243748932"/>
-      <w:r>
-        <w:rPr>
-          <w:lang w:val="en-US"/>
-        </w:rPr>
-        <w:t>System models</w:t>
-      </w:r>
-      <w:bookmarkEnd w:id="23"/>
-    </w:p>
-    <w:p>
-      <w:pPr>
+        <w:t xml:space="preserve">Nonfunctional requirements </w:t>
+      </w:r>
+      <w:proofErr w:type="gramStart"/>
+      <w:r>
         <w:rPr>
           <w:i/>
           <w:iCs/>
           <w:lang w:val="en-US"/>
         </w:rPr>
-      </w:pPr>
+        <w:t>describes</w:t>
+      </w:r>
+      <w:proofErr w:type="gramEnd"/>
       <w:r>
         <w:rPr>
           <w:i/>
           <w:iCs/>
           <w:lang w:val="en-US"/>
         </w:rPr>
-        <w:t>System models describes the scenarios, use cases, object model, and dynamic models for the system. This section contains the complete functional specification, including mock-ups illustrating the user interface of the system and navigational paths representing the sequence of screens. The subsections Object model and Dynamic model are written during the Analysis activity.</w:t>
-      </w:r>
+        <w:t xml:space="preserve"> user-level requirements that are not directly related to functionality. This includes usability, reliability, performance, supportability, implementation, interface, operational, packaging, and legal requirements.</w:t>
+      </w:r>
+    </w:p>
+    <w:p>
+      <w:pPr>
+        <w:rPr>
+          <w:lang w:val="en-US"/>
+        </w:rPr>
+      </w:pPr>
+    </w:p>
+    <w:p>
+      <w:pPr>
+        <w:pStyle w:val="Balk3"/>
+        <w:rPr>
+          <w:lang w:val="en-US"/>
+        </w:rPr>
+      </w:pPr>
+      <w:bookmarkStart w:id="15" w:name="_Toc243748924"/>
+      <w:r>
+        <w:rPr>
+          <w:lang w:val="en-US"/>
+        </w:rPr>
+        <w:t>Usability</w:t>
+      </w:r>
+      <w:bookmarkEnd w:id="15"/>
+    </w:p>
+    <w:p>
+      <w:pPr>
+        <w:rPr>
+          <w:lang w:val="en-US"/>
+        </w:rPr>
+      </w:pPr>
+    </w:p>
+    <w:p>
+      <w:pPr>
+        <w:pStyle w:val="Balk3"/>
+        <w:rPr>
+          <w:lang w:val="en-US"/>
+        </w:rPr>
+      </w:pPr>
+      <w:bookmarkStart w:id="16" w:name="_Toc243748925"/>
+      <w:r>
+        <w:rPr>
+          <w:lang w:val="en-US"/>
+        </w:rPr>
+        <w:t>Reliability</w:t>
+      </w:r>
+      <w:bookmarkEnd w:id="16"/>
+    </w:p>
+    <w:p>
+      <w:pPr>
+        <w:rPr>
+          <w:lang w:val="en-US"/>
+        </w:rPr>
+      </w:pPr>
+    </w:p>
+    <w:p>
+      <w:pPr>
+        <w:pStyle w:val="Balk3"/>
+        <w:rPr>
+          <w:lang w:val="en-US"/>
+        </w:rPr>
+      </w:pPr>
+      <w:bookmarkStart w:id="17" w:name="_Toc243748926"/>
+      <w:r>
+        <w:rPr>
+          <w:lang w:val="en-US"/>
+        </w:rPr>
+        <w:t>Performance</w:t>
+      </w:r>
+      <w:bookmarkEnd w:id="17"/>
+    </w:p>
+    <w:p>
+      <w:pPr>
+        <w:rPr>
+          <w:lang w:val="en-US"/>
+        </w:rPr>
+      </w:pPr>
+    </w:p>
+    <w:p>
+      <w:pPr>
+        <w:pStyle w:val="Balk3"/>
+        <w:rPr>
+          <w:lang w:val="en-US"/>
+        </w:rPr>
+      </w:pPr>
+      <w:bookmarkStart w:id="18" w:name="_Toc243748927"/>
+      <w:r>
+        <w:rPr>
+          <w:lang w:val="en-US"/>
+        </w:rPr>
+        <w:t>Supportability</w:t>
+      </w:r>
+      <w:bookmarkEnd w:id="18"/>
+    </w:p>
+    <w:p>
+      <w:pPr>
+        <w:rPr>
+          <w:lang w:val="en-US"/>
+        </w:rPr>
+      </w:pPr>
+    </w:p>
+    <w:p>
+      <w:pPr>
+        <w:pStyle w:val="Balk3"/>
+        <w:rPr>
+          <w:lang w:val="en-US"/>
+        </w:rPr>
+      </w:pPr>
+      <w:bookmarkStart w:id="19" w:name="_Toc243748928"/>
+      <w:r>
+        <w:rPr>
+          <w:lang w:val="en-US"/>
+        </w:rPr>
+        <w:t>Implementation</w:t>
+      </w:r>
+      <w:bookmarkEnd w:id="19"/>
+    </w:p>
+    <w:p>
+      <w:pPr>
+        <w:rPr>
+          <w:lang w:val="en-US"/>
+        </w:rPr>
+      </w:pPr>
+    </w:p>
+    <w:p>
+      <w:pPr>
+        <w:pStyle w:val="Balk3"/>
+        <w:rPr>
+          <w:lang w:val="en-US"/>
+        </w:rPr>
+      </w:pPr>
+      <w:bookmarkStart w:id="20" w:name="_Toc243748929"/>
+      <w:r>
+        <w:rPr>
+          <w:lang w:val="en-US"/>
+        </w:rPr>
+        <w:t>Interface</w:t>
+      </w:r>
+      <w:bookmarkEnd w:id="20"/>
+    </w:p>
+    <w:p>
+      <w:pPr>
+        <w:rPr>
+          <w:lang w:val="en-US"/>
+        </w:rPr>
+      </w:pPr>
+    </w:p>
+    <w:p>
+      <w:pPr>
+        <w:pStyle w:val="Balk3"/>
+        <w:rPr>
+          <w:lang w:val="en-US"/>
+        </w:rPr>
+      </w:pPr>
+      <w:bookmarkStart w:id="21" w:name="_Toc243748930"/>
+      <w:r>
+        <w:rPr>
+          <w:lang w:val="en-US"/>
+        </w:rPr>
+        <w:t>Packaging</w:t>
+      </w:r>
+      <w:bookmarkEnd w:id="21"/>
+    </w:p>
+    <w:p>
+      <w:pPr>
+        <w:rPr>
+          <w:lang w:val="en-US"/>
+        </w:rPr>
+      </w:pPr>
+    </w:p>
+    <w:p>
+      <w:pPr>
+        <w:pStyle w:val="Balk3"/>
+        <w:rPr>
+          <w:lang w:val="en-US"/>
+        </w:rPr>
+      </w:pPr>
+      <w:bookmarkStart w:id="22" w:name="_Toc243748931"/>
+      <w:r>
+        <w:rPr>
+          <w:lang w:val="en-US"/>
+        </w:rPr>
+        <w:t>Legal</w:t>
+      </w:r>
+      <w:bookmarkEnd w:id="22"/>
+    </w:p>
+    <w:p>
+      <w:pPr>
+        <w:rPr>
+          <w:lang w:val="en-US"/>
+        </w:rPr>
+      </w:pPr>
+    </w:p>
+    <w:p>
+      <w:pPr>
+        <w:pStyle w:val="Balk2"/>
+        <w:rPr>
+          <w:lang w:val="en-US"/>
+        </w:rPr>
+      </w:pPr>
+      <w:bookmarkStart w:id="23" w:name="_Toc243748932"/>
+      <w:r>
+        <w:rPr>
+          <w:lang w:val="en-US"/>
+        </w:rPr>
+        <w:t>System models</w:t>
+      </w:r>
+      <w:bookmarkEnd w:id="23"/>
     </w:p>
     <w:p>
       <w:pPr>
@@ -4454,6 +4796,41 @@
           <w:lang w:val="en-US"/>
         </w:rPr>
       </w:pPr>
+      <w:r>
+        <w:rPr>
+          <w:i/>
+          <w:iCs/>
+          <w:lang w:val="en-US"/>
+        </w:rPr>
+        <w:t xml:space="preserve">System models </w:t>
+      </w:r>
+      <w:proofErr w:type="gramStart"/>
+      <w:r>
+        <w:rPr>
+          <w:i/>
+          <w:iCs/>
+          <w:lang w:val="en-US"/>
+        </w:rPr>
+        <w:t>describes</w:t>
+      </w:r>
+      <w:proofErr w:type="gramEnd"/>
+      <w:r>
+        <w:rPr>
+          <w:i/>
+          <w:iCs/>
+          <w:lang w:val="en-US"/>
+        </w:rPr>
+        <w:t xml:space="preserve"> the scenarios, use cases, object model, and dynamic models for the system. This section contains the complete functional specification, including mock-ups illustrating the user interface of the system and navigational paths representing the sequence of screens. The subsections Object model and Dynamic model are written during the Analysis activity.</w:t>
+      </w:r>
+    </w:p>
+    <w:p>
+      <w:pPr>
+        <w:rPr>
+          <w:i/>
+          <w:iCs/>
+          <w:lang w:val="en-US"/>
+        </w:rPr>
+      </w:pPr>
     </w:p>
     <w:p>
       <w:pPr>
@@ -4490,6 +4867,7 @@
         <w:rPr>
           <w:lang w:val="en-US"/>
         </w:rPr>
+        <w:lastRenderedPageBreak/>
         <w:t>Use case model</w:t>
       </w:r>
       <w:bookmarkEnd w:id="25"/>
@@ -4994,9 +5372,43 @@
             </w:rPr>
             <w:br/>
           </w:r>
+          <w:proofErr w:type="spellStart"/>
           <w:r>
-            <w:t>Automated Gherkin and BDD Test Scenario Generator</w:t>
+            <w:t>Automated</w:t>
           </w:r>
+          <w:proofErr w:type="spellEnd"/>
+          <w:r>
+            <w:t xml:space="preserve"> </w:t>
+          </w:r>
+          <w:proofErr w:type="spellStart"/>
+          <w:r>
+            <w:t>Gherkin</w:t>
+          </w:r>
+          <w:proofErr w:type="spellEnd"/>
+          <w:r>
+            <w:t xml:space="preserve"> </w:t>
+          </w:r>
+          <w:proofErr w:type="spellStart"/>
+          <w:r>
+            <w:t>and</w:t>
+          </w:r>
+          <w:proofErr w:type="spellEnd"/>
+          <w:r>
+            <w:t xml:space="preserve"> BDD Test </w:t>
+          </w:r>
+          <w:proofErr w:type="spellStart"/>
+          <w:r>
+            <w:t>Scenario</w:t>
+          </w:r>
+          <w:proofErr w:type="spellEnd"/>
+          <w:r>
+            <w:t xml:space="preserve"> </w:t>
+          </w:r>
+          <w:proofErr w:type="spellStart"/>
+          <w:r>
+            <w:t>Generator</w:t>
+          </w:r>
+          <w:proofErr w:type="spellEnd"/>
         </w:p>
       </w:tc>
       <w:tc>
@@ -5021,7 +5433,13 @@
             <w:rPr>
               <w:lang w:val="en-US"/>
             </w:rPr>
-            <w:t xml:space="preserve"> No: 1.0</w:t>
+            <w:t xml:space="preserve"> No: 1.</w:t>
+          </w:r>
+          <w:r>
+            <w:rPr>
+              <w:lang w:val="en-US"/>
+            </w:rPr>
+            <w:t>1</w:t>
           </w:r>
         </w:p>
         <w:p>
@@ -5909,6 +6327,119 @@
     </w:lvl>
   </w:abstractNum>
   <w:abstractNum w:abstractNumId="8" w15:restartNumberingAfterBreak="0">
+    <w:nsid w:val="5F662320"/>
+    <w:multiLevelType w:val="hybridMultilevel"/>
+    <w:tmpl w:val="55DA0366"/>
+    <w:lvl w:ilvl="0" w:tplc="041F0001">
+      <w:start w:val="1"/>
+      <w:numFmt w:val="bullet"/>
+      <w:lvlText w:val=""/>
+      <w:lvlJc w:val="left"/>
+      <w:pPr>
+        <w:ind w:left="720" w:hanging="360"/>
+      </w:pPr>
+      <w:rPr>
+        <w:rFonts w:ascii="Symbol" w:hAnsi="Symbol" w:hint="default"/>
+      </w:rPr>
+    </w:lvl>
+    <w:lvl w:ilvl="1" w:tplc="041F0003" w:tentative="1">
+      <w:start w:val="1"/>
+      <w:numFmt w:val="bullet"/>
+      <w:lvlText w:val="o"/>
+      <w:lvlJc w:val="left"/>
+      <w:pPr>
+        <w:ind w:left="1440" w:hanging="360"/>
+      </w:pPr>
+      <w:rPr>
+        <w:rFonts w:ascii="Courier New" w:hAnsi="Courier New" w:cs="Courier New" w:hint="default"/>
+      </w:rPr>
+    </w:lvl>
+    <w:lvl w:ilvl="2" w:tplc="041F0005" w:tentative="1">
+      <w:start w:val="1"/>
+      <w:numFmt w:val="bullet"/>
+      <w:lvlText w:val=""/>
+      <w:lvlJc w:val="left"/>
+      <w:pPr>
+        <w:ind w:left="2160" w:hanging="360"/>
+      </w:pPr>
+      <w:rPr>
+        <w:rFonts w:ascii="Wingdings" w:hAnsi="Wingdings" w:hint="default"/>
+      </w:rPr>
+    </w:lvl>
+    <w:lvl w:ilvl="3" w:tplc="041F0001" w:tentative="1">
+      <w:start w:val="1"/>
+      <w:numFmt w:val="bullet"/>
+      <w:lvlText w:val=""/>
+      <w:lvlJc w:val="left"/>
+      <w:pPr>
+        <w:ind w:left="2880" w:hanging="360"/>
+      </w:pPr>
+      <w:rPr>
+        <w:rFonts w:ascii="Symbol" w:hAnsi="Symbol" w:hint="default"/>
+      </w:rPr>
+    </w:lvl>
+    <w:lvl w:ilvl="4" w:tplc="041F0003" w:tentative="1">
+      <w:start w:val="1"/>
+      <w:numFmt w:val="bullet"/>
+      <w:lvlText w:val="o"/>
+      <w:lvlJc w:val="left"/>
+      <w:pPr>
+        <w:ind w:left="3600" w:hanging="360"/>
+      </w:pPr>
+      <w:rPr>
+        <w:rFonts w:ascii="Courier New" w:hAnsi="Courier New" w:cs="Courier New" w:hint="default"/>
+      </w:rPr>
+    </w:lvl>
+    <w:lvl w:ilvl="5" w:tplc="041F0005" w:tentative="1">
+      <w:start w:val="1"/>
+      <w:numFmt w:val="bullet"/>
+      <w:lvlText w:val=""/>
+      <w:lvlJc w:val="left"/>
+      <w:pPr>
+        <w:ind w:left="4320" w:hanging="360"/>
+      </w:pPr>
+      <w:rPr>
+        <w:rFonts w:ascii="Wingdings" w:hAnsi="Wingdings" w:hint="default"/>
+      </w:rPr>
+    </w:lvl>
+    <w:lvl w:ilvl="6" w:tplc="041F0001" w:tentative="1">
+      <w:start w:val="1"/>
+      <w:numFmt w:val="bullet"/>
+      <w:lvlText w:val=""/>
+      <w:lvlJc w:val="left"/>
+      <w:pPr>
+        <w:ind w:left="5040" w:hanging="360"/>
+      </w:pPr>
+      <w:rPr>
+        <w:rFonts w:ascii="Symbol" w:hAnsi="Symbol" w:hint="default"/>
+      </w:rPr>
+    </w:lvl>
+    <w:lvl w:ilvl="7" w:tplc="041F0003" w:tentative="1">
+      <w:start w:val="1"/>
+      <w:numFmt w:val="bullet"/>
+      <w:lvlText w:val="o"/>
+      <w:lvlJc w:val="left"/>
+      <w:pPr>
+        <w:ind w:left="5760" w:hanging="360"/>
+      </w:pPr>
+      <w:rPr>
+        <w:rFonts w:ascii="Courier New" w:hAnsi="Courier New" w:cs="Courier New" w:hint="default"/>
+      </w:rPr>
+    </w:lvl>
+    <w:lvl w:ilvl="8" w:tplc="041F0005" w:tentative="1">
+      <w:start w:val="1"/>
+      <w:numFmt w:val="bullet"/>
+      <w:lvlText w:val=""/>
+      <w:lvlJc w:val="left"/>
+      <w:pPr>
+        <w:ind w:left="6480" w:hanging="360"/>
+      </w:pPr>
+      <w:rPr>
+        <w:rFonts w:ascii="Wingdings" w:hAnsi="Wingdings" w:hint="default"/>
+      </w:rPr>
+    </w:lvl>
+  </w:abstractNum>
+  <w:abstractNum w:abstractNumId="9" w15:restartNumberingAfterBreak="0">
     <w:nsid w:val="606E24C9"/>
     <w:multiLevelType w:val="hybridMultilevel"/>
     <w:tmpl w:val="D804C842"/>
@@ -6021,7 +6552,7 @@
       </w:rPr>
     </w:lvl>
   </w:abstractNum>
-  <w:abstractNum w:abstractNumId="9" w15:restartNumberingAfterBreak="0">
+  <w:abstractNum w:abstractNumId="10" w15:restartNumberingAfterBreak="0">
     <w:nsid w:val="68165764"/>
     <w:multiLevelType w:val="hybridMultilevel"/>
     <w:tmpl w:val="C144CEB0"/>
@@ -6134,7 +6665,7 @@
       </w:rPr>
     </w:lvl>
   </w:abstractNum>
-  <w:abstractNum w:abstractNumId="10" w15:restartNumberingAfterBreak="0">
+  <w:abstractNum w:abstractNumId="11" w15:restartNumberingAfterBreak="0">
     <w:nsid w:val="6CC1056C"/>
     <w:multiLevelType w:val="hybridMultilevel"/>
     <w:tmpl w:val="522247C2"/>
@@ -6223,7 +6754,7 @@
       </w:pPr>
     </w:lvl>
   </w:abstractNum>
-  <w:abstractNum w:abstractNumId="11" w15:restartNumberingAfterBreak="0">
+  <w:abstractNum w:abstractNumId="12" w15:restartNumberingAfterBreak="0">
     <w:nsid w:val="740E17E7"/>
     <w:multiLevelType w:val="hybridMultilevel"/>
     <w:tmpl w:val="7258390A"/>
@@ -6309,7 +6840,7 @@
       </w:pPr>
     </w:lvl>
   </w:abstractNum>
-  <w:abstractNum w:abstractNumId="12" w15:restartNumberingAfterBreak="0">
+  <w:abstractNum w:abstractNumId="13" w15:restartNumberingAfterBreak="0">
     <w:nsid w:val="795D38E2"/>
     <w:multiLevelType w:val="hybridMultilevel"/>
     <w:tmpl w:val="F0B27F3E"/>
@@ -6395,11 +6926,100 @@
       </w:pPr>
     </w:lvl>
   </w:abstractNum>
+  <w:abstractNum w:abstractNumId="14" w15:restartNumberingAfterBreak="0">
+    <w:nsid w:val="7B7933C0"/>
+    <w:multiLevelType w:val="hybridMultilevel"/>
+    <w:tmpl w:val="FECC8B48"/>
+    <w:lvl w:ilvl="0" w:tplc="041F000F">
+      <w:start w:val="1"/>
+      <w:numFmt w:val="decimal"/>
+      <w:lvlText w:val="%1."/>
+      <w:lvlJc w:val="left"/>
+      <w:pPr>
+        <w:ind w:left="720" w:hanging="360"/>
+      </w:pPr>
+      <w:rPr>
+        <w:rFonts w:hint="default"/>
+      </w:rPr>
+    </w:lvl>
+    <w:lvl w:ilvl="1" w:tplc="041F0019" w:tentative="1">
+      <w:start w:val="1"/>
+      <w:numFmt w:val="lowerLetter"/>
+      <w:lvlText w:val="%2."/>
+      <w:lvlJc w:val="left"/>
+      <w:pPr>
+        <w:ind w:left="1440" w:hanging="360"/>
+      </w:pPr>
+    </w:lvl>
+    <w:lvl w:ilvl="2" w:tplc="041F001B" w:tentative="1">
+      <w:start w:val="1"/>
+      <w:numFmt w:val="lowerRoman"/>
+      <w:lvlText w:val="%3."/>
+      <w:lvlJc w:val="right"/>
+      <w:pPr>
+        <w:ind w:left="2160" w:hanging="180"/>
+      </w:pPr>
+    </w:lvl>
+    <w:lvl w:ilvl="3" w:tplc="041F000F" w:tentative="1">
+      <w:start w:val="1"/>
+      <w:numFmt w:val="decimal"/>
+      <w:lvlText w:val="%4."/>
+      <w:lvlJc w:val="left"/>
+      <w:pPr>
+        <w:ind w:left="2880" w:hanging="360"/>
+      </w:pPr>
+    </w:lvl>
+    <w:lvl w:ilvl="4" w:tplc="041F0019" w:tentative="1">
+      <w:start w:val="1"/>
+      <w:numFmt w:val="lowerLetter"/>
+      <w:lvlText w:val="%5."/>
+      <w:lvlJc w:val="left"/>
+      <w:pPr>
+        <w:ind w:left="3600" w:hanging="360"/>
+      </w:pPr>
+    </w:lvl>
+    <w:lvl w:ilvl="5" w:tplc="041F001B" w:tentative="1">
+      <w:start w:val="1"/>
+      <w:numFmt w:val="lowerRoman"/>
+      <w:lvlText w:val="%6."/>
+      <w:lvlJc w:val="right"/>
+      <w:pPr>
+        <w:ind w:left="4320" w:hanging="180"/>
+      </w:pPr>
+    </w:lvl>
+    <w:lvl w:ilvl="6" w:tplc="041F000F" w:tentative="1">
+      <w:start w:val="1"/>
+      <w:numFmt w:val="decimal"/>
+      <w:lvlText w:val="%7."/>
+      <w:lvlJc w:val="left"/>
+      <w:pPr>
+        <w:ind w:left="5040" w:hanging="360"/>
+      </w:pPr>
+    </w:lvl>
+    <w:lvl w:ilvl="7" w:tplc="041F0019" w:tentative="1">
+      <w:start w:val="1"/>
+      <w:numFmt w:val="lowerLetter"/>
+      <w:lvlText w:val="%8."/>
+      <w:lvlJc w:val="left"/>
+      <w:pPr>
+        <w:ind w:left="5760" w:hanging="360"/>
+      </w:pPr>
+    </w:lvl>
+    <w:lvl w:ilvl="8" w:tplc="041F001B" w:tentative="1">
+      <w:start w:val="1"/>
+      <w:numFmt w:val="lowerRoman"/>
+      <w:lvlText w:val="%9."/>
+      <w:lvlJc w:val="right"/>
+      <w:pPr>
+        <w:ind w:left="6480" w:hanging="180"/>
+      </w:pPr>
+    </w:lvl>
+  </w:abstractNum>
   <w:num w:numId="1" w16cid:durableId="571893156">
-    <w:abstractNumId w:val="11"/>
+    <w:abstractNumId w:val="12"/>
   </w:num>
   <w:num w:numId="2" w16cid:durableId="954367949">
-    <w:abstractNumId w:val="12"/>
+    <w:abstractNumId w:val="13"/>
   </w:num>
   <w:num w:numId="3" w16cid:durableId="1432700190">
     <w:abstractNumId w:val="2"/>
@@ -6411,7 +7031,7 @@
     <w:abstractNumId w:val="3"/>
   </w:num>
   <w:num w:numId="6" w16cid:durableId="1505632676">
-    <w:abstractNumId w:val="9"/>
+    <w:abstractNumId w:val="10"/>
   </w:num>
   <w:num w:numId="7" w16cid:durableId="1229609474">
     <w:abstractNumId w:val="3"/>
@@ -6426,7 +7046,7 @@
     <w:abstractNumId w:val="4"/>
   </w:num>
   <w:num w:numId="11" w16cid:durableId="925528599">
-    <w:abstractNumId w:val="8"/>
+    <w:abstractNumId w:val="9"/>
   </w:num>
   <w:num w:numId="12" w16cid:durableId="1692685974">
     <w:abstractNumId w:val="3"/>
@@ -6477,7 +7097,13 @@
     <w:abstractNumId w:val="6"/>
   </w:num>
   <w:num w:numId="28" w16cid:durableId="313145721">
-    <w:abstractNumId w:val="10"/>
+    <w:abstractNumId w:val="11"/>
+  </w:num>
+  <w:num w:numId="29" w16cid:durableId="2004310505">
+    <w:abstractNumId w:val="14"/>
+  </w:num>
+  <w:num w:numId="30" w16cid:durableId="831063776">
+    <w:abstractNumId w:val="8"/>
   </w:num>
 </w:numbering>
 </file>

</xml_diff>

<commit_message>
Sequence Diagramlar eklendi, revize yapıldı, class diagram değişiklikleri ve formatlama düzenlemeleri uygulandı
</commit_message>
<xml_diff>
--- a/CSE443 - RAD_Template.docx
+++ b/CSE443 - RAD_Template.docx
@@ -121,7 +121,13 @@
         <w:rPr>
           <w:lang w:val="en-US"/>
         </w:rPr>
-        <w:t>1.3</w:t>
+        <w:t>1.</w:t>
+      </w:r>
+      <w:r>
+        <w:rPr>
+          <w:lang w:val="en-US"/>
+        </w:rPr>
+        <w:t>4</w:t>
       </w:r>
     </w:p>
     <w:p>
@@ -358,7 +364,7 @@
         <w:rPr>
           <w:noProof/>
         </w:rPr>
-        <w:instrText xml:space="preserve"> PAGEREF _Toc243911381 \h </w:instrText>
+        <w:instrText xml:space="preserve"> PAGEREF _Toc244009470 \h </w:instrText>
       </w:r>
       <w:r>
         <w:rPr>
@@ -443,7 +449,7 @@
         <w:rPr>
           <w:noProof/>
         </w:rPr>
-        <w:instrText xml:space="preserve"> PAGEREF _Toc243911382 \h </w:instrText>
+        <w:instrText xml:space="preserve"> PAGEREF _Toc244009471 \h </w:instrText>
       </w:r>
       <w:r>
         <w:rPr>
@@ -528,7 +534,7 @@
         <w:rPr>
           <w:noProof/>
         </w:rPr>
-        <w:instrText xml:space="preserve"> PAGEREF _Toc243911383 \h </w:instrText>
+        <w:instrText xml:space="preserve"> PAGEREF _Toc244009472 \h </w:instrText>
       </w:r>
       <w:r>
         <w:rPr>
@@ -613,7 +619,7 @@
         <w:rPr>
           <w:noProof/>
         </w:rPr>
-        <w:instrText xml:space="preserve"> PAGEREF _Toc243911384 \h </w:instrText>
+        <w:instrText xml:space="preserve"> PAGEREF _Toc244009473 \h </w:instrText>
       </w:r>
       <w:r>
         <w:rPr>
@@ -698,7 +704,7 @@
         <w:rPr>
           <w:noProof/>
         </w:rPr>
-        <w:instrText xml:space="preserve"> PAGEREF _Toc243911385 \h </w:instrText>
+        <w:instrText xml:space="preserve"> PAGEREF _Toc244009474 \h </w:instrText>
       </w:r>
       <w:r>
         <w:rPr>
@@ -783,7 +789,7 @@
         <w:rPr>
           <w:noProof/>
         </w:rPr>
-        <w:instrText xml:space="preserve"> PAGEREF _Toc243911386 \h </w:instrText>
+        <w:instrText xml:space="preserve"> PAGEREF _Toc244009475 \h </w:instrText>
       </w:r>
       <w:r>
         <w:rPr>
@@ -868,7 +874,7 @@
         <w:rPr>
           <w:noProof/>
         </w:rPr>
-        <w:instrText xml:space="preserve"> PAGEREF _Toc243911387 \h </w:instrText>
+        <w:instrText xml:space="preserve"> PAGEREF _Toc244009476 \h </w:instrText>
       </w:r>
       <w:r>
         <w:rPr>
@@ -953,7 +959,7 @@
         <w:rPr>
           <w:noProof/>
         </w:rPr>
-        <w:instrText xml:space="preserve"> PAGEREF _Toc243911388 \h </w:instrText>
+        <w:instrText xml:space="preserve"> PAGEREF _Toc244009477 \h </w:instrText>
       </w:r>
       <w:r>
         <w:rPr>
@@ -1038,7 +1044,7 @@
         <w:rPr>
           <w:noProof/>
         </w:rPr>
-        <w:instrText xml:space="preserve"> PAGEREF _Toc243911389 \h </w:instrText>
+        <w:instrText xml:space="preserve"> PAGEREF _Toc244009478 \h </w:instrText>
       </w:r>
       <w:r>
         <w:rPr>
@@ -1119,7 +1125,7 @@
         <w:rPr>
           <w:noProof/>
         </w:rPr>
-        <w:instrText xml:space="preserve"> PAGEREF _Toc243911390 \h </w:instrText>
+        <w:instrText xml:space="preserve"> PAGEREF _Toc244009479 \h </w:instrText>
       </w:r>
       <w:r>
         <w:rPr>
@@ -1204,7 +1210,7 @@
         <w:rPr>
           <w:noProof/>
         </w:rPr>
-        <w:instrText xml:space="preserve"> PAGEREF _Toc243911391 \h </w:instrText>
+        <w:instrText xml:space="preserve"> PAGEREF _Toc244009480 \h </w:instrText>
       </w:r>
       <w:r>
         <w:rPr>
@@ -1285,7 +1291,7 @@
         <w:rPr>
           <w:noProof/>
         </w:rPr>
-        <w:instrText xml:space="preserve"> PAGEREF _Toc243911392 \h </w:instrText>
+        <w:instrText xml:space="preserve"> PAGEREF _Toc244009481 \h </w:instrText>
       </w:r>
       <w:r>
         <w:rPr>
@@ -1370,7 +1376,7 @@
         <w:rPr>
           <w:noProof/>
         </w:rPr>
-        <w:instrText xml:space="preserve"> PAGEREF _Toc243911393 \h </w:instrText>
+        <w:instrText xml:space="preserve"> PAGEREF _Toc244009482 \h </w:instrText>
       </w:r>
       <w:r>
         <w:rPr>
@@ -1455,7 +1461,7 @@
         <w:rPr>
           <w:noProof/>
         </w:rPr>
-        <w:instrText xml:space="preserve"> PAGEREF _Toc243911394 \h </w:instrText>
+        <w:instrText xml:space="preserve"> PAGEREF _Toc244009483 \h </w:instrText>
       </w:r>
       <w:r>
         <w:rPr>
@@ -1540,7 +1546,7 @@
         <w:rPr>
           <w:noProof/>
         </w:rPr>
-        <w:instrText xml:space="preserve"> PAGEREF _Toc243911395 \h </w:instrText>
+        <w:instrText xml:space="preserve"> PAGEREF _Toc244009484 \h </w:instrText>
       </w:r>
       <w:r>
         <w:rPr>
@@ -1625,7 +1631,7 @@
         <w:rPr>
           <w:noProof/>
         </w:rPr>
-        <w:instrText xml:space="preserve"> PAGEREF _Toc243911396 \h </w:instrText>
+        <w:instrText xml:space="preserve"> PAGEREF _Toc244009485 \h </w:instrText>
       </w:r>
       <w:r>
         <w:rPr>
@@ -1710,7 +1716,7 @@
         <w:rPr>
           <w:noProof/>
         </w:rPr>
-        <w:instrText xml:space="preserve"> PAGEREF _Toc243911397 \h </w:instrText>
+        <w:instrText xml:space="preserve"> PAGEREF _Toc244009486 \h </w:instrText>
       </w:r>
       <w:r>
         <w:rPr>
@@ -1795,7 +1801,7 @@
         <w:rPr>
           <w:noProof/>
         </w:rPr>
-        <w:instrText xml:space="preserve"> PAGEREF _Toc243911398 \h </w:instrText>
+        <w:instrText xml:space="preserve"> PAGEREF _Toc244009487 \h </w:instrText>
       </w:r>
       <w:r>
         <w:rPr>
@@ -1880,7 +1886,7 @@
         <w:rPr>
           <w:noProof/>
         </w:rPr>
-        <w:instrText xml:space="preserve"> PAGEREF _Toc243911399 \h </w:instrText>
+        <w:instrText xml:space="preserve"> PAGEREF _Toc244009488 \h </w:instrText>
       </w:r>
       <w:r>
         <w:rPr>
@@ -1965,7 +1971,7 @@
         <w:rPr>
           <w:noProof/>
         </w:rPr>
-        <w:instrText xml:space="preserve"> PAGEREF _Toc243911400 \h </w:instrText>
+        <w:instrText xml:space="preserve"> PAGEREF _Toc244009489 \h </w:instrText>
       </w:r>
       <w:r>
         <w:rPr>
@@ -2050,7 +2056,7 @@
         <w:rPr>
           <w:noProof/>
         </w:rPr>
-        <w:instrText xml:space="preserve"> PAGEREF _Toc243911401 \h </w:instrText>
+        <w:instrText xml:space="preserve"> PAGEREF _Toc244009490 \h </w:instrText>
       </w:r>
       <w:r>
         <w:rPr>
@@ -2135,7 +2141,7 @@
         <w:rPr>
           <w:noProof/>
         </w:rPr>
-        <w:instrText xml:space="preserve"> PAGEREF _Toc243911402 \h </w:instrText>
+        <w:instrText xml:space="preserve"> PAGEREF _Toc244009491 \h </w:instrText>
       </w:r>
       <w:r>
         <w:rPr>
@@ -2220,7 +2226,7 @@
         <w:rPr>
           <w:noProof/>
         </w:rPr>
-        <w:instrText xml:space="preserve"> PAGEREF _Toc243911403 \h </w:instrText>
+        <w:instrText xml:space="preserve"> PAGEREF _Toc244009492 \h </w:instrText>
       </w:r>
       <w:r>
         <w:rPr>
@@ -2305,7 +2311,7 @@
         <w:rPr>
           <w:noProof/>
         </w:rPr>
-        <w:instrText xml:space="preserve"> PAGEREF _Toc243911404 \h </w:instrText>
+        <w:instrText xml:space="preserve"> PAGEREF _Toc244009493 \h </w:instrText>
       </w:r>
       <w:r>
         <w:rPr>
@@ -2390,7 +2396,7 @@
         <w:rPr>
           <w:noProof/>
         </w:rPr>
-        <w:instrText xml:space="preserve"> PAGEREF _Toc243911405 \h </w:instrText>
+        <w:instrText xml:space="preserve"> PAGEREF _Toc244009494 \h </w:instrText>
       </w:r>
       <w:r>
         <w:rPr>
@@ -2475,7 +2481,7 @@
         <w:rPr>
           <w:noProof/>
         </w:rPr>
-        <w:instrText xml:space="preserve"> PAGEREF _Toc243911406 \h </w:instrText>
+        <w:instrText xml:space="preserve"> PAGEREF _Toc244009495 \h </w:instrText>
       </w:r>
       <w:r>
         <w:rPr>
@@ -2560,7 +2566,7 @@
         <w:rPr>
           <w:noProof/>
         </w:rPr>
-        <w:instrText xml:space="preserve"> PAGEREF _Toc243911407 \h </w:instrText>
+        <w:instrText xml:space="preserve"> PAGEREF _Toc244009496 \h </w:instrText>
       </w:r>
       <w:r>
         <w:rPr>
@@ -2645,7 +2651,7 @@
         <w:rPr>
           <w:noProof/>
         </w:rPr>
-        <w:instrText xml:space="preserve"> PAGEREF _Toc243911408 \h </w:instrText>
+        <w:instrText xml:space="preserve"> PAGEREF _Toc244009497 \h </w:instrText>
       </w:r>
       <w:r>
         <w:rPr>
@@ -2730,7 +2736,7 @@
         <w:rPr>
           <w:noProof/>
         </w:rPr>
-        <w:instrText xml:space="preserve"> PAGEREF _Toc243911409 \h </w:instrText>
+        <w:instrText xml:space="preserve"> PAGEREF _Toc244009498 \h </w:instrText>
       </w:r>
       <w:r>
         <w:rPr>
@@ -2815,7 +2821,7 @@
         <w:rPr>
           <w:noProof/>
         </w:rPr>
-        <w:instrText xml:space="preserve"> PAGEREF _Toc243911410 \h </w:instrText>
+        <w:instrText xml:space="preserve"> PAGEREF _Toc244009499 \h </w:instrText>
       </w:r>
       <w:r>
         <w:rPr>
@@ -2900,7 +2906,7 @@
         <w:rPr>
           <w:noProof/>
         </w:rPr>
-        <w:instrText xml:space="preserve"> PAGEREF _Toc243911411 \h </w:instrText>
+        <w:instrText xml:space="preserve"> PAGEREF _Toc244009500 \h </w:instrText>
       </w:r>
       <w:r>
         <w:rPr>
@@ -2985,7 +2991,7 @@
         <w:rPr>
           <w:noProof/>
         </w:rPr>
-        <w:instrText xml:space="preserve"> PAGEREF _Toc243911412 \h </w:instrText>
+        <w:instrText xml:space="preserve"> PAGEREF _Toc244009501 \h </w:instrText>
       </w:r>
       <w:r>
         <w:rPr>
@@ -3070,7 +3076,7 @@
         <w:rPr>
           <w:noProof/>
         </w:rPr>
-        <w:instrText xml:space="preserve"> PAGEREF _Toc243911413 \h </w:instrText>
+        <w:instrText xml:space="preserve"> PAGEREF _Toc244009502 \h </w:instrText>
       </w:r>
       <w:r>
         <w:rPr>
@@ -3155,7 +3161,7 @@
         <w:rPr>
           <w:noProof/>
         </w:rPr>
-        <w:instrText xml:space="preserve"> PAGEREF _Toc243911414 \h </w:instrText>
+        <w:instrText xml:space="preserve"> PAGEREF _Toc244009503 \h </w:instrText>
       </w:r>
       <w:r>
         <w:rPr>
@@ -3240,7 +3246,7 @@
         <w:rPr>
           <w:noProof/>
         </w:rPr>
-        <w:instrText xml:space="preserve"> PAGEREF _Toc243911415 \h </w:instrText>
+        <w:instrText xml:space="preserve"> PAGEREF _Toc244009504 \h </w:instrText>
       </w:r>
       <w:r>
         <w:rPr>
@@ -3325,7 +3331,7 @@
         <w:rPr>
           <w:noProof/>
         </w:rPr>
-        <w:instrText xml:space="preserve"> PAGEREF _Toc243911416 \h </w:instrText>
+        <w:instrText xml:space="preserve"> PAGEREF _Toc244009505 \h </w:instrText>
       </w:r>
       <w:r>
         <w:rPr>
@@ -3342,7 +3348,263 @@
         <w:rPr>
           <w:noProof/>
         </w:rPr>
-        <w:t>18</w:t>
+        <w:t>19</w:t>
+      </w:r>
+      <w:r>
+        <w:rPr>
+          <w:noProof/>
+        </w:rPr>
+        <w:fldChar w:fldCharType="end"/>
+      </w:r>
+    </w:p>
+    <w:p>
+      <w:pPr>
+        <w:pStyle w:val="T4"/>
+        <w:tabs>
+          <w:tab w:val="left" w:pos="1680"/>
+          <w:tab w:val="right" w:leader="dot" w:pos="9062"/>
+        </w:tabs>
+        <w:rPr>
+          <w:rFonts w:asciiTheme="minorHAnsi" w:eastAsiaTheme="minorEastAsia" w:hAnsiTheme="minorHAnsi"/>
+          <w:noProof/>
+          <w:kern w:val="2"/>
+          <w:sz w:val="24"/>
+          <w:szCs w:val="24"/>
+          <w:lang w:eastAsia="tr-TR"/>
+          <w14:ligatures w14:val="standardContextual"/>
+        </w:rPr>
+      </w:pPr>
+      <w:r>
+        <w:rPr>
+          <w:noProof/>
+          <w:lang w:val="en-US"/>
+        </w:rPr>
+        <w:t>3.4.4.1</w:t>
+      </w:r>
+      <w:r>
+        <w:rPr>
+          <w:rFonts w:asciiTheme="minorHAnsi" w:eastAsiaTheme="minorEastAsia" w:hAnsiTheme="minorHAnsi"/>
+          <w:noProof/>
+          <w:kern w:val="2"/>
+          <w:sz w:val="24"/>
+          <w:szCs w:val="24"/>
+          <w:lang w:eastAsia="tr-TR"/>
+          <w14:ligatures w14:val="standardContextual"/>
+        </w:rPr>
+        <w:tab/>
+      </w:r>
+      <w:r>
+        <w:rPr>
+          <w:noProof/>
+          <w:lang w:val="en-US"/>
+        </w:rPr>
+        <w:t>Sequence diagram: Import, parse and validate backlog</w:t>
+      </w:r>
+      <w:r>
+        <w:rPr>
+          <w:noProof/>
+        </w:rPr>
+        <w:tab/>
+      </w:r>
+      <w:r>
+        <w:rPr>
+          <w:noProof/>
+        </w:rPr>
+        <w:fldChar w:fldCharType="begin"/>
+      </w:r>
+      <w:r>
+        <w:rPr>
+          <w:noProof/>
+        </w:rPr>
+        <w:instrText xml:space="preserve"> PAGEREF _Toc244009506 \h </w:instrText>
+      </w:r>
+      <w:r>
+        <w:rPr>
+          <w:noProof/>
+        </w:rPr>
+      </w:r>
+      <w:r>
+        <w:rPr>
+          <w:noProof/>
+        </w:rPr>
+        <w:fldChar w:fldCharType="separate"/>
+      </w:r>
+      <w:r>
+        <w:rPr>
+          <w:noProof/>
+        </w:rPr>
+        <w:t>19</w:t>
+      </w:r>
+      <w:r>
+        <w:rPr>
+          <w:noProof/>
+        </w:rPr>
+        <w:fldChar w:fldCharType="end"/>
+      </w:r>
+    </w:p>
+    <w:p>
+      <w:pPr>
+        <w:pStyle w:val="T4"/>
+        <w:tabs>
+          <w:tab w:val="left" w:pos="1680"/>
+          <w:tab w:val="right" w:leader="dot" w:pos="9062"/>
+        </w:tabs>
+        <w:rPr>
+          <w:rFonts w:asciiTheme="minorHAnsi" w:eastAsiaTheme="minorEastAsia" w:hAnsiTheme="minorHAnsi"/>
+          <w:noProof/>
+          <w:kern w:val="2"/>
+          <w:sz w:val="24"/>
+          <w:szCs w:val="24"/>
+          <w:lang w:eastAsia="tr-TR"/>
+          <w14:ligatures w14:val="standardContextual"/>
+        </w:rPr>
+      </w:pPr>
+      <w:r>
+        <w:rPr>
+          <w:noProof/>
+          <w:lang w:val="en-US"/>
+        </w:rPr>
+        <w:lastRenderedPageBreak/>
+        <w:t>3.4.4.2</w:t>
+      </w:r>
+      <w:r>
+        <w:rPr>
+          <w:rFonts w:asciiTheme="minorHAnsi" w:eastAsiaTheme="minorEastAsia" w:hAnsiTheme="minorHAnsi"/>
+          <w:noProof/>
+          <w:kern w:val="2"/>
+          <w:sz w:val="24"/>
+          <w:szCs w:val="24"/>
+          <w:lang w:eastAsia="tr-TR"/>
+          <w14:ligatures w14:val="standardContextual"/>
+        </w:rPr>
+        <w:tab/>
+      </w:r>
+      <w:r>
+        <w:rPr>
+          <w:noProof/>
+          <w:lang w:val="en-US"/>
+        </w:rPr>
+        <w:t>Sequence diagram: Generate and display scenarios</w:t>
+      </w:r>
+      <w:r>
+        <w:rPr>
+          <w:noProof/>
+        </w:rPr>
+        <w:tab/>
+      </w:r>
+      <w:r>
+        <w:rPr>
+          <w:noProof/>
+        </w:rPr>
+        <w:fldChar w:fldCharType="begin"/>
+      </w:r>
+      <w:r>
+        <w:rPr>
+          <w:noProof/>
+        </w:rPr>
+        <w:instrText xml:space="preserve"> PAGEREF _Toc244009507 \h </w:instrText>
+      </w:r>
+      <w:r>
+        <w:rPr>
+          <w:noProof/>
+        </w:rPr>
+      </w:r>
+      <w:r>
+        <w:rPr>
+          <w:noProof/>
+        </w:rPr>
+        <w:fldChar w:fldCharType="separate"/>
+      </w:r>
+      <w:r>
+        <w:rPr>
+          <w:noProof/>
+        </w:rPr>
+        <w:t>21</w:t>
+      </w:r>
+      <w:r>
+        <w:rPr>
+          <w:noProof/>
+        </w:rPr>
+        <w:fldChar w:fldCharType="end"/>
+      </w:r>
+    </w:p>
+    <w:p>
+      <w:pPr>
+        <w:pStyle w:val="T4"/>
+        <w:tabs>
+          <w:tab w:val="left" w:pos="1680"/>
+          <w:tab w:val="right" w:leader="dot" w:pos="9062"/>
+        </w:tabs>
+        <w:rPr>
+          <w:rFonts w:asciiTheme="minorHAnsi" w:eastAsiaTheme="minorEastAsia" w:hAnsiTheme="minorHAnsi"/>
+          <w:noProof/>
+          <w:kern w:val="2"/>
+          <w:sz w:val="24"/>
+          <w:szCs w:val="24"/>
+          <w:lang w:eastAsia="tr-TR"/>
+          <w14:ligatures w14:val="standardContextual"/>
+        </w:rPr>
+      </w:pPr>
+      <w:r>
+        <w:rPr>
+          <w:noProof/>
+          <w:lang w:val="en-US"/>
+        </w:rPr>
+        <w:t>3.4.4.3</w:t>
+      </w:r>
+      <w:r>
+        <w:rPr>
+          <w:rFonts w:asciiTheme="minorHAnsi" w:eastAsiaTheme="minorEastAsia" w:hAnsiTheme="minorHAnsi"/>
+          <w:noProof/>
+          <w:kern w:val="2"/>
+          <w:sz w:val="24"/>
+          <w:szCs w:val="24"/>
+          <w:lang w:eastAsia="tr-TR"/>
+          <w14:ligatures w14:val="standardContextual"/>
+        </w:rPr>
+        <w:tab/>
+      </w:r>
+      <w:r>
+        <w:rPr>
+          <w:noProof/>
+          <w:lang w:val="en-US"/>
+        </w:rPr>
+        <w:t>Sequence diagram: Log in</w:t>
+      </w:r>
+      <w:r>
+        <w:rPr>
+          <w:noProof/>
+        </w:rPr>
+        <w:tab/>
+      </w:r>
+      <w:r>
+        <w:rPr>
+          <w:noProof/>
+        </w:rPr>
+        <w:fldChar w:fldCharType="begin"/>
+      </w:r>
+      <w:r>
+        <w:rPr>
+          <w:noProof/>
+        </w:rPr>
+        <w:instrText xml:space="preserve"> PAGEREF _Toc244009508 \h </w:instrText>
+      </w:r>
+      <w:r>
+        <w:rPr>
+          <w:noProof/>
+        </w:rPr>
+      </w:r>
+      <w:r>
+        <w:rPr>
+          <w:noProof/>
+        </w:rPr>
+        <w:fldChar w:fldCharType="separate"/>
+      </w:r>
+      <w:r>
+        <w:rPr>
+          <w:noProof/>
+        </w:rPr>
+        <w:t>23</w:t>
       </w:r>
       <w:r>
         <w:rPr>
@@ -3410,7 +3672,7 @@
         <w:rPr>
           <w:noProof/>
         </w:rPr>
-        <w:instrText xml:space="preserve"> PAGEREF _Toc243911417 \h </w:instrText>
+        <w:instrText xml:space="preserve"> PAGEREF _Toc244009509 \h </w:instrText>
       </w:r>
       <w:r>
         <w:rPr>
@@ -3427,7 +3689,7 @@
         <w:rPr>
           <w:noProof/>
         </w:rPr>
-        <w:t>18</w:t>
+        <w:t>23</w:t>
       </w:r>
       <w:r>
         <w:rPr>
@@ -3454,7 +3716,6 @@
           <w:noProof/>
           <w:lang w:val="en-US"/>
         </w:rPr>
-        <w:lastRenderedPageBreak/>
         <w:t>4</w:t>
       </w:r>
       <w:r>
@@ -3492,7 +3753,7 @@
         <w:rPr>
           <w:noProof/>
         </w:rPr>
-        <w:instrText xml:space="preserve"> PAGEREF _Toc243911418 \h </w:instrText>
+        <w:instrText xml:space="preserve"> PAGEREF _Toc244009510 \h </w:instrText>
       </w:r>
       <w:r>
         <w:rPr>
@@ -3509,7 +3770,7 @@
         <w:rPr>
           <w:noProof/>
         </w:rPr>
-        <w:t>18</w:t>
+        <w:t>23</w:t>
       </w:r>
       <w:r>
         <w:rPr>
@@ -3573,7 +3834,7 @@
         <w:rPr>
           <w:noProof/>
         </w:rPr>
-        <w:instrText xml:space="preserve"> PAGEREF _Toc243911419 \h </w:instrText>
+        <w:instrText xml:space="preserve"> PAGEREF _Toc244009511 \h </w:instrText>
       </w:r>
       <w:r>
         <w:rPr>
@@ -3590,7 +3851,7 @@
         <w:rPr>
           <w:noProof/>
         </w:rPr>
-        <w:t>20</w:t>
+        <w:t>25</w:t>
       </w:r>
       <w:r>
         <w:rPr>
@@ -3654,7 +3915,7 @@
         <w:rPr>
           <w:noProof/>
         </w:rPr>
-        <w:instrText xml:space="preserve"> PAGEREF _Toc243911420 \h </w:instrText>
+        <w:instrText xml:space="preserve"> PAGEREF _Toc244009512 \h </w:instrText>
       </w:r>
       <w:r>
         <w:rPr>
@@ -3671,7 +3932,7 @@
         <w:rPr>
           <w:noProof/>
         </w:rPr>
-        <w:t>21</w:t>
+        <w:t>26</w:t>
       </w:r>
       <w:r>
         <w:rPr>
@@ -3711,7 +3972,7 @@
           <w:lang w:val="en-US"/>
         </w:rPr>
       </w:pPr>
-      <w:bookmarkStart w:id="0" w:name="_Toc243911381"/>
+      <w:bookmarkStart w:id="0" w:name="_Toc244009470"/>
       <w:r>
         <w:rPr>
           <w:lang w:val="en-US"/>
@@ -3752,7 +4013,7 @@
           <w:lang w:val="en-US"/>
         </w:rPr>
       </w:pPr>
-      <w:bookmarkStart w:id="2" w:name="_Toc243911382"/>
+      <w:bookmarkStart w:id="2" w:name="_Toc244009471"/>
       <w:r>
         <w:rPr>
           <w:lang w:val="en-US"/>
@@ -3788,7 +4049,7 @@
           <w:lang w:val="en-US"/>
         </w:rPr>
       </w:pPr>
-      <w:bookmarkStart w:id="3" w:name="_Toc243911383"/>
+      <w:bookmarkStart w:id="3" w:name="_Toc244009472"/>
       <w:r>
         <w:rPr>
           <w:lang w:val="en-US"/>
@@ -3963,7 +4224,7 @@
           <w:lang w:val="en-US"/>
         </w:rPr>
       </w:pPr>
-      <w:bookmarkStart w:id="4" w:name="_Toc243911384"/>
+      <w:bookmarkStart w:id="4" w:name="_Toc244009473"/>
       <w:r>
         <w:rPr>
           <w:lang w:val="en-US"/>
@@ -3979,7 +4240,7 @@
           <w:lang w:val="en-US"/>
         </w:rPr>
       </w:pPr>
-      <w:bookmarkStart w:id="5" w:name="_Toc243911385"/>
+      <w:bookmarkStart w:id="5" w:name="_Toc244009474"/>
       <w:r>
         <w:rPr>
           <w:lang w:val="en-US"/>
@@ -4093,7 +4354,7 @@
           <w:lang w:val="en-US"/>
         </w:rPr>
       </w:pPr>
-      <w:bookmarkStart w:id="6" w:name="_Toc243911386"/>
+      <w:bookmarkStart w:id="6" w:name="_Toc244009475"/>
       <w:r>
         <w:rPr>
           <w:lang w:val="en-US"/>
@@ -4194,7 +4455,7 @@
           <w:lang w:val="en-US"/>
         </w:rPr>
       </w:pPr>
-      <w:bookmarkStart w:id="7" w:name="_Toc243911387"/>
+      <w:bookmarkStart w:id="7" w:name="_Toc244009476"/>
       <w:r>
         <w:rPr>
           <w:lang w:val="en-US"/>
@@ -4722,7 +4983,7 @@
           <w:lang w:val="en-US"/>
         </w:rPr>
       </w:pPr>
-      <w:bookmarkStart w:id="8" w:name="_Toc243911388"/>
+      <w:bookmarkStart w:id="8" w:name="_Toc244009477"/>
       <w:r>
         <w:rPr>
           <w:lang w:val="en-US"/>
@@ -4835,7 +5096,7 @@
           <w:lang w:val="en-US"/>
         </w:rPr>
       </w:pPr>
-      <w:bookmarkStart w:id="9" w:name="_Toc243911389"/>
+      <w:bookmarkStart w:id="9" w:name="_Toc244009478"/>
       <w:r>
         <w:rPr>
           <w:lang w:val="en-US"/>
@@ -4865,7 +5126,7 @@
           <w:lang w:val="en-US"/>
         </w:rPr>
       </w:pPr>
-      <w:bookmarkStart w:id="10" w:name="_Toc243911390"/>
+      <w:bookmarkStart w:id="10" w:name="_Toc244009479"/>
       <w:r>
         <w:rPr>
           <w:lang w:val="en-US"/>
@@ -4901,7 +5162,7 @@
           <w:lang w:val="en-US"/>
         </w:rPr>
       </w:pPr>
-      <w:bookmarkStart w:id="11" w:name="_Toc243911391"/>
+      <w:bookmarkStart w:id="11" w:name="_Toc244009480"/>
       <w:r>
         <w:rPr>
           <w:lang w:val="en-US"/>
@@ -5154,7 +5415,7 @@
           <w:lang w:val="en-US"/>
         </w:rPr>
       </w:pPr>
-      <w:bookmarkStart w:id="12" w:name="_Toc243911392"/>
+      <w:bookmarkStart w:id="12" w:name="_Toc244009481"/>
       <w:r>
         <w:rPr>
           <w:lang w:val="en-US"/>
@@ -5170,7 +5431,7 @@
           <w:lang w:val="en-US"/>
         </w:rPr>
       </w:pPr>
-      <w:bookmarkStart w:id="13" w:name="_Toc243911393"/>
+      <w:bookmarkStart w:id="13" w:name="_Toc244009482"/>
       <w:r>
         <w:rPr>
           <w:lang w:val="en-US"/>
@@ -5246,7 +5507,7 @@
           <w:lang w:val="en-US"/>
         </w:rPr>
       </w:pPr>
-      <w:bookmarkStart w:id="14" w:name="_Toc243911394"/>
+      <w:bookmarkStart w:id="14" w:name="_Toc244009483"/>
       <w:r>
         <w:rPr>
           <w:lang w:val="en-US"/>
@@ -5282,7 +5543,7 @@
           <w:lang w:val="en-US"/>
         </w:rPr>
       </w:pPr>
-      <w:bookmarkStart w:id="15" w:name="_Toc243911395"/>
+      <w:bookmarkStart w:id="15" w:name="_Toc244009484"/>
       <w:r>
         <w:rPr>
           <w:lang w:val="en-US"/>
@@ -5614,7 +5875,7 @@
           <w:lang w:val="en-US"/>
         </w:rPr>
       </w:pPr>
-      <w:bookmarkStart w:id="16" w:name="_Toc243911396"/>
+      <w:bookmarkStart w:id="16" w:name="_Toc244009485"/>
       <w:r>
         <w:rPr>
           <w:lang w:val="en-US"/>
@@ -5945,7 +6206,7 @@
           <w:lang w:val="en-US"/>
         </w:rPr>
       </w:pPr>
-      <w:bookmarkStart w:id="17" w:name="_Toc243911397"/>
+      <w:bookmarkStart w:id="17" w:name="_Toc244009486"/>
       <w:r>
         <w:rPr>
           <w:lang w:val="en-US"/>
@@ -6235,7 +6496,7 @@
           <w:lang w:val="en-US"/>
         </w:rPr>
       </w:pPr>
-      <w:bookmarkStart w:id="18" w:name="_Toc243911398"/>
+      <w:bookmarkStart w:id="18" w:name="_Toc244009487"/>
       <w:r>
         <w:rPr>
           <w:lang w:val="en-US"/>
@@ -6526,7 +6787,7 @@
           <w:lang w:val="en-US"/>
         </w:rPr>
       </w:pPr>
-      <w:bookmarkStart w:id="19" w:name="_Toc243911399"/>
+      <w:bookmarkStart w:id="19" w:name="_Toc244009488"/>
       <w:r>
         <w:rPr>
           <w:lang w:val="en-US"/>
@@ -6775,7 +7036,7 @@
           <w:lang w:val="en-US"/>
         </w:rPr>
       </w:pPr>
-      <w:bookmarkStart w:id="20" w:name="_Toc243911400"/>
+      <w:bookmarkStart w:id="20" w:name="_Toc244009489"/>
       <w:r>
         <w:rPr>
           <w:lang w:val="en-US"/>
@@ -7106,7 +7367,7 @@
           <w:lang w:val="en-US"/>
         </w:rPr>
       </w:pPr>
-      <w:bookmarkStart w:id="21" w:name="_Toc243911401"/>
+      <w:bookmarkStart w:id="21" w:name="_Toc244009490"/>
       <w:r>
         <w:rPr>
           <w:lang w:val="en-US"/>
@@ -7356,7 +7617,7 @@
           <w:lang w:val="en-US"/>
         </w:rPr>
       </w:pPr>
-      <w:bookmarkStart w:id="22" w:name="_Toc243911402"/>
+      <w:bookmarkStart w:id="22" w:name="_Toc244009491"/>
       <w:r>
         <w:rPr>
           <w:lang w:val="en-US"/>
@@ -7523,7 +7784,7 @@
           <w:lang w:val="en-US"/>
         </w:rPr>
       </w:pPr>
-      <w:bookmarkStart w:id="23" w:name="_Toc243911403"/>
+      <w:bookmarkStart w:id="23" w:name="_Toc244009492"/>
       <w:r>
         <w:rPr>
           <w:lang w:val="en-US"/>
@@ -7552,7 +7813,7 @@
           <w:lang w:val="en-US"/>
         </w:rPr>
       </w:pPr>
-      <w:bookmarkStart w:id="24" w:name="_Toc243911404"/>
+      <w:bookmarkStart w:id="24" w:name="_Toc244009493"/>
       <w:r>
         <w:rPr>
           <w:lang w:val="en-US"/>
@@ -7719,7 +7980,7 @@
           <w:lang w:val="en-US"/>
         </w:rPr>
       </w:pPr>
-      <w:bookmarkStart w:id="25" w:name="_Toc243911405"/>
+      <w:bookmarkStart w:id="25" w:name="_Toc244009494"/>
       <w:r>
         <w:rPr>
           <w:lang w:val="en-US"/>
@@ -7969,7 +8230,7 @@
           <w:lang w:val="en-US"/>
         </w:rPr>
       </w:pPr>
-      <w:bookmarkStart w:id="26" w:name="_Toc243911406"/>
+      <w:bookmarkStart w:id="26" w:name="_Toc244009495"/>
       <w:r>
         <w:rPr>
           <w:lang w:val="en-US"/>
@@ -8095,7 +8356,7 @@
           <w:lang w:val="en-US"/>
         </w:rPr>
       </w:pPr>
-      <w:bookmarkStart w:id="27" w:name="_Toc243911407"/>
+      <w:bookmarkStart w:id="27" w:name="_Toc244009496"/>
       <w:r>
         <w:rPr>
           <w:lang w:val="en-US"/>
@@ -8303,7 +8564,7 @@
           <w:lang w:val="en-US"/>
         </w:rPr>
       </w:pPr>
-      <w:bookmarkStart w:id="28" w:name="_Toc243911408"/>
+      <w:bookmarkStart w:id="28" w:name="_Toc244009497"/>
       <w:r>
         <w:rPr>
           <w:lang w:val="en-US"/>
@@ -8511,7 +8772,7 @@
           <w:lang w:val="en-US"/>
         </w:rPr>
       </w:pPr>
-      <w:bookmarkStart w:id="29" w:name="_Toc243911409"/>
+      <w:bookmarkStart w:id="29" w:name="_Toc244009498"/>
       <w:r>
         <w:rPr>
           <w:lang w:val="en-US"/>
@@ -8719,7 +8980,7 @@
           <w:lang w:val="en-US"/>
         </w:rPr>
       </w:pPr>
-      <w:bookmarkStart w:id="30" w:name="_Toc243911410"/>
+      <w:bookmarkStart w:id="30" w:name="_Toc244009499"/>
       <w:r>
         <w:rPr>
           <w:lang w:val="en-US"/>
@@ -8887,7 +9148,7 @@
           <w:lang w:val="en-US"/>
         </w:rPr>
       </w:pPr>
-      <w:bookmarkStart w:id="31" w:name="_Toc243911411"/>
+      <w:bookmarkStart w:id="31" w:name="_Toc244009500"/>
       <w:r>
         <w:rPr>
           <w:lang w:val="en-US"/>
@@ -9054,7 +9315,7 @@
           <w:lang w:val="en-US"/>
         </w:rPr>
       </w:pPr>
-      <w:bookmarkStart w:id="32" w:name="_Toc243911412"/>
+      <w:bookmarkStart w:id="32" w:name="_Toc244009501"/>
       <w:r>
         <w:rPr>
           <w:lang w:val="en-US"/>
@@ -9073,7 +9334,7 @@
         <w:rPr>
           <w:lang w:val="en-US"/>
         </w:rPr>
-        <w:t>System models describes the scenarios, use cases, object model, and dynamic models for the system. This section contains the complete functional specification, including mock-ups illustrating the user interface of the system and navigational paths representing the sequence of screens. The subsections Object model and Dynamic model are written during the Analysis activity.</w:t>
+        <w:t>This section presents the analysis models of the system. Section 3.4.1 describes concrete scenarios of how users work with the system. Section 3.4.2 presents the use case model, which shows the actors and the functions they use. Section 3.4.3 presents the object model, which describes the concepts of the problem domain and their relationships. Section 3.4.4 presents the dynamic model, which shows how the objects of the system collaborate over time. Section 3.4.5 presents the mock-ups of the user interface. The models use the same names for actors, use cases, and classes, and they realize the functional requirements of Section 3.2.</w:t>
       </w:r>
     </w:p>
     <w:p>
@@ -9090,7 +9351,7 @@
           <w:lang w:val="en-US"/>
         </w:rPr>
       </w:pPr>
-      <w:bookmarkStart w:id="33" w:name="_Toc243911413"/>
+      <w:bookmarkStart w:id="33" w:name="_Toc244009502"/>
       <w:r>
         <w:rPr>
           <w:lang w:val="en-US"/>
@@ -9353,6 +9614,7 @@
               <w:rPr>
                 <w:lang w:val="en-US"/>
               </w:rPr>
+              <w:lastRenderedPageBreak/>
               <w:t>5. The system authenticates Elif and grants access to the import, generation, and history functions.</w:t>
             </w:r>
           </w:p>
@@ -9789,20 +10051,26 @@
               <w:rPr>
                 <w:lang w:val="en-US"/>
               </w:rPr>
-              <w:t>6. The system generates at least one Gherkin scenario for each requirement. For SHOP-2 it generates the scenario "Customer adds a product to the cart" with the steps "Given the customer is viewing a product", "When the customer adds the product to the cart", and "Then the product is in the customer's cart". It adds further scenarios for the alternative flows that it can identify.</w:t>
-            </w:r>
-          </w:p>
-          <w:p>
-            <w:pPr>
-              <w:rPr>
-                <w:lang w:val="en-US"/>
-              </w:rPr>
-            </w:pPr>
+              <w:t xml:space="preserve">6. The system generates at least one Gherkin scenario for each requirement. For SHOP-2 it generates the scenario "Customer adds a product to the cart" with the steps "Given the customer is viewing a </w:t>
+            </w:r>
             <w:r>
               <w:rPr>
                 <w:lang w:val="en-US"/>
               </w:rPr>
               <w:lastRenderedPageBreak/>
+              <w:t>product", "When the customer adds the product to the cart", and "Then the product is in the customer's cart". It adds further scenarios for the alternative flows that it can identify.</w:t>
+            </w:r>
+          </w:p>
+          <w:p>
+            <w:pPr>
+              <w:rPr>
+                <w:lang w:val="en-US"/>
+              </w:rPr>
+            </w:pPr>
+            <w:r>
+              <w:rPr>
+                <w:lang w:val="en-US"/>
+              </w:rPr>
               <w:t>7. The system stores the import in Elif's history and displays the generated scenarios as Gherkin text, together with the warning for SHOP-4.</w:t>
             </w:r>
           </w:p>
@@ -10905,33 +11173,43 @@
                 <w:lang w:val="en-US"/>
               </w:rPr>
             </w:pPr>
-            <w:r>
+          </w:p>
+          <w:p>
+            <w:pPr>
               <w:rPr>
                 <w:rFonts w:ascii="Consolas" w:hAnsi="Consolas" w:cs="Consolas"/>
                 <w:sz w:val="18"/>
                 <w:szCs w:val="18"/>
                 <w:lang w:val="en-US"/>
               </w:rPr>
-              <w:t xml:space="preserve">  @SHOP-3</w:t>
-            </w:r>
-          </w:p>
-          <w:p>
-            <w:pPr>
+            </w:pPr>
+            <w:r>
               <w:rPr>
                 <w:rFonts w:ascii="Consolas" w:hAnsi="Consolas" w:cs="Consolas"/>
                 <w:sz w:val="18"/>
                 <w:szCs w:val="18"/>
                 <w:lang w:val="en-US"/>
               </w:rPr>
-            </w:pPr>
-            <w:r>
+              <w:lastRenderedPageBreak/>
+              <w:t xml:space="preserve">  @SHOP-3</w:t>
+            </w:r>
+          </w:p>
+          <w:p>
+            <w:pPr>
               <w:rPr>
                 <w:rFonts w:ascii="Consolas" w:hAnsi="Consolas" w:cs="Consolas"/>
                 <w:sz w:val="18"/>
                 <w:szCs w:val="18"/>
                 <w:lang w:val="en-US"/>
               </w:rPr>
-              <w:lastRenderedPageBreak/>
+            </w:pPr>
+            <w:r>
+              <w:rPr>
+                <w:rFonts w:ascii="Consolas" w:hAnsi="Consolas" w:cs="Consolas"/>
+                <w:sz w:val="18"/>
+                <w:szCs w:val="18"/>
+                <w:lang w:val="en-US"/>
+              </w:rPr>
               <w:t xml:space="preserve">  Scenario: Customer removes a product from the cart</w:t>
             </w:r>
           </w:p>
@@ -11597,6 +11875,7 @@
               <w:rPr>
                 <w:lang w:val="en-US"/>
               </w:rPr>
+              <w:lastRenderedPageBreak/>
               <w:t>A2. AI-assisted validation is disabled, which is the default. The system does not send any data to the AI component and displays no findings.</w:t>
             </w:r>
           </w:p>
@@ -11660,7 +11939,7 @@
           <w:lang w:val="en-US"/>
         </w:rPr>
       </w:pPr>
-      <w:bookmarkStart w:id="34" w:name="_Toc243911414"/>
+      <w:bookmarkStart w:id="34" w:name="_Toc244009503"/>
       <w:r>
         <w:rPr>
           <w:lang w:val="en-US"/>
@@ -11677,13 +11956,46 @@
       </w:pPr>
       <w:r>
         <w:rPr>
+          <w:lang w:val="en-US"/>
+        </w:rPr>
+        <w:t>Figure 3.4.2-1 shows the use case model of the system. The system has three actors. A Visitor is a person who is not logged in and can register an account (Register Account) and log in (Log In). A Registered user is a person who has logged in and can log out, generate scenarios from a backlog, copy or export the generated scenarios, view the source user story of a scenario, and view their history. The AI component is a secondary actor that takes part only in the optional use case Validate Scenarios with AI.</w:t>
+      </w:r>
+    </w:p>
+    <w:p>
+      <w:pPr>
+        <w:rPr>
+          <w:lang w:val="en-US"/>
+        </w:rPr>
+      </w:pPr>
+    </w:p>
+    <w:p>
+      <w:pPr>
+        <w:rPr>
+          <w:lang w:val="en-US"/>
+        </w:rPr>
+      </w:pPr>
+      <w:r>
+        <w:rPr>
+          <w:lang w:val="en-US"/>
+        </w:rPr>
+        <w:t>The use case Generate Scenarios from Backlog includes Parse Requirements and Validate Requirements, because the generation of scenarios always depends on both. Validate Scenarios with AI extends Generate Scenarios from Backlog and is performed only when AI-assisted validation is enabled. All use cases except Register Account and Log In require that the user is logged in.</w:t>
+      </w:r>
+    </w:p>
+    <w:p>
+      <w:pPr>
+        <w:rPr>
+          <w:lang w:val="en-US"/>
+        </w:rPr>
+      </w:pPr>
+      <w:r>
+        <w:rPr>
           <w:noProof/>
           <w:lang w:val="en-US"/>
         </w:rPr>
         <w:drawing>
-          <wp:inline distT="0" distB="0" distL="0" distR="0" wp14:anchorId="2E6293A7" wp14:editId="4DF6AFFD">
-            <wp:extent cx="5438775" cy="4223157"/>
-            <wp:effectExtent l="0" t="0" r="0" b="6350"/>
+          <wp:inline distT="0" distB="0" distL="0" distR="0" wp14:anchorId="2E6293A7" wp14:editId="15786A8A">
+            <wp:extent cx="5618164" cy="4362450"/>
+            <wp:effectExtent l="0" t="0" r="1905" b="0"/>
             <wp:docPr id="663320550" name="Resim 1"/>
             <wp:cNvGraphicFramePr>
               <a:graphicFrameLocks xmlns:a="http://schemas.openxmlformats.org/drawingml/2006/main" noChangeAspect="1"/>
@@ -11713,7 +12025,7 @@
                   <pic:spPr bwMode="auto">
                     <a:xfrm>
                       <a:off x="0" y="0"/>
-                      <a:ext cx="5496698" cy="4268133"/>
+                      <a:ext cx="5689181" cy="4417594"/>
                     </a:xfrm>
                     <a:prstGeom prst="rect">
                       <a:avLst/>
@@ -11732,6 +12044,24 @@
     </w:p>
     <w:p>
       <w:pPr>
+        <w:jc w:val="center"/>
+        <w:rPr>
+          <w:i/>
+          <w:iCs/>
+          <w:lang w:val="en-US"/>
+        </w:rPr>
+      </w:pPr>
+      <w:r>
+        <w:rPr>
+          <w:i/>
+          <w:iCs/>
+          <w:lang w:val="en-US"/>
+        </w:rPr>
+        <w:t>Figure 3.4.2-1</w:t>
+      </w:r>
+    </w:p>
+    <w:p>
+      <w:pPr>
         <w:rPr>
           <w:lang w:val="en-US"/>
         </w:rPr>
@@ -11744,12 +12074,11 @@
           <w:lang w:val="en-US"/>
         </w:rPr>
       </w:pPr>
-      <w:bookmarkStart w:id="35" w:name="_Toc243911415"/>
-      <w:r>
-        <w:rPr>
-          <w:lang w:val="en-US"/>
-        </w:rPr>
-        <w:lastRenderedPageBreak/>
+      <w:bookmarkStart w:id="35" w:name="_Toc244009504"/>
+      <w:r>
+        <w:rPr>
+          <w:lang w:val="en-US"/>
+        </w:rPr>
         <w:t>Object model</w:t>
       </w:r>
       <w:bookmarkEnd w:id="35"/>
@@ -11762,14 +12091,47 @@
       </w:pPr>
       <w:r>
         <w:rPr>
+          <w:lang w:val="en-US"/>
+        </w:rPr>
+        <w:t>A RegisteredUser submits any number of Imports. An Import contains the UserStories read from one Jira CSV file. A UserStory has an optional issue key, its summary, and a status. It is parsed into at most one Requirement, which is either a UserStoryTemplateRequirement (role, capability, and an optional benefit) or an EARSRequirement (an optional precondition, an optional trigger, and a system response). A UserStory that is unsupported has no Requirement. The validation of a user story produces any number of ValidationResults, each of which is an error or a warning.</w:t>
+      </w:r>
+    </w:p>
+    <w:p>
+      <w:pPr>
+        <w:rPr>
+          <w:lang w:val="en-US"/>
+        </w:rPr>
+      </w:pPr>
+    </w:p>
+    <w:p>
+      <w:pPr>
+        <w:rPr>
+          <w:lang w:val="en-US"/>
+        </w:rPr>
+      </w:pPr>
+      <w:r>
+        <w:rPr>
+          <w:lang w:val="en-US"/>
+        </w:rPr>
+        <w:t>A user story that has passed validation is described by one Feature, which contains one or more Scenarios. A Scenario consists of an ordered list of Steps, is either a normal or an alternative flow, and may be checked by AI findings. A scenario is associated with its source user story through its Feature (FR-26, FR-32).</w:t>
+      </w:r>
+    </w:p>
+    <w:p>
+      <w:pPr>
+        <w:rPr>
+          <w:lang w:val="en-US"/>
+        </w:rPr>
+      </w:pPr>
+      <w:r>
+        <w:rPr>
           <w:noProof/>
           <w:lang w:val="en-US"/>
         </w:rPr>
         <w:drawing>
-          <wp:inline distT="0" distB="0" distL="0" distR="0" wp14:anchorId="63870D6F" wp14:editId="4951D25F">
+          <wp:inline distT="0" distB="0" distL="0" distR="0" wp14:anchorId="4B273838" wp14:editId="5968F6E8">
             <wp:extent cx="5753100" cy="5524500"/>
             <wp:effectExtent l="0" t="0" r="0" b="0"/>
-            <wp:docPr id="2097372396" name="Resim 2"/>
+            <wp:docPr id="1366782324" name="Resim 2"/>
             <wp:cNvGraphicFramePr>
               <a:graphicFrameLocks xmlns:a="http://schemas.openxmlformats.org/drawingml/2006/main" noChangeAspect="1"/>
             </wp:cNvGraphicFramePr>
@@ -11817,16 +12179,51 @@
     </w:p>
     <w:p>
       <w:pPr>
+        <w:jc w:val="center"/>
+        <w:rPr>
+          <w:i/>
+          <w:iCs/>
+          <w:lang w:val="en-US"/>
+        </w:rPr>
+      </w:pPr>
+      <w:r>
+        <w:rPr>
+          <w:i/>
+          <w:iCs/>
+          <w:lang w:val="en-US"/>
+        </w:rPr>
+        <w:t>Figure 3.4.</w:t>
+      </w:r>
+      <w:r>
+        <w:rPr>
+          <w:i/>
+          <w:iCs/>
+          <w:lang w:val="en-US"/>
+        </w:rPr>
+        <w:t>3</w:t>
+      </w:r>
+      <w:r>
+        <w:rPr>
+          <w:i/>
+          <w:iCs/>
+          <w:lang w:val="en-US"/>
+        </w:rPr>
+        <w:t>-1</w:t>
+      </w:r>
+    </w:p>
+    <w:p>
+      <w:pPr>
         <w:pStyle w:val="Balk3"/>
         <w:rPr>
           <w:lang w:val="en-US"/>
         </w:rPr>
       </w:pPr>
-      <w:bookmarkStart w:id="36" w:name="_Toc243911416"/>
-      <w:r>
-        <w:rPr>
-          <w:lang w:val="en-US"/>
-        </w:rPr>
+      <w:bookmarkStart w:id="36" w:name="_Toc244009505"/>
+      <w:r>
+        <w:rPr>
+          <w:lang w:val="en-US"/>
+        </w:rPr>
+        <w:lastRenderedPageBreak/>
         <w:t>Dynamic model</w:t>
       </w:r>
       <w:bookmarkEnd w:id="36"/>
@@ -11837,6 +12234,471 @@
           <w:lang w:val="en-US"/>
         </w:rPr>
       </w:pPr>
+      <w:r>
+        <w:rPr>
+          <w:lang w:val="en-US"/>
+        </w:rPr>
+        <w:t>The dynamic model shows how the objects of the system collaborate over time to realize the main use cases. It consists of three sequence diagrams. Following the analysis convention, boundary objects (ImportForm, LoginForm) handle the interaction with the user, control objects (GenerationControl, AccountControl) coordinate a use case, and entity objects (Import, UserStory, Requirement, Feature, Scenario, RegisteredUser) are the classes of the object model. Figures 3.4.4-1 and 3.4.4-2 describe the use case Generate Scenarios from Backlog together with Parse Requirements, Validate Requirements, and Validate Scenarios with AI. Figure 3.4.4-3 describes the use case Log In.</w:t>
+      </w:r>
+    </w:p>
+    <w:p>
+      <w:pPr>
+        <w:pStyle w:val="Balk4"/>
+        <w:rPr>
+          <w:lang w:val="en-US"/>
+        </w:rPr>
+      </w:pPr>
+      <w:bookmarkStart w:id="37" w:name="_Toc244009506"/>
+      <w:r>
+        <w:rPr>
+          <w:lang w:val="en-US"/>
+        </w:rPr>
+        <w:t>Sequence diagram: Import, parse and validate backlog</w:t>
+      </w:r>
+      <w:bookmarkEnd w:id="37"/>
+    </w:p>
+    <w:p>
+      <w:pPr>
+        <w:rPr>
+          <w:lang w:val="en-US"/>
+        </w:rPr>
+      </w:pPr>
+      <w:r>
+        <w:rPr>
+          <w:lang w:val="en-US"/>
+        </w:rPr>
+        <w:t>Figure 3.4.4-1 shows how a submitted Jira CSV file is processed up to the validation of its requirements. The user submits the file through the ImportForm, which passes it to the GenerationControl. The GenerationControl reads the items of the file. If the file cannot be read or a required column is missing, it reports the reason to the user and the processing ends (FR-11).</w:t>
+      </w:r>
+    </w:p>
+    <w:p>
+      <w:pPr>
+        <w:rPr>
+          <w:rFonts w:ascii="Segoe UI Symbol" w:hAnsi="Segoe UI Symbol" w:cs="Segoe UI Symbol"/>
+          <w:lang w:val="en-US"/>
+        </w:rPr>
+      </w:pPr>
+    </w:p>
+    <w:p>
+      <w:pPr>
+        <w:rPr>
+          <w:lang w:val="en-US"/>
+        </w:rPr>
+      </w:pPr>
+      <w:r>
+        <w:rPr>
+          <w:lang w:val="en-US"/>
+        </w:rPr>
+        <w:t>Otherwise, the GenerationControl creates an Import and, for each item of Issue Type "Story", a UserStory (FR-9, FR-10). It then determines the format of the Summary and creates a UserStoryTemplateRequirement or an EARSRequirement. If the Summary matches neither format, the user story is marked as unsupported and an error is added (FR-16). For every created Requirement, the GenerationControl checks the required elements. If a required element is missing, an error is added and the user story is marked as invalid (FR-20); if only the benefit is missing, a warning is added and processing continues (FR-19). The processing then continues with the next user story (NFR-3). Figure 3.4.4-2 continues this sequence.</w:t>
+      </w:r>
+    </w:p>
+    <w:p>
+      <w:pPr>
+        <w:rPr>
+          <w:lang w:val="en-US"/>
+        </w:rPr>
+      </w:pPr>
+      <w:r>
+        <w:rPr>
+          <w:noProof/>
+          <w:lang w:val="en-US"/>
+        </w:rPr>
+        <w:lastRenderedPageBreak/>
+        <w:drawing>
+          <wp:inline distT="0" distB="0" distL="0" distR="0" wp14:anchorId="3D6FD1DF" wp14:editId="5149B621">
+            <wp:extent cx="5397815" cy="8248650"/>
+            <wp:effectExtent l="0" t="0" r="0" b="0"/>
+            <wp:docPr id="459575291" name="Resim 2"/>
+            <wp:cNvGraphicFramePr>
+              <a:graphicFrameLocks xmlns:a="http://schemas.openxmlformats.org/drawingml/2006/main" noChangeAspect="1"/>
+            </wp:cNvGraphicFramePr>
+            <a:graphic xmlns:a="http://schemas.openxmlformats.org/drawingml/2006/main">
+              <a:graphicData uri="http://schemas.openxmlformats.org/drawingml/2006/picture">
+                <pic:pic xmlns:pic="http://schemas.openxmlformats.org/drawingml/2006/picture">
+                  <pic:nvPicPr>
+                    <pic:cNvPr id="0" name="Picture 2"/>
+                    <pic:cNvPicPr>
+                      <a:picLocks noChangeAspect="1" noChangeArrowheads="1"/>
+                    </pic:cNvPicPr>
+                  </pic:nvPicPr>
+                  <pic:blipFill>
+                    <a:blip r:embed="rId15">
+                      <a:extLst>
+                        <a:ext uri="{28A0092B-C50C-407E-A947-70E740481C1C}">
+                          <a14:useLocalDpi xmlns:a14="http://schemas.microsoft.com/office/drawing/2010/main" val="0"/>
+                        </a:ext>
+                      </a:extLst>
+                    </a:blip>
+                    <a:srcRect/>
+                    <a:stretch>
+                      <a:fillRect/>
+                    </a:stretch>
+                  </pic:blipFill>
+                  <pic:spPr bwMode="auto">
+                    <a:xfrm>
+                      <a:off x="0" y="0"/>
+                      <a:ext cx="5443074" cy="8317812"/>
+                    </a:xfrm>
+                    <a:prstGeom prst="rect">
+                      <a:avLst/>
+                    </a:prstGeom>
+                    <a:noFill/>
+                    <a:ln>
+                      <a:noFill/>
+                    </a:ln>
+                  </pic:spPr>
+                </pic:pic>
+              </a:graphicData>
+            </a:graphic>
+          </wp:inline>
+        </w:drawing>
+      </w:r>
+    </w:p>
+    <w:p>
+      <w:pPr>
+        <w:jc w:val="center"/>
+        <w:rPr>
+          <w:i/>
+          <w:iCs/>
+          <w:lang w:val="en-US"/>
+        </w:rPr>
+      </w:pPr>
+      <w:r>
+        <w:rPr>
+          <w:i/>
+          <w:iCs/>
+          <w:lang w:val="en-US"/>
+        </w:rPr>
+        <w:t>Figure 3.4.</w:t>
+      </w:r>
+      <w:r>
+        <w:rPr>
+          <w:i/>
+          <w:iCs/>
+          <w:lang w:val="en-US"/>
+        </w:rPr>
+        <w:t>4</w:t>
+      </w:r>
+      <w:r>
+        <w:rPr>
+          <w:i/>
+          <w:iCs/>
+          <w:lang w:val="en-US"/>
+        </w:rPr>
+        <w:t>-1</w:t>
+      </w:r>
+    </w:p>
+    <w:p>
+      <w:pPr>
+        <w:rPr>
+          <w:lang w:val="en-US"/>
+        </w:rPr>
+      </w:pPr>
+    </w:p>
+    <w:p>
+      <w:pPr>
+        <w:pStyle w:val="Balk4"/>
+        <w:rPr>
+          <w:lang w:val="en-US"/>
+        </w:rPr>
+      </w:pPr>
+      <w:bookmarkStart w:id="38" w:name="_Toc244009507"/>
+      <w:r>
+        <w:rPr>
+          <w:lang w:val="en-US"/>
+        </w:rPr>
+        <w:t>Sequence diagram: Generate and display scenarios</w:t>
+      </w:r>
+      <w:bookmarkEnd w:id="38"/>
+    </w:p>
+    <w:p>
+      <w:pPr>
+        <w:rPr>
+          <w:lang w:val="en-US"/>
+        </w:rPr>
+      </w:pPr>
+      <w:r>
+        <w:rPr>
+          <w:lang w:val="en-US"/>
+        </w:rPr>
+        <w:t>Figure 3.4.4-2 continues Figure 3.4.4-1. For each user story that passed validation, the GenerationControl creates a Feature with the feature name and a Scenario for the normal flow (FR-23, FR-24). Where alternative or exceptional behavior can be identified, it creates an additional Scenario for each identified behavior (FR-25). The scenarios are added to the Feature, and the Feature is associated with the user story (FR-26). The user stories, together with their features and scenarios, are then stored in the Import and become part of the user's history (FR-33).</w:t>
+      </w:r>
+    </w:p>
+    <w:p>
+      <w:pPr>
+        <w:rPr>
+          <w:lang w:val="en-US"/>
+        </w:rPr>
+      </w:pPr>
+    </w:p>
+    <w:p>
+      <w:pPr>
+        <w:rPr>
+          <w:lang w:val="en-US"/>
+        </w:rPr>
+      </w:pPr>
+      <w:r>
+        <w:rPr>
+          <w:lang w:val="en-US"/>
+        </w:rPr>
+        <w:t>If AI-assisted validation is enabled, the GenerationControl submits each Scenario to the AI component and adds the findings it returns to the Scenario (FR-37). If the AI component is unavailable or returns an error, the AI validation is skipped and the processing continues (FR-38). Finally, the ImportForm displays the generated scenarios as Gherkin text together with the warnings, the errors, the AI findings, or a notice that the AI check was skipped (FR-27).</w:t>
+      </w:r>
+    </w:p>
+    <w:p>
+      <w:pPr>
+        <w:rPr>
+          <w:lang w:val="en-US"/>
+        </w:rPr>
+      </w:pPr>
+      <w:r>
+        <w:rPr>
+          <w:noProof/>
+          <w:lang w:val="en-US"/>
+        </w:rPr>
+        <w:lastRenderedPageBreak/>
+        <w:drawing>
+          <wp:inline distT="0" distB="0" distL="0" distR="0" wp14:anchorId="671EF360" wp14:editId="35CABAD5">
+            <wp:extent cx="6306428" cy="7924800"/>
+            <wp:effectExtent l="0" t="0" r="0" b="0"/>
+            <wp:docPr id="1196623139" name="Resim 1"/>
+            <wp:cNvGraphicFramePr>
+              <a:graphicFrameLocks xmlns:a="http://schemas.openxmlformats.org/drawingml/2006/main" noChangeAspect="1"/>
+            </wp:cNvGraphicFramePr>
+            <a:graphic xmlns:a="http://schemas.openxmlformats.org/drawingml/2006/main">
+              <a:graphicData uri="http://schemas.openxmlformats.org/drawingml/2006/picture">
+                <pic:pic xmlns:pic="http://schemas.openxmlformats.org/drawingml/2006/picture">
+                  <pic:nvPicPr>
+                    <pic:cNvPr id="0" name="Picture 1"/>
+                    <pic:cNvPicPr>
+                      <a:picLocks noChangeAspect="1" noChangeArrowheads="1"/>
+                    </pic:cNvPicPr>
+                  </pic:nvPicPr>
+                  <pic:blipFill>
+                    <a:blip r:embed="rId16">
+                      <a:extLst>
+                        <a:ext uri="{28A0092B-C50C-407E-A947-70E740481C1C}">
+                          <a14:useLocalDpi xmlns:a14="http://schemas.microsoft.com/office/drawing/2010/main" val="0"/>
+                        </a:ext>
+                      </a:extLst>
+                    </a:blip>
+                    <a:srcRect/>
+                    <a:stretch>
+                      <a:fillRect/>
+                    </a:stretch>
+                  </pic:blipFill>
+                  <pic:spPr bwMode="auto">
+                    <a:xfrm>
+                      <a:off x="0" y="0"/>
+                      <a:ext cx="6322887" cy="7945482"/>
+                    </a:xfrm>
+                    <a:prstGeom prst="rect">
+                      <a:avLst/>
+                    </a:prstGeom>
+                    <a:noFill/>
+                    <a:ln>
+                      <a:noFill/>
+                    </a:ln>
+                  </pic:spPr>
+                </pic:pic>
+              </a:graphicData>
+            </a:graphic>
+          </wp:inline>
+        </w:drawing>
+      </w:r>
+    </w:p>
+    <w:p>
+      <w:pPr>
+        <w:jc w:val="center"/>
+        <w:rPr>
+          <w:i/>
+          <w:iCs/>
+          <w:lang w:val="en-US"/>
+        </w:rPr>
+      </w:pPr>
+      <w:r>
+        <w:rPr>
+          <w:i/>
+          <w:iCs/>
+          <w:lang w:val="en-US"/>
+        </w:rPr>
+        <w:t>Figure 3.4.</w:t>
+      </w:r>
+      <w:r>
+        <w:rPr>
+          <w:i/>
+          <w:iCs/>
+          <w:lang w:val="en-US"/>
+        </w:rPr>
+        <w:t>4</w:t>
+      </w:r>
+      <w:r>
+        <w:rPr>
+          <w:i/>
+          <w:iCs/>
+          <w:lang w:val="en-US"/>
+        </w:rPr>
+        <w:t>-</w:t>
+      </w:r>
+      <w:r>
+        <w:rPr>
+          <w:i/>
+          <w:iCs/>
+          <w:lang w:val="en-US"/>
+        </w:rPr>
+        <w:t>2</w:t>
+      </w:r>
+    </w:p>
+    <w:p>
+      <w:pPr>
+        <w:rPr>
+          <w:lang w:val="en-US"/>
+        </w:rPr>
+      </w:pPr>
+    </w:p>
+    <w:p>
+      <w:pPr>
+        <w:rPr>
+          <w:lang w:val="en-US"/>
+        </w:rPr>
+      </w:pPr>
+    </w:p>
+    <w:p>
+      <w:pPr>
+        <w:pStyle w:val="Balk4"/>
+        <w:rPr>
+          <w:lang w:val="en-US"/>
+        </w:rPr>
+      </w:pPr>
+      <w:bookmarkStart w:id="39" w:name="_Toc244009508"/>
+      <w:r>
+        <w:rPr>
+          <w:lang w:val="en-US"/>
+        </w:rPr>
+        <w:t>Sequence diagram: Log in</w:t>
+      </w:r>
+      <w:bookmarkEnd w:id="39"/>
+    </w:p>
+    <w:p>
+      <w:pPr>
+        <w:rPr>
+          <w:lang w:val="en-US"/>
+        </w:rPr>
+      </w:pPr>
+      <w:r>
+        <w:rPr>
+          <w:lang w:val="en-US"/>
+        </w:rPr>
+        <w:t>Figure 3.4.4-3 shows the use case Log In. The visitor enters an email address and a password in the LoginForm, which passes them to the AccountControl. The AccountControl verifies the credentials against the RegisteredUser. If the credentials are valid, the AccountControl grants access and the LoginForm displays the main page (FR-3). Otherwise, the AccountControl denies access and the LoginForm displays an error message (FR-4).</w:t>
+      </w:r>
+    </w:p>
+    <w:p>
+      <w:pPr>
+        <w:rPr>
+          <w:lang w:val="en-US"/>
+        </w:rPr>
+      </w:pPr>
+      <w:r>
+        <w:rPr>
+          <w:noProof/>
+          <w:lang w:val="en-US"/>
+        </w:rPr>
+        <w:drawing>
+          <wp:inline distT="0" distB="0" distL="0" distR="0" wp14:anchorId="312340E9" wp14:editId="53F7B647">
+            <wp:extent cx="5933691" cy="4381500"/>
+            <wp:effectExtent l="0" t="0" r="0" b="0"/>
+            <wp:docPr id="1620250733" name="Resim 4"/>
+            <wp:cNvGraphicFramePr>
+              <a:graphicFrameLocks xmlns:a="http://schemas.openxmlformats.org/drawingml/2006/main" noChangeAspect="1"/>
+            </wp:cNvGraphicFramePr>
+            <a:graphic xmlns:a="http://schemas.openxmlformats.org/drawingml/2006/main">
+              <a:graphicData uri="http://schemas.openxmlformats.org/drawingml/2006/picture">
+                <pic:pic xmlns:pic="http://schemas.openxmlformats.org/drawingml/2006/picture">
+                  <pic:nvPicPr>
+                    <pic:cNvPr id="0" name="Picture 4"/>
+                    <pic:cNvPicPr>
+                      <a:picLocks noChangeAspect="1" noChangeArrowheads="1"/>
+                    </pic:cNvPicPr>
+                  </pic:nvPicPr>
+                  <pic:blipFill>
+                    <a:blip r:embed="rId17">
+                      <a:extLst>
+                        <a:ext uri="{28A0092B-C50C-407E-A947-70E740481C1C}">
+                          <a14:useLocalDpi xmlns:a14="http://schemas.microsoft.com/office/drawing/2010/main" val="0"/>
+                        </a:ext>
+                      </a:extLst>
+                    </a:blip>
+                    <a:srcRect/>
+                    <a:stretch>
+                      <a:fillRect/>
+                    </a:stretch>
+                  </pic:blipFill>
+                  <pic:spPr bwMode="auto">
+                    <a:xfrm>
+                      <a:off x="0" y="0"/>
+                      <a:ext cx="5941046" cy="4386931"/>
+                    </a:xfrm>
+                    <a:prstGeom prst="rect">
+                      <a:avLst/>
+                    </a:prstGeom>
+                    <a:noFill/>
+                    <a:ln>
+                      <a:noFill/>
+                    </a:ln>
+                  </pic:spPr>
+                </pic:pic>
+              </a:graphicData>
+            </a:graphic>
+          </wp:inline>
+        </w:drawing>
+      </w:r>
+    </w:p>
+    <w:p>
+      <w:pPr>
+        <w:jc w:val="center"/>
+        <w:rPr>
+          <w:i/>
+          <w:iCs/>
+          <w:lang w:val="en-US"/>
+        </w:rPr>
+      </w:pPr>
+      <w:r>
+        <w:rPr>
+          <w:i/>
+          <w:iCs/>
+          <w:lang w:val="en-US"/>
+        </w:rPr>
+        <w:t>Figure 3.4.</w:t>
+      </w:r>
+      <w:r>
+        <w:rPr>
+          <w:i/>
+          <w:iCs/>
+          <w:lang w:val="en-US"/>
+        </w:rPr>
+        <w:t>4</w:t>
+      </w:r>
+      <w:r>
+        <w:rPr>
+          <w:i/>
+          <w:iCs/>
+          <w:lang w:val="en-US"/>
+        </w:rPr>
+        <w:t>-</w:t>
+      </w:r>
+      <w:r>
+        <w:rPr>
+          <w:i/>
+          <w:iCs/>
+          <w:lang w:val="en-US"/>
+        </w:rPr>
+        <w:t>3</w:t>
+      </w:r>
+    </w:p>
+    <w:p>
+      <w:pPr>
+        <w:rPr>
+          <w:lang w:val="en-US"/>
+        </w:rPr>
+      </w:pPr>
     </w:p>
     <w:p>
       <w:pPr>
@@ -11845,14 +12707,14 @@
           <w:lang w:val="en-US"/>
         </w:rPr>
       </w:pPr>
-      <w:bookmarkStart w:id="37" w:name="_Toc243911417"/>
+      <w:bookmarkStart w:id="40" w:name="_Toc244009509"/>
       <w:r>
         <w:rPr>
           <w:lang w:val="en-US"/>
         </w:rPr>
         <w:t>User interfaces and Mock-ups</w:t>
       </w:r>
-      <w:bookmarkEnd w:id="37"/>
+      <w:bookmarkEnd w:id="40"/>
     </w:p>
     <w:p>
       <w:pPr>
@@ -11868,14 +12730,14 @@
           <w:lang w:val="en-US"/>
         </w:rPr>
       </w:pPr>
-      <w:bookmarkStart w:id="38" w:name="_Toc243911418"/>
+      <w:bookmarkStart w:id="41" w:name="_Toc244009510"/>
       <w:r>
         <w:rPr>
           <w:lang w:val="en-US"/>
         </w:rPr>
         <w:t>Glossary of Terms</w:t>
       </w:r>
-      <w:bookmarkEnd w:id="38"/>
+      <w:bookmarkEnd w:id="41"/>
     </w:p>
     <w:p>
       <w:pPr>
@@ -13248,14 +14110,14 @@
           <w:lang w:val="en-US"/>
         </w:rPr>
       </w:pPr>
-      <w:bookmarkStart w:id="39" w:name="_Toc243911419"/>
+      <w:bookmarkStart w:id="42" w:name="_Toc244009511"/>
       <w:r>
         <w:rPr>
           <w:lang w:val="en-US"/>
         </w:rPr>
         <w:t>Priority</w:t>
       </w:r>
-      <w:bookmarkEnd w:id="39"/>
+      <w:bookmarkEnd w:id="42"/>
     </w:p>
     <w:p>
       <w:pPr>
@@ -13438,7 +14300,70 @@
               <w:rPr>
                 <w:lang w:val="en-US"/>
               </w:rPr>
-              <w:t>FR-1, FR-3 – FR-5, FR-7, FR-9 – FR-11, FR-13 – FR-21, FR-23, FR-24, FR-26, FR-27, FR-29 – FR-31, FR-33, FR-34, FR-36</w:t>
+              <w:t xml:space="preserve">FR-1, FR-3 – FR-5, FR-7, </w:t>
+            </w:r>
+            <w:r>
+              <w:rPr>
+                <w:lang w:val="en-US"/>
+              </w:rPr>
+              <w:t xml:space="preserve">FR-8, </w:t>
+            </w:r>
+            <w:r>
+              <w:rPr>
+                <w:lang w:val="en-US"/>
+              </w:rPr>
+              <w:t>FR-9 – FR-11, FR-13 – FR-21, FR-23, FR-24,</w:t>
+            </w:r>
+            <w:r>
+              <w:rPr>
+                <w:lang w:val="en-US"/>
+              </w:rPr>
+              <w:t xml:space="preserve"> </w:t>
+            </w:r>
+            <w:r>
+              <w:rPr>
+                <w:lang w:val="en-US"/>
+              </w:rPr>
+              <w:t>FR-25,</w:t>
+            </w:r>
+            <w:r>
+              <w:rPr>
+                <w:lang w:val="en-US"/>
+              </w:rPr>
+              <w:t xml:space="preserve">FR-26, FR-27, </w:t>
+            </w:r>
+            <w:r>
+              <w:rPr>
+                <w:lang w:val="en-US"/>
+              </w:rPr>
+              <w:t>FR-28</w:t>
+            </w:r>
+            <w:r>
+              <w:rPr>
+                <w:lang w:val="en-US"/>
+              </w:rPr>
+              <w:t xml:space="preserve">, </w:t>
+            </w:r>
+            <w:r>
+              <w:rPr>
+                <w:lang w:val="en-US"/>
+              </w:rPr>
+              <w:t>FR-29 – FR-31,</w:t>
+            </w:r>
+            <w:r>
+              <w:t xml:space="preserve"> </w:t>
+            </w:r>
+            <w:r>
+              <w:rPr>
+                <w:lang w:val="en-US"/>
+              </w:rPr>
+              <w:t>FR-32,</w:t>
+            </w:r>
+            <w:r>
+              <w:rPr>
+                <w:lang w:val="en-US"/>
+              </w:rPr>
+              <w:t xml:space="preserve"> FR-33, FR-34, FR-36</w:t>
             </w:r>
           </w:p>
         </w:tc>
@@ -13515,7 +14440,7 @@
               <w:rPr>
                 <w:lang w:val="en-US"/>
               </w:rPr>
-              <w:t>FR-2, FR-6, FR-8, FR-12, FR-22, FR-25, FR-28, FR-32, FR-35</w:t>
+              <w:t>FR-2, FR-6, FR-12, FR-22, FR-35</w:t>
             </w:r>
           </w:p>
         </w:tc>
@@ -13633,14 +14558,14 @@
           <w:lang w:val="en-US"/>
         </w:rPr>
       </w:pPr>
-      <w:bookmarkStart w:id="40" w:name="_Toc243911420"/>
+      <w:bookmarkStart w:id="43" w:name="_Toc244009512"/>
       <w:r>
         <w:rPr>
           <w:lang w:val="en-US"/>
         </w:rPr>
         <w:t>Traceability</w:t>
       </w:r>
-      <w:bookmarkEnd w:id="40"/>
+      <w:bookmarkEnd w:id="43"/>
     </w:p>
     <w:p>
       <w:pPr>
@@ -14349,8 +15274,8 @@
       </w:pPr>
     </w:p>
     <w:sectPr>
-      <w:headerReference w:type="default" r:id="rId15"/>
-      <w:footerReference w:type="default" r:id="rId16"/>
+      <w:headerReference w:type="default" r:id="rId18"/>
+      <w:footerReference w:type="default" r:id="rId19"/>
       <w:pgSz w:w="11906" w:h="16838"/>
       <w:pgMar w:top="1417" w:right="1417" w:bottom="1417" w:left="1417" w:header="708" w:footer="708" w:gutter="0"/>
       <w:cols w:space="708"/>
@@ -14602,43 +15527,9 @@
             </w:rPr>
             <w:br/>
           </w:r>
-          <w:proofErr w:type="spellStart"/>
           <w:r>
-            <w:t>Automated</w:t>
+            <w:t>Automated Gherkin and BDD Test Scenario Generator</w:t>
           </w:r>
-          <w:proofErr w:type="spellEnd"/>
-          <w:r>
-            <w:t xml:space="preserve"> </w:t>
-          </w:r>
-          <w:proofErr w:type="spellStart"/>
-          <w:r>
-            <w:t>Gherkin</w:t>
-          </w:r>
-          <w:proofErr w:type="spellEnd"/>
-          <w:r>
-            <w:t xml:space="preserve"> </w:t>
-          </w:r>
-          <w:proofErr w:type="spellStart"/>
-          <w:r>
-            <w:t>and</w:t>
-          </w:r>
-          <w:proofErr w:type="spellEnd"/>
-          <w:r>
-            <w:t xml:space="preserve"> BDD Test </w:t>
-          </w:r>
-          <w:proofErr w:type="spellStart"/>
-          <w:r>
-            <w:t>Scenario</w:t>
-          </w:r>
-          <w:proofErr w:type="spellEnd"/>
-          <w:r>
-            <w:t xml:space="preserve"> </w:t>
-          </w:r>
-          <w:proofErr w:type="spellStart"/>
-          <w:r>
-            <w:t>Generator</w:t>
-          </w:r>
-          <w:proofErr w:type="spellEnd"/>
         </w:p>
       </w:tc>
       <w:tc>
@@ -14669,7 +15560,7 @@
             <w:rPr>
               <w:lang w:val="en-US"/>
             </w:rPr>
-            <w:t>3</w:t>
+            <w:t>4</w:t>
           </w:r>
         </w:p>
         <w:p>
@@ -16736,7 +17627,7 @@
   <w:style w:type="paragraph" w:default="1" w:styleId="Normal">
     <w:name w:val="Normal"/>
     <w:qFormat/>
-    <w:rsid w:val="00B00440"/>
+    <w:rsid w:val="00B86F48"/>
     <w:pPr>
       <w:spacing w:after="120" w:line="240" w:lineRule="auto"/>
     </w:pPr>

</xml_diff>

<commit_message>
Mock UI Eklendi, RAD Template gerekli şekilde güncellendi (.zip/export all)
</commit_message>
<xml_diff>
--- a/CSE443 - RAD_Template.docx
+++ b/CSE443 - RAD_Template.docx
@@ -3234,36 +3234,7 @@
         <w:rPr>
           <w:noProof/>
         </w:rPr>
-        <w:fldChar w:fldCharType="begin"/>
-      </w:r>
-      <w:r>
-        <w:rPr>
-          <w:noProof/>
-        </w:rPr>
-        <w:instrText xml:space="preserve"> PAGEREF _Toc244106663 \h </w:instrText>
-      </w:r>
-      <w:r>
-        <w:rPr>
-          <w:noProof/>
-        </w:rPr>
-      </w:r>
-      <w:r>
-        <w:rPr>
-          <w:noProof/>
-        </w:rPr>
-        <w:fldChar w:fldCharType="separate"/>
-      </w:r>
-      <w:r>
-        <w:rPr>
-          <w:noProof/>
-        </w:rPr>
-        <w:t>19</w:t>
-      </w:r>
-      <w:r>
-        <w:rPr>
-          <w:noProof/>
-        </w:rPr>
-        <w:fldChar w:fldCharType="end"/>
+        <w:t>20</w:t>
       </w:r>
     </w:p>
     <w:p>
@@ -3319,36 +3290,7 @@
         <w:rPr>
           <w:noProof/>
         </w:rPr>
-        <w:fldChar w:fldCharType="begin"/>
-      </w:r>
-      <w:r>
-        <w:rPr>
-          <w:noProof/>
-        </w:rPr>
-        <w:instrText xml:space="preserve"> PAGEREF _Toc244106664 \h </w:instrText>
-      </w:r>
-      <w:r>
-        <w:rPr>
-          <w:noProof/>
-        </w:rPr>
-      </w:r>
-      <w:r>
-        <w:rPr>
-          <w:noProof/>
-        </w:rPr>
-        <w:fldChar w:fldCharType="separate"/>
-      </w:r>
-      <w:r>
-        <w:rPr>
-          <w:noProof/>
-        </w:rPr>
-        <w:t>20</w:t>
-      </w:r>
-      <w:r>
-        <w:rPr>
-          <w:noProof/>
-        </w:rPr>
-        <w:fldChar w:fldCharType="end"/>
+        <w:t>21</w:t>
       </w:r>
     </w:p>
     <w:p>
@@ -3490,36 +3432,7 @@
         <w:rPr>
           <w:noProof/>
         </w:rPr>
-        <w:fldChar w:fldCharType="begin"/>
-      </w:r>
-      <w:r>
-        <w:rPr>
-          <w:noProof/>
-        </w:rPr>
-        <w:instrText xml:space="preserve"> PAGEREF _Toc244106666 \h </w:instrText>
-      </w:r>
-      <w:r>
-        <w:rPr>
-          <w:noProof/>
-        </w:rPr>
-      </w:r>
-      <w:r>
-        <w:rPr>
-          <w:noProof/>
-        </w:rPr>
-        <w:fldChar w:fldCharType="separate"/>
-      </w:r>
-      <w:r>
-        <w:rPr>
-          <w:noProof/>
-        </w:rPr>
-        <w:t>23</w:t>
-      </w:r>
-      <w:r>
-        <w:rPr>
-          <w:noProof/>
-        </w:rPr>
-        <w:fldChar w:fldCharType="end"/>
+        <w:t>24</w:t>
       </w:r>
     </w:p>
     <w:p>
@@ -3575,36 +3488,7 @@
         <w:rPr>
           <w:noProof/>
         </w:rPr>
-        <w:fldChar w:fldCharType="begin"/>
-      </w:r>
-      <w:r>
-        <w:rPr>
-          <w:noProof/>
-        </w:rPr>
-        <w:instrText xml:space="preserve"> PAGEREF _Toc244106667 \h </w:instrText>
-      </w:r>
-      <w:r>
-        <w:rPr>
-          <w:noProof/>
-        </w:rPr>
-      </w:r>
-      <w:r>
-        <w:rPr>
-          <w:noProof/>
-        </w:rPr>
-        <w:fldChar w:fldCharType="separate"/>
-      </w:r>
-      <w:r>
-        <w:rPr>
-          <w:noProof/>
-        </w:rPr>
-        <w:t>25</w:t>
-      </w:r>
-      <w:r>
-        <w:rPr>
-          <w:noProof/>
-        </w:rPr>
-        <w:fldChar w:fldCharType="end"/>
+        <w:t>26</w:t>
       </w:r>
     </w:p>
     <w:p>
@@ -3660,36 +3544,7 @@
         <w:rPr>
           <w:noProof/>
         </w:rPr>
-        <w:fldChar w:fldCharType="begin"/>
-      </w:r>
-      <w:r>
-        <w:rPr>
-          <w:noProof/>
-        </w:rPr>
-        <w:instrText xml:space="preserve"> PAGEREF _Toc244106668 \h </w:instrText>
-      </w:r>
-      <w:r>
-        <w:rPr>
-          <w:noProof/>
-        </w:rPr>
-      </w:r>
-      <w:r>
-        <w:rPr>
-          <w:noProof/>
-        </w:rPr>
-        <w:fldChar w:fldCharType="separate"/>
-      </w:r>
-      <w:r>
-        <w:rPr>
-          <w:noProof/>
-        </w:rPr>
-        <w:t>25</w:t>
-      </w:r>
-      <w:r>
-        <w:rPr>
-          <w:noProof/>
-        </w:rPr>
-        <w:fldChar w:fldCharType="end"/>
+        <w:t>26</w:t>
       </w:r>
     </w:p>
     <w:p>
@@ -3741,36 +3596,7 @@
         <w:rPr>
           <w:noProof/>
         </w:rPr>
-        <w:fldChar w:fldCharType="begin"/>
-      </w:r>
-      <w:r>
-        <w:rPr>
-          <w:noProof/>
-        </w:rPr>
-        <w:instrText xml:space="preserve"> PAGEREF _Toc244106669 \h </w:instrText>
-      </w:r>
-      <w:r>
-        <w:rPr>
-          <w:noProof/>
-        </w:rPr>
-      </w:r>
-      <w:r>
-        <w:rPr>
-          <w:noProof/>
-        </w:rPr>
-        <w:fldChar w:fldCharType="separate"/>
-      </w:r>
-      <w:r>
-        <w:rPr>
-          <w:noProof/>
-        </w:rPr>
-        <w:t>25</w:t>
-      </w:r>
-      <w:r>
-        <w:rPr>
-          <w:noProof/>
-        </w:rPr>
-        <w:fldChar w:fldCharType="end"/>
+        <w:t>32</w:t>
       </w:r>
     </w:p>
     <w:p>
@@ -3822,36 +3648,7 @@
         <w:rPr>
           <w:noProof/>
         </w:rPr>
-        <w:fldChar w:fldCharType="begin"/>
-      </w:r>
-      <w:r>
-        <w:rPr>
-          <w:noProof/>
-        </w:rPr>
-        <w:instrText xml:space="preserve"> PAGEREF _Toc244106670 \h </w:instrText>
-      </w:r>
-      <w:r>
-        <w:rPr>
-          <w:noProof/>
-        </w:rPr>
-      </w:r>
-      <w:r>
-        <w:rPr>
-          <w:noProof/>
-        </w:rPr>
-        <w:fldChar w:fldCharType="separate"/>
-      </w:r>
-      <w:r>
-        <w:rPr>
-          <w:noProof/>
-        </w:rPr>
-        <w:t>27</w:t>
-      </w:r>
-      <w:r>
-        <w:rPr>
-          <w:noProof/>
-        </w:rPr>
-        <w:fldChar w:fldCharType="end"/>
+        <w:t>34</w:t>
       </w:r>
     </w:p>
     <w:p>
@@ -3903,36 +3700,7 @@
         <w:rPr>
           <w:noProof/>
         </w:rPr>
-        <w:fldChar w:fldCharType="begin"/>
-      </w:r>
-      <w:r>
-        <w:rPr>
-          <w:noProof/>
-        </w:rPr>
-        <w:instrText xml:space="preserve"> PAGEREF _Toc244106671 \h </w:instrText>
-      </w:r>
-      <w:r>
-        <w:rPr>
-          <w:noProof/>
-        </w:rPr>
-      </w:r>
-      <w:r>
-        <w:rPr>
-          <w:noProof/>
-        </w:rPr>
-        <w:fldChar w:fldCharType="separate"/>
-      </w:r>
-      <w:r>
-        <w:rPr>
-          <w:noProof/>
-        </w:rPr>
-        <w:t>28</w:t>
-      </w:r>
-      <w:r>
-        <w:rPr>
-          <w:noProof/>
-        </w:rPr>
-        <w:fldChar w:fldCharType="end"/>
+        <w:t>35</w:t>
       </w:r>
     </w:p>
     <w:p>
@@ -7238,7 +7006,7 @@
               <w:rPr>
                 <w:lang w:val="en-US"/>
               </w:rPr>
-              <w:t>When a user requests to export generated scenarios, the system shall produce one feature file for each Feature, each containing exactly one Feature and valid Gherkin syntax.</w:t>
+              <w:t>When a user requests to export generated scenarios, the system shall produce one feature file for each Feature, each containing exactly one Feature and valid Gherkin syntax, and shall provide the feature files of more than one Feature together as a single ZIP archive.</w:t>
             </w:r>
           </w:p>
         </w:tc>
@@ -10064,7 +9832,7 @@
               <w:rPr>
                 <w:lang w:val="en-US"/>
               </w:rPr>
-              <w:t>6. The system generates at least one Gherkin scenario for each requirement. For SHOP-2 it generates the scenario "Customer adds a product to the cart" with the steps "Given the customer is viewing a product", "When the customer adds the product to the cart", and "Then the product is in the customer's cart". It adds further scenarios for the alternative flows that it can identify.</w:t>
+              <w:t>6. The system generates at least one Gherkin scenario for each requirement. For SHOP-2 it generates the scenario "Customer adds a product to the cart" with the steps "Given the customer is viewing a product", "When the customer adds the product to the cart", and "Then the product is in the customer's cart". It identifies no alternative flow in these four user stories, so it generates one scenario for each of them.</w:t>
             </w:r>
           </w:p>
           <w:p>
@@ -10162,7 +9930,7 @@
               <w:rPr>
                 <w:lang w:val="en-US"/>
               </w:rPr>
-              <w:t>FR-7 – FR-10, FR-13, FR-14, FR-17 – FR-19, FR-23 – FR-27, FR-33</w:t>
+              <w:t>FR-7 – FR-10, FR-13, FR-14, FR-17 – FR-19, FR-23, FR-24, FR-26, FR-27, FR-33</w:t>
             </w:r>
           </w:p>
         </w:tc>
@@ -10396,14 +10164,8 @@
               <w:rPr>
                 <w:lang w:val="en-US"/>
               </w:rPr>
-              <w:t xml:space="preserve">4. SHOP-7 is written in the user story template but has no capability. The system reports an error that identifies the user story, the missing </w:t>
-            </w:r>
-            <w:r>
-              <w:rPr>
-                <w:lang w:val="en-US"/>
-              </w:rPr>
               <w:lastRenderedPageBreak/>
-              <w:t>element (the capability), and a suggested correction (add an "I want ..." clause). The system generates no scenarios for SHOP-7.</w:t>
+              <w:t>4. SHOP-7 is written in the user story template but has no capability. The system reports an error that identifies the user story, the missing element (the capability), and a suggested correction (add an "I want ..." clause). The system generates no scenarios for SHOP-7.</w:t>
             </w:r>
           </w:p>
           <w:p>
@@ -10969,7 +10731,14 @@
               <w:rPr>
                 <w:lang w:val="en-US"/>
               </w:rPr>
-              <w:t>3. The system produces one feature file for each user story, for example one file for SHOP-2 and one for SHOP-3, because a feature file may contain only one Feature. Because the Issue keys are available, the system tags each exported scenario with the Issue key of its user story, for example @SHOP-2.</w:t>
+              <w:t xml:space="preserve">3. The system produces one feature file for each user story, for example one file for SHOP-2 and one for SHOP-3, because a feature file may contain only one Feature, and delivers the files together in a single ZIP archive. Because the Issue keys are available, the system </w:t>
+            </w:r>
+            <w:r>
+              <w:rPr>
+                <w:lang w:val="en-US"/>
+              </w:rPr>
+              <w:lastRenderedPageBreak/>
+              <w:t>tags each exported scenario with the Issue key of its user story, for example @SHOP-2.</w:t>
             </w:r>
           </w:p>
         </w:tc>
@@ -11013,6 +10782,19 @@
                 <w:lang w:val="en-US"/>
               </w:rPr>
               <w:t>A1. Elif exports scenarios that were generated from a file without an Issue key column. The system precedes each exported scenario with a comment that contains the Summary of its user story, for example "# Source: As a customer, I want to add a product to my cart, so that I can buy it later."</w:t>
+            </w:r>
+          </w:p>
+          <w:p>
+            <w:pPr>
+              <w:rPr>
+                <w:lang w:val="en-US"/>
+              </w:rPr>
+            </w:pPr>
+            <w:r>
+              <w:rPr>
+                <w:lang w:val="en-US"/>
+              </w:rPr>
+              <w:t>A2. Elif exports a single user story with "Export .feature". The system delivers that one feature file directly, without a ZIP archive.</w:t>
             </w:r>
           </w:p>
         </w:tc>
@@ -11169,111 +10951,6 @@
                 <w:lang w:val="en-US"/>
               </w:rPr>
               <w:t xml:space="preserve">    Then the product is in the customer's cart</w:t>
-            </w:r>
-          </w:p>
-          <w:p>
-            <w:pPr>
-              <w:rPr>
-                <w:rFonts w:ascii="Consolas" w:hAnsi="Consolas" w:cs="Consolas"/>
-                <w:sz w:val="18"/>
-                <w:szCs w:val="18"/>
-                <w:lang w:val="en-US"/>
-              </w:rPr>
-            </w:pPr>
-          </w:p>
-          <w:p>
-            <w:pPr>
-              <w:rPr>
-                <w:rFonts w:ascii="Consolas" w:hAnsi="Consolas" w:cs="Consolas"/>
-                <w:sz w:val="18"/>
-                <w:szCs w:val="18"/>
-                <w:lang w:val="en-US"/>
-              </w:rPr>
-            </w:pPr>
-            <w:r>
-              <w:rPr>
-                <w:rFonts w:ascii="Consolas" w:hAnsi="Consolas" w:cs="Consolas"/>
-                <w:sz w:val="18"/>
-                <w:szCs w:val="18"/>
-                <w:lang w:val="en-US"/>
-              </w:rPr>
-              <w:t xml:space="preserve">  @SHOP-2</w:t>
-            </w:r>
-          </w:p>
-          <w:p>
-            <w:pPr>
-              <w:rPr>
-                <w:rFonts w:ascii="Consolas" w:hAnsi="Consolas" w:cs="Consolas"/>
-                <w:sz w:val="18"/>
-                <w:szCs w:val="18"/>
-                <w:lang w:val="en-US"/>
-              </w:rPr>
-            </w:pPr>
-            <w:r>
-              <w:rPr>
-                <w:rFonts w:ascii="Consolas" w:hAnsi="Consolas" w:cs="Consolas"/>
-                <w:sz w:val="18"/>
-                <w:szCs w:val="18"/>
-                <w:lang w:val="en-US"/>
-              </w:rPr>
-              <w:t xml:space="preserve">  Scenario: Customer adds a product that is out of stock</w:t>
-            </w:r>
-          </w:p>
-          <w:p>
-            <w:pPr>
-              <w:rPr>
-                <w:rFonts w:ascii="Consolas" w:hAnsi="Consolas" w:cs="Consolas"/>
-                <w:sz w:val="18"/>
-                <w:szCs w:val="18"/>
-                <w:lang w:val="en-US"/>
-              </w:rPr>
-            </w:pPr>
-            <w:r>
-              <w:rPr>
-                <w:rFonts w:ascii="Consolas" w:hAnsi="Consolas" w:cs="Consolas"/>
-                <w:sz w:val="18"/>
-                <w:szCs w:val="18"/>
-                <w:lang w:val="en-US"/>
-              </w:rPr>
-              <w:t xml:space="preserve">    Given the customer is viewing a product that is out of stock</w:t>
-            </w:r>
-          </w:p>
-          <w:p>
-            <w:pPr>
-              <w:rPr>
-                <w:rFonts w:ascii="Consolas" w:hAnsi="Consolas" w:cs="Consolas"/>
-                <w:sz w:val="18"/>
-                <w:szCs w:val="18"/>
-                <w:lang w:val="en-US"/>
-              </w:rPr>
-            </w:pPr>
-            <w:r>
-              <w:rPr>
-                <w:rFonts w:ascii="Consolas" w:hAnsi="Consolas" w:cs="Consolas"/>
-                <w:sz w:val="18"/>
-                <w:szCs w:val="18"/>
-                <w:lang w:val="en-US"/>
-              </w:rPr>
-              <w:t xml:space="preserve">    When the customer adds the product to the cart</w:t>
-            </w:r>
-          </w:p>
-          <w:p>
-            <w:pPr>
-              <w:rPr>
-                <w:rFonts w:ascii="Consolas" w:hAnsi="Consolas" w:cs="Consolas"/>
-                <w:sz w:val="18"/>
-                <w:szCs w:val="18"/>
-                <w:lang w:val="en-US"/>
-              </w:rPr>
-            </w:pPr>
-            <w:r>
-              <w:rPr>
-                <w:rFonts w:ascii="Consolas" w:hAnsi="Consolas" w:cs="Consolas"/>
-                <w:sz w:val="18"/>
-                <w:szCs w:val="18"/>
-                <w:lang w:val="en-US"/>
-              </w:rPr>
-              <w:t xml:space="preserve">    Then the system informs the customer that the product is unavailable</w:t>
             </w:r>
           </w:p>
         </w:tc>
@@ -11562,7 +11239,20 @@
               <w:rPr>
                 <w:lang w:val="en-US"/>
               </w:rPr>
-              <w:t>5. Later, Can logs in and requests the history. The system displays only Can's own imports and none of Elif's imports.</w:t>
+              <w:t>5. Elif requests to download the feature files of the import. The system delivers them together in a single ZIP archive.</w:t>
+            </w:r>
+          </w:p>
+          <w:p>
+            <w:pPr>
+              <w:rPr>
+                <w:lang w:val="en-US"/>
+              </w:rPr>
+            </w:pPr>
+            <w:r>
+              <w:rPr>
+                <w:lang w:val="en-US"/>
+              </w:rPr>
+              <w:t>6. Later, Can logs in and requests the history. The system displays only Can's own imports and none of Elif's imports.</w:t>
             </w:r>
           </w:p>
         </w:tc>
@@ -11604,7 +11294,7 @@
               <w:rPr>
                 <w:lang w:val="en-US"/>
               </w:rPr>
-              <w:t>FR-32, FR-34 – FR-36</w:t>
+              <w:t>FR-29, FR-32, FR-34 – FR-36</w:t>
             </w:r>
           </w:p>
         </w:tc>
@@ -12906,6 +12596,7 @@
               <w:rPr>
                 <w:lang w:val="en-US"/>
               </w:rPr>
+              <w:lastRenderedPageBreak/>
               <w:t>UC-8</w:t>
             </w:r>
           </w:p>
@@ -12960,7 +12651,7 @@
               <w:rPr>
                 <w:lang w:val="en-US"/>
               </w:rPr>
-              <w:t>A registered user copies the generated Gherkin text or exports the scenarios as feature files, one for each user story. Each exported scenario identifies its user story by its Issue key or by a comment with its Summary.</w:t>
+              <w:t>A registered user copies the generated Gherkin text or exports the scenarios as feature files, one for each user story, with several files delivered together as a single ZIP archive. Each exported scenario identifies its user story by its Issue key or by a comment with its Summary.</w:t>
             </w:r>
           </w:p>
         </w:tc>
@@ -13001,7 +12692,6 @@
               <w:rPr>
                 <w:lang w:val="en-US"/>
               </w:rPr>
-              <w:lastRenderedPageBreak/>
               <w:t>UC-9</w:t>
             </w:r>
           </w:p>
@@ -13401,6 +13091,7 @@
           <w:noProof/>
           <w:lang w:val="en-US"/>
         </w:rPr>
+        <w:lastRenderedPageBreak/>
         <w:drawing>
           <wp:inline distT="0" distB="0" distL="0" distR="0" wp14:anchorId="3D6FD1DF" wp14:editId="5149B621">
             <wp:extent cx="5397815" cy="8248650"/>
@@ -13756,6 +13447,664 @@
           <w:lang w:val="en-US"/>
         </w:rPr>
       </w:pPr>
+      <w:r>
+        <w:rPr>
+          <w:lang w:val="en-US"/>
+        </w:rPr>
+        <w:t>This section presents mock-ups of the user interface and the navigation between its screens. The user interface consists of five screens: LoginForm, RegisterForm, ImportForm, HistoryView, and ImportDetailView. Each screen is a boundary object of the dynamic model in Section 3.4.4. LoginForm and ImportForm appear in the sequence diagrams of that section. RegisterForm, HistoryView, and ImportDetailView are the screens of the use cases Register Account and View History, which are not shown as sequence diagrams. ImportDetailView also supports Copy or Export Scenarios and View Scenario Source.</w:t>
+      </w:r>
+    </w:p>
+    <w:p>
+      <w:pPr>
+        <w:rPr>
+          <w:lang w:val="en-US"/>
+        </w:rPr>
+      </w:pPr>
+      <w:r>
+        <w:rPr>
+          <w:lang w:val="en-US"/>
+        </w:rPr>
+        <w:t xml:space="preserve">Figures 3.4.5-1 and 3.4.5-2 show the two screens available to a Visitor, LoginForm and RegisterForm, which are reached through two tabs, Log In and Register. Figure 3.4.5-3 shows ImportForm, the screen a Registered user reaches after logging in. As in Figure 3.4.4-2, the user submits a Jira CSV file and sees the generated scenarios, the messages, and the </w:t>
+      </w:r>
+      <w:r>
+        <w:rPr>
+          <w:lang w:val="en-US"/>
+        </w:rPr>
+        <w:lastRenderedPageBreak/>
+        <w:t>source user story on the same screen. Figures 3.4.5-4 and 3.4.5-5 show HistoryView, which lists the user’s previous imports, and ImportDetailView, which shows the user stories and scenarios of one import. Figure 3.4.5-6 shows the navigation between these screens and the use cases that each screen realizes.</w:t>
+      </w:r>
+    </w:p>
+    <w:p>
+      <w:pPr>
+        <w:rPr>
+          <w:lang w:val="en-US"/>
+        </w:rPr>
+      </w:pPr>
+      <w:r>
+        <w:rPr>
+          <w:lang w:val="en-US"/>
+        </w:rPr>
+        <w:t>The mock-ups use the online shop of Section 3.4.1. The file shop-backlog-v2.csv combines the user stories of scenarios S-2 and S-3, so that warnings, errors, and unsupported requirements appear together in one example. The title bar of each mock-up names the screen and lists the functional requirements it realizes. The mock-ups show the content and behavior of the screens, not their final visual design.</w:t>
+      </w:r>
+    </w:p>
+    <w:p>
+      <w:pPr>
+        <w:rPr>
+          <w:lang w:val="en-US"/>
+        </w:rPr>
+      </w:pPr>
+      <w:r>
+        <w:rPr>
+          <w:lang w:val="en-US"/>
+        </w:rPr>
+        <w:t>Figure 3.4.5-1 shows the LoginForm, the screen of the use case Log In. A Visitor enters an email address and a password and selects “Log In”. If the credentials are valid, the system grants access and displays the ImportForm (FR-3). If they are invalid, the screen displays the error message “Invalid email address or password.” and denies access (FR-4). A note on the screen states that import, scenario generation, and history are available only after logging in (FR-5). The tab “Register” leads to the RegisterForm.</w:t>
+      </w:r>
+    </w:p>
+    <w:p>
+      <w:pPr>
+        <w:keepNext/>
+        <w:jc w:val="center"/>
+        <w:rPr>
+          <w:lang w:val="en-US"/>
+        </w:rPr>
+      </w:pPr>
+      <w:r>
+        <w:rPr>
+          <w:noProof/>
+          <w:lang w:val="en-US"/>
+        </w:rPr>
+        <w:drawing>
+          <wp:inline distT="0" distB="0" distL="0" distR="0" wp14:anchorId="21B33B31" wp14:editId="73F29240">
+            <wp:extent cx="5400000" cy="4628571"/>
+            <wp:effectExtent l="0" t="0" r="0" b="0"/>
+            <wp:docPr id="1700000001" name="Resim 11" descr="Figure 3.4.5-1 LoginForm mock-up"/>
+            <wp:cNvGraphicFramePr>
+              <a:graphicFrameLocks xmlns:a="http://schemas.openxmlformats.org/drawingml/2006/main" noChangeAspect="1"/>
+            </wp:cNvGraphicFramePr>
+            <a:graphic xmlns:a="http://schemas.openxmlformats.org/drawingml/2006/main">
+              <a:graphicData uri="http://schemas.openxmlformats.org/drawingml/2006/picture">
+                <pic:pic xmlns:pic="http://schemas.openxmlformats.org/drawingml/2006/picture">
+                  <pic:nvPicPr>
+                    <pic:cNvPr id="0" name="LoginForm.jpg"/>
+                    <pic:cNvPicPr>
+                      <a:picLocks noChangeAspect="1" noChangeArrowheads="1"/>
+                    </pic:cNvPicPr>
+                  </pic:nvPicPr>
+                  <pic:blipFill>
+                    <a:blip r:embed="rId18"/>
+                    <a:srcRect/>
+                    <a:stretch>
+                      <a:fillRect/>
+                    </a:stretch>
+                  </pic:blipFill>
+                  <pic:spPr bwMode="auto">
+                    <a:xfrm>
+                      <a:off x="0" y="0"/>
+                      <a:ext cx="5400000" cy="4628571"/>
+                    </a:xfrm>
+                    <a:prstGeom prst="rect">
+                      <a:avLst/>
+                    </a:prstGeom>
+                    <a:noFill/>
+                    <a:ln>
+                      <a:noFill/>
+                    </a:ln>
+                  </pic:spPr>
+                </pic:pic>
+              </a:graphicData>
+            </a:graphic>
+          </wp:inline>
+        </w:drawing>
+      </w:r>
+    </w:p>
+    <w:p>
+      <w:pPr>
+        <w:jc w:val="center"/>
+        <w:rPr>
+          <w:i/>
+          <w:iCs/>
+          <w:lang w:val="en-US"/>
+        </w:rPr>
+      </w:pPr>
+      <w:r>
+        <w:rPr>
+          <w:i/>
+          <w:iCs/>
+          <w:lang w:val="en-US"/>
+        </w:rPr>
+        <w:t>Figure 3.4.5-1</w:t>
+      </w:r>
+    </w:p>
+    <w:p>
+      <w:pPr>
+        <w:rPr>
+          <w:lang w:val="en-US"/>
+        </w:rPr>
+      </w:pPr>
+    </w:p>
+    <w:p>
+      <w:pPr>
+        <w:rPr>
+          <w:lang w:val="en-US"/>
+        </w:rPr>
+      </w:pPr>
+      <w:r>
+        <w:rPr>
+          <w:lang w:val="en-US"/>
+        </w:rPr>
+        <w:t xml:space="preserve">Figure 3.4.5-2 shows the RegisterForm, the screen of the use case Register Account. A Visitor enters an email address and a password and selects “Register”, and the system creates a user account (FR-1). If the email address is already registered, the screen displays the error message “This email address is already registered.” next to the email field and </w:t>
+      </w:r>
+      <w:r>
+        <w:rPr>
+          <w:lang w:val="en-US"/>
+        </w:rPr>
+        <w:lastRenderedPageBreak/>
+        <w:t>rejects the request (FR-2). A note on the screen states that only the email address and a hash of the password are stored (NFR-6, NFR-19). After registering, the Visitor logs in on the LoginForm, as described in scenario S-1. The tab “Log In” leads to the LoginForm.</w:t>
+      </w:r>
+    </w:p>
+    <w:p>
+      <w:pPr>
+        <w:keepNext/>
+        <w:jc w:val="center"/>
+        <w:rPr>
+          <w:lang w:val="en-US"/>
+        </w:rPr>
+      </w:pPr>
+      <w:r>
+        <w:rPr>
+          <w:noProof/>
+          <w:lang w:val="en-US"/>
+        </w:rPr>
+        <w:drawing>
+          <wp:inline distT="0" distB="0" distL="0" distR="0" wp14:anchorId="3BE19E15" wp14:editId="597A56C8">
+            <wp:extent cx="5400000" cy="4628571"/>
+            <wp:effectExtent l="0" t="0" r="0" b="0"/>
+            <wp:docPr id="1700000002" name="Resim 12" descr="Figure 3.4.5-2 RegisterForm mock-up"/>
+            <wp:cNvGraphicFramePr>
+              <a:graphicFrameLocks xmlns:a="http://schemas.openxmlformats.org/drawingml/2006/main" noChangeAspect="1"/>
+            </wp:cNvGraphicFramePr>
+            <a:graphic xmlns:a="http://schemas.openxmlformats.org/drawingml/2006/main">
+              <a:graphicData uri="http://schemas.openxmlformats.org/drawingml/2006/picture">
+                <pic:pic xmlns:pic="http://schemas.openxmlformats.org/drawingml/2006/picture">
+                  <pic:nvPicPr>
+                    <pic:cNvPr id="0" name="RegisterForm.jpg"/>
+                    <pic:cNvPicPr>
+                      <a:picLocks noChangeAspect="1" noChangeArrowheads="1"/>
+                    </pic:cNvPicPr>
+                  </pic:nvPicPr>
+                  <pic:blipFill>
+                    <a:blip r:embed="rId19"/>
+                    <a:srcRect/>
+                    <a:stretch>
+                      <a:fillRect/>
+                    </a:stretch>
+                  </pic:blipFill>
+                  <pic:spPr bwMode="auto">
+                    <a:xfrm>
+                      <a:off x="0" y="0"/>
+                      <a:ext cx="5400000" cy="4628571"/>
+                    </a:xfrm>
+                    <a:prstGeom prst="rect">
+                      <a:avLst/>
+                    </a:prstGeom>
+                    <a:noFill/>
+                    <a:ln>
+                      <a:noFill/>
+                    </a:ln>
+                  </pic:spPr>
+                </pic:pic>
+              </a:graphicData>
+            </a:graphic>
+          </wp:inline>
+        </w:drawing>
+      </w:r>
+    </w:p>
+    <w:p>
+      <w:pPr>
+        <w:jc w:val="center"/>
+        <w:rPr>
+          <w:i/>
+          <w:iCs/>
+          <w:lang w:val="en-US"/>
+        </w:rPr>
+      </w:pPr>
+      <w:r>
+        <w:rPr>
+          <w:i/>
+          <w:iCs/>
+          <w:lang w:val="en-US"/>
+        </w:rPr>
+        <w:t>Figure 3.4.5-2</w:t>
+      </w:r>
+    </w:p>
+    <w:p>
+      <w:pPr>
+        <w:rPr>
+          <w:lang w:val="en-US"/>
+        </w:rPr>
+      </w:pPr>
+    </w:p>
+    <w:p>
+      <w:pPr>
+        <w:rPr>
+          <w:lang w:val="en-US"/>
+        </w:rPr>
+      </w:pPr>
+      <w:r>
+        <w:rPr>
+          <w:lang w:val="en-US"/>
+        </w:rPr>
+        <w:t>Figure 3.4.5-3 shows the ImportForm, the screen of the use case Generate Scenarios from Backlog and the entry screen after logging in. It is divided into three parts. In part 1, the user selects a Jira CSV file with “Choose file” and selects “Generate Scenarios” (FR-7). The user needs two actions and sees the result on the same screen (NFR-1). If the file cannot be processed, the screen displays the reason (FR-11), and if the file contains no user stories, it informs the user (FR-12). These cases are not shown in the figure.</w:t>
+      </w:r>
+    </w:p>
+    <w:p>
+      <w:pPr>
+        <w:keepNext/>
+        <w:jc w:val="center"/>
+        <w:rPr>
+          <w:lang w:val="en-US"/>
+        </w:rPr>
+      </w:pPr>
+      <w:r>
+        <w:rPr>
+          <w:noProof/>
+          <w:lang w:val="en-US"/>
+        </w:rPr>
+        <w:lastRenderedPageBreak/>
+        <w:drawing>
+          <wp:inline distT="0" distB="0" distL="0" distR="0" wp14:anchorId="4560179D" wp14:editId="1276BD87">
+            <wp:extent cx="5400000" cy="5850000"/>
+            <wp:effectExtent l="0" t="0" r="0" b="0"/>
+            <wp:docPr id="1700000003" name="Resim 13" descr="Figure 3.4.5-3 ImportForm mock-up"/>
+            <wp:cNvGraphicFramePr>
+              <a:graphicFrameLocks xmlns:a="http://schemas.openxmlformats.org/drawingml/2006/main" noChangeAspect="1"/>
+            </wp:cNvGraphicFramePr>
+            <a:graphic xmlns:a="http://schemas.openxmlformats.org/drawingml/2006/main">
+              <a:graphicData uri="http://schemas.openxmlformats.org/drawingml/2006/picture">
+                <pic:pic xmlns:pic="http://schemas.openxmlformats.org/drawingml/2006/picture">
+                  <pic:nvPicPr>
+                    <pic:cNvPr id="0" name="ImportForm.jpg"/>
+                    <pic:cNvPicPr>
+                      <a:picLocks noChangeAspect="1" noChangeArrowheads="1"/>
+                    </pic:cNvPicPr>
+                  </pic:nvPicPr>
+                  <pic:blipFill>
+                    <a:blip r:embed="rId20"/>
+                    <a:srcRect/>
+                    <a:stretch>
+                      <a:fillRect/>
+                    </a:stretch>
+                  </pic:blipFill>
+                  <pic:spPr bwMode="auto">
+                    <a:xfrm>
+                      <a:off x="0" y="0"/>
+                      <a:ext cx="5400000" cy="5850000"/>
+                    </a:xfrm>
+                    <a:prstGeom prst="rect">
+                      <a:avLst/>
+                    </a:prstGeom>
+                    <a:noFill/>
+                    <a:ln>
+                      <a:noFill/>
+                    </a:ln>
+                  </pic:spPr>
+                </pic:pic>
+              </a:graphicData>
+            </a:graphic>
+          </wp:inline>
+        </w:drawing>
+      </w:r>
+    </w:p>
+    <w:p>
+      <w:pPr>
+        <w:jc w:val="center"/>
+        <w:rPr>
+          <w:i/>
+          <w:iCs/>
+          <w:lang w:val="en-US"/>
+        </w:rPr>
+      </w:pPr>
+      <w:r>
+        <w:rPr>
+          <w:i/>
+          <w:iCs/>
+          <w:lang w:val="en-US"/>
+        </w:rPr>
+        <w:t>Figure 3.4.5-3</w:t>
+      </w:r>
+    </w:p>
+    <w:p>
+      <w:pPr>
+        <w:rPr>
+          <w:lang w:val="en-US"/>
+        </w:rPr>
+      </w:pPr>
+      <w:r>
+        <w:rPr>
+          <w:lang w:val="en-US"/>
+        </w:rPr>
+        <w:t>Part 2 lists the messages of the processing. The summary line states that seven user stories were processed and that one item, the Epic SHOP-1, was excluded (FR-10). Each message names the user story and is labeled WARNING, ERROR, or UNSUPPORTED. SHOP-4 has no “so that” clause, so the system issues a warning and continues processing it (FR-19). SHOP-7 has no capability, so the system reports an error with the missing element and a suggested correction (FR-20) and generates no scenarios for it (FR-21). SHOP-8 matches neither the user story template nor EARS syntax, so it is marked as unsupported and reported (FR-16). The label at the right of each message, “Invalid input” or “Internal”, tells the user whether the cause is the input or an internal failure (FR-22). The last message states that the AI component was unavailable and that the scenarios were generated without AI validation (FR-38). When AI-assisted validation is enabled and the AI component responds, its findings appear in this list (FR-37). In the default configuration, no AI message is shown.</w:t>
+      </w:r>
+    </w:p>
+    <w:p>
+      <w:pPr>
+        <w:rPr>
+          <w:lang w:val="en-US"/>
+        </w:rPr>
+      </w:pPr>
+      <w:r>
+        <w:rPr>
+          <w:lang w:val="en-US"/>
+        </w:rPr>
+        <w:t xml:space="preserve">Part 3 lists the generated scenarios, one row for each user story that passed validation, with its Issue key, its feature name, and its number of scenarios. Each user story has its own </w:t>
+      </w:r>
+      <w:r>
+        <w:rPr>
+          <w:lang w:val="en-US"/>
+        </w:rPr>
+        <w:lastRenderedPageBreak/>
+        <w:t>Feature (FR-24). SHOP-7 and SHOP-8 have no row, because no scenarios are generated for them. Selecting a row displays its Feature as Gherkin text (FR-27). In the figure, SHOP-2 is selected and its scenario is tagged with the Issue key @SHOP-2 (FR-30). “Copy” makes the Gherkin text available for copying (FR-28), “Export .feature” exports the feature file of that user story, and “Export all (.zip)” delivers the feature files of all user stories together in one ZIP archive (FR-29). If the file has no Issue key column, the exported scenarios are preceded by a comment with the Summary instead of the tag (FR-31). The panel at the bottom of the screen displays the source user story of the selected scenario, here SHOP-2 with its Summary (FR-32). When the processing is complete, the import is stored in the user’s history (FR-33).</w:t>
+      </w:r>
+    </w:p>
+    <w:p>
+      <w:pPr>
+        <w:rPr>
+          <w:lang w:val="en-US"/>
+        </w:rPr>
+      </w:pPr>
+    </w:p>
+    <w:p>
+      <w:pPr>
+        <w:rPr>
+          <w:lang w:val="en-US"/>
+        </w:rPr>
+      </w:pPr>
+      <w:r>
+        <w:rPr>
+          <w:lang w:val="en-US"/>
+        </w:rPr>
+        <w:t>Figure 3.4.5-4 shows the HistoryView, the screen of the use case View History. It lists the previous imports of the logged-in user (FR-34). For each import it shows the file name, the time of the import, the number of user stories, the number of generated scenarios, and the numbers of warnings and errors. “Previous” and “Next” allow the user to page through a long history. A note on the screen states that imports are visible only to the user who submitted them (FR-36). “View” opens the ImportDetailView of the import (FR-35). “Download (.zip)” exports the feature files of the import as one ZIP archive (FR-29). “+ New Import” leads to the ImportForm.</w:t>
+      </w:r>
+    </w:p>
+    <w:p>
+      <w:pPr>
+        <w:keepNext/>
+        <w:jc w:val="center"/>
+        <w:rPr>
+          <w:lang w:val="en-US"/>
+        </w:rPr>
+      </w:pPr>
+      <w:r>
+        <w:rPr>
+          <w:noProof/>
+          <w:lang w:val="en-US"/>
+        </w:rPr>
+        <w:drawing>
+          <wp:inline distT="0" distB="0" distL="0" distR="0" wp14:anchorId="70518F33" wp14:editId="03EF8959">
+            <wp:extent cx="5400000" cy="4628571"/>
+            <wp:effectExtent l="0" t="0" r="0" b="0"/>
+            <wp:docPr id="1700000004" name="Resim 14" descr="Figure 3.4.5-4 HistoryView mock-up"/>
+            <wp:cNvGraphicFramePr>
+              <a:graphicFrameLocks xmlns:a="http://schemas.openxmlformats.org/drawingml/2006/main" noChangeAspect="1"/>
+            </wp:cNvGraphicFramePr>
+            <a:graphic xmlns:a="http://schemas.openxmlformats.org/drawingml/2006/main">
+              <a:graphicData uri="http://schemas.openxmlformats.org/drawingml/2006/picture">
+                <pic:pic xmlns:pic="http://schemas.openxmlformats.org/drawingml/2006/picture">
+                  <pic:nvPicPr>
+                    <pic:cNvPr id="0" name="HistoryView.jpg"/>
+                    <pic:cNvPicPr>
+                      <a:picLocks noChangeAspect="1" noChangeArrowheads="1"/>
+                    </pic:cNvPicPr>
+                  </pic:nvPicPr>
+                  <pic:blipFill>
+                    <a:blip r:embed="rId21"/>
+                    <a:srcRect/>
+                    <a:stretch>
+                      <a:fillRect/>
+                    </a:stretch>
+                  </pic:blipFill>
+                  <pic:spPr bwMode="auto">
+                    <a:xfrm>
+                      <a:off x="0" y="0"/>
+                      <a:ext cx="5400000" cy="4628571"/>
+                    </a:xfrm>
+                    <a:prstGeom prst="rect">
+                      <a:avLst/>
+                    </a:prstGeom>
+                    <a:noFill/>
+                    <a:ln>
+                      <a:noFill/>
+                    </a:ln>
+                  </pic:spPr>
+                </pic:pic>
+              </a:graphicData>
+            </a:graphic>
+          </wp:inline>
+        </w:drawing>
+      </w:r>
+    </w:p>
+    <w:p>
+      <w:pPr>
+        <w:jc w:val="center"/>
+        <w:rPr>
+          <w:i/>
+          <w:iCs/>
+          <w:lang w:val="en-US"/>
+        </w:rPr>
+      </w:pPr>
+      <w:r>
+        <w:rPr>
+          <w:i/>
+          <w:iCs/>
+          <w:lang w:val="en-US"/>
+        </w:rPr>
+        <w:t>Figure 3.4.5-4</w:t>
+      </w:r>
+    </w:p>
+    <w:p>
+      <w:pPr>
+        <w:rPr>
+          <w:lang w:val="en-US"/>
+        </w:rPr>
+      </w:pPr>
+    </w:p>
+    <w:p>
+      <w:pPr>
+        <w:rPr>
+          <w:lang w:val="en-US"/>
+        </w:rPr>
+      </w:pPr>
+      <w:r>
+        <w:rPr>
+          <w:lang w:val="en-US"/>
+        </w:rPr>
+        <w:lastRenderedPageBreak/>
+        <w:t>Figure 3.4.5-5 shows the ImportDetailView, which is displayed when the user selects “View” for an import. The header shows the file name, the time of the import, the number of items, and the number of excluded items. Four counters summarize the import: the user stories, the generated scenarios, the warnings, and the errors. In the example, the two errors are the invalid user story SHOP-7 and the unsupported user story SHOP-8. The table lists every user story of the import with its Issue key, its Summary, the detected format (user story, EARS, or unknown) (FR-13), its validation result (FR-19, FR-20), and its status. The statuses Scenarios generated, Invalid, and Unsupported are the values of the user story status of the object model. For a user story with scenarios, “View” displays the generated Feature, with the same “Copy” and “Export .feature” actions and the same source user story as on the ImportForm (FR-35, FR-28, FR-29, FR-32). “Download all (.zip)” exports the feature files of the whole import as one ZIP archive (FR-29). “Back to History” returns to the HistoryView.</w:t>
+      </w:r>
+    </w:p>
+    <w:p>
+      <w:pPr>
+        <w:keepNext/>
+        <w:jc w:val="center"/>
+        <w:rPr>
+          <w:lang w:val="en-US"/>
+        </w:rPr>
+      </w:pPr>
+      <w:r>
+        <w:rPr>
+          <w:noProof/>
+          <w:lang w:val="en-US"/>
+        </w:rPr>
+        <w:drawing>
+          <wp:inline distT="0" distB="0" distL="0" distR="0" wp14:anchorId="1774CB84" wp14:editId="76B0328F">
+            <wp:extent cx="5400000" cy="5335714"/>
+            <wp:effectExtent l="0" t="0" r="0" b="0"/>
+            <wp:docPr id="1700000005" name="Resim 15" descr="Figure 3.4.5-5 ImportDetailView mock-up"/>
+            <wp:cNvGraphicFramePr>
+              <a:graphicFrameLocks xmlns:a="http://schemas.openxmlformats.org/drawingml/2006/main" noChangeAspect="1"/>
+            </wp:cNvGraphicFramePr>
+            <a:graphic xmlns:a="http://schemas.openxmlformats.org/drawingml/2006/main">
+              <a:graphicData uri="http://schemas.openxmlformats.org/drawingml/2006/picture">
+                <pic:pic xmlns:pic="http://schemas.openxmlformats.org/drawingml/2006/picture">
+                  <pic:nvPicPr>
+                    <pic:cNvPr id="0" name="ImportDetailView.jpg"/>
+                    <pic:cNvPicPr>
+                      <a:picLocks noChangeAspect="1" noChangeArrowheads="1"/>
+                    </pic:cNvPicPr>
+                  </pic:nvPicPr>
+                  <pic:blipFill>
+                    <a:blip r:embed="rId22"/>
+                    <a:srcRect/>
+                    <a:stretch>
+                      <a:fillRect/>
+                    </a:stretch>
+                  </pic:blipFill>
+                  <pic:spPr bwMode="auto">
+                    <a:xfrm>
+                      <a:off x="0" y="0"/>
+                      <a:ext cx="5400000" cy="5335714"/>
+                    </a:xfrm>
+                    <a:prstGeom prst="rect">
+                      <a:avLst/>
+                    </a:prstGeom>
+                    <a:noFill/>
+                    <a:ln>
+                      <a:noFill/>
+                    </a:ln>
+                  </pic:spPr>
+                </pic:pic>
+              </a:graphicData>
+            </a:graphic>
+          </wp:inline>
+        </w:drawing>
+      </w:r>
+    </w:p>
+    <w:p>
+      <w:pPr>
+        <w:jc w:val="center"/>
+        <w:rPr>
+          <w:i/>
+          <w:iCs/>
+          <w:lang w:val="en-US"/>
+        </w:rPr>
+      </w:pPr>
+      <w:r>
+        <w:rPr>
+          <w:i/>
+          <w:iCs/>
+          <w:lang w:val="en-US"/>
+        </w:rPr>
+        <w:t>Figure 3.4.5-5</w:t>
+      </w:r>
+    </w:p>
+    <w:p>
+      <w:pPr>
+        <w:rPr>
+          <w:lang w:val="en-US"/>
+        </w:rPr>
+      </w:pPr>
+    </w:p>
+    <w:p>
+      <w:pPr>
+        <w:rPr>
+          <w:lang w:val="en-US"/>
+        </w:rPr>
+      </w:pPr>
+      <w:r>
+        <w:rPr>
+          <w:lang w:val="en-US"/>
+        </w:rPr>
+        <w:t xml:space="preserve">Figure 3.4.5-6 shows the navigation between the screens and the use cases that each screen realizes. A Visitor can reach only the LoginForm and the RegisterForm, which are connected by the tabs “Log In” and “Register” (FR-5). With valid credentials, the user </w:t>
+      </w:r>
+      <w:r>
+        <w:rPr>
+          <w:lang w:val="en-US"/>
+        </w:rPr>
+        <w:lastRenderedPageBreak/>
+        <w:t>reaches the ImportForm (FR-3). All screens of a logged-in user share a navigation bar with the entries “Import”, “History”, and “Log Out”. “Import” leads to the ImportForm and “History” leads to the HistoryView. An import that has been processed on the ImportForm is stored (FR-33) and appears in the HistoryView. From the HistoryView, “View” opens the ImportDetailView, “Back to History” returns to the HistoryView, and “+ New Import” leads to the ImportForm. “Log Out” on any screen ends the session and returns to the LoginForm (FR-6).</w:t>
+      </w:r>
+    </w:p>
+    <w:p>
+      <w:pPr>
+        <w:keepNext/>
+        <w:jc w:val="center"/>
+        <w:rPr>
+          <w:lang w:val="en-US"/>
+        </w:rPr>
+      </w:pPr>
+      <w:r>
+        <w:rPr>
+          <w:noProof/>
+          <w:lang w:val="en-US"/>
+        </w:rPr>
+        <w:drawing>
+          <wp:inline distT="0" distB="0" distL="0" distR="0" wp14:anchorId="60908D36" wp14:editId="248634CC">
+            <wp:extent cx="5400000" cy="3991304"/>
+            <wp:effectExtent l="0" t="0" r="0" b="0"/>
+            <wp:docPr id="1700000006" name="Resim 16" descr="Figure 3.4.5-6 Navigation mock-up"/>
+            <wp:cNvGraphicFramePr>
+              <a:graphicFrameLocks xmlns:a="http://schemas.openxmlformats.org/drawingml/2006/main" noChangeAspect="1"/>
+            </wp:cNvGraphicFramePr>
+            <a:graphic xmlns:a="http://schemas.openxmlformats.org/drawingml/2006/main">
+              <a:graphicData uri="http://schemas.openxmlformats.org/drawingml/2006/picture">
+                <pic:pic xmlns:pic="http://schemas.openxmlformats.org/drawingml/2006/picture">
+                  <pic:nvPicPr>
+                    <pic:cNvPr id="0" name="Navigation.jpg"/>
+                    <pic:cNvPicPr>
+                      <a:picLocks noChangeAspect="1" noChangeArrowheads="1"/>
+                    </pic:cNvPicPr>
+                  </pic:nvPicPr>
+                  <pic:blipFill>
+                    <a:blip r:embed="rId23"/>
+                    <a:srcRect/>
+                    <a:stretch>
+                      <a:fillRect/>
+                    </a:stretch>
+                  </pic:blipFill>
+                  <pic:spPr bwMode="auto">
+                    <a:xfrm>
+                      <a:off x="0" y="0"/>
+                      <a:ext cx="5400000" cy="3991304"/>
+                    </a:xfrm>
+                    <a:prstGeom prst="rect">
+                      <a:avLst/>
+                    </a:prstGeom>
+                    <a:noFill/>
+                    <a:ln>
+                      <a:noFill/>
+                    </a:ln>
+                  </pic:spPr>
+                </pic:pic>
+              </a:graphicData>
+            </a:graphic>
+          </wp:inline>
+        </w:drawing>
+      </w:r>
+    </w:p>
+    <w:p>
+      <w:pPr>
+        <w:jc w:val="center"/>
+        <w:rPr>
+          <w:i/>
+          <w:iCs/>
+          <w:lang w:val="en-US"/>
+        </w:rPr>
+      </w:pPr>
+      <w:r>
+        <w:rPr>
+          <w:i/>
+          <w:iCs/>
+          <w:lang w:val="en-US"/>
+        </w:rPr>
+        <w:t>Figure 3.4.5-6</w:t>
+      </w:r>
+    </w:p>
+    <w:p>
+      <w:pPr>
+        <w:rPr>
+          <w:lang w:val="en-US"/>
+        </w:rPr>
+      </w:pPr>
     </w:p>
     <w:p>
       <w:pPr>
@@ -13827,7 +14176,6 @@
                 <w:bCs/>
                 <w:lang w:val="en-US"/>
               </w:rPr>
-              <w:lastRenderedPageBreak/>
               <w:t>Term</w:t>
             </w:r>
           </w:p>
@@ -13955,6 +14303,7 @@
               <w:rPr>
                 <w:lang w:val="en-US"/>
               </w:rPr>
+              <w:lastRenderedPageBreak/>
               <w:t>Alternative flow</w:t>
             </w:r>
           </w:p>
@@ -14734,7 +15083,6 @@
               <w:rPr>
                 <w:lang w:val="en-US"/>
               </w:rPr>
-              <w:lastRenderedPageBreak/>
               <w:t>Scenario</w:t>
             </w:r>
           </w:p>
@@ -14817,6 +15165,7 @@
               <w:rPr>
                 <w:lang w:val="en-US"/>
               </w:rPr>
+              <w:lastRenderedPageBreak/>
               <w:t>Summary</w:t>
             </w:r>
           </w:p>
@@ -15123,6 +15472,47 @@
                 <w:lang w:val="en-US"/>
               </w:rPr>
               <w:t>A validation result that reports a problem in a requirement but allows its processing to continue.</w:t>
+            </w:r>
+          </w:p>
+        </w:tc>
+      </w:tr>
+      <w:tr>
+        <w:trPr>
+          <w:cantSplit/>
+        </w:trPr>
+        <w:tc>
+          <w:tcPr>
+            <w:tcW w:w="2200" w:type="dxa"/>
+          </w:tcPr>
+          <w:p>
+            <w:pPr>
+              <w:rPr>
+                <w:lang w:val="en-US"/>
+              </w:rPr>
+            </w:pPr>
+            <w:r>
+              <w:rPr>
+                <w:lang w:val="en-US"/>
+              </w:rPr>
+              <w:t>ZIP archive</w:t>
+            </w:r>
+          </w:p>
+        </w:tc>
+        <w:tc>
+          <w:tcPr>
+            <w:tcW w:w="6862" w:type="dxa"/>
+          </w:tcPr>
+          <w:p>
+            <w:pPr>
+              <w:rPr>
+                <w:lang w:val="en-US"/>
+              </w:rPr>
+            </w:pPr>
+            <w:r>
+              <w:rPr>
+                <w:lang w:val="en-US"/>
+              </w:rPr>
+              <w:t>A single compressed file that contains several feature files, so that they can be downloaded together.</w:t>
             </w:r>
           </w:p>
         </w:tc>
@@ -15461,7 +15851,6 @@
               <w:rPr>
                 <w:lang w:val="en-US"/>
               </w:rPr>
-              <w:lastRenderedPageBreak/>
               <w:t>Could</w:t>
             </w:r>
           </w:p>
@@ -15543,6 +15932,7 @@
         <w:rPr>
           <w:lang w:val="en-US"/>
         </w:rPr>
+        <w:lastRenderedPageBreak/>
         <w:t>Traceability</w:t>
       </w:r>
       <w:bookmarkEnd w:id="43"/>
@@ -16263,7 +16653,6 @@
         <w:rPr>
           <w:lang w:val="en-US"/>
         </w:rPr>
-        <w:lastRenderedPageBreak/>
         <w:t>The use cases of Section 3.4.2 trace to the functional requirements of Section 3.2 as shown in the following table. Every use case links to one or more functional requirements, and every functional requirement is linked to at least one use case.</w:t>
       </w:r>
     </w:p>
@@ -16435,6 +16824,7 @@
               <w:rPr>
                 <w:lang w:val="en-US"/>
               </w:rPr>
+              <w:lastRenderedPageBreak/>
               <w:t>UC-3 Log Out</w:t>
             </w:r>
           </w:p>
@@ -16754,8 +17144,8 @@
       </w:pPr>
     </w:p>
     <w:sectPr>
-      <w:headerReference w:type="default" r:id="rId18"/>
-      <w:footerReference w:type="default" r:id="rId19"/>
+      <w:headerReference w:type="default" r:id="rId24"/>
+      <w:footerReference w:type="default" r:id="rId25"/>
       <w:pgSz w:w="11906" w:h="16838"/>
       <w:pgMar w:top="1417" w:right="1417" w:bottom="1417" w:left="1417" w:header="708" w:footer="708" w:gutter="0"/>
       <w:cols w:space="708"/>
@@ -20099,12 +20489,11 @@
 </file>
 
 <file path=customXml/item1.xml><?xml version="1.0" encoding="utf-8"?>
-<?mso-contentType ?>
-<FormTemplates xmlns="http://schemas.microsoft.com/sharepoint/v3/contenttype/forms">
-  <Display>DocumentLibraryForm</Display>
-  <Edit>DocumentLibraryForm</Edit>
-  <New>DocumentLibraryForm</New>
-</FormTemplates>
+<p:properties xmlns:p="http://schemas.microsoft.com/office/2006/metadata/properties" xmlns:xsi="http://www.w3.org/2001/XMLSchema-instance" xmlns:pc="http://schemas.microsoft.com/office/infopath/2007/PartnerControls">
+  <documentManagement>
+    <ReferenceId xmlns="90f865b1-d0dc-4fc3-9a7d-0ca5134e2b59" xsi:nil="true"/>
+  </documentManagement>
+</p:properties>
 </file>
 
 <file path=customXml/item2.xml><?xml version="1.0" encoding="utf-8"?>
@@ -20112,11 +20501,12 @@
 </file>
 
 <file path=customXml/item3.xml><?xml version="1.0" encoding="utf-8"?>
-<p:properties xmlns:p="http://schemas.microsoft.com/office/2006/metadata/properties" xmlns:xsi="http://www.w3.org/2001/XMLSchema-instance" xmlns:pc="http://schemas.microsoft.com/office/infopath/2007/PartnerControls">
-  <documentManagement>
-    <ReferenceId xmlns="90f865b1-d0dc-4fc3-9a7d-0ca5134e2b59" xsi:nil="true"/>
-  </documentManagement>
-</p:properties>
+<?mso-contentType ?>
+<FormTemplates xmlns="http://schemas.microsoft.com/sharepoint/v3/contenttype/forms">
+  <Display>DocumentLibraryForm</Display>
+  <Edit>DocumentLibraryForm</Edit>
+  <New>DocumentLibraryForm</New>
+</FormTemplates>
 </file>
 
 <file path=customXml/item4.xml><?xml version="1.0" encoding="utf-8"?>
@@ -20246,9 +20636,11 @@
 </file>
 
 <file path=customXml/itemProps1.xml><?xml version="1.0" encoding="utf-8"?>
-<ds:datastoreItem xmlns:ds="http://schemas.openxmlformats.org/officeDocument/2006/customXml" ds:itemID="{7451EBBF-49FB-4295-BC57-7BAD6477FB01}">
+<ds:datastoreItem xmlns:ds="http://schemas.openxmlformats.org/officeDocument/2006/customXml" ds:itemID="{96DEB25F-1766-4A55-BC0F-248365F4AA66}">
   <ds:schemaRefs>
-    <ds:schemaRef ds:uri="http://schemas.microsoft.com/sharepoint/v3/contenttype/forms"/>
+    <ds:schemaRef ds:uri="http://schemas.microsoft.com/office/2006/metadata/properties"/>
+    <ds:schemaRef ds:uri="http://schemas.microsoft.com/office/infopath/2007/PartnerControls"/>
+    <ds:schemaRef ds:uri="90f865b1-d0dc-4fc3-9a7d-0ca5134e2b59"/>
   </ds:schemaRefs>
 </ds:datastoreItem>
 </file>
@@ -20262,11 +20654,9 @@
 </file>
 
 <file path=customXml/itemProps3.xml><?xml version="1.0" encoding="utf-8"?>
-<ds:datastoreItem xmlns:ds="http://schemas.openxmlformats.org/officeDocument/2006/customXml" ds:itemID="{96DEB25F-1766-4A55-BC0F-248365F4AA66}">
+<ds:datastoreItem xmlns:ds="http://schemas.openxmlformats.org/officeDocument/2006/customXml" ds:itemID="{7451EBBF-49FB-4295-BC57-7BAD6477FB01}">
   <ds:schemaRefs>
-    <ds:schemaRef ds:uri="http://schemas.microsoft.com/office/2006/metadata/properties"/>
-    <ds:schemaRef ds:uri="http://schemas.microsoft.com/office/infopath/2007/PartnerControls"/>
-    <ds:schemaRef ds:uri="90f865b1-d0dc-4fc3-9a7d-0ca5134e2b59"/>
+    <ds:schemaRef ds:uri="http://schemas.microsoft.com/sharepoint/v3/contenttype/forms"/>
   </ds:schemaRefs>
 </ds:datastoreItem>
 </file>

</xml_diff>